<commit_message>
Saving all changes. Additions made to submission document and changed KiCad page size to suit schematic.
</commit_message>
<xml_diff>
--- a/Supplementary Files/Submission - Electrical Software Indivual Challenge Douglas Gray ID 190.docx
+++ b/Supplementary Files/Submission - Electrical Software Indivual Challenge Douglas Gray ID 190.docx
@@ -64,31 +64,7 @@
         <w:t>T11.7.12</w:t>
       </w:r>
       <w:r>
-        <w:t xml:space="preserve"> “</w:t>
-      </w:r>
-      <w:r>
-        <w:t>Must include overtemperature protection of at least 30 % of the cells, meeting EV5.8.4,</w:t>
-      </w:r>
-      <w:r>
-        <w:t xml:space="preserve"> </w:t>
-      </w:r>
-      <w:r>
-        <w:t>that trips when any cell leaves the allowed temperature range according to the</w:t>
-      </w:r>
-      <w:r>
-        <w:t xml:space="preserve"> </w:t>
-      </w:r>
-      <w:r>
-        <w:t>manufacturer’s datasheet, but not more than 60°C, for more than 1s and disconnects</w:t>
-      </w:r>
-      <w:r>
-        <w:t xml:space="preserve"> </w:t>
-      </w:r>
-      <w:r>
-        <w:t>the battery</w:t>
-      </w:r>
-      <w:r>
-        <w:t>,”</w:t>
+        <w:t xml:space="preserve"> “Must include overtemperature protection of at least 30 % of the cells, meeting EV5.8.4, that trips when any cell leaves the allowed temperature range according to the manufacturer’s datasheet, but not more than 60°C, for more than 1s and disconnects the battery,”</w:t>
       </w:r>
       <w:r>
         <w:t>, “</w:t>
@@ -367,8 +343,319 @@
         <w:pStyle w:val="Heading1"/>
       </w:pPr>
       <w:r>
+        <w:rPr>
+          <w:noProof/>
+        </w:rPr>
         <w:lastRenderedPageBreak/>
+        <w:drawing>
+          <wp:anchor distT="0" distB="0" distL="114300" distR="114300" simplePos="0" relativeHeight="251658240" behindDoc="0" locked="0" layoutInCell="1" allowOverlap="1" wp14:anchorId="3511E1A5" wp14:editId="5785B5EC">
+            <wp:simplePos x="0" y="0"/>
+            <wp:positionH relativeFrom="margin">
+              <wp:align>right</wp:align>
+            </wp:positionH>
+            <wp:positionV relativeFrom="paragraph">
+              <wp:posOffset>388620</wp:posOffset>
+            </wp:positionV>
+            <wp:extent cx="5730240" cy="5386070"/>
+            <wp:effectExtent l="0" t="0" r="3810" b="5080"/>
+            <wp:wrapSquare wrapText="bothSides"/>
+            <wp:docPr id="1683921458" name="Picture 2"/>
+            <wp:cNvGraphicFramePr>
+              <a:graphicFrameLocks xmlns:a="http://schemas.openxmlformats.org/drawingml/2006/main" noChangeAspect="1"/>
+            </wp:cNvGraphicFramePr>
+            <a:graphic xmlns:a="http://schemas.openxmlformats.org/drawingml/2006/main">
+              <a:graphicData uri="http://schemas.openxmlformats.org/drawingml/2006/picture">
+                <pic:pic xmlns:pic="http://schemas.openxmlformats.org/drawingml/2006/picture">
+                  <pic:nvPicPr>
+                    <pic:cNvPr id="1683921458" name="Picture 1683921458"/>
+                    <pic:cNvPicPr/>
+                  </pic:nvPicPr>
+                  <pic:blipFill>
+                    <a:blip r:embed="rId11">
+                      <a:extLst>
+                        <a:ext uri="{28A0092B-C50C-407E-A947-70E740481C1C}">
+                          <a14:useLocalDpi xmlns:a14="http://schemas.microsoft.com/office/drawing/2010/main" val="0"/>
+                        </a:ext>
+                      </a:extLst>
+                    </a:blip>
+                    <a:stretch>
+                      <a:fillRect/>
+                    </a:stretch>
+                  </pic:blipFill>
+                  <pic:spPr>
+                    <a:xfrm>
+                      <a:off x="0" y="0"/>
+                      <a:ext cx="5730240" cy="5386070"/>
+                    </a:xfrm>
+                    <a:prstGeom prst="rect">
+                      <a:avLst/>
+                    </a:prstGeom>
+                  </pic:spPr>
+                </pic:pic>
+              </a:graphicData>
+            </a:graphic>
+            <wp14:sizeRelH relativeFrom="margin">
+              <wp14:pctWidth>0</wp14:pctWidth>
+            </wp14:sizeRelH>
+            <wp14:sizeRelV relativeFrom="margin">
+              <wp14:pctHeight>0</wp14:pctHeight>
+            </wp14:sizeRelV>
+          </wp:anchor>
+        </w:drawing>
+      </w:r>
+      <w:r>
         <w:t>3. Logic/block diagram</w:t>
+      </w:r>
+    </w:p>
+    <w:p/>
+    <w:p/>
+    <w:p/>
+    <w:p/>
+    <w:p/>
+    <w:p/>
+    <w:p/>
+    <w:p/>
+    <w:p/>
+    <w:p>
+      <w:r>
+        <w:lastRenderedPageBreak/>
+        <w:t>Desmos Graph to model the inputs, constants, and ‘outputs’ for the ADC task processes:</w:t>
+      </w:r>
+    </w:p>
+    <w:p>
+      <w:r>
+        <w:rPr>
+          <w:noProof/>
+        </w:rPr>
+        <w:drawing>
+          <wp:anchor distT="0" distB="0" distL="114300" distR="114300" simplePos="0" relativeHeight="251659264" behindDoc="0" locked="0" layoutInCell="1" allowOverlap="1" wp14:anchorId="4ADFB9DC" wp14:editId="58C35C61">
+            <wp:simplePos x="0" y="0"/>
+            <wp:positionH relativeFrom="margin">
+              <wp:align>right</wp:align>
+            </wp:positionH>
+            <wp:positionV relativeFrom="paragraph">
+              <wp:posOffset>328626</wp:posOffset>
+            </wp:positionV>
+            <wp:extent cx="2987040" cy="1120140"/>
+            <wp:effectExtent l="0" t="0" r="3810" b="3810"/>
+            <wp:wrapSquare wrapText="bothSides"/>
+            <wp:docPr id="884224468" name="Picture 4"/>
+            <wp:cNvGraphicFramePr>
+              <a:graphicFrameLocks xmlns:a="http://schemas.openxmlformats.org/drawingml/2006/main" noChangeAspect="1"/>
+            </wp:cNvGraphicFramePr>
+            <a:graphic xmlns:a="http://schemas.openxmlformats.org/drawingml/2006/main">
+              <a:graphicData uri="http://schemas.openxmlformats.org/drawingml/2006/picture">
+                <pic:pic xmlns:pic="http://schemas.openxmlformats.org/drawingml/2006/picture">
+                  <pic:nvPicPr>
+                    <pic:cNvPr id="884224468" name="Picture 884224468"/>
+                    <pic:cNvPicPr/>
+                  </pic:nvPicPr>
+                  <pic:blipFill>
+                    <a:blip r:embed="rId12" cstate="print">
+                      <a:extLst>
+                        <a:ext uri="{28A0092B-C50C-407E-A947-70E740481C1C}">
+                          <a14:useLocalDpi xmlns:a14="http://schemas.microsoft.com/office/drawing/2010/main" val="0"/>
+                        </a:ext>
+                      </a:extLst>
+                    </a:blip>
+                    <a:stretch>
+                      <a:fillRect/>
+                    </a:stretch>
+                  </pic:blipFill>
+                  <pic:spPr>
+                    <a:xfrm>
+                      <a:off x="0" y="0"/>
+                      <a:ext cx="2987040" cy="1120140"/>
+                    </a:xfrm>
+                    <a:prstGeom prst="rect">
+                      <a:avLst/>
+                    </a:prstGeom>
+                  </pic:spPr>
+                </pic:pic>
+              </a:graphicData>
+            </a:graphic>
+            <wp14:sizeRelH relativeFrom="margin">
+              <wp14:pctWidth>0</wp14:pctWidth>
+            </wp14:sizeRelH>
+            <wp14:sizeRelV relativeFrom="margin">
+              <wp14:pctHeight>0</wp14:pctHeight>
+            </wp14:sizeRelV>
+          </wp:anchor>
+        </w:drawing>
+      </w:r>
+      <w:hyperlink r:id="rId13" w:history="1">
+        <w:r>
+          <w:rPr>
+            <w:rStyle w:val="Hyperlink"/>
+          </w:rPr>
+          <w:t>https://www.desmos.com/calculator/gdqgglfel8</w:t>
+        </w:r>
+      </w:hyperlink>
+    </w:p>
+    <w:p>
+      <w:r>
+        <w:rPr>
+          <w:noProof/>
+        </w:rPr>
+        <w:drawing>
+          <wp:anchor distT="0" distB="0" distL="114300" distR="114300" simplePos="0" relativeHeight="251660288" behindDoc="0" locked="0" layoutInCell="1" allowOverlap="1" wp14:anchorId="1A782856" wp14:editId="0DB44B8F">
+            <wp:simplePos x="0" y="0"/>
+            <wp:positionH relativeFrom="margin">
+              <wp:align>left</wp:align>
+            </wp:positionH>
+            <wp:positionV relativeFrom="paragraph">
+              <wp:posOffset>11430</wp:posOffset>
+            </wp:positionV>
+            <wp:extent cx="2700000" cy="1471150"/>
+            <wp:effectExtent l="0" t="0" r="5715" b="0"/>
+            <wp:wrapSquare wrapText="bothSides"/>
+            <wp:docPr id="2044035093" name="Picture 3"/>
+            <wp:cNvGraphicFramePr>
+              <a:graphicFrameLocks xmlns:a="http://schemas.openxmlformats.org/drawingml/2006/main" noChangeAspect="1"/>
+            </wp:cNvGraphicFramePr>
+            <a:graphic xmlns:a="http://schemas.openxmlformats.org/drawingml/2006/main">
+              <a:graphicData uri="http://schemas.openxmlformats.org/drawingml/2006/picture">
+                <pic:pic xmlns:pic="http://schemas.openxmlformats.org/drawingml/2006/picture">
+                  <pic:nvPicPr>
+                    <pic:cNvPr id="2044035093" name="Picture 2044035093"/>
+                    <pic:cNvPicPr/>
+                  </pic:nvPicPr>
+                  <pic:blipFill>
+                    <a:blip r:embed="rId14" cstate="print">
+                      <a:extLst>
+                        <a:ext uri="{28A0092B-C50C-407E-A947-70E740481C1C}">
+                          <a14:useLocalDpi xmlns:a14="http://schemas.microsoft.com/office/drawing/2010/main" val="0"/>
+                        </a:ext>
+                      </a:extLst>
+                    </a:blip>
+                    <a:stretch>
+                      <a:fillRect/>
+                    </a:stretch>
+                  </pic:blipFill>
+                  <pic:spPr>
+                    <a:xfrm>
+                      <a:off x="0" y="0"/>
+                      <a:ext cx="2700000" cy="1471150"/>
+                    </a:xfrm>
+                    <a:prstGeom prst="rect">
+                      <a:avLst/>
+                    </a:prstGeom>
+                  </pic:spPr>
+                </pic:pic>
+              </a:graphicData>
+            </a:graphic>
+          </wp:anchor>
+        </w:drawing>
+      </w:r>
+    </w:p>
+    <w:p>
+      <w:r>
+        <w:rPr>
+          <w:noProof/>
+        </w:rPr>
+        <w:drawing>
+          <wp:inline distT="0" distB="0" distL="0" distR="0" wp14:anchorId="5C901307" wp14:editId="09F9B3E2">
+            <wp:extent cx="5731510" cy="1715135"/>
+            <wp:effectExtent l="0" t="0" r="2540" b="0"/>
+            <wp:docPr id="781044121" name="Picture 5"/>
+            <wp:cNvGraphicFramePr>
+              <a:graphicFrameLocks xmlns:a="http://schemas.openxmlformats.org/drawingml/2006/main" noChangeAspect="1"/>
+            </wp:cNvGraphicFramePr>
+            <a:graphic xmlns:a="http://schemas.openxmlformats.org/drawingml/2006/main">
+              <a:graphicData uri="http://schemas.openxmlformats.org/drawingml/2006/picture">
+                <pic:pic xmlns:pic="http://schemas.openxmlformats.org/drawingml/2006/picture">
+                  <pic:nvPicPr>
+                    <pic:cNvPr id="781044121" name="Picture 781044121"/>
+                    <pic:cNvPicPr/>
+                  </pic:nvPicPr>
+                  <pic:blipFill>
+                    <a:blip r:embed="rId15">
+                      <a:extLst>
+                        <a:ext uri="{28A0092B-C50C-407E-A947-70E740481C1C}">
+                          <a14:useLocalDpi xmlns:a14="http://schemas.microsoft.com/office/drawing/2010/main" val="0"/>
+                        </a:ext>
+                      </a:extLst>
+                    </a:blip>
+                    <a:stretch>
+                      <a:fillRect/>
+                    </a:stretch>
+                  </pic:blipFill>
+                  <pic:spPr>
+                    <a:xfrm>
+                      <a:off x="0" y="0"/>
+                      <a:ext cx="5731510" cy="1715135"/>
+                    </a:xfrm>
+                    <a:prstGeom prst="rect">
+                      <a:avLst/>
+                    </a:prstGeom>
+                  </pic:spPr>
+                </pic:pic>
+              </a:graphicData>
+            </a:graphic>
+          </wp:inline>
+        </w:drawing>
+      </w:r>
+    </w:p>
+    <w:p>
+      <w:r>
+        <w:rPr>
+          <w:noProof/>
+        </w:rPr>
+        <w:drawing>
+          <wp:inline distT="0" distB="0" distL="0" distR="0" wp14:anchorId="127C02E0" wp14:editId="606CB81B">
+            <wp:extent cx="5731510" cy="1939925"/>
+            <wp:effectExtent l="0" t="0" r="2540" b="3175"/>
+            <wp:docPr id="1358259451" name="Picture 6"/>
+            <wp:cNvGraphicFramePr>
+              <a:graphicFrameLocks xmlns:a="http://schemas.openxmlformats.org/drawingml/2006/main" noChangeAspect="1"/>
+            </wp:cNvGraphicFramePr>
+            <a:graphic xmlns:a="http://schemas.openxmlformats.org/drawingml/2006/main">
+              <a:graphicData uri="http://schemas.openxmlformats.org/drawingml/2006/picture">
+                <pic:pic xmlns:pic="http://schemas.openxmlformats.org/drawingml/2006/picture">
+                  <pic:nvPicPr>
+                    <pic:cNvPr id="1358259451" name="Picture 1358259451"/>
+                    <pic:cNvPicPr/>
+                  </pic:nvPicPr>
+                  <pic:blipFill>
+                    <a:blip r:embed="rId16">
+                      <a:extLst>
+                        <a:ext uri="{28A0092B-C50C-407E-A947-70E740481C1C}">
+                          <a14:useLocalDpi xmlns:a14="http://schemas.microsoft.com/office/drawing/2010/main" val="0"/>
+                        </a:ext>
+                      </a:extLst>
+                    </a:blip>
+                    <a:stretch>
+                      <a:fillRect/>
+                    </a:stretch>
+                  </pic:blipFill>
+                  <pic:spPr>
+                    <a:xfrm>
+                      <a:off x="0" y="0"/>
+                      <a:ext cx="5731510" cy="1939925"/>
+                    </a:xfrm>
+                    <a:prstGeom prst="rect">
+                      <a:avLst/>
+                    </a:prstGeom>
+                  </pic:spPr>
+                </pic:pic>
+              </a:graphicData>
+            </a:graphic>
+          </wp:inline>
+        </w:drawing>
+      </w:r>
+    </w:p>
+    <w:p>
+      <w:r>
+        <w:t>A graph of temperature against resistance for the specified thermistor. Points are the edge values for the range 0-100</w:t>
+      </w:r>
+      <w:r>
+        <w:rPr>
+          <w:vertAlign w:val="superscript"/>
+        </w:rPr>
+        <w:t>o</w:t>
+      </w:r>
+      <w:r>
+        <w:t>C.</w:t>
       </w:r>
     </w:p>
     <w:p>
@@ -391,7 +678,193 @@
         <w:pStyle w:val="Heading1"/>
       </w:pPr>
       <w:r>
+        <w:rPr>
+          <w:noProof/>
+        </w:rPr>
+        <w:lastRenderedPageBreak/>
+        <w:drawing>
+          <wp:anchor distT="0" distB="0" distL="114300" distR="114300" simplePos="0" relativeHeight="251661312" behindDoc="0" locked="0" layoutInCell="1" allowOverlap="1" wp14:anchorId="39AEF56C" wp14:editId="6016761D">
+            <wp:simplePos x="0" y="0"/>
+            <wp:positionH relativeFrom="margin">
+              <wp:align>right</wp:align>
+            </wp:positionH>
+            <wp:positionV relativeFrom="paragraph">
+              <wp:posOffset>388620</wp:posOffset>
+            </wp:positionV>
+            <wp:extent cx="5730240" cy="3736340"/>
+            <wp:effectExtent l="0" t="0" r="0" b="0"/>
+            <wp:wrapSquare wrapText="bothSides"/>
+            <wp:docPr id="1728043272" name="Graphic 1"/>
+            <wp:cNvGraphicFramePr>
+              <a:graphicFrameLocks xmlns:a="http://schemas.openxmlformats.org/drawingml/2006/main" noChangeAspect="1"/>
+            </wp:cNvGraphicFramePr>
+            <a:graphic xmlns:a="http://schemas.openxmlformats.org/drawingml/2006/main">
+              <a:graphicData uri="http://schemas.openxmlformats.org/drawingml/2006/picture">
+                <pic:pic xmlns:pic="http://schemas.openxmlformats.org/drawingml/2006/picture">
+                  <pic:nvPicPr>
+                    <pic:cNvPr id="1728043272" name=""/>
+                    <pic:cNvPicPr/>
+                  </pic:nvPicPr>
+                  <pic:blipFill>
+                    <a:blip r:embed="rId17">
+                      <a:extLst>
+                        <a:ext uri="{96DAC541-7B7A-43D3-8B79-37D633B846F1}">
+                          <asvg:svgBlip xmlns:asvg="http://schemas.microsoft.com/office/drawing/2016/SVG/main" r:embed="rId18"/>
+                        </a:ext>
+                      </a:extLst>
+                    </a:blip>
+                    <a:stretch>
+                      <a:fillRect/>
+                    </a:stretch>
+                  </pic:blipFill>
+                  <pic:spPr>
+                    <a:xfrm>
+                      <a:off x="0" y="0"/>
+                      <a:ext cx="5730240" cy="3736340"/>
+                    </a:xfrm>
+                    <a:prstGeom prst="rect">
+                      <a:avLst/>
+                    </a:prstGeom>
+                  </pic:spPr>
+                </pic:pic>
+              </a:graphicData>
+            </a:graphic>
+            <wp14:sizeRelH relativeFrom="margin">
+              <wp14:pctWidth>0</wp14:pctWidth>
+            </wp14:sizeRelH>
+            <wp14:sizeRelV relativeFrom="margin">
+              <wp14:pctHeight>0</wp14:pctHeight>
+            </wp14:sizeRelV>
+          </wp:anchor>
+        </w:drawing>
+      </w:r>
+      <w:r>
         <w:t xml:space="preserve">4. Schematic Design </w:t>
+      </w:r>
+    </w:p>
+    <w:p>
+      <w:r>
+        <w:t>The schematic includes 3 primary elements as follows:</w:t>
+      </w:r>
+    </w:p>
+    <w:p>
+      <w:r>
+        <w:rPr>
+          <w:b/>
+          <w:bCs/>
+        </w:rPr>
+        <w:t>Voltage Divider</w:t>
+      </w:r>
+    </w:p>
+    <w:p>
+      <w:r>
+        <w:t xml:space="preserve">A simple voltage divider to find the voltage across the 10kOhm constant resistor against the variable resistance of the NTC thermistor. The </w:t>
+      </w:r>
+      <w:proofErr w:type="spellStart"/>
+      <w:r>
+        <w:t>V</w:t>
+      </w:r>
+      <w:r>
+        <w:rPr>
+          <w:vertAlign w:val="subscript"/>
+        </w:rPr>
+        <w:t>out</w:t>
+      </w:r>
+      <w:proofErr w:type="spellEnd"/>
+      <w:r>
+        <w:t xml:space="preserve"> from this goes to the input pin of the ADC to be converted into a digital signal.</w:t>
+      </w:r>
+    </w:p>
+    <w:p/>
+    <w:p>
+      <w:r>
+        <w:rPr>
+          <w:b/>
+          <w:bCs/>
+        </w:rPr>
+        <w:t>Analogue Digital Converter</w:t>
+      </w:r>
+    </w:p>
+    <w:p>
+      <w:r>
+        <w:t xml:space="preserve">The ADC takes input on only 1 pin of the voltage across the constant resistor and translates it into a </w:t>
+      </w:r>
+      <w:proofErr w:type="gramStart"/>
+      <w:r>
+        <w:t>12 bit</w:t>
+      </w:r>
+      <w:proofErr w:type="gramEnd"/>
+      <w:r>
+        <w:t xml:space="preserve"> signal. It is powered in parallel to the voltage divider from a 3.3V source, within </w:t>
+      </w:r>
+      <w:proofErr w:type="spellStart"/>
+      <w:proofErr w:type="gramStart"/>
+      <w:r>
+        <w:t>it’s</w:t>
+      </w:r>
+      <w:proofErr w:type="spellEnd"/>
+      <w:proofErr w:type="gramEnd"/>
+      <w:r>
+        <w:t xml:space="preserve"> operating range, with the recommended capacitors from the datasheet in place performing power bypassing to ensure any noise from the power source does not interfere.</w:t>
+      </w:r>
+    </w:p>
+    <w:p>
+      <w:r>
+        <w:t xml:space="preserve">The chip </w:t>
+      </w:r>
+      <w:proofErr w:type="gramStart"/>
+      <w:r>
+        <w:t>select</w:t>
+      </w:r>
+      <w:proofErr w:type="gramEnd"/>
+      <w:r>
+        <w:t xml:space="preserve">, clock and data output and input pins are all connected to the microcontroller to the correct GPIO pins as specified in framework.cpp from the template code and the microcontrollers datasheet. This ensures that it stays in sync and can be called to with the </w:t>
+      </w:r>
+      <w:proofErr w:type="spellStart"/>
+      <w:r>
+        <w:t>read_</w:t>
+      </w:r>
+      <w:proofErr w:type="gramStart"/>
+      <w:r>
+        <w:t>adc</w:t>
+      </w:r>
+      <w:proofErr w:type="spellEnd"/>
+      <w:r>
+        <w:t>(</w:t>
+      </w:r>
+      <w:proofErr w:type="gramEnd"/>
+      <w:r>
+        <w:t>) function.</w:t>
+      </w:r>
+    </w:p>
+    <w:p/>
+    <w:p/>
+    <w:p>
+      <w:r>
+        <w:rPr>
+          <w:b/>
+          <w:bCs/>
+        </w:rPr>
+        <w:lastRenderedPageBreak/>
+        <w:t>Microcontroller</w:t>
+      </w:r>
+    </w:p>
+    <w:p>
+      <w:r>
+        <w:t>Powered by a separate 3.3</w:t>
+      </w:r>
+      <w:r>
+        <w:t>V power source, also using capacitors to reduce noise from the source, and with a 10kOhm pull up resistor to provide a high signal to the EN pin so that it turns on properly.</w:t>
+      </w:r>
+    </w:p>
+    <w:p>
+      <w:pPr>
+        <w:rPr>
+          <w:vertAlign w:val="subscript"/>
+        </w:rPr>
+      </w:pPr>
+      <w:r>
+        <w:t>As stated in the brief, the microcontroller is already integrated into the CAN node with a CAN interface, so in order to keep the schematic clear I have not detailed this.</w:t>
       </w:r>
     </w:p>
     <w:p>
@@ -424,6 +897,3731 @@
       </w:r>
     </w:p>
     <w:p>
+      <w:r>
+        <w:t>ADC Task:</w:t>
+      </w:r>
+    </w:p>
+    <w:p>
+      <w:pPr>
+        <w:shd w:val="clear" w:color="auto" w:fill="002451"/>
+        <w:spacing w:after="0" w:line="285" w:lineRule="atLeast"/>
+        <w:rPr>
+          <w:rFonts w:ascii="Consolas" w:eastAsia="Times New Roman" w:hAnsi="Consolas" w:cs="Times New Roman"/>
+          <w:color w:val="FFFFFF"/>
+          <w:sz w:val="21"/>
+          <w:szCs w:val="21"/>
+        </w:rPr>
+      </w:pPr>
+      <w:r>
+        <w:rPr>
+          <w:rFonts w:ascii="Consolas" w:eastAsia="Times New Roman" w:hAnsi="Consolas" w:cs="Times New Roman"/>
+          <w:color w:val="EBBBFF"/>
+          <w:sz w:val="21"/>
+          <w:szCs w:val="21"/>
+        </w:rPr>
+        <w:t>#include</w:t>
+      </w:r>
+      <w:r>
+        <w:rPr>
+          <w:rFonts w:ascii="Consolas" w:eastAsia="Times New Roman" w:hAnsi="Consolas" w:cs="Times New Roman"/>
+          <w:color w:val="FFFFFF"/>
+          <w:sz w:val="21"/>
+          <w:szCs w:val="21"/>
+        </w:rPr>
+        <w:t xml:space="preserve"> </w:t>
+      </w:r>
+      <w:r>
+        <w:rPr>
+          <w:rFonts w:ascii="Consolas" w:eastAsia="Times New Roman" w:hAnsi="Consolas" w:cs="Times New Roman"/>
+          <w:color w:val="D1F1A9"/>
+          <w:sz w:val="21"/>
+          <w:szCs w:val="21"/>
+        </w:rPr>
+        <w:t>"</w:t>
+      </w:r>
+      <w:proofErr w:type="spellStart"/>
+      <w:r>
+        <w:rPr>
+          <w:rFonts w:ascii="Consolas" w:eastAsia="Times New Roman" w:hAnsi="Consolas" w:cs="Times New Roman"/>
+          <w:color w:val="D1F1A9"/>
+          <w:sz w:val="21"/>
+          <w:szCs w:val="21"/>
+        </w:rPr>
+        <w:t>challenge.h</w:t>
+      </w:r>
+      <w:proofErr w:type="spellEnd"/>
+      <w:r>
+        <w:rPr>
+          <w:rFonts w:ascii="Consolas" w:eastAsia="Times New Roman" w:hAnsi="Consolas" w:cs="Times New Roman"/>
+          <w:color w:val="D1F1A9"/>
+          <w:sz w:val="21"/>
+          <w:szCs w:val="21"/>
+        </w:rPr>
+        <w:t>"</w:t>
+      </w:r>
+    </w:p>
+    <w:p>
+      <w:pPr>
+        <w:shd w:val="clear" w:color="auto" w:fill="002451"/>
+        <w:spacing w:after="0" w:line="285" w:lineRule="atLeast"/>
+        <w:rPr>
+          <w:rFonts w:ascii="Consolas" w:eastAsia="Times New Roman" w:hAnsi="Consolas" w:cs="Times New Roman"/>
+          <w:color w:val="FFFFFF"/>
+          <w:sz w:val="21"/>
+          <w:szCs w:val="21"/>
+        </w:rPr>
+      </w:pPr>
+      <w:r>
+        <w:rPr>
+          <w:rFonts w:ascii="Consolas" w:eastAsia="Times New Roman" w:hAnsi="Consolas" w:cs="Times New Roman"/>
+          <w:color w:val="EBBBFF"/>
+          <w:sz w:val="21"/>
+          <w:szCs w:val="21"/>
+        </w:rPr>
+        <w:t>#include</w:t>
+      </w:r>
+      <w:r>
+        <w:rPr>
+          <w:rFonts w:ascii="Consolas" w:eastAsia="Times New Roman" w:hAnsi="Consolas" w:cs="Times New Roman"/>
+          <w:color w:val="FFFFFF"/>
+          <w:sz w:val="21"/>
+          <w:szCs w:val="21"/>
+        </w:rPr>
+        <w:t xml:space="preserve"> </w:t>
+      </w:r>
+      <w:r>
+        <w:rPr>
+          <w:rFonts w:ascii="Consolas" w:eastAsia="Times New Roman" w:hAnsi="Consolas" w:cs="Times New Roman"/>
+          <w:color w:val="D1F1A9"/>
+          <w:sz w:val="21"/>
+          <w:szCs w:val="21"/>
+        </w:rPr>
+        <w:t>&lt;</w:t>
+      </w:r>
+      <w:proofErr w:type="spellStart"/>
+      <w:r>
+        <w:rPr>
+          <w:rFonts w:ascii="Consolas" w:eastAsia="Times New Roman" w:hAnsi="Consolas" w:cs="Times New Roman"/>
+          <w:color w:val="D1F1A9"/>
+          <w:sz w:val="21"/>
+          <w:szCs w:val="21"/>
+        </w:rPr>
+        <w:t>cmath</w:t>
+      </w:r>
+      <w:proofErr w:type="spellEnd"/>
+      <w:r>
+        <w:rPr>
+          <w:rFonts w:ascii="Consolas" w:eastAsia="Times New Roman" w:hAnsi="Consolas" w:cs="Times New Roman"/>
+          <w:color w:val="D1F1A9"/>
+          <w:sz w:val="21"/>
+          <w:szCs w:val="21"/>
+        </w:rPr>
+        <w:t>&gt;</w:t>
+      </w:r>
+    </w:p>
+    <w:p>
+      <w:pPr>
+        <w:shd w:val="clear" w:color="auto" w:fill="002451"/>
+        <w:spacing w:after="0" w:line="285" w:lineRule="atLeast"/>
+        <w:rPr>
+          <w:rFonts w:ascii="Consolas" w:eastAsia="Times New Roman" w:hAnsi="Consolas" w:cs="Times New Roman"/>
+          <w:color w:val="FFFFFF"/>
+          <w:sz w:val="21"/>
+          <w:szCs w:val="21"/>
+        </w:rPr>
+      </w:pPr>
+    </w:p>
+    <w:p>
+      <w:pPr>
+        <w:shd w:val="clear" w:color="auto" w:fill="002451"/>
+        <w:spacing w:after="0" w:line="285" w:lineRule="atLeast"/>
+        <w:rPr>
+          <w:rFonts w:ascii="Consolas" w:eastAsia="Times New Roman" w:hAnsi="Consolas" w:cs="Times New Roman"/>
+          <w:color w:val="FFFFFF"/>
+          <w:sz w:val="21"/>
+          <w:szCs w:val="21"/>
+        </w:rPr>
+      </w:pPr>
+      <w:r>
+        <w:rPr>
+          <w:rFonts w:ascii="Consolas" w:eastAsia="Times New Roman" w:hAnsi="Consolas" w:cs="Times New Roman"/>
+          <w:color w:val="7285B7"/>
+          <w:sz w:val="21"/>
+          <w:szCs w:val="21"/>
+        </w:rPr>
+        <w:t xml:space="preserve">// Runs once a second. </w:t>
+      </w:r>
+      <w:proofErr w:type="spellStart"/>
+      <w:r>
+        <w:rPr>
+          <w:rFonts w:ascii="Consolas" w:eastAsia="Times New Roman" w:hAnsi="Consolas" w:cs="Times New Roman"/>
+          <w:color w:val="7285B7"/>
+          <w:sz w:val="21"/>
+          <w:szCs w:val="21"/>
+        </w:rPr>
+        <w:t>read_</w:t>
+      </w:r>
+      <w:proofErr w:type="gramStart"/>
+      <w:r>
+        <w:rPr>
+          <w:rFonts w:ascii="Consolas" w:eastAsia="Times New Roman" w:hAnsi="Consolas" w:cs="Times New Roman"/>
+          <w:color w:val="7285B7"/>
+          <w:sz w:val="21"/>
+          <w:szCs w:val="21"/>
+        </w:rPr>
+        <w:t>adc</w:t>
+      </w:r>
+      <w:proofErr w:type="spellEnd"/>
+      <w:r>
+        <w:rPr>
+          <w:rFonts w:ascii="Consolas" w:eastAsia="Times New Roman" w:hAnsi="Consolas" w:cs="Times New Roman"/>
+          <w:color w:val="7285B7"/>
+          <w:sz w:val="21"/>
+          <w:szCs w:val="21"/>
+        </w:rPr>
+        <w:t>(</w:t>
+      </w:r>
+      <w:proofErr w:type="gramEnd"/>
+      <w:r>
+        <w:rPr>
+          <w:rFonts w:ascii="Consolas" w:eastAsia="Times New Roman" w:hAnsi="Consolas" w:cs="Times New Roman"/>
+          <w:color w:val="7285B7"/>
+          <w:sz w:val="21"/>
+          <w:szCs w:val="21"/>
+        </w:rPr>
+        <w:t>) gives you a number from 0 to 4095.</w:t>
+      </w:r>
+    </w:p>
+    <w:p>
+      <w:pPr>
+        <w:shd w:val="clear" w:color="auto" w:fill="002451"/>
+        <w:spacing w:after="0" w:line="285" w:lineRule="atLeast"/>
+        <w:rPr>
+          <w:rFonts w:ascii="Consolas" w:eastAsia="Times New Roman" w:hAnsi="Consolas" w:cs="Times New Roman"/>
+          <w:color w:val="FFFFFF"/>
+          <w:sz w:val="21"/>
+          <w:szCs w:val="21"/>
+        </w:rPr>
+      </w:pPr>
+      <w:r>
+        <w:rPr>
+          <w:rFonts w:ascii="Consolas" w:eastAsia="Times New Roman" w:hAnsi="Consolas" w:cs="Times New Roman"/>
+          <w:color w:val="EBBBFF"/>
+          <w:sz w:val="21"/>
+          <w:szCs w:val="21"/>
+        </w:rPr>
+        <w:t>bool</w:t>
+      </w:r>
+      <w:r>
+        <w:rPr>
+          <w:rFonts w:ascii="Consolas" w:eastAsia="Times New Roman" w:hAnsi="Consolas" w:cs="Times New Roman"/>
+          <w:color w:val="FFFFFF"/>
+          <w:sz w:val="21"/>
+          <w:szCs w:val="21"/>
+        </w:rPr>
+        <w:t xml:space="preserve"> </w:t>
+      </w:r>
+      <w:proofErr w:type="spellStart"/>
+      <w:r>
+        <w:rPr>
+          <w:rFonts w:ascii="Consolas" w:eastAsia="Times New Roman" w:hAnsi="Consolas" w:cs="Times New Roman"/>
+          <w:color w:val="BBDAFF"/>
+          <w:sz w:val="21"/>
+          <w:szCs w:val="21"/>
+        </w:rPr>
+        <w:t>adc_</w:t>
+      </w:r>
+      <w:proofErr w:type="gramStart"/>
+      <w:r>
+        <w:rPr>
+          <w:rFonts w:ascii="Consolas" w:eastAsia="Times New Roman" w:hAnsi="Consolas" w:cs="Times New Roman"/>
+          <w:color w:val="BBDAFF"/>
+          <w:sz w:val="21"/>
+          <w:szCs w:val="21"/>
+        </w:rPr>
+        <w:t>read</w:t>
+      </w:r>
+      <w:proofErr w:type="spellEnd"/>
+      <w:r>
+        <w:rPr>
+          <w:rFonts w:ascii="Consolas" w:eastAsia="Times New Roman" w:hAnsi="Consolas" w:cs="Times New Roman"/>
+          <w:color w:val="FFFFFF"/>
+          <w:sz w:val="21"/>
+          <w:szCs w:val="21"/>
+        </w:rPr>
+        <w:t>(</w:t>
+      </w:r>
+      <w:proofErr w:type="gramEnd"/>
+      <w:r>
+        <w:rPr>
+          <w:rFonts w:ascii="Consolas" w:eastAsia="Times New Roman" w:hAnsi="Consolas" w:cs="Times New Roman"/>
+          <w:color w:val="EBBBFF"/>
+          <w:sz w:val="21"/>
+          <w:szCs w:val="21"/>
+        </w:rPr>
+        <w:t>float</w:t>
+      </w:r>
+      <w:r>
+        <w:rPr>
+          <w:rFonts w:ascii="Consolas" w:eastAsia="Times New Roman" w:hAnsi="Consolas" w:cs="Times New Roman"/>
+          <w:color w:val="FFFFFF"/>
+          <w:sz w:val="21"/>
+          <w:szCs w:val="21"/>
+        </w:rPr>
+        <w:t xml:space="preserve"> </w:t>
+      </w:r>
+      <w:r>
+        <w:rPr>
+          <w:rFonts w:ascii="Consolas" w:eastAsia="Times New Roman" w:hAnsi="Consolas" w:cs="Times New Roman"/>
+          <w:color w:val="EBBBFF"/>
+          <w:sz w:val="21"/>
+          <w:szCs w:val="21"/>
+        </w:rPr>
+        <w:t>&amp;</w:t>
+      </w:r>
+      <w:proofErr w:type="spellStart"/>
+      <w:r>
+        <w:rPr>
+          <w:rFonts w:ascii="Consolas" w:eastAsia="Times New Roman" w:hAnsi="Consolas" w:cs="Times New Roman"/>
+          <w:color w:val="FFC58F"/>
+          <w:sz w:val="21"/>
+          <w:szCs w:val="21"/>
+        </w:rPr>
+        <w:t>temperature_c</w:t>
+      </w:r>
+      <w:proofErr w:type="spellEnd"/>
+      <w:r>
+        <w:rPr>
+          <w:rFonts w:ascii="Consolas" w:eastAsia="Times New Roman" w:hAnsi="Consolas" w:cs="Times New Roman"/>
+          <w:color w:val="FFFFFF"/>
+          <w:sz w:val="21"/>
+          <w:szCs w:val="21"/>
+        </w:rPr>
+        <w:t>)</w:t>
+      </w:r>
+    </w:p>
+    <w:p>
+      <w:pPr>
+        <w:shd w:val="clear" w:color="auto" w:fill="002451"/>
+        <w:spacing w:after="0" w:line="285" w:lineRule="atLeast"/>
+        <w:rPr>
+          <w:rFonts w:ascii="Consolas" w:eastAsia="Times New Roman" w:hAnsi="Consolas" w:cs="Times New Roman"/>
+          <w:color w:val="FFFFFF"/>
+          <w:sz w:val="21"/>
+          <w:szCs w:val="21"/>
+        </w:rPr>
+      </w:pPr>
+      <w:r>
+        <w:rPr>
+          <w:rFonts w:ascii="Consolas" w:eastAsia="Times New Roman" w:hAnsi="Consolas" w:cs="Times New Roman"/>
+          <w:color w:val="FFFFFF"/>
+          <w:sz w:val="21"/>
+          <w:szCs w:val="21"/>
+        </w:rPr>
+        <w:t>{</w:t>
+      </w:r>
+    </w:p>
+    <w:p>
+      <w:pPr>
+        <w:shd w:val="clear" w:color="auto" w:fill="002451"/>
+        <w:spacing w:after="0" w:line="285" w:lineRule="atLeast"/>
+        <w:rPr>
+          <w:rFonts w:ascii="Consolas" w:eastAsia="Times New Roman" w:hAnsi="Consolas" w:cs="Times New Roman"/>
+          <w:color w:val="FFFFFF"/>
+          <w:sz w:val="21"/>
+          <w:szCs w:val="21"/>
+        </w:rPr>
+      </w:pPr>
+      <w:r>
+        <w:rPr>
+          <w:rFonts w:ascii="Consolas" w:eastAsia="Times New Roman" w:hAnsi="Consolas" w:cs="Times New Roman"/>
+          <w:color w:val="FFFFFF"/>
+          <w:sz w:val="21"/>
+          <w:szCs w:val="21"/>
+        </w:rPr>
+        <w:t xml:space="preserve">    </w:t>
+      </w:r>
+      <w:proofErr w:type="spellStart"/>
+      <w:r>
+        <w:rPr>
+          <w:rFonts w:ascii="Consolas" w:eastAsia="Times New Roman" w:hAnsi="Consolas" w:cs="Times New Roman"/>
+          <w:color w:val="EBBBFF"/>
+          <w:sz w:val="21"/>
+          <w:szCs w:val="21"/>
+        </w:rPr>
+        <w:t>const</w:t>
+      </w:r>
+      <w:proofErr w:type="spellEnd"/>
+      <w:r>
+        <w:rPr>
+          <w:rFonts w:ascii="Consolas" w:eastAsia="Times New Roman" w:hAnsi="Consolas" w:cs="Times New Roman"/>
+          <w:color w:val="FFFFFF"/>
+          <w:sz w:val="21"/>
+          <w:szCs w:val="21"/>
+        </w:rPr>
+        <w:t xml:space="preserve"> </w:t>
+      </w:r>
+      <w:r>
+        <w:rPr>
+          <w:rFonts w:ascii="Consolas" w:eastAsia="Times New Roman" w:hAnsi="Consolas" w:cs="Times New Roman"/>
+          <w:color w:val="EBBBFF"/>
+          <w:sz w:val="21"/>
+          <w:szCs w:val="21"/>
+        </w:rPr>
+        <w:t>float</w:t>
+      </w:r>
+      <w:r>
+        <w:rPr>
+          <w:rFonts w:ascii="Consolas" w:eastAsia="Times New Roman" w:hAnsi="Consolas" w:cs="Times New Roman"/>
+          <w:color w:val="FFFFFF"/>
+          <w:sz w:val="21"/>
+          <w:szCs w:val="21"/>
+        </w:rPr>
+        <w:t xml:space="preserve"> </w:t>
+      </w:r>
+      <w:proofErr w:type="spellStart"/>
+      <w:r>
+        <w:rPr>
+          <w:rFonts w:ascii="Consolas" w:eastAsia="Times New Roman" w:hAnsi="Consolas" w:cs="Times New Roman"/>
+          <w:color w:val="FF9DA4"/>
+          <w:sz w:val="21"/>
+          <w:szCs w:val="21"/>
+        </w:rPr>
+        <w:t>raw_adc</w:t>
+      </w:r>
+      <w:proofErr w:type="spellEnd"/>
+      <w:r>
+        <w:rPr>
+          <w:rFonts w:ascii="Consolas" w:eastAsia="Times New Roman" w:hAnsi="Consolas" w:cs="Times New Roman"/>
+          <w:color w:val="FFFFFF"/>
+          <w:sz w:val="21"/>
+          <w:szCs w:val="21"/>
+        </w:rPr>
+        <w:t xml:space="preserve"> </w:t>
+      </w:r>
+      <w:r>
+        <w:rPr>
+          <w:rFonts w:ascii="Consolas" w:eastAsia="Times New Roman" w:hAnsi="Consolas" w:cs="Times New Roman"/>
+          <w:color w:val="99FFFF"/>
+          <w:sz w:val="21"/>
+          <w:szCs w:val="21"/>
+        </w:rPr>
+        <w:t>=</w:t>
+      </w:r>
+      <w:r>
+        <w:rPr>
+          <w:rFonts w:ascii="Consolas" w:eastAsia="Times New Roman" w:hAnsi="Consolas" w:cs="Times New Roman"/>
+          <w:color w:val="FFFFFF"/>
+          <w:sz w:val="21"/>
+          <w:szCs w:val="21"/>
+        </w:rPr>
+        <w:t xml:space="preserve"> </w:t>
+      </w:r>
+      <w:proofErr w:type="spellStart"/>
+      <w:r>
+        <w:rPr>
+          <w:rFonts w:ascii="Consolas" w:eastAsia="Times New Roman" w:hAnsi="Consolas" w:cs="Times New Roman"/>
+          <w:color w:val="BBDAFF"/>
+          <w:sz w:val="21"/>
+          <w:szCs w:val="21"/>
+        </w:rPr>
+        <w:t>read_</w:t>
+      </w:r>
+      <w:proofErr w:type="gramStart"/>
+      <w:r>
+        <w:rPr>
+          <w:rFonts w:ascii="Consolas" w:eastAsia="Times New Roman" w:hAnsi="Consolas" w:cs="Times New Roman"/>
+          <w:color w:val="BBDAFF"/>
+          <w:sz w:val="21"/>
+          <w:szCs w:val="21"/>
+        </w:rPr>
+        <w:t>adc</w:t>
+      </w:r>
+      <w:proofErr w:type="spellEnd"/>
+      <w:r>
+        <w:rPr>
+          <w:rFonts w:ascii="Consolas" w:eastAsia="Times New Roman" w:hAnsi="Consolas" w:cs="Times New Roman"/>
+          <w:color w:val="FFFFFF"/>
+          <w:sz w:val="21"/>
+          <w:szCs w:val="21"/>
+        </w:rPr>
+        <w:t>(</w:t>
+      </w:r>
+      <w:proofErr w:type="gramEnd"/>
+      <w:r>
+        <w:rPr>
+          <w:rFonts w:ascii="Consolas" w:eastAsia="Times New Roman" w:hAnsi="Consolas" w:cs="Times New Roman"/>
+          <w:color w:val="FFFFFF"/>
+          <w:sz w:val="21"/>
+          <w:szCs w:val="21"/>
+        </w:rPr>
+        <w:t>);</w:t>
+      </w:r>
+    </w:p>
+    <w:p>
+      <w:pPr>
+        <w:shd w:val="clear" w:color="auto" w:fill="002451"/>
+        <w:spacing w:after="0" w:line="285" w:lineRule="atLeast"/>
+        <w:rPr>
+          <w:rFonts w:ascii="Consolas" w:eastAsia="Times New Roman" w:hAnsi="Consolas" w:cs="Times New Roman"/>
+          <w:color w:val="FFFFFF"/>
+          <w:sz w:val="21"/>
+          <w:szCs w:val="21"/>
+        </w:rPr>
+      </w:pPr>
+      <w:r>
+        <w:rPr>
+          <w:rFonts w:ascii="Consolas" w:eastAsia="Times New Roman" w:hAnsi="Consolas" w:cs="Times New Roman"/>
+          <w:color w:val="FFFFFF"/>
+          <w:sz w:val="21"/>
+          <w:szCs w:val="21"/>
+        </w:rPr>
+        <w:t xml:space="preserve">    </w:t>
+      </w:r>
+      <w:r>
+        <w:rPr>
+          <w:rFonts w:ascii="Consolas" w:eastAsia="Times New Roman" w:hAnsi="Consolas" w:cs="Times New Roman"/>
+          <w:color w:val="EBBBFF"/>
+          <w:sz w:val="21"/>
+          <w:szCs w:val="21"/>
+        </w:rPr>
+        <w:t>if</w:t>
+      </w:r>
+      <w:r>
+        <w:rPr>
+          <w:rFonts w:ascii="Consolas" w:eastAsia="Times New Roman" w:hAnsi="Consolas" w:cs="Times New Roman"/>
+          <w:color w:val="FFFFFF"/>
+          <w:sz w:val="21"/>
+          <w:szCs w:val="21"/>
+        </w:rPr>
+        <w:t xml:space="preserve"> </w:t>
+      </w:r>
+      <w:proofErr w:type="gramStart"/>
+      <w:r>
+        <w:rPr>
+          <w:rFonts w:ascii="Consolas" w:eastAsia="Times New Roman" w:hAnsi="Consolas" w:cs="Times New Roman"/>
+          <w:color w:val="FFFFFF"/>
+          <w:sz w:val="21"/>
+          <w:szCs w:val="21"/>
+        </w:rPr>
+        <w:t>(</w:t>
+      </w:r>
+      <w:r>
+        <w:rPr>
+          <w:rFonts w:ascii="Consolas" w:eastAsia="Times New Roman" w:hAnsi="Consolas" w:cs="Times New Roman"/>
+          <w:color w:val="99FFFF"/>
+          <w:sz w:val="21"/>
+          <w:szCs w:val="21"/>
+        </w:rPr>
+        <w:t>!</w:t>
+      </w:r>
+      <w:r>
+        <w:rPr>
+          <w:rFonts w:ascii="Consolas" w:eastAsia="Times New Roman" w:hAnsi="Consolas" w:cs="Times New Roman"/>
+          <w:color w:val="FFEEAD"/>
+          <w:sz w:val="21"/>
+          <w:szCs w:val="21"/>
+        </w:rPr>
+        <w:t>std</w:t>
+      </w:r>
+      <w:r>
+        <w:rPr>
+          <w:rFonts w:ascii="Consolas" w:eastAsia="Times New Roman" w:hAnsi="Consolas" w:cs="Times New Roman"/>
+          <w:color w:val="FFFFFF"/>
+          <w:sz w:val="21"/>
+          <w:szCs w:val="21"/>
+        </w:rPr>
+        <w:t>::</w:t>
+      </w:r>
+      <w:proofErr w:type="spellStart"/>
+      <w:proofErr w:type="gramEnd"/>
+      <w:r>
+        <w:rPr>
+          <w:rFonts w:ascii="Consolas" w:eastAsia="Times New Roman" w:hAnsi="Consolas" w:cs="Times New Roman"/>
+          <w:color w:val="BBDAFF"/>
+          <w:sz w:val="21"/>
+          <w:szCs w:val="21"/>
+        </w:rPr>
+        <w:t>isfinite</w:t>
+      </w:r>
+      <w:proofErr w:type="spellEnd"/>
+      <w:r>
+        <w:rPr>
+          <w:rFonts w:ascii="Consolas" w:eastAsia="Times New Roman" w:hAnsi="Consolas" w:cs="Times New Roman"/>
+          <w:color w:val="FFFFFF"/>
+          <w:sz w:val="21"/>
+          <w:szCs w:val="21"/>
+        </w:rPr>
+        <w:t>(</w:t>
+      </w:r>
+      <w:proofErr w:type="spellStart"/>
+      <w:r>
+        <w:rPr>
+          <w:rFonts w:ascii="Consolas" w:eastAsia="Times New Roman" w:hAnsi="Consolas" w:cs="Times New Roman"/>
+          <w:color w:val="FF9DA4"/>
+          <w:sz w:val="21"/>
+          <w:szCs w:val="21"/>
+        </w:rPr>
+        <w:t>raw_adc</w:t>
+      </w:r>
+      <w:proofErr w:type="spellEnd"/>
+      <w:r>
+        <w:rPr>
+          <w:rFonts w:ascii="Consolas" w:eastAsia="Times New Roman" w:hAnsi="Consolas" w:cs="Times New Roman"/>
+          <w:color w:val="FFFFFF"/>
+          <w:sz w:val="21"/>
+          <w:szCs w:val="21"/>
+        </w:rPr>
+        <w:t xml:space="preserve">)) </w:t>
+      </w:r>
+      <w:r>
+        <w:rPr>
+          <w:rFonts w:ascii="Consolas" w:eastAsia="Times New Roman" w:hAnsi="Consolas" w:cs="Times New Roman"/>
+          <w:color w:val="EBBBFF"/>
+          <w:sz w:val="21"/>
+          <w:szCs w:val="21"/>
+        </w:rPr>
+        <w:t>return</w:t>
+      </w:r>
+      <w:r>
+        <w:rPr>
+          <w:rFonts w:ascii="Consolas" w:eastAsia="Times New Roman" w:hAnsi="Consolas" w:cs="Times New Roman"/>
+          <w:color w:val="FFFFFF"/>
+          <w:sz w:val="21"/>
+          <w:szCs w:val="21"/>
+        </w:rPr>
+        <w:t xml:space="preserve"> </w:t>
+      </w:r>
+      <w:r>
+        <w:rPr>
+          <w:rFonts w:ascii="Consolas" w:eastAsia="Times New Roman" w:hAnsi="Consolas" w:cs="Times New Roman"/>
+          <w:color w:val="FFC58F"/>
+          <w:sz w:val="21"/>
+          <w:szCs w:val="21"/>
+        </w:rPr>
+        <w:t>false</w:t>
+      </w:r>
+      <w:r>
+        <w:rPr>
+          <w:rFonts w:ascii="Consolas" w:eastAsia="Times New Roman" w:hAnsi="Consolas" w:cs="Times New Roman"/>
+          <w:color w:val="FFFFFF"/>
+          <w:sz w:val="21"/>
+          <w:szCs w:val="21"/>
+        </w:rPr>
+        <w:t>;</w:t>
+      </w:r>
+    </w:p>
+    <w:p>
+      <w:pPr>
+        <w:shd w:val="clear" w:color="auto" w:fill="002451"/>
+        <w:spacing w:after="0" w:line="285" w:lineRule="atLeast"/>
+        <w:rPr>
+          <w:rFonts w:ascii="Consolas" w:eastAsia="Times New Roman" w:hAnsi="Consolas" w:cs="Times New Roman"/>
+          <w:color w:val="FFFFFF"/>
+          <w:sz w:val="21"/>
+          <w:szCs w:val="21"/>
+        </w:rPr>
+      </w:pPr>
+      <w:r>
+        <w:rPr>
+          <w:rFonts w:ascii="Consolas" w:eastAsia="Times New Roman" w:hAnsi="Consolas" w:cs="Times New Roman"/>
+          <w:color w:val="FFFFFF"/>
+          <w:sz w:val="21"/>
+          <w:szCs w:val="21"/>
+        </w:rPr>
+        <w:t xml:space="preserve">    </w:t>
+      </w:r>
+      <w:proofErr w:type="spellStart"/>
+      <w:r>
+        <w:rPr>
+          <w:rFonts w:ascii="Consolas" w:eastAsia="Times New Roman" w:hAnsi="Consolas" w:cs="Times New Roman"/>
+          <w:color w:val="FFC58F"/>
+          <w:sz w:val="21"/>
+          <w:szCs w:val="21"/>
+        </w:rPr>
+        <w:t>temperature_c</w:t>
+      </w:r>
+      <w:proofErr w:type="spellEnd"/>
+      <w:r>
+        <w:rPr>
+          <w:rFonts w:ascii="Consolas" w:eastAsia="Times New Roman" w:hAnsi="Consolas" w:cs="Times New Roman"/>
+          <w:color w:val="FFFFFF"/>
+          <w:sz w:val="21"/>
+          <w:szCs w:val="21"/>
+        </w:rPr>
+        <w:t xml:space="preserve"> </w:t>
+      </w:r>
+      <w:r>
+        <w:rPr>
+          <w:rFonts w:ascii="Consolas" w:eastAsia="Times New Roman" w:hAnsi="Consolas" w:cs="Times New Roman"/>
+          <w:color w:val="99FFFF"/>
+          <w:sz w:val="21"/>
+          <w:szCs w:val="21"/>
+        </w:rPr>
+        <w:t>=</w:t>
+      </w:r>
+      <w:r>
+        <w:rPr>
+          <w:rFonts w:ascii="Consolas" w:eastAsia="Times New Roman" w:hAnsi="Consolas" w:cs="Times New Roman"/>
+          <w:color w:val="FFFFFF"/>
+          <w:sz w:val="21"/>
+          <w:szCs w:val="21"/>
+        </w:rPr>
+        <w:t xml:space="preserve"> </w:t>
+      </w:r>
+      <w:r>
+        <w:rPr>
+          <w:rFonts w:ascii="Consolas" w:eastAsia="Times New Roman" w:hAnsi="Consolas" w:cs="Times New Roman"/>
+          <w:color w:val="BBDAFF"/>
+          <w:sz w:val="21"/>
+          <w:szCs w:val="21"/>
+        </w:rPr>
+        <w:t>NAN</w:t>
+      </w:r>
+      <w:r>
+        <w:rPr>
+          <w:rFonts w:ascii="Consolas" w:eastAsia="Times New Roman" w:hAnsi="Consolas" w:cs="Times New Roman"/>
+          <w:color w:val="FFFFFF"/>
+          <w:sz w:val="21"/>
+          <w:szCs w:val="21"/>
+        </w:rPr>
+        <w:t>;</w:t>
+      </w:r>
+    </w:p>
+    <w:p>
+      <w:pPr>
+        <w:shd w:val="clear" w:color="auto" w:fill="002451"/>
+        <w:spacing w:after="0" w:line="285" w:lineRule="atLeast"/>
+        <w:rPr>
+          <w:rFonts w:ascii="Consolas" w:eastAsia="Times New Roman" w:hAnsi="Consolas" w:cs="Times New Roman"/>
+          <w:color w:val="FFFFFF"/>
+          <w:sz w:val="21"/>
+          <w:szCs w:val="21"/>
+        </w:rPr>
+      </w:pPr>
+    </w:p>
+    <w:p>
+      <w:pPr>
+        <w:shd w:val="clear" w:color="auto" w:fill="002451"/>
+        <w:spacing w:after="0" w:line="285" w:lineRule="atLeast"/>
+        <w:rPr>
+          <w:rFonts w:ascii="Consolas" w:eastAsia="Times New Roman" w:hAnsi="Consolas" w:cs="Times New Roman"/>
+          <w:color w:val="FFFFFF"/>
+          <w:sz w:val="21"/>
+          <w:szCs w:val="21"/>
+        </w:rPr>
+      </w:pPr>
+      <w:r>
+        <w:rPr>
+          <w:rFonts w:ascii="Consolas" w:eastAsia="Times New Roman" w:hAnsi="Consolas" w:cs="Times New Roman"/>
+          <w:color w:val="7285B7"/>
+          <w:sz w:val="21"/>
+          <w:szCs w:val="21"/>
+        </w:rPr>
+        <w:t>    //Circuit &amp; Thermistor Constants</w:t>
+      </w:r>
+    </w:p>
+    <w:p>
+      <w:pPr>
+        <w:shd w:val="clear" w:color="auto" w:fill="002451"/>
+        <w:spacing w:after="0" w:line="285" w:lineRule="atLeast"/>
+        <w:rPr>
+          <w:rFonts w:ascii="Consolas" w:eastAsia="Times New Roman" w:hAnsi="Consolas" w:cs="Times New Roman"/>
+          <w:color w:val="FFFFFF"/>
+          <w:sz w:val="21"/>
+          <w:szCs w:val="21"/>
+        </w:rPr>
+      </w:pPr>
+      <w:r>
+        <w:rPr>
+          <w:rFonts w:ascii="Consolas" w:eastAsia="Times New Roman" w:hAnsi="Consolas" w:cs="Times New Roman"/>
+          <w:color w:val="7285B7"/>
+          <w:sz w:val="21"/>
+          <w:szCs w:val="21"/>
+        </w:rPr>
+        <w:t>    //</w:t>
+      </w:r>
+      <w:proofErr w:type="spellStart"/>
+      <w:r>
+        <w:rPr>
+          <w:rFonts w:ascii="Consolas" w:eastAsia="Times New Roman" w:hAnsi="Consolas" w:cs="Times New Roman"/>
+          <w:color w:val="7285B7"/>
+          <w:sz w:val="21"/>
+          <w:szCs w:val="21"/>
+        </w:rPr>
+        <w:t>RCon</w:t>
+      </w:r>
+      <w:proofErr w:type="spellEnd"/>
+      <w:r>
+        <w:rPr>
+          <w:rFonts w:ascii="Consolas" w:eastAsia="Times New Roman" w:hAnsi="Consolas" w:cs="Times New Roman"/>
+          <w:color w:val="7285B7"/>
+          <w:sz w:val="21"/>
+          <w:szCs w:val="21"/>
+        </w:rPr>
+        <w:t xml:space="preserve"> - Resistance of constant resistance comparator resistor in the voltage divider against the thermistor.</w:t>
+      </w:r>
+    </w:p>
+    <w:p>
+      <w:pPr>
+        <w:shd w:val="clear" w:color="auto" w:fill="002451"/>
+        <w:spacing w:after="0" w:line="285" w:lineRule="atLeast"/>
+        <w:rPr>
+          <w:rFonts w:ascii="Consolas" w:eastAsia="Times New Roman" w:hAnsi="Consolas" w:cs="Times New Roman"/>
+          <w:color w:val="FFFFFF"/>
+          <w:sz w:val="21"/>
+          <w:szCs w:val="21"/>
+        </w:rPr>
+      </w:pPr>
+      <w:r>
+        <w:rPr>
+          <w:rFonts w:ascii="Consolas" w:eastAsia="Times New Roman" w:hAnsi="Consolas" w:cs="Times New Roman"/>
+          <w:color w:val="7285B7"/>
+          <w:sz w:val="21"/>
+          <w:szCs w:val="21"/>
+        </w:rPr>
+        <w:t>    //</w:t>
+      </w:r>
+      <w:proofErr w:type="spellStart"/>
+      <w:r>
+        <w:rPr>
+          <w:rFonts w:ascii="Consolas" w:eastAsia="Times New Roman" w:hAnsi="Consolas" w:cs="Times New Roman"/>
+          <w:color w:val="7285B7"/>
+          <w:sz w:val="21"/>
+          <w:szCs w:val="21"/>
+        </w:rPr>
+        <w:t>RThe</w:t>
+      </w:r>
+      <w:proofErr w:type="spellEnd"/>
+      <w:r>
+        <w:rPr>
+          <w:rFonts w:ascii="Consolas" w:eastAsia="Times New Roman" w:hAnsi="Consolas" w:cs="Times New Roman"/>
+          <w:color w:val="7285B7"/>
+          <w:sz w:val="21"/>
+          <w:szCs w:val="21"/>
+        </w:rPr>
+        <w:t xml:space="preserve"> - Datasheet resistance of thermistor at a temperature of 25 degrees </w:t>
+      </w:r>
+      <w:proofErr w:type="spellStart"/>
+      <w:r>
+        <w:rPr>
+          <w:rFonts w:ascii="Consolas" w:eastAsia="Times New Roman" w:hAnsi="Consolas" w:cs="Times New Roman"/>
+          <w:color w:val="7285B7"/>
+          <w:sz w:val="21"/>
+          <w:szCs w:val="21"/>
+        </w:rPr>
+        <w:t>celsius</w:t>
+      </w:r>
+      <w:proofErr w:type="spellEnd"/>
+      <w:r>
+        <w:rPr>
+          <w:rFonts w:ascii="Consolas" w:eastAsia="Times New Roman" w:hAnsi="Consolas" w:cs="Times New Roman"/>
+          <w:color w:val="7285B7"/>
+          <w:sz w:val="21"/>
+          <w:szCs w:val="21"/>
+        </w:rPr>
+        <w:t>.</w:t>
+      </w:r>
+    </w:p>
+    <w:p>
+      <w:pPr>
+        <w:shd w:val="clear" w:color="auto" w:fill="002451"/>
+        <w:spacing w:after="0" w:line="285" w:lineRule="atLeast"/>
+        <w:rPr>
+          <w:rFonts w:ascii="Consolas" w:eastAsia="Times New Roman" w:hAnsi="Consolas" w:cs="Times New Roman"/>
+          <w:color w:val="FFFFFF"/>
+          <w:sz w:val="21"/>
+          <w:szCs w:val="21"/>
+        </w:rPr>
+      </w:pPr>
+      <w:r>
+        <w:rPr>
+          <w:rFonts w:ascii="Consolas" w:eastAsia="Times New Roman" w:hAnsi="Consolas" w:cs="Times New Roman"/>
+          <w:color w:val="7285B7"/>
+          <w:sz w:val="21"/>
+          <w:szCs w:val="21"/>
+        </w:rPr>
+        <w:t>    //</w:t>
+      </w:r>
+      <w:proofErr w:type="spellStart"/>
+      <w:r>
+        <w:rPr>
+          <w:rFonts w:ascii="Consolas" w:eastAsia="Times New Roman" w:hAnsi="Consolas" w:cs="Times New Roman"/>
+          <w:color w:val="7285B7"/>
+          <w:sz w:val="21"/>
+          <w:szCs w:val="21"/>
+        </w:rPr>
+        <w:t>BetaCon</w:t>
+      </w:r>
+      <w:proofErr w:type="spellEnd"/>
+      <w:r>
+        <w:rPr>
+          <w:rFonts w:ascii="Consolas" w:eastAsia="Times New Roman" w:hAnsi="Consolas" w:cs="Times New Roman"/>
+          <w:color w:val="7285B7"/>
+          <w:sz w:val="21"/>
+          <w:szCs w:val="21"/>
+        </w:rPr>
+        <w:t xml:space="preserve"> - Datasheet beta constant of thermistor between temps of 25 to 85 degrees </w:t>
+      </w:r>
+      <w:proofErr w:type="spellStart"/>
+      <w:r>
+        <w:rPr>
+          <w:rFonts w:ascii="Consolas" w:eastAsia="Times New Roman" w:hAnsi="Consolas" w:cs="Times New Roman"/>
+          <w:color w:val="7285B7"/>
+          <w:sz w:val="21"/>
+          <w:szCs w:val="21"/>
+        </w:rPr>
+        <w:t>celsius</w:t>
+      </w:r>
+      <w:proofErr w:type="spellEnd"/>
+      <w:r>
+        <w:rPr>
+          <w:rFonts w:ascii="Consolas" w:eastAsia="Times New Roman" w:hAnsi="Consolas" w:cs="Times New Roman"/>
+          <w:color w:val="7285B7"/>
+          <w:sz w:val="21"/>
+          <w:szCs w:val="21"/>
+        </w:rPr>
+        <w:t>, used to calculate temperature from resistance.</w:t>
+      </w:r>
+    </w:p>
+    <w:p>
+      <w:pPr>
+        <w:shd w:val="clear" w:color="auto" w:fill="002451"/>
+        <w:spacing w:after="0" w:line="285" w:lineRule="atLeast"/>
+        <w:rPr>
+          <w:rFonts w:ascii="Consolas" w:eastAsia="Times New Roman" w:hAnsi="Consolas" w:cs="Times New Roman"/>
+          <w:color w:val="FFFFFF"/>
+          <w:sz w:val="21"/>
+          <w:szCs w:val="21"/>
+        </w:rPr>
+      </w:pPr>
+      <w:r>
+        <w:rPr>
+          <w:rFonts w:ascii="Consolas" w:eastAsia="Times New Roman" w:hAnsi="Consolas" w:cs="Times New Roman"/>
+          <w:color w:val="7285B7"/>
+          <w:sz w:val="21"/>
+          <w:szCs w:val="21"/>
+        </w:rPr>
+        <w:t>    //</w:t>
+      </w:r>
+      <w:proofErr w:type="spellStart"/>
+      <w:r>
+        <w:rPr>
+          <w:rFonts w:ascii="Consolas" w:eastAsia="Times New Roman" w:hAnsi="Consolas" w:cs="Times New Roman"/>
+          <w:color w:val="7285B7"/>
+          <w:sz w:val="21"/>
+          <w:szCs w:val="21"/>
+        </w:rPr>
+        <w:t>ThermistorBaselineTemp</w:t>
+      </w:r>
+      <w:proofErr w:type="spellEnd"/>
+      <w:r>
+        <w:rPr>
+          <w:rFonts w:ascii="Consolas" w:eastAsia="Times New Roman" w:hAnsi="Consolas" w:cs="Times New Roman"/>
+          <w:color w:val="7285B7"/>
+          <w:sz w:val="21"/>
+          <w:szCs w:val="21"/>
+        </w:rPr>
+        <w:t xml:space="preserve"> - Temperature in kelvin (required for temp calculations) at which thermistor reaches its baseline resistance.</w:t>
+      </w:r>
+    </w:p>
+    <w:p>
+      <w:pPr>
+        <w:shd w:val="clear" w:color="auto" w:fill="002451"/>
+        <w:spacing w:after="0" w:line="285" w:lineRule="atLeast"/>
+        <w:rPr>
+          <w:rFonts w:ascii="Consolas" w:eastAsia="Times New Roman" w:hAnsi="Consolas" w:cs="Times New Roman"/>
+          <w:color w:val="FFFFFF"/>
+          <w:sz w:val="21"/>
+          <w:szCs w:val="21"/>
+        </w:rPr>
+      </w:pPr>
+      <w:r>
+        <w:rPr>
+          <w:rFonts w:ascii="Consolas" w:eastAsia="Times New Roman" w:hAnsi="Consolas" w:cs="Times New Roman"/>
+          <w:color w:val="FFFFFF"/>
+          <w:sz w:val="21"/>
+          <w:szCs w:val="21"/>
+        </w:rPr>
+        <w:t xml:space="preserve">    </w:t>
+      </w:r>
+      <w:proofErr w:type="spellStart"/>
+      <w:r>
+        <w:rPr>
+          <w:rFonts w:ascii="Consolas" w:eastAsia="Times New Roman" w:hAnsi="Consolas" w:cs="Times New Roman"/>
+          <w:color w:val="EBBBFF"/>
+          <w:sz w:val="21"/>
+          <w:szCs w:val="21"/>
+        </w:rPr>
+        <w:t>const</w:t>
+      </w:r>
+      <w:proofErr w:type="spellEnd"/>
+      <w:r>
+        <w:rPr>
+          <w:rFonts w:ascii="Consolas" w:eastAsia="Times New Roman" w:hAnsi="Consolas" w:cs="Times New Roman"/>
+          <w:color w:val="FFFFFF"/>
+          <w:sz w:val="21"/>
+          <w:szCs w:val="21"/>
+        </w:rPr>
+        <w:t xml:space="preserve"> </w:t>
+      </w:r>
+      <w:r>
+        <w:rPr>
+          <w:rFonts w:ascii="Consolas" w:eastAsia="Times New Roman" w:hAnsi="Consolas" w:cs="Times New Roman"/>
+          <w:color w:val="EBBBFF"/>
+          <w:sz w:val="21"/>
+          <w:szCs w:val="21"/>
+        </w:rPr>
+        <w:t>float</w:t>
+      </w:r>
+      <w:r>
+        <w:rPr>
+          <w:rFonts w:ascii="Consolas" w:eastAsia="Times New Roman" w:hAnsi="Consolas" w:cs="Times New Roman"/>
+          <w:color w:val="FFFFFF"/>
+          <w:sz w:val="21"/>
+          <w:szCs w:val="21"/>
+        </w:rPr>
+        <w:t xml:space="preserve"> </w:t>
+      </w:r>
+      <w:proofErr w:type="spellStart"/>
+      <w:r>
+        <w:rPr>
+          <w:rFonts w:ascii="Consolas" w:eastAsia="Times New Roman" w:hAnsi="Consolas" w:cs="Times New Roman"/>
+          <w:color w:val="FF9DA4"/>
+          <w:sz w:val="21"/>
+          <w:szCs w:val="21"/>
+        </w:rPr>
+        <w:t>RConstant</w:t>
+      </w:r>
+      <w:proofErr w:type="spellEnd"/>
+      <w:r>
+        <w:rPr>
+          <w:rFonts w:ascii="Consolas" w:eastAsia="Times New Roman" w:hAnsi="Consolas" w:cs="Times New Roman"/>
+          <w:color w:val="FFFFFF"/>
+          <w:sz w:val="21"/>
+          <w:szCs w:val="21"/>
+        </w:rPr>
+        <w:t xml:space="preserve"> </w:t>
+      </w:r>
+      <w:r>
+        <w:rPr>
+          <w:rFonts w:ascii="Consolas" w:eastAsia="Times New Roman" w:hAnsi="Consolas" w:cs="Times New Roman"/>
+          <w:color w:val="99FFFF"/>
+          <w:sz w:val="21"/>
+          <w:szCs w:val="21"/>
+        </w:rPr>
+        <w:t>=</w:t>
+      </w:r>
+      <w:r>
+        <w:rPr>
+          <w:rFonts w:ascii="Consolas" w:eastAsia="Times New Roman" w:hAnsi="Consolas" w:cs="Times New Roman"/>
+          <w:color w:val="FFFFFF"/>
+          <w:sz w:val="21"/>
+          <w:szCs w:val="21"/>
+        </w:rPr>
+        <w:t xml:space="preserve"> </w:t>
+      </w:r>
+      <w:r>
+        <w:rPr>
+          <w:rFonts w:ascii="Consolas" w:eastAsia="Times New Roman" w:hAnsi="Consolas" w:cs="Times New Roman"/>
+          <w:color w:val="FFC58F"/>
+          <w:sz w:val="21"/>
+          <w:szCs w:val="21"/>
+        </w:rPr>
+        <w:t>10000.0</w:t>
+      </w:r>
+      <w:r>
+        <w:rPr>
+          <w:rFonts w:ascii="Consolas" w:eastAsia="Times New Roman" w:hAnsi="Consolas" w:cs="Times New Roman"/>
+          <w:color w:val="FFFFFF"/>
+          <w:sz w:val="21"/>
+          <w:szCs w:val="21"/>
+        </w:rPr>
+        <w:t xml:space="preserve">, </w:t>
+      </w:r>
+      <w:r>
+        <w:rPr>
+          <w:rFonts w:ascii="Consolas" w:eastAsia="Times New Roman" w:hAnsi="Consolas" w:cs="Times New Roman"/>
+          <w:color w:val="FF9DA4"/>
+          <w:sz w:val="21"/>
+          <w:szCs w:val="21"/>
+        </w:rPr>
+        <w:t>RThermistor25Baseline</w:t>
+      </w:r>
+      <w:r>
+        <w:rPr>
+          <w:rFonts w:ascii="Consolas" w:eastAsia="Times New Roman" w:hAnsi="Consolas" w:cs="Times New Roman"/>
+          <w:color w:val="FFFFFF"/>
+          <w:sz w:val="21"/>
+          <w:szCs w:val="21"/>
+        </w:rPr>
+        <w:t xml:space="preserve"> </w:t>
+      </w:r>
+      <w:r>
+        <w:rPr>
+          <w:rFonts w:ascii="Consolas" w:eastAsia="Times New Roman" w:hAnsi="Consolas" w:cs="Times New Roman"/>
+          <w:color w:val="99FFFF"/>
+          <w:sz w:val="21"/>
+          <w:szCs w:val="21"/>
+        </w:rPr>
+        <w:t>=</w:t>
+      </w:r>
+      <w:r>
+        <w:rPr>
+          <w:rFonts w:ascii="Consolas" w:eastAsia="Times New Roman" w:hAnsi="Consolas" w:cs="Times New Roman"/>
+          <w:color w:val="FFFFFF"/>
+          <w:sz w:val="21"/>
+          <w:szCs w:val="21"/>
+        </w:rPr>
+        <w:t xml:space="preserve"> </w:t>
+      </w:r>
+      <w:r>
+        <w:rPr>
+          <w:rFonts w:ascii="Consolas" w:eastAsia="Times New Roman" w:hAnsi="Consolas" w:cs="Times New Roman"/>
+          <w:color w:val="FFC58F"/>
+          <w:sz w:val="21"/>
+          <w:szCs w:val="21"/>
+        </w:rPr>
+        <w:t>10000.0</w:t>
+      </w:r>
+      <w:r>
+        <w:rPr>
+          <w:rFonts w:ascii="Consolas" w:eastAsia="Times New Roman" w:hAnsi="Consolas" w:cs="Times New Roman"/>
+          <w:color w:val="FFFFFF"/>
+          <w:sz w:val="21"/>
+          <w:szCs w:val="21"/>
+        </w:rPr>
+        <w:t>;</w:t>
+      </w:r>
+    </w:p>
+    <w:p>
+      <w:pPr>
+        <w:shd w:val="clear" w:color="auto" w:fill="002451"/>
+        <w:spacing w:after="0" w:line="285" w:lineRule="atLeast"/>
+        <w:rPr>
+          <w:rFonts w:ascii="Consolas" w:eastAsia="Times New Roman" w:hAnsi="Consolas" w:cs="Times New Roman"/>
+          <w:color w:val="FFFFFF"/>
+          <w:sz w:val="21"/>
+          <w:szCs w:val="21"/>
+        </w:rPr>
+      </w:pPr>
+      <w:r>
+        <w:rPr>
+          <w:rFonts w:ascii="Consolas" w:eastAsia="Times New Roman" w:hAnsi="Consolas" w:cs="Times New Roman"/>
+          <w:color w:val="FFFFFF"/>
+          <w:sz w:val="21"/>
+          <w:szCs w:val="21"/>
+        </w:rPr>
+        <w:t xml:space="preserve">    </w:t>
+      </w:r>
+      <w:proofErr w:type="spellStart"/>
+      <w:r>
+        <w:rPr>
+          <w:rFonts w:ascii="Consolas" w:eastAsia="Times New Roman" w:hAnsi="Consolas" w:cs="Times New Roman"/>
+          <w:color w:val="EBBBFF"/>
+          <w:sz w:val="21"/>
+          <w:szCs w:val="21"/>
+        </w:rPr>
+        <w:t>const</w:t>
+      </w:r>
+      <w:proofErr w:type="spellEnd"/>
+      <w:r>
+        <w:rPr>
+          <w:rFonts w:ascii="Consolas" w:eastAsia="Times New Roman" w:hAnsi="Consolas" w:cs="Times New Roman"/>
+          <w:color w:val="FFFFFF"/>
+          <w:sz w:val="21"/>
+          <w:szCs w:val="21"/>
+        </w:rPr>
+        <w:t xml:space="preserve"> </w:t>
+      </w:r>
+      <w:r>
+        <w:rPr>
+          <w:rFonts w:ascii="Consolas" w:eastAsia="Times New Roman" w:hAnsi="Consolas" w:cs="Times New Roman"/>
+          <w:color w:val="EBBBFF"/>
+          <w:sz w:val="21"/>
+          <w:szCs w:val="21"/>
+        </w:rPr>
+        <w:t>float</w:t>
+      </w:r>
+      <w:r>
+        <w:rPr>
+          <w:rFonts w:ascii="Consolas" w:eastAsia="Times New Roman" w:hAnsi="Consolas" w:cs="Times New Roman"/>
+          <w:color w:val="FFFFFF"/>
+          <w:sz w:val="21"/>
+          <w:szCs w:val="21"/>
+        </w:rPr>
+        <w:t xml:space="preserve"> </w:t>
+      </w:r>
+      <w:r>
+        <w:rPr>
+          <w:rFonts w:ascii="Consolas" w:eastAsia="Times New Roman" w:hAnsi="Consolas" w:cs="Times New Roman"/>
+          <w:color w:val="FF9DA4"/>
+          <w:sz w:val="21"/>
+          <w:szCs w:val="21"/>
+        </w:rPr>
+        <w:t>BetaConstant2585</w:t>
+      </w:r>
+      <w:r>
+        <w:rPr>
+          <w:rFonts w:ascii="Consolas" w:eastAsia="Times New Roman" w:hAnsi="Consolas" w:cs="Times New Roman"/>
+          <w:color w:val="FFFFFF"/>
+          <w:sz w:val="21"/>
+          <w:szCs w:val="21"/>
+        </w:rPr>
+        <w:t xml:space="preserve"> </w:t>
+      </w:r>
+      <w:r>
+        <w:rPr>
+          <w:rFonts w:ascii="Consolas" w:eastAsia="Times New Roman" w:hAnsi="Consolas" w:cs="Times New Roman"/>
+          <w:color w:val="99FFFF"/>
+          <w:sz w:val="21"/>
+          <w:szCs w:val="21"/>
+        </w:rPr>
+        <w:t>=</w:t>
+      </w:r>
+      <w:r>
+        <w:rPr>
+          <w:rFonts w:ascii="Consolas" w:eastAsia="Times New Roman" w:hAnsi="Consolas" w:cs="Times New Roman"/>
+          <w:color w:val="FFFFFF"/>
+          <w:sz w:val="21"/>
+          <w:szCs w:val="21"/>
+        </w:rPr>
+        <w:t xml:space="preserve"> </w:t>
+      </w:r>
+      <w:r>
+        <w:rPr>
+          <w:rFonts w:ascii="Consolas" w:eastAsia="Times New Roman" w:hAnsi="Consolas" w:cs="Times New Roman"/>
+          <w:color w:val="FFC58F"/>
+          <w:sz w:val="21"/>
+          <w:szCs w:val="21"/>
+        </w:rPr>
+        <w:t>3940.0</w:t>
+      </w:r>
+      <w:r>
+        <w:rPr>
+          <w:rFonts w:ascii="Consolas" w:eastAsia="Times New Roman" w:hAnsi="Consolas" w:cs="Times New Roman"/>
+          <w:color w:val="FFFFFF"/>
+          <w:sz w:val="21"/>
+          <w:szCs w:val="21"/>
+        </w:rPr>
+        <w:t>;</w:t>
+      </w:r>
+    </w:p>
+    <w:p>
+      <w:pPr>
+        <w:shd w:val="clear" w:color="auto" w:fill="002451"/>
+        <w:spacing w:after="0" w:line="285" w:lineRule="atLeast"/>
+        <w:rPr>
+          <w:rFonts w:ascii="Consolas" w:eastAsia="Times New Roman" w:hAnsi="Consolas" w:cs="Times New Roman"/>
+          <w:color w:val="FFFFFF"/>
+          <w:sz w:val="21"/>
+          <w:szCs w:val="21"/>
+        </w:rPr>
+      </w:pPr>
+      <w:r>
+        <w:rPr>
+          <w:rFonts w:ascii="Consolas" w:eastAsia="Times New Roman" w:hAnsi="Consolas" w:cs="Times New Roman"/>
+          <w:color w:val="FFFFFF"/>
+          <w:sz w:val="21"/>
+          <w:szCs w:val="21"/>
+        </w:rPr>
+        <w:t xml:space="preserve">    </w:t>
+      </w:r>
+      <w:proofErr w:type="spellStart"/>
+      <w:r>
+        <w:rPr>
+          <w:rFonts w:ascii="Consolas" w:eastAsia="Times New Roman" w:hAnsi="Consolas" w:cs="Times New Roman"/>
+          <w:color w:val="EBBBFF"/>
+          <w:sz w:val="21"/>
+          <w:szCs w:val="21"/>
+        </w:rPr>
+        <w:t>const</w:t>
+      </w:r>
+      <w:proofErr w:type="spellEnd"/>
+      <w:r>
+        <w:rPr>
+          <w:rFonts w:ascii="Consolas" w:eastAsia="Times New Roman" w:hAnsi="Consolas" w:cs="Times New Roman"/>
+          <w:color w:val="FFFFFF"/>
+          <w:sz w:val="21"/>
+          <w:szCs w:val="21"/>
+        </w:rPr>
+        <w:t xml:space="preserve"> </w:t>
+      </w:r>
+      <w:r>
+        <w:rPr>
+          <w:rFonts w:ascii="Consolas" w:eastAsia="Times New Roman" w:hAnsi="Consolas" w:cs="Times New Roman"/>
+          <w:color w:val="EBBBFF"/>
+          <w:sz w:val="21"/>
+          <w:szCs w:val="21"/>
+        </w:rPr>
+        <w:t>float</w:t>
+      </w:r>
+      <w:r>
+        <w:rPr>
+          <w:rFonts w:ascii="Consolas" w:eastAsia="Times New Roman" w:hAnsi="Consolas" w:cs="Times New Roman"/>
+          <w:color w:val="FFFFFF"/>
+          <w:sz w:val="21"/>
+          <w:szCs w:val="21"/>
+        </w:rPr>
+        <w:t xml:space="preserve"> </w:t>
+      </w:r>
+      <w:proofErr w:type="spellStart"/>
+      <w:r>
+        <w:rPr>
+          <w:rFonts w:ascii="Consolas" w:eastAsia="Times New Roman" w:hAnsi="Consolas" w:cs="Times New Roman"/>
+          <w:color w:val="FF9DA4"/>
+          <w:sz w:val="21"/>
+          <w:szCs w:val="21"/>
+        </w:rPr>
+        <w:t>ThermistorBaselineTempKelvin</w:t>
+      </w:r>
+      <w:proofErr w:type="spellEnd"/>
+      <w:r>
+        <w:rPr>
+          <w:rFonts w:ascii="Consolas" w:eastAsia="Times New Roman" w:hAnsi="Consolas" w:cs="Times New Roman"/>
+          <w:color w:val="FFFFFF"/>
+          <w:sz w:val="21"/>
+          <w:szCs w:val="21"/>
+        </w:rPr>
+        <w:t xml:space="preserve"> </w:t>
+      </w:r>
+      <w:r>
+        <w:rPr>
+          <w:rFonts w:ascii="Consolas" w:eastAsia="Times New Roman" w:hAnsi="Consolas" w:cs="Times New Roman"/>
+          <w:color w:val="99FFFF"/>
+          <w:sz w:val="21"/>
+          <w:szCs w:val="21"/>
+        </w:rPr>
+        <w:t>=</w:t>
+      </w:r>
+      <w:r>
+        <w:rPr>
+          <w:rFonts w:ascii="Consolas" w:eastAsia="Times New Roman" w:hAnsi="Consolas" w:cs="Times New Roman"/>
+          <w:color w:val="FFFFFF"/>
+          <w:sz w:val="21"/>
+          <w:szCs w:val="21"/>
+        </w:rPr>
+        <w:t xml:space="preserve"> </w:t>
+      </w:r>
+      <w:r>
+        <w:rPr>
+          <w:rFonts w:ascii="Consolas" w:eastAsia="Times New Roman" w:hAnsi="Consolas" w:cs="Times New Roman"/>
+          <w:color w:val="FFC58F"/>
+          <w:sz w:val="21"/>
+          <w:szCs w:val="21"/>
+        </w:rPr>
+        <w:t>25.0</w:t>
+      </w:r>
+      <w:r>
+        <w:rPr>
+          <w:rFonts w:ascii="Consolas" w:eastAsia="Times New Roman" w:hAnsi="Consolas" w:cs="Times New Roman"/>
+          <w:color w:val="FFFFFF"/>
+          <w:sz w:val="21"/>
+          <w:szCs w:val="21"/>
+        </w:rPr>
+        <w:t xml:space="preserve"> </w:t>
+      </w:r>
+      <w:r>
+        <w:rPr>
+          <w:rFonts w:ascii="Consolas" w:eastAsia="Times New Roman" w:hAnsi="Consolas" w:cs="Times New Roman"/>
+          <w:color w:val="99FFFF"/>
+          <w:sz w:val="21"/>
+          <w:szCs w:val="21"/>
+        </w:rPr>
+        <w:t>+</w:t>
+      </w:r>
+      <w:r>
+        <w:rPr>
+          <w:rFonts w:ascii="Consolas" w:eastAsia="Times New Roman" w:hAnsi="Consolas" w:cs="Times New Roman"/>
+          <w:color w:val="FFFFFF"/>
+          <w:sz w:val="21"/>
+          <w:szCs w:val="21"/>
+        </w:rPr>
+        <w:t xml:space="preserve"> </w:t>
+      </w:r>
+      <w:r>
+        <w:rPr>
+          <w:rFonts w:ascii="Consolas" w:eastAsia="Times New Roman" w:hAnsi="Consolas" w:cs="Times New Roman"/>
+          <w:color w:val="FFC58F"/>
+          <w:sz w:val="21"/>
+          <w:szCs w:val="21"/>
+        </w:rPr>
+        <w:t>273.15</w:t>
+      </w:r>
+      <w:r>
+        <w:rPr>
+          <w:rFonts w:ascii="Consolas" w:eastAsia="Times New Roman" w:hAnsi="Consolas" w:cs="Times New Roman"/>
+          <w:color w:val="FFFFFF"/>
+          <w:sz w:val="21"/>
+          <w:szCs w:val="21"/>
+        </w:rPr>
+        <w:t>;</w:t>
+      </w:r>
+    </w:p>
+    <w:p>
+      <w:pPr>
+        <w:shd w:val="clear" w:color="auto" w:fill="002451"/>
+        <w:spacing w:after="0" w:line="285" w:lineRule="atLeast"/>
+        <w:rPr>
+          <w:rFonts w:ascii="Consolas" w:eastAsia="Times New Roman" w:hAnsi="Consolas" w:cs="Times New Roman"/>
+          <w:color w:val="FFFFFF"/>
+          <w:sz w:val="21"/>
+          <w:szCs w:val="21"/>
+        </w:rPr>
+      </w:pPr>
+      <w:r>
+        <w:rPr>
+          <w:rFonts w:ascii="Consolas" w:eastAsia="Times New Roman" w:hAnsi="Consolas" w:cs="Times New Roman"/>
+          <w:color w:val="FFFFFF"/>
+          <w:sz w:val="21"/>
+          <w:szCs w:val="21"/>
+        </w:rPr>
+        <w:t xml:space="preserve">    </w:t>
+      </w:r>
+    </w:p>
+    <w:p>
+      <w:pPr>
+        <w:shd w:val="clear" w:color="auto" w:fill="002451"/>
+        <w:spacing w:after="0" w:line="285" w:lineRule="atLeast"/>
+        <w:rPr>
+          <w:rFonts w:ascii="Consolas" w:eastAsia="Times New Roman" w:hAnsi="Consolas" w:cs="Times New Roman"/>
+          <w:color w:val="FFFFFF"/>
+          <w:sz w:val="21"/>
+          <w:szCs w:val="21"/>
+        </w:rPr>
+      </w:pPr>
+      <w:r>
+        <w:rPr>
+          <w:rFonts w:ascii="Consolas" w:eastAsia="Times New Roman" w:hAnsi="Consolas" w:cs="Times New Roman"/>
+          <w:color w:val="FFFFFF"/>
+          <w:sz w:val="21"/>
+          <w:szCs w:val="21"/>
+        </w:rPr>
+        <w:t xml:space="preserve">    </w:t>
+      </w:r>
+    </w:p>
+    <w:p>
+      <w:pPr>
+        <w:shd w:val="clear" w:color="auto" w:fill="002451"/>
+        <w:spacing w:after="0" w:line="285" w:lineRule="atLeast"/>
+        <w:rPr>
+          <w:rFonts w:ascii="Consolas" w:eastAsia="Times New Roman" w:hAnsi="Consolas" w:cs="Times New Roman"/>
+          <w:color w:val="FFFFFF"/>
+          <w:sz w:val="21"/>
+          <w:szCs w:val="21"/>
+        </w:rPr>
+      </w:pPr>
+      <w:r>
+        <w:rPr>
+          <w:rFonts w:ascii="Consolas" w:eastAsia="Times New Roman" w:hAnsi="Consolas" w:cs="Times New Roman"/>
+          <w:color w:val="7285B7"/>
+          <w:sz w:val="21"/>
+          <w:szCs w:val="21"/>
+        </w:rPr>
+        <w:t xml:space="preserve">    //float </w:t>
+      </w:r>
+      <w:proofErr w:type="spellStart"/>
+      <w:r>
+        <w:rPr>
+          <w:rFonts w:ascii="Consolas" w:eastAsia="Times New Roman" w:hAnsi="Consolas" w:cs="Times New Roman"/>
+          <w:color w:val="7285B7"/>
+          <w:sz w:val="21"/>
+          <w:szCs w:val="21"/>
+        </w:rPr>
+        <w:t>VOut</w:t>
+      </w:r>
+      <w:proofErr w:type="spellEnd"/>
+      <w:r>
+        <w:rPr>
+          <w:rFonts w:ascii="Consolas" w:eastAsia="Times New Roman" w:hAnsi="Consolas" w:cs="Times New Roman"/>
+          <w:color w:val="7285B7"/>
+          <w:sz w:val="21"/>
+          <w:szCs w:val="21"/>
+        </w:rPr>
+        <w:t xml:space="preserve"> = 5.25 * </w:t>
+      </w:r>
+      <w:proofErr w:type="spellStart"/>
+      <w:r>
+        <w:rPr>
+          <w:rFonts w:ascii="Consolas" w:eastAsia="Times New Roman" w:hAnsi="Consolas" w:cs="Times New Roman"/>
+          <w:color w:val="7285B7"/>
+          <w:sz w:val="21"/>
+          <w:szCs w:val="21"/>
+        </w:rPr>
+        <w:t>raw_adc</w:t>
+      </w:r>
+      <w:proofErr w:type="spellEnd"/>
+      <w:r>
+        <w:rPr>
+          <w:rFonts w:ascii="Consolas" w:eastAsia="Times New Roman" w:hAnsi="Consolas" w:cs="Times New Roman"/>
+          <w:color w:val="7285B7"/>
+          <w:sz w:val="21"/>
+          <w:szCs w:val="21"/>
+        </w:rPr>
+        <w:t xml:space="preserve"> / 4095.0, simplified steps from flowchart diagram but line here for clarity.</w:t>
+      </w:r>
+    </w:p>
+    <w:p>
+      <w:pPr>
+        <w:shd w:val="clear" w:color="auto" w:fill="002451"/>
+        <w:spacing w:after="0" w:line="285" w:lineRule="atLeast"/>
+        <w:rPr>
+          <w:rFonts w:ascii="Consolas" w:eastAsia="Times New Roman" w:hAnsi="Consolas" w:cs="Times New Roman"/>
+          <w:color w:val="FFFFFF"/>
+          <w:sz w:val="21"/>
+          <w:szCs w:val="21"/>
+        </w:rPr>
+      </w:pPr>
+      <w:r>
+        <w:rPr>
+          <w:rFonts w:ascii="Consolas" w:eastAsia="Times New Roman" w:hAnsi="Consolas" w:cs="Times New Roman"/>
+          <w:color w:val="FFFFFF"/>
+          <w:sz w:val="21"/>
+          <w:szCs w:val="21"/>
+        </w:rPr>
+        <w:t xml:space="preserve">    </w:t>
+      </w:r>
+      <w:r>
+        <w:rPr>
+          <w:rFonts w:ascii="Consolas" w:eastAsia="Times New Roman" w:hAnsi="Consolas" w:cs="Times New Roman"/>
+          <w:color w:val="EBBBFF"/>
+          <w:sz w:val="21"/>
+          <w:szCs w:val="21"/>
+        </w:rPr>
+        <w:t>float</w:t>
+      </w:r>
+      <w:r>
+        <w:rPr>
+          <w:rFonts w:ascii="Consolas" w:eastAsia="Times New Roman" w:hAnsi="Consolas" w:cs="Times New Roman"/>
+          <w:color w:val="FFFFFF"/>
+          <w:sz w:val="21"/>
+          <w:szCs w:val="21"/>
+        </w:rPr>
+        <w:t xml:space="preserve"> </w:t>
+      </w:r>
+      <w:proofErr w:type="spellStart"/>
+      <w:r>
+        <w:rPr>
+          <w:rFonts w:ascii="Consolas" w:eastAsia="Times New Roman" w:hAnsi="Consolas" w:cs="Times New Roman"/>
+          <w:color w:val="FF9DA4"/>
+          <w:sz w:val="21"/>
+          <w:szCs w:val="21"/>
+        </w:rPr>
+        <w:t>RThermistor</w:t>
+      </w:r>
+      <w:proofErr w:type="spellEnd"/>
+      <w:r>
+        <w:rPr>
+          <w:rFonts w:ascii="Consolas" w:eastAsia="Times New Roman" w:hAnsi="Consolas" w:cs="Times New Roman"/>
+          <w:color w:val="FFFFFF"/>
+          <w:sz w:val="21"/>
+          <w:szCs w:val="21"/>
+        </w:rPr>
+        <w:t xml:space="preserve"> </w:t>
+      </w:r>
+      <w:r>
+        <w:rPr>
+          <w:rFonts w:ascii="Consolas" w:eastAsia="Times New Roman" w:hAnsi="Consolas" w:cs="Times New Roman"/>
+          <w:color w:val="99FFFF"/>
+          <w:sz w:val="21"/>
+          <w:szCs w:val="21"/>
+        </w:rPr>
+        <w:t>=</w:t>
+      </w:r>
+      <w:r>
+        <w:rPr>
+          <w:rFonts w:ascii="Consolas" w:eastAsia="Times New Roman" w:hAnsi="Consolas" w:cs="Times New Roman"/>
+          <w:color w:val="FFFFFF"/>
+          <w:sz w:val="21"/>
+          <w:szCs w:val="21"/>
+        </w:rPr>
+        <w:t xml:space="preserve"> </w:t>
+      </w:r>
+      <w:proofErr w:type="spellStart"/>
+      <w:r>
+        <w:rPr>
+          <w:rFonts w:ascii="Consolas" w:eastAsia="Times New Roman" w:hAnsi="Consolas" w:cs="Times New Roman"/>
+          <w:color w:val="FF9DA4"/>
+          <w:sz w:val="21"/>
+          <w:szCs w:val="21"/>
+        </w:rPr>
+        <w:t>RConstant</w:t>
+      </w:r>
+      <w:proofErr w:type="spellEnd"/>
+      <w:r>
+        <w:rPr>
+          <w:rFonts w:ascii="Consolas" w:eastAsia="Times New Roman" w:hAnsi="Consolas" w:cs="Times New Roman"/>
+          <w:color w:val="FFFFFF"/>
+          <w:sz w:val="21"/>
+          <w:szCs w:val="21"/>
+        </w:rPr>
+        <w:t xml:space="preserve"> </w:t>
+      </w:r>
+      <w:r>
+        <w:rPr>
+          <w:rFonts w:ascii="Consolas" w:eastAsia="Times New Roman" w:hAnsi="Consolas" w:cs="Times New Roman"/>
+          <w:color w:val="99FFFF"/>
+          <w:sz w:val="21"/>
+          <w:szCs w:val="21"/>
+        </w:rPr>
+        <w:t>*</w:t>
+      </w:r>
+      <w:r>
+        <w:rPr>
+          <w:rFonts w:ascii="Consolas" w:eastAsia="Times New Roman" w:hAnsi="Consolas" w:cs="Times New Roman"/>
+          <w:color w:val="FFFFFF"/>
+          <w:sz w:val="21"/>
+          <w:szCs w:val="21"/>
+        </w:rPr>
+        <w:t xml:space="preserve"> </w:t>
+      </w:r>
+      <w:r>
+        <w:rPr>
+          <w:rFonts w:ascii="Consolas" w:eastAsia="Times New Roman" w:hAnsi="Consolas" w:cs="Times New Roman"/>
+          <w:color w:val="FFC58F"/>
+          <w:sz w:val="21"/>
+          <w:szCs w:val="21"/>
+        </w:rPr>
+        <w:t>4095</w:t>
+      </w:r>
+      <w:r>
+        <w:rPr>
+          <w:rFonts w:ascii="Consolas" w:eastAsia="Times New Roman" w:hAnsi="Consolas" w:cs="Times New Roman"/>
+          <w:color w:val="FFFFFF"/>
+          <w:sz w:val="21"/>
+          <w:szCs w:val="21"/>
+        </w:rPr>
+        <w:t xml:space="preserve"> </w:t>
+      </w:r>
+      <w:r>
+        <w:rPr>
+          <w:rFonts w:ascii="Consolas" w:eastAsia="Times New Roman" w:hAnsi="Consolas" w:cs="Times New Roman"/>
+          <w:color w:val="99FFFF"/>
+          <w:sz w:val="21"/>
+          <w:szCs w:val="21"/>
+        </w:rPr>
+        <w:t>/</w:t>
+      </w:r>
+      <w:r>
+        <w:rPr>
+          <w:rFonts w:ascii="Consolas" w:eastAsia="Times New Roman" w:hAnsi="Consolas" w:cs="Times New Roman"/>
+          <w:color w:val="FFFFFF"/>
+          <w:sz w:val="21"/>
+          <w:szCs w:val="21"/>
+        </w:rPr>
+        <w:t xml:space="preserve"> </w:t>
+      </w:r>
+      <w:proofErr w:type="spellStart"/>
+      <w:r>
+        <w:rPr>
+          <w:rFonts w:ascii="Consolas" w:eastAsia="Times New Roman" w:hAnsi="Consolas" w:cs="Times New Roman"/>
+          <w:color w:val="FF9DA4"/>
+          <w:sz w:val="21"/>
+          <w:szCs w:val="21"/>
+        </w:rPr>
+        <w:t>raw_adc</w:t>
+      </w:r>
+      <w:proofErr w:type="spellEnd"/>
+      <w:r>
+        <w:rPr>
+          <w:rFonts w:ascii="Consolas" w:eastAsia="Times New Roman" w:hAnsi="Consolas" w:cs="Times New Roman"/>
+          <w:color w:val="FFFFFF"/>
+          <w:sz w:val="21"/>
+          <w:szCs w:val="21"/>
+        </w:rPr>
+        <w:t xml:space="preserve"> </w:t>
+      </w:r>
+      <w:r>
+        <w:rPr>
+          <w:rFonts w:ascii="Consolas" w:eastAsia="Times New Roman" w:hAnsi="Consolas" w:cs="Times New Roman"/>
+          <w:color w:val="99FFFF"/>
+          <w:sz w:val="21"/>
+          <w:szCs w:val="21"/>
+        </w:rPr>
+        <w:t>-</w:t>
+      </w:r>
+      <w:r>
+        <w:rPr>
+          <w:rFonts w:ascii="Consolas" w:eastAsia="Times New Roman" w:hAnsi="Consolas" w:cs="Times New Roman"/>
+          <w:color w:val="FFFFFF"/>
+          <w:sz w:val="21"/>
+          <w:szCs w:val="21"/>
+        </w:rPr>
+        <w:t xml:space="preserve"> </w:t>
+      </w:r>
+      <w:proofErr w:type="spellStart"/>
+      <w:r>
+        <w:rPr>
+          <w:rFonts w:ascii="Consolas" w:eastAsia="Times New Roman" w:hAnsi="Consolas" w:cs="Times New Roman"/>
+          <w:color w:val="FF9DA4"/>
+          <w:sz w:val="21"/>
+          <w:szCs w:val="21"/>
+        </w:rPr>
+        <w:t>RConstant</w:t>
+      </w:r>
+      <w:proofErr w:type="spellEnd"/>
+      <w:r>
+        <w:rPr>
+          <w:rFonts w:ascii="Consolas" w:eastAsia="Times New Roman" w:hAnsi="Consolas" w:cs="Times New Roman"/>
+          <w:color w:val="FFFFFF"/>
+          <w:sz w:val="21"/>
+          <w:szCs w:val="21"/>
+        </w:rPr>
+        <w:t>;</w:t>
+      </w:r>
+    </w:p>
+    <w:p>
+      <w:pPr>
+        <w:shd w:val="clear" w:color="auto" w:fill="002451"/>
+        <w:spacing w:after="0" w:line="285" w:lineRule="atLeast"/>
+        <w:rPr>
+          <w:rFonts w:ascii="Consolas" w:eastAsia="Times New Roman" w:hAnsi="Consolas" w:cs="Times New Roman"/>
+          <w:color w:val="FFFFFF"/>
+          <w:sz w:val="21"/>
+          <w:szCs w:val="21"/>
+        </w:rPr>
+      </w:pPr>
+      <w:r>
+        <w:rPr>
+          <w:rFonts w:ascii="Consolas" w:eastAsia="Times New Roman" w:hAnsi="Consolas" w:cs="Times New Roman"/>
+          <w:color w:val="7285B7"/>
+          <w:sz w:val="21"/>
+          <w:szCs w:val="21"/>
+        </w:rPr>
+        <w:t>    //Temperature calculated using Beta Parameter Model (sufficient for this application over Steinhart-Hart model as lacking required measurements and level of precision not required.)</w:t>
+      </w:r>
+    </w:p>
+    <w:p>
+      <w:pPr>
+        <w:shd w:val="clear" w:color="auto" w:fill="002451"/>
+        <w:spacing w:after="0" w:line="285" w:lineRule="atLeast"/>
+        <w:rPr>
+          <w:rFonts w:ascii="Consolas" w:eastAsia="Times New Roman" w:hAnsi="Consolas" w:cs="Times New Roman"/>
+          <w:color w:val="FFFFFF"/>
+          <w:sz w:val="21"/>
+          <w:szCs w:val="21"/>
+        </w:rPr>
+      </w:pPr>
+      <w:r>
+        <w:rPr>
+          <w:rFonts w:ascii="Consolas" w:eastAsia="Times New Roman" w:hAnsi="Consolas" w:cs="Times New Roman"/>
+          <w:color w:val="7285B7"/>
+          <w:sz w:val="21"/>
+          <w:szCs w:val="21"/>
+        </w:rPr>
+        <w:lastRenderedPageBreak/>
+        <w:t>    //</w:t>
+      </w:r>
+      <w:proofErr w:type="spellStart"/>
+      <w:r>
+        <w:rPr>
+          <w:rFonts w:ascii="Consolas" w:eastAsia="Times New Roman" w:hAnsi="Consolas" w:cs="Times New Roman"/>
+          <w:color w:val="7285B7"/>
+          <w:sz w:val="21"/>
+          <w:szCs w:val="21"/>
+        </w:rPr>
+        <w:t>cmath</w:t>
+      </w:r>
+      <w:proofErr w:type="spellEnd"/>
+      <w:r>
+        <w:rPr>
+          <w:rFonts w:ascii="Consolas" w:eastAsia="Times New Roman" w:hAnsi="Consolas" w:cs="Times New Roman"/>
+          <w:color w:val="7285B7"/>
+          <w:sz w:val="21"/>
+          <w:szCs w:val="21"/>
+        </w:rPr>
+        <w:t xml:space="preserve"> power and natural log used, optimised math performance by performing minimal amount of resource intensive exponentiation and logarithms.</w:t>
+      </w:r>
+    </w:p>
+    <w:p>
+      <w:pPr>
+        <w:shd w:val="clear" w:color="auto" w:fill="002451"/>
+        <w:spacing w:after="0" w:line="285" w:lineRule="atLeast"/>
+        <w:rPr>
+          <w:rFonts w:ascii="Consolas" w:eastAsia="Times New Roman" w:hAnsi="Consolas" w:cs="Times New Roman"/>
+          <w:color w:val="FFFFFF"/>
+          <w:sz w:val="21"/>
+          <w:szCs w:val="21"/>
+        </w:rPr>
+      </w:pPr>
+      <w:r>
+        <w:rPr>
+          <w:rFonts w:ascii="Consolas" w:eastAsia="Times New Roman" w:hAnsi="Consolas" w:cs="Times New Roman"/>
+          <w:color w:val="FFFFFF"/>
+          <w:sz w:val="21"/>
+          <w:szCs w:val="21"/>
+        </w:rPr>
+        <w:t xml:space="preserve">    </w:t>
+      </w:r>
+      <w:proofErr w:type="spellStart"/>
+      <w:r>
+        <w:rPr>
+          <w:rFonts w:ascii="Consolas" w:eastAsia="Times New Roman" w:hAnsi="Consolas" w:cs="Times New Roman"/>
+          <w:color w:val="FFC58F"/>
+          <w:sz w:val="21"/>
+          <w:szCs w:val="21"/>
+        </w:rPr>
+        <w:t>temperature_c</w:t>
+      </w:r>
+      <w:proofErr w:type="spellEnd"/>
+      <w:r>
+        <w:rPr>
+          <w:rFonts w:ascii="Consolas" w:eastAsia="Times New Roman" w:hAnsi="Consolas" w:cs="Times New Roman"/>
+          <w:color w:val="FFFFFF"/>
+          <w:sz w:val="21"/>
+          <w:szCs w:val="21"/>
+        </w:rPr>
+        <w:t xml:space="preserve"> </w:t>
+      </w:r>
+      <w:r>
+        <w:rPr>
+          <w:rFonts w:ascii="Consolas" w:eastAsia="Times New Roman" w:hAnsi="Consolas" w:cs="Times New Roman"/>
+          <w:color w:val="99FFFF"/>
+          <w:sz w:val="21"/>
+          <w:szCs w:val="21"/>
+        </w:rPr>
+        <w:t>=</w:t>
+      </w:r>
+      <w:r>
+        <w:rPr>
+          <w:rFonts w:ascii="Consolas" w:eastAsia="Times New Roman" w:hAnsi="Consolas" w:cs="Times New Roman"/>
+          <w:color w:val="FFFFFF"/>
+          <w:sz w:val="21"/>
+          <w:szCs w:val="21"/>
+        </w:rPr>
+        <w:t xml:space="preserve"> </w:t>
+      </w:r>
+      <w:proofErr w:type="gramStart"/>
+      <w:r>
+        <w:rPr>
+          <w:rFonts w:ascii="Consolas" w:eastAsia="Times New Roman" w:hAnsi="Consolas" w:cs="Times New Roman"/>
+          <w:color w:val="BBDAFF"/>
+          <w:sz w:val="21"/>
+          <w:szCs w:val="21"/>
+        </w:rPr>
+        <w:t>pow</w:t>
+      </w:r>
+      <w:r>
+        <w:rPr>
+          <w:rFonts w:ascii="Consolas" w:eastAsia="Times New Roman" w:hAnsi="Consolas" w:cs="Times New Roman"/>
+          <w:color w:val="FFFFFF"/>
+          <w:sz w:val="21"/>
+          <w:szCs w:val="21"/>
+        </w:rPr>
+        <w:t>(</w:t>
+      </w:r>
+      <w:proofErr w:type="gramEnd"/>
+      <w:r>
+        <w:rPr>
+          <w:rFonts w:ascii="Consolas" w:eastAsia="Times New Roman" w:hAnsi="Consolas" w:cs="Times New Roman"/>
+          <w:color w:val="FFFFFF"/>
+          <w:sz w:val="21"/>
+          <w:szCs w:val="21"/>
+        </w:rPr>
+        <w:t>((</w:t>
+      </w:r>
+      <w:proofErr w:type="gramStart"/>
+      <w:r>
+        <w:rPr>
+          <w:rFonts w:ascii="Consolas" w:eastAsia="Times New Roman" w:hAnsi="Consolas" w:cs="Times New Roman"/>
+          <w:color w:val="BBDAFF"/>
+          <w:sz w:val="21"/>
+          <w:szCs w:val="21"/>
+        </w:rPr>
+        <w:t>log</w:t>
+      </w:r>
+      <w:r>
+        <w:rPr>
+          <w:rFonts w:ascii="Consolas" w:eastAsia="Times New Roman" w:hAnsi="Consolas" w:cs="Times New Roman"/>
+          <w:color w:val="FFFFFF"/>
+          <w:sz w:val="21"/>
+          <w:szCs w:val="21"/>
+        </w:rPr>
+        <w:t>(</w:t>
+      </w:r>
+      <w:proofErr w:type="spellStart"/>
+      <w:proofErr w:type="gramEnd"/>
+      <w:r>
+        <w:rPr>
+          <w:rFonts w:ascii="Consolas" w:eastAsia="Times New Roman" w:hAnsi="Consolas" w:cs="Times New Roman"/>
+          <w:color w:val="FF9DA4"/>
+          <w:sz w:val="21"/>
+          <w:szCs w:val="21"/>
+        </w:rPr>
+        <w:t>RThermistor</w:t>
+      </w:r>
+      <w:proofErr w:type="spellEnd"/>
+      <w:r>
+        <w:rPr>
+          <w:rFonts w:ascii="Consolas" w:eastAsia="Times New Roman" w:hAnsi="Consolas" w:cs="Times New Roman"/>
+          <w:color w:val="FFFFFF"/>
+          <w:sz w:val="21"/>
+          <w:szCs w:val="21"/>
+        </w:rPr>
+        <w:t xml:space="preserve"> </w:t>
+      </w:r>
+      <w:r>
+        <w:rPr>
+          <w:rFonts w:ascii="Consolas" w:eastAsia="Times New Roman" w:hAnsi="Consolas" w:cs="Times New Roman"/>
+          <w:color w:val="99FFFF"/>
+          <w:sz w:val="21"/>
+          <w:szCs w:val="21"/>
+        </w:rPr>
+        <w:t>/</w:t>
+      </w:r>
+      <w:r>
+        <w:rPr>
+          <w:rFonts w:ascii="Consolas" w:eastAsia="Times New Roman" w:hAnsi="Consolas" w:cs="Times New Roman"/>
+          <w:color w:val="FFFFFF"/>
+          <w:sz w:val="21"/>
+          <w:szCs w:val="21"/>
+        </w:rPr>
+        <w:t xml:space="preserve"> </w:t>
+      </w:r>
+      <w:r>
+        <w:rPr>
+          <w:rFonts w:ascii="Consolas" w:eastAsia="Times New Roman" w:hAnsi="Consolas" w:cs="Times New Roman"/>
+          <w:color w:val="FF9DA4"/>
+          <w:sz w:val="21"/>
+          <w:szCs w:val="21"/>
+        </w:rPr>
+        <w:t>RThermistor25Baseline</w:t>
+      </w:r>
+      <w:r>
+        <w:rPr>
+          <w:rFonts w:ascii="Consolas" w:eastAsia="Times New Roman" w:hAnsi="Consolas" w:cs="Times New Roman"/>
+          <w:color w:val="FFFFFF"/>
+          <w:sz w:val="21"/>
+          <w:szCs w:val="21"/>
+        </w:rPr>
+        <w:t xml:space="preserve">) </w:t>
+      </w:r>
+      <w:r>
+        <w:rPr>
+          <w:rFonts w:ascii="Consolas" w:eastAsia="Times New Roman" w:hAnsi="Consolas" w:cs="Times New Roman"/>
+          <w:color w:val="99FFFF"/>
+          <w:sz w:val="21"/>
+          <w:szCs w:val="21"/>
+        </w:rPr>
+        <w:t>/</w:t>
+      </w:r>
+      <w:r>
+        <w:rPr>
+          <w:rFonts w:ascii="Consolas" w:eastAsia="Times New Roman" w:hAnsi="Consolas" w:cs="Times New Roman"/>
+          <w:color w:val="FFFFFF"/>
+          <w:sz w:val="21"/>
+          <w:szCs w:val="21"/>
+        </w:rPr>
+        <w:t xml:space="preserve"> </w:t>
+      </w:r>
+      <w:r>
+        <w:rPr>
+          <w:rFonts w:ascii="Consolas" w:eastAsia="Times New Roman" w:hAnsi="Consolas" w:cs="Times New Roman"/>
+          <w:color w:val="FF9DA4"/>
+          <w:sz w:val="21"/>
+          <w:szCs w:val="21"/>
+        </w:rPr>
+        <w:t>BetaConstant2585</w:t>
+      </w:r>
+      <w:r>
+        <w:rPr>
+          <w:rFonts w:ascii="Consolas" w:eastAsia="Times New Roman" w:hAnsi="Consolas" w:cs="Times New Roman"/>
+          <w:color w:val="FFFFFF"/>
+          <w:sz w:val="21"/>
+          <w:szCs w:val="21"/>
+        </w:rPr>
+        <w:t xml:space="preserve">) </w:t>
+      </w:r>
+      <w:r>
+        <w:rPr>
+          <w:rFonts w:ascii="Consolas" w:eastAsia="Times New Roman" w:hAnsi="Consolas" w:cs="Times New Roman"/>
+          <w:color w:val="99FFFF"/>
+          <w:sz w:val="21"/>
+          <w:szCs w:val="21"/>
+        </w:rPr>
+        <w:t>+</w:t>
+      </w:r>
+      <w:r>
+        <w:rPr>
+          <w:rFonts w:ascii="Consolas" w:eastAsia="Times New Roman" w:hAnsi="Consolas" w:cs="Times New Roman"/>
+          <w:color w:val="FFFFFF"/>
+          <w:sz w:val="21"/>
+          <w:szCs w:val="21"/>
+        </w:rPr>
+        <w:t xml:space="preserve"> </w:t>
+      </w:r>
+      <w:proofErr w:type="gramStart"/>
+      <w:r>
+        <w:rPr>
+          <w:rFonts w:ascii="Consolas" w:eastAsia="Times New Roman" w:hAnsi="Consolas" w:cs="Times New Roman"/>
+          <w:color w:val="BBDAFF"/>
+          <w:sz w:val="21"/>
+          <w:szCs w:val="21"/>
+        </w:rPr>
+        <w:t>pow</w:t>
+      </w:r>
+      <w:r>
+        <w:rPr>
+          <w:rFonts w:ascii="Consolas" w:eastAsia="Times New Roman" w:hAnsi="Consolas" w:cs="Times New Roman"/>
+          <w:color w:val="FFFFFF"/>
+          <w:sz w:val="21"/>
+          <w:szCs w:val="21"/>
+        </w:rPr>
+        <w:t>(</w:t>
+      </w:r>
+      <w:proofErr w:type="spellStart"/>
+      <w:proofErr w:type="gramEnd"/>
+      <w:r>
+        <w:rPr>
+          <w:rFonts w:ascii="Consolas" w:eastAsia="Times New Roman" w:hAnsi="Consolas" w:cs="Times New Roman"/>
+          <w:color w:val="FF9DA4"/>
+          <w:sz w:val="21"/>
+          <w:szCs w:val="21"/>
+        </w:rPr>
+        <w:t>ThermistorBaselineTempKelvin</w:t>
+      </w:r>
+      <w:proofErr w:type="spellEnd"/>
+      <w:r>
+        <w:rPr>
+          <w:rFonts w:ascii="Consolas" w:eastAsia="Times New Roman" w:hAnsi="Consolas" w:cs="Times New Roman"/>
+          <w:color w:val="FFFFFF"/>
+          <w:sz w:val="21"/>
+          <w:szCs w:val="21"/>
+        </w:rPr>
+        <w:t xml:space="preserve">, </w:t>
+      </w:r>
+      <w:r>
+        <w:rPr>
+          <w:rFonts w:ascii="Consolas" w:eastAsia="Times New Roman" w:hAnsi="Consolas" w:cs="Times New Roman"/>
+          <w:color w:val="99FFFF"/>
+          <w:sz w:val="21"/>
+          <w:szCs w:val="21"/>
+        </w:rPr>
+        <w:t>-</w:t>
+      </w:r>
+      <w:r>
+        <w:rPr>
+          <w:rFonts w:ascii="Consolas" w:eastAsia="Times New Roman" w:hAnsi="Consolas" w:cs="Times New Roman"/>
+          <w:color w:val="FFC58F"/>
+          <w:sz w:val="21"/>
+          <w:szCs w:val="21"/>
+        </w:rPr>
+        <w:t>1</w:t>
+      </w:r>
+      <w:r>
+        <w:rPr>
+          <w:rFonts w:ascii="Consolas" w:eastAsia="Times New Roman" w:hAnsi="Consolas" w:cs="Times New Roman"/>
+          <w:color w:val="FFFFFF"/>
+          <w:sz w:val="21"/>
+          <w:szCs w:val="21"/>
+        </w:rPr>
+        <w:t xml:space="preserve">)), </w:t>
+      </w:r>
+      <w:r>
+        <w:rPr>
+          <w:rFonts w:ascii="Consolas" w:eastAsia="Times New Roman" w:hAnsi="Consolas" w:cs="Times New Roman"/>
+          <w:color w:val="99FFFF"/>
+          <w:sz w:val="21"/>
+          <w:szCs w:val="21"/>
+        </w:rPr>
+        <w:t>-</w:t>
+      </w:r>
+      <w:r>
+        <w:rPr>
+          <w:rFonts w:ascii="Consolas" w:eastAsia="Times New Roman" w:hAnsi="Consolas" w:cs="Times New Roman"/>
+          <w:color w:val="FFC58F"/>
+          <w:sz w:val="21"/>
+          <w:szCs w:val="21"/>
+        </w:rPr>
+        <w:t>1</w:t>
+      </w:r>
+      <w:r>
+        <w:rPr>
+          <w:rFonts w:ascii="Consolas" w:eastAsia="Times New Roman" w:hAnsi="Consolas" w:cs="Times New Roman"/>
+          <w:color w:val="FFFFFF"/>
+          <w:sz w:val="21"/>
+          <w:szCs w:val="21"/>
+        </w:rPr>
+        <w:t xml:space="preserve">) </w:t>
+      </w:r>
+      <w:r>
+        <w:rPr>
+          <w:rFonts w:ascii="Consolas" w:eastAsia="Times New Roman" w:hAnsi="Consolas" w:cs="Times New Roman"/>
+          <w:color w:val="99FFFF"/>
+          <w:sz w:val="21"/>
+          <w:szCs w:val="21"/>
+        </w:rPr>
+        <w:t>-</w:t>
+      </w:r>
+      <w:r>
+        <w:rPr>
+          <w:rFonts w:ascii="Consolas" w:eastAsia="Times New Roman" w:hAnsi="Consolas" w:cs="Times New Roman"/>
+          <w:color w:val="FFFFFF"/>
+          <w:sz w:val="21"/>
+          <w:szCs w:val="21"/>
+        </w:rPr>
+        <w:t xml:space="preserve"> </w:t>
+      </w:r>
+      <w:r>
+        <w:rPr>
+          <w:rFonts w:ascii="Consolas" w:eastAsia="Times New Roman" w:hAnsi="Consolas" w:cs="Times New Roman"/>
+          <w:color w:val="FFC58F"/>
+          <w:sz w:val="21"/>
+          <w:szCs w:val="21"/>
+        </w:rPr>
+        <w:t>273.15</w:t>
+      </w:r>
+      <w:r>
+        <w:rPr>
+          <w:rFonts w:ascii="Consolas" w:eastAsia="Times New Roman" w:hAnsi="Consolas" w:cs="Times New Roman"/>
+          <w:color w:val="FFFFFF"/>
+          <w:sz w:val="21"/>
+          <w:szCs w:val="21"/>
+        </w:rPr>
+        <w:t>;</w:t>
+      </w:r>
+    </w:p>
+    <w:p>
+      <w:pPr>
+        <w:shd w:val="clear" w:color="auto" w:fill="002451"/>
+        <w:spacing w:after="0" w:line="285" w:lineRule="atLeast"/>
+        <w:rPr>
+          <w:rFonts w:ascii="Consolas" w:eastAsia="Times New Roman" w:hAnsi="Consolas" w:cs="Times New Roman"/>
+          <w:color w:val="FFFFFF"/>
+          <w:sz w:val="21"/>
+          <w:szCs w:val="21"/>
+        </w:rPr>
+      </w:pPr>
+    </w:p>
+    <w:p>
+      <w:pPr>
+        <w:shd w:val="clear" w:color="auto" w:fill="002451"/>
+        <w:spacing w:after="0" w:line="285" w:lineRule="atLeast"/>
+        <w:rPr>
+          <w:rFonts w:ascii="Consolas" w:eastAsia="Times New Roman" w:hAnsi="Consolas" w:cs="Times New Roman"/>
+          <w:color w:val="FFFFFF"/>
+          <w:sz w:val="21"/>
+          <w:szCs w:val="21"/>
+        </w:rPr>
+      </w:pPr>
+      <w:r>
+        <w:rPr>
+          <w:rFonts w:ascii="Consolas" w:eastAsia="Times New Roman" w:hAnsi="Consolas" w:cs="Times New Roman"/>
+          <w:color w:val="7285B7"/>
+          <w:sz w:val="21"/>
+          <w:szCs w:val="21"/>
+        </w:rPr>
+        <w:t xml:space="preserve">    //Maths code tested </w:t>
+      </w:r>
+      <w:proofErr w:type="spellStart"/>
+      <w:r>
+        <w:rPr>
+          <w:rFonts w:ascii="Consolas" w:eastAsia="Times New Roman" w:hAnsi="Consolas" w:cs="Times New Roman"/>
+          <w:color w:val="7285B7"/>
+          <w:sz w:val="21"/>
+          <w:szCs w:val="21"/>
+        </w:rPr>
+        <w:t>seperately</w:t>
+      </w:r>
+      <w:proofErr w:type="spellEnd"/>
+      <w:r>
+        <w:rPr>
+          <w:rFonts w:ascii="Consolas" w:eastAsia="Times New Roman" w:hAnsi="Consolas" w:cs="Times New Roman"/>
+          <w:color w:val="7285B7"/>
+          <w:sz w:val="21"/>
+          <w:szCs w:val="21"/>
+        </w:rPr>
+        <w:t xml:space="preserve"> outputs expected value for different </w:t>
+      </w:r>
+      <w:proofErr w:type="spellStart"/>
+      <w:r>
+        <w:rPr>
+          <w:rFonts w:ascii="Consolas" w:eastAsia="Times New Roman" w:hAnsi="Consolas" w:cs="Times New Roman"/>
+          <w:color w:val="7285B7"/>
+          <w:sz w:val="21"/>
+          <w:szCs w:val="21"/>
+        </w:rPr>
+        <w:t>raw_adcs</w:t>
+      </w:r>
+      <w:proofErr w:type="spellEnd"/>
+      <w:r>
+        <w:rPr>
+          <w:rFonts w:ascii="Consolas" w:eastAsia="Times New Roman" w:hAnsi="Consolas" w:cs="Times New Roman"/>
+          <w:color w:val="7285B7"/>
+          <w:sz w:val="21"/>
+          <w:szCs w:val="21"/>
+        </w:rPr>
+        <w:t>.</w:t>
+      </w:r>
+    </w:p>
+    <w:p>
+      <w:pPr>
+        <w:shd w:val="clear" w:color="auto" w:fill="002451"/>
+        <w:spacing w:after="0" w:line="285" w:lineRule="atLeast"/>
+        <w:rPr>
+          <w:rFonts w:ascii="Consolas" w:eastAsia="Times New Roman" w:hAnsi="Consolas" w:cs="Times New Roman"/>
+          <w:color w:val="FFFFFF"/>
+          <w:sz w:val="21"/>
+          <w:szCs w:val="21"/>
+        </w:rPr>
+      </w:pPr>
+    </w:p>
+    <w:p>
+      <w:pPr>
+        <w:shd w:val="clear" w:color="auto" w:fill="002451"/>
+        <w:spacing w:after="0" w:line="285" w:lineRule="atLeast"/>
+        <w:rPr>
+          <w:rFonts w:ascii="Consolas" w:eastAsia="Times New Roman" w:hAnsi="Consolas" w:cs="Times New Roman"/>
+          <w:color w:val="FFFFFF"/>
+          <w:sz w:val="21"/>
+          <w:szCs w:val="21"/>
+        </w:rPr>
+      </w:pPr>
+      <w:r>
+        <w:rPr>
+          <w:rFonts w:ascii="Consolas" w:eastAsia="Times New Roman" w:hAnsi="Consolas" w:cs="Times New Roman"/>
+          <w:color w:val="FFFFFF"/>
+          <w:sz w:val="21"/>
+          <w:szCs w:val="21"/>
+        </w:rPr>
+        <w:t xml:space="preserve">    </w:t>
+      </w:r>
+      <w:r>
+        <w:rPr>
+          <w:rFonts w:ascii="Consolas" w:eastAsia="Times New Roman" w:hAnsi="Consolas" w:cs="Times New Roman"/>
+          <w:color w:val="EBBBFF"/>
+          <w:sz w:val="21"/>
+          <w:szCs w:val="21"/>
+        </w:rPr>
+        <w:t>return</w:t>
+      </w:r>
+      <w:r>
+        <w:rPr>
+          <w:rFonts w:ascii="Consolas" w:eastAsia="Times New Roman" w:hAnsi="Consolas" w:cs="Times New Roman"/>
+          <w:color w:val="FFFFFF"/>
+          <w:sz w:val="21"/>
+          <w:szCs w:val="21"/>
+        </w:rPr>
+        <w:t xml:space="preserve"> </w:t>
+      </w:r>
+      <w:proofErr w:type="gramStart"/>
+      <w:r>
+        <w:rPr>
+          <w:rFonts w:ascii="Consolas" w:eastAsia="Times New Roman" w:hAnsi="Consolas" w:cs="Times New Roman"/>
+          <w:color w:val="FFEEAD"/>
+          <w:sz w:val="21"/>
+          <w:szCs w:val="21"/>
+        </w:rPr>
+        <w:t>std</w:t>
+      </w:r>
+      <w:r>
+        <w:rPr>
+          <w:rFonts w:ascii="Consolas" w:eastAsia="Times New Roman" w:hAnsi="Consolas" w:cs="Times New Roman"/>
+          <w:color w:val="FFFFFF"/>
+          <w:sz w:val="21"/>
+          <w:szCs w:val="21"/>
+        </w:rPr>
+        <w:t>::</w:t>
+      </w:r>
+      <w:proofErr w:type="spellStart"/>
+      <w:proofErr w:type="gramEnd"/>
+      <w:r>
+        <w:rPr>
+          <w:rFonts w:ascii="Consolas" w:eastAsia="Times New Roman" w:hAnsi="Consolas" w:cs="Times New Roman"/>
+          <w:color w:val="BBDAFF"/>
+          <w:sz w:val="21"/>
+          <w:szCs w:val="21"/>
+        </w:rPr>
+        <w:t>isfinite</w:t>
+      </w:r>
+      <w:proofErr w:type="spellEnd"/>
+      <w:r>
+        <w:rPr>
+          <w:rFonts w:ascii="Consolas" w:eastAsia="Times New Roman" w:hAnsi="Consolas" w:cs="Times New Roman"/>
+          <w:color w:val="FFFFFF"/>
+          <w:sz w:val="21"/>
+          <w:szCs w:val="21"/>
+        </w:rPr>
+        <w:t>(</w:t>
+      </w:r>
+      <w:proofErr w:type="spellStart"/>
+      <w:r>
+        <w:rPr>
+          <w:rFonts w:ascii="Consolas" w:eastAsia="Times New Roman" w:hAnsi="Consolas" w:cs="Times New Roman"/>
+          <w:color w:val="FFC58F"/>
+          <w:sz w:val="21"/>
+          <w:szCs w:val="21"/>
+        </w:rPr>
+        <w:t>temperature_c</w:t>
+      </w:r>
+      <w:proofErr w:type="spellEnd"/>
+      <w:r>
+        <w:rPr>
+          <w:rFonts w:ascii="Consolas" w:eastAsia="Times New Roman" w:hAnsi="Consolas" w:cs="Times New Roman"/>
+          <w:color w:val="FFFFFF"/>
+          <w:sz w:val="21"/>
+          <w:szCs w:val="21"/>
+        </w:rPr>
+        <w:t>);</w:t>
+      </w:r>
+    </w:p>
+    <w:p>
+      <w:pPr>
+        <w:shd w:val="clear" w:color="auto" w:fill="002451"/>
+        <w:spacing w:after="0" w:line="285" w:lineRule="atLeast"/>
+        <w:rPr>
+          <w:rFonts w:ascii="Consolas" w:eastAsia="Times New Roman" w:hAnsi="Consolas" w:cs="Times New Roman"/>
+          <w:color w:val="FFFFFF"/>
+          <w:sz w:val="21"/>
+          <w:szCs w:val="21"/>
+        </w:rPr>
+      </w:pPr>
+      <w:r>
+        <w:rPr>
+          <w:rFonts w:ascii="Consolas" w:eastAsia="Times New Roman" w:hAnsi="Consolas" w:cs="Times New Roman"/>
+          <w:color w:val="FFFFFF"/>
+          <w:sz w:val="21"/>
+          <w:szCs w:val="21"/>
+        </w:rPr>
+        <w:t>}</w:t>
+      </w:r>
+    </w:p>
+    <w:p>
+      <w:pPr>
+        <w:shd w:val="clear" w:color="auto" w:fill="002451"/>
+        <w:spacing w:after="0" w:line="285" w:lineRule="atLeast"/>
+        <w:rPr>
+          <w:rFonts w:ascii="Consolas" w:eastAsia="Times New Roman" w:hAnsi="Consolas" w:cs="Times New Roman"/>
+          <w:color w:val="FFFFFF"/>
+          <w:sz w:val="21"/>
+          <w:szCs w:val="21"/>
+        </w:rPr>
+      </w:pPr>
+    </w:p>
+    <w:p>
+      <w:pPr>
+        <w:shd w:val="clear" w:color="auto" w:fill="002451"/>
+        <w:spacing w:after="0" w:line="285" w:lineRule="atLeast"/>
+        <w:rPr>
+          <w:rFonts w:ascii="Consolas" w:eastAsia="Times New Roman" w:hAnsi="Consolas" w:cs="Times New Roman"/>
+          <w:color w:val="FFFFFF"/>
+          <w:sz w:val="21"/>
+          <w:szCs w:val="21"/>
+        </w:rPr>
+      </w:pPr>
+      <w:r>
+        <w:rPr>
+          <w:rFonts w:ascii="Consolas" w:eastAsia="Times New Roman" w:hAnsi="Consolas" w:cs="Times New Roman"/>
+          <w:color w:val="7285B7"/>
+          <w:sz w:val="21"/>
+          <w:szCs w:val="21"/>
+        </w:rPr>
+        <w:t>//File size is 2KB, should fit easily within Microcontroller's ROM capacity of 384KB.</w:t>
+      </w:r>
+    </w:p>
+    <w:p/>
+    <w:p>
+      <w:r>
+        <w:t>CAN Task</w:t>
+      </w:r>
+    </w:p>
+    <w:p>
+      <w:pPr>
+        <w:shd w:val="clear" w:color="auto" w:fill="002451"/>
+        <w:spacing w:after="0" w:line="285" w:lineRule="atLeast"/>
+        <w:rPr>
+          <w:rFonts w:ascii="Consolas" w:eastAsia="Times New Roman" w:hAnsi="Consolas" w:cs="Times New Roman"/>
+          <w:color w:val="FFFFFF"/>
+          <w:sz w:val="21"/>
+          <w:szCs w:val="21"/>
+        </w:rPr>
+      </w:pPr>
+      <w:r>
+        <w:rPr>
+          <w:rFonts w:ascii="Consolas" w:eastAsia="Times New Roman" w:hAnsi="Consolas" w:cs="Times New Roman"/>
+          <w:color w:val="EBBBFF"/>
+          <w:sz w:val="21"/>
+          <w:szCs w:val="21"/>
+        </w:rPr>
+        <w:t>#include</w:t>
+      </w:r>
+      <w:r>
+        <w:rPr>
+          <w:rFonts w:ascii="Consolas" w:eastAsia="Times New Roman" w:hAnsi="Consolas" w:cs="Times New Roman"/>
+          <w:color w:val="FFFFFF"/>
+          <w:sz w:val="21"/>
+          <w:szCs w:val="21"/>
+        </w:rPr>
+        <w:t xml:space="preserve"> </w:t>
+      </w:r>
+      <w:r>
+        <w:rPr>
+          <w:rFonts w:ascii="Consolas" w:eastAsia="Times New Roman" w:hAnsi="Consolas" w:cs="Times New Roman"/>
+          <w:color w:val="D1F1A9"/>
+          <w:sz w:val="21"/>
+          <w:szCs w:val="21"/>
+        </w:rPr>
+        <w:t>"</w:t>
+      </w:r>
+      <w:proofErr w:type="spellStart"/>
+      <w:r>
+        <w:rPr>
+          <w:rFonts w:ascii="Consolas" w:eastAsia="Times New Roman" w:hAnsi="Consolas" w:cs="Times New Roman"/>
+          <w:color w:val="D1F1A9"/>
+          <w:sz w:val="21"/>
+          <w:szCs w:val="21"/>
+        </w:rPr>
+        <w:t>challenge.h</w:t>
+      </w:r>
+      <w:proofErr w:type="spellEnd"/>
+      <w:r>
+        <w:rPr>
+          <w:rFonts w:ascii="Consolas" w:eastAsia="Times New Roman" w:hAnsi="Consolas" w:cs="Times New Roman"/>
+          <w:color w:val="D1F1A9"/>
+          <w:sz w:val="21"/>
+          <w:szCs w:val="21"/>
+        </w:rPr>
+        <w:t>"</w:t>
+      </w:r>
+    </w:p>
+    <w:p>
+      <w:pPr>
+        <w:shd w:val="clear" w:color="auto" w:fill="002451"/>
+        <w:spacing w:after="0" w:line="285" w:lineRule="atLeast"/>
+        <w:rPr>
+          <w:rFonts w:ascii="Consolas" w:eastAsia="Times New Roman" w:hAnsi="Consolas" w:cs="Times New Roman"/>
+          <w:color w:val="FFFFFF"/>
+          <w:sz w:val="21"/>
+          <w:szCs w:val="21"/>
+        </w:rPr>
+      </w:pPr>
+      <w:r>
+        <w:rPr>
+          <w:rFonts w:ascii="Consolas" w:eastAsia="Times New Roman" w:hAnsi="Consolas" w:cs="Times New Roman"/>
+          <w:color w:val="EBBBFF"/>
+          <w:sz w:val="21"/>
+          <w:szCs w:val="21"/>
+        </w:rPr>
+        <w:t>#include</w:t>
+      </w:r>
+      <w:r>
+        <w:rPr>
+          <w:rFonts w:ascii="Consolas" w:eastAsia="Times New Roman" w:hAnsi="Consolas" w:cs="Times New Roman"/>
+          <w:color w:val="FFFFFF"/>
+          <w:sz w:val="21"/>
+          <w:szCs w:val="21"/>
+        </w:rPr>
+        <w:t xml:space="preserve"> </w:t>
+      </w:r>
+      <w:r>
+        <w:rPr>
+          <w:rFonts w:ascii="Consolas" w:eastAsia="Times New Roman" w:hAnsi="Consolas" w:cs="Times New Roman"/>
+          <w:color w:val="D1F1A9"/>
+          <w:sz w:val="21"/>
+          <w:szCs w:val="21"/>
+        </w:rPr>
+        <w:t>"MSM_CAN.hpp"</w:t>
+      </w:r>
+    </w:p>
+    <w:p>
+      <w:pPr>
+        <w:shd w:val="clear" w:color="auto" w:fill="002451"/>
+        <w:spacing w:after="0" w:line="285" w:lineRule="atLeast"/>
+        <w:rPr>
+          <w:rFonts w:ascii="Consolas" w:eastAsia="Times New Roman" w:hAnsi="Consolas" w:cs="Times New Roman"/>
+          <w:color w:val="FFFFFF"/>
+          <w:sz w:val="21"/>
+          <w:szCs w:val="21"/>
+        </w:rPr>
+      </w:pPr>
+      <w:r>
+        <w:rPr>
+          <w:rFonts w:ascii="Consolas" w:eastAsia="Times New Roman" w:hAnsi="Consolas" w:cs="Times New Roman"/>
+          <w:color w:val="EBBBFF"/>
+          <w:sz w:val="21"/>
+          <w:szCs w:val="21"/>
+        </w:rPr>
+        <w:t>#include</w:t>
+      </w:r>
+      <w:r>
+        <w:rPr>
+          <w:rFonts w:ascii="Consolas" w:eastAsia="Times New Roman" w:hAnsi="Consolas" w:cs="Times New Roman"/>
+          <w:color w:val="FFFFFF"/>
+          <w:sz w:val="21"/>
+          <w:szCs w:val="21"/>
+        </w:rPr>
+        <w:t xml:space="preserve"> </w:t>
+      </w:r>
+      <w:r>
+        <w:rPr>
+          <w:rFonts w:ascii="Consolas" w:eastAsia="Times New Roman" w:hAnsi="Consolas" w:cs="Times New Roman"/>
+          <w:color w:val="D1F1A9"/>
+          <w:sz w:val="21"/>
+          <w:szCs w:val="21"/>
+        </w:rPr>
+        <w:t>&lt;</w:t>
+      </w:r>
+      <w:proofErr w:type="spellStart"/>
+      <w:r>
+        <w:rPr>
+          <w:rFonts w:ascii="Consolas" w:eastAsia="Times New Roman" w:hAnsi="Consolas" w:cs="Times New Roman"/>
+          <w:color w:val="D1F1A9"/>
+          <w:sz w:val="21"/>
+          <w:szCs w:val="21"/>
+        </w:rPr>
+        <w:t>cmath</w:t>
+      </w:r>
+      <w:proofErr w:type="spellEnd"/>
+      <w:r>
+        <w:rPr>
+          <w:rFonts w:ascii="Consolas" w:eastAsia="Times New Roman" w:hAnsi="Consolas" w:cs="Times New Roman"/>
+          <w:color w:val="D1F1A9"/>
+          <w:sz w:val="21"/>
+          <w:szCs w:val="21"/>
+        </w:rPr>
+        <w:t>&gt;</w:t>
+      </w:r>
+    </w:p>
+    <w:p>
+      <w:pPr>
+        <w:shd w:val="clear" w:color="auto" w:fill="002451"/>
+        <w:spacing w:after="0" w:line="285" w:lineRule="atLeast"/>
+        <w:rPr>
+          <w:rFonts w:ascii="Consolas" w:eastAsia="Times New Roman" w:hAnsi="Consolas" w:cs="Times New Roman"/>
+          <w:color w:val="FFFFFF"/>
+          <w:sz w:val="21"/>
+          <w:szCs w:val="21"/>
+        </w:rPr>
+      </w:pPr>
+    </w:p>
+    <w:p>
+      <w:pPr>
+        <w:shd w:val="clear" w:color="auto" w:fill="002451"/>
+        <w:spacing w:after="0" w:line="285" w:lineRule="atLeast"/>
+        <w:rPr>
+          <w:rFonts w:ascii="Consolas" w:eastAsia="Times New Roman" w:hAnsi="Consolas" w:cs="Times New Roman"/>
+          <w:color w:val="FFFFFF"/>
+          <w:sz w:val="21"/>
+          <w:szCs w:val="21"/>
+        </w:rPr>
+      </w:pPr>
+      <w:r>
+        <w:rPr>
+          <w:rFonts w:ascii="Consolas" w:eastAsia="Times New Roman" w:hAnsi="Consolas" w:cs="Times New Roman"/>
+          <w:color w:val="7285B7"/>
+          <w:sz w:val="21"/>
+          <w:szCs w:val="21"/>
+        </w:rPr>
+        <w:t xml:space="preserve">// Pack </w:t>
+      </w:r>
+      <w:proofErr w:type="spellStart"/>
+      <w:r>
+        <w:rPr>
+          <w:rFonts w:ascii="Consolas" w:eastAsia="Times New Roman" w:hAnsi="Consolas" w:cs="Times New Roman"/>
+          <w:color w:val="7285B7"/>
+          <w:sz w:val="21"/>
+          <w:szCs w:val="21"/>
+        </w:rPr>
+        <w:t>temperature_c</w:t>
+      </w:r>
+      <w:proofErr w:type="spellEnd"/>
+      <w:r>
+        <w:rPr>
+          <w:rFonts w:ascii="Consolas" w:eastAsia="Times New Roman" w:hAnsi="Consolas" w:cs="Times New Roman"/>
+          <w:color w:val="7285B7"/>
+          <w:sz w:val="21"/>
+          <w:szCs w:val="21"/>
+        </w:rPr>
+        <w:t xml:space="preserve"> multiplied by 10, then send the message.</w:t>
+      </w:r>
+    </w:p>
+    <w:p>
+      <w:pPr>
+        <w:shd w:val="clear" w:color="auto" w:fill="002451"/>
+        <w:spacing w:after="0" w:line="285" w:lineRule="atLeast"/>
+        <w:rPr>
+          <w:rFonts w:ascii="Consolas" w:eastAsia="Times New Roman" w:hAnsi="Consolas" w:cs="Times New Roman"/>
+          <w:color w:val="FFFFFF"/>
+          <w:sz w:val="21"/>
+          <w:szCs w:val="21"/>
+        </w:rPr>
+      </w:pPr>
+      <w:r>
+        <w:rPr>
+          <w:rFonts w:ascii="Consolas" w:eastAsia="Times New Roman" w:hAnsi="Consolas" w:cs="Times New Roman"/>
+          <w:color w:val="EBBBFF"/>
+          <w:sz w:val="21"/>
+          <w:szCs w:val="21"/>
+        </w:rPr>
+        <w:t>void</w:t>
+      </w:r>
+      <w:r>
+        <w:rPr>
+          <w:rFonts w:ascii="Consolas" w:eastAsia="Times New Roman" w:hAnsi="Consolas" w:cs="Times New Roman"/>
+          <w:color w:val="FFFFFF"/>
+          <w:sz w:val="21"/>
+          <w:szCs w:val="21"/>
+        </w:rPr>
+        <w:t xml:space="preserve"> </w:t>
+      </w:r>
+      <w:proofErr w:type="spellStart"/>
+      <w:r>
+        <w:rPr>
+          <w:rFonts w:ascii="Consolas" w:eastAsia="Times New Roman" w:hAnsi="Consolas" w:cs="Times New Roman"/>
+          <w:color w:val="BBDAFF"/>
+          <w:sz w:val="21"/>
+          <w:szCs w:val="21"/>
+        </w:rPr>
+        <w:t>can_send_</w:t>
+      </w:r>
+      <w:proofErr w:type="gramStart"/>
+      <w:r>
+        <w:rPr>
+          <w:rFonts w:ascii="Consolas" w:eastAsia="Times New Roman" w:hAnsi="Consolas" w:cs="Times New Roman"/>
+          <w:color w:val="BBDAFF"/>
+          <w:sz w:val="21"/>
+          <w:szCs w:val="21"/>
+        </w:rPr>
+        <w:t>temperature</w:t>
+      </w:r>
+      <w:proofErr w:type="spellEnd"/>
+      <w:r>
+        <w:rPr>
+          <w:rFonts w:ascii="Consolas" w:eastAsia="Times New Roman" w:hAnsi="Consolas" w:cs="Times New Roman"/>
+          <w:color w:val="FFFFFF"/>
+          <w:sz w:val="21"/>
+          <w:szCs w:val="21"/>
+        </w:rPr>
+        <w:t>(</w:t>
+      </w:r>
+      <w:proofErr w:type="gramEnd"/>
+      <w:r>
+        <w:rPr>
+          <w:rFonts w:ascii="Consolas" w:eastAsia="Times New Roman" w:hAnsi="Consolas" w:cs="Times New Roman"/>
+          <w:color w:val="EBBBFF"/>
+          <w:sz w:val="21"/>
+          <w:szCs w:val="21"/>
+        </w:rPr>
+        <w:t>float</w:t>
+      </w:r>
+      <w:r>
+        <w:rPr>
+          <w:rFonts w:ascii="Consolas" w:eastAsia="Times New Roman" w:hAnsi="Consolas" w:cs="Times New Roman"/>
+          <w:color w:val="FFFFFF"/>
+          <w:sz w:val="21"/>
+          <w:szCs w:val="21"/>
+        </w:rPr>
+        <w:t xml:space="preserve"> </w:t>
+      </w:r>
+      <w:proofErr w:type="spellStart"/>
+      <w:r>
+        <w:rPr>
+          <w:rFonts w:ascii="Consolas" w:eastAsia="Times New Roman" w:hAnsi="Consolas" w:cs="Times New Roman"/>
+          <w:color w:val="FFC58F"/>
+          <w:sz w:val="21"/>
+          <w:szCs w:val="21"/>
+        </w:rPr>
+        <w:t>temperature_c</w:t>
+      </w:r>
+      <w:proofErr w:type="spellEnd"/>
+      <w:r>
+        <w:rPr>
+          <w:rFonts w:ascii="Consolas" w:eastAsia="Times New Roman" w:hAnsi="Consolas" w:cs="Times New Roman"/>
+          <w:color w:val="FFFFFF"/>
+          <w:sz w:val="21"/>
+          <w:szCs w:val="21"/>
+        </w:rPr>
+        <w:t>)</w:t>
+      </w:r>
+    </w:p>
+    <w:p>
+      <w:pPr>
+        <w:shd w:val="clear" w:color="auto" w:fill="002451"/>
+        <w:spacing w:after="0" w:line="285" w:lineRule="atLeast"/>
+        <w:rPr>
+          <w:rFonts w:ascii="Consolas" w:eastAsia="Times New Roman" w:hAnsi="Consolas" w:cs="Times New Roman"/>
+          <w:color w:val="FFFFFF"/>
+          <w:sz w:val="21"/>
+          <w:szCs w:val="21"/>
+        </w:rPr>
+      </w:pPr>
+      <w:r>
+        <w:rPr>
+          <w:rFonts w:ascii="Consolas" w:eastAsia="Times New Roman" w:hAnsi="Consolas" w:cs="Times New Roman"/>
+          <w:color w:val="FFFFFF"/>
+          <w:sz w:val="21"/>
+          <w:szCs w:val="21"/>
+        </w:rPr>
+        <w:t>{</w:t>
+      </w:r>
+    </w:p>
+    <w:p>
+      <w:pPr>
+        <w:shd w:val="clear" w:color="auto" w:fill="002451"/>
+        <w:spacing w:after="0" w:line="285" w:lineRule="atLeast"/>
+        <w:rPr>
+          <w:rFonts w:ascii="Consolas" w:eastAsia="Times New Roman" w:hAnsi="Consolas" w:cs="Times New Roman"/>
+          <w:color w:val="FFFFFF"/>
+          <w:sz w:val="21"/>
+          <w:szCs w:val="21"/>
+        </w:rPr>
+      </w:pPr>
+      <w:r>
+        <w:rPr>
+          <w:rFonts w:ascii="Consolas" w:eastAsia="Times New Roman" w:hAnsi="Consolas" w:cs="Times New Roman"/>
+          <w:color w:val="FFFFFF"/>
+          <w:sz w:val="21"/>
+          <w:szCs w:val="21"/>
+        </w:rPr>
+        <w:t xml:space="preserve">    </w:t>
+      </w:r>
+      <w:r>
+        <w:rPr>
+          <w:rFonts w:ascii="Consolas" w:eastAsia="Times New Roman" w:hAnsi="Consolas" w:cs="Times New Roman"/>
+          <w:color w:val="FFEEAD"/>
+          <w:sz w:val="21"/>
+          <w:szCs w:val="21"/>
+        </w:rPr>
+        <w:t>MSM_</w:t>
+      </w:r>
+      <w:proofErr w:type="gramStart"/>
+      <w:r>
+        <w:rPr>
+          <w:rFonts w:ascii="Consolas" w:eastAsia="Times New Roman" w:hAnsi="Consolas" w:cs="Times New Roman"/>
+          <w:color w:val="FFEEAD"/>
+          <w:sz w:val="21"/>
+          <w:szCs w:val="21"/>
+        </w:rPr>
+        <w:t>CAN</w:t>
+      </w:r>
+      <w:r>
+        <w:rPr>
+          <w:rFonts w:ascii="Consolas" w:eastAsia="Times New Roman" w:hAnsi="Consolas" w:cs="Times New Roman"/>
+          <w:color w:val="FFFFFF"/>
+          <w:sz w:val="21"/>
+          <w:szCs w:val="21"/>
+        </w:rPr>
+        <w:t>::</w:t>
+      </w:r>
+      <w:proofErr w:type="spellStart"/>
+      <w:proofErr w:type="gramEnd"/>
+      <w:r>
+        <w:rPr>
+          <w:rFonts w:ascii="Consolas" w:eastAsia="Times New Roman" w:hAnsi="Consolas" w:cs="Times New Roman"/>
+          <w:color w:val="FFEEAD"/>
+          <w:sz w:val="21"/>
+          <w:szCs w:val="21"/>
+        </w:rPr>
+        <w:t>TxFrame</w:t>
+      </w:r>
+      <w:proofErr w:type="spellEnd"/>
+      <w:r>
+        <w:rPr>
+          <w:rFonts w:ascii="Consolas" w:eastAsia="Times New Roman" w:hAnsi="Consolas" w:cs="Times New Roman"/>
+          <w:color w:val="FFFFFF"/>
+          <w:sz w:val="21"/>
+          <w:szCs w:val="21"/>
+        </w:rPr>
+        <w:t xml:space="preserve"> </w:t>
+      </w:r>
+      <w:proofErr w:type="gramStart"/>
+      <w:r>
+        <w:rPr>
+          <w:rFonts w:ascii="Consolas" w:eastAsia="Times New Roman" w:hAnsi="Consolas" w:cs="Times New Roman"/>
+          <w:color w:val="FF9DA4"/>
+          <w:sz w:val="21"/>
+          <w:szCs w:val="21"/>
+        </w:rPr>
+        <w:t>frame</w:t>
+      </w:r>
+      <w:r>
+        <w:rPr>
+          <w:rFonts w:ascii="Consolas" w:eastAsia="Times New Roman" w:hAnsi="Consolas" w:cs="Times New Roman"/>
+          <w:color w:val="FFFFFF"/>
+          <w:sz w:val="21"/>
+          <w:szCs w:val="21"/>
+        </w:rPr>
+        <w:t>{</w:t>
+      </w:r>
+      <w:proofErr w:type="gramEnd"/>
+      <w:r>
+        <w:rPr>
+          <w:rFonts w:ascii="Consolas" w:eastAsia="Times New Roman" w:hAnsi="Consolas" w:cs="Times New Roman"/>
+          <w:color w:val="FFFFFF"/>
+          <w:sz w:val="21"/>
+          <w:szCs w:val="21"/>
+        </w:rPr>
+        <w:t>};</w:t>
+      </w:r>
+    </w:p>
+    <w:p>
+      <w:pPr>
+        <w:shd w:val="clear" w:color="auto" w:fill="002451"/>
+        <w:spacing w:after="0" w:line="285" w:lineRule="atLeast"/>
+        <w:rPr>
+          <w:rFonts w:ascii="Consolas" w:eastAsia="Times New Roman" w:hAnsi="Consolas" w:cs="Times New Roman"/>
+          <w:color w:val="FFFFFF"/>
+          <w:sz w:val="21"/>
+          <w:szCs w:val="21"/>
+        </w:rPr>
+      </w:pPr>
+      <w:r>
+        <w:rPr>
+          <w:rFonts w:ascii="Consolas" w:eastAsia="Times New Roman" w:hAnsi="Consolas" w:cs="Times New Roman"/>
+          <w:color w:val="FFFFFF"/>
+          <w:sz w:val="21"/>
+          <w:szCs w:val="21"/>
+        </w:rPr>
+        <w:t xml:space="preserve">    </w:t>
+      </w:r>
+      <w:r>
+        <w:rPr>
+          <w:rFonts w:ascii="Consolas" w:eastAsia="Times New Roman" w:hAnsi="Consolas" w:cs="Times New Roman"/>
+          <w:color w:val="FF9DA4"/>
+          <w:sz w:val="21"/>
+          <w:szCs w:val="21"/>
+        </w:rPr>
+        <w:t>frame</w:t>
+      </w:r>
+      <w:r>
+        <w:rPr>
+          <w:rFonts w:ascii="Consolas" w:eastAsia="Times New Roman" w:hAnsi="Consolas" w:cs="Times New Roman"/>
+          <w:color w:val="FFFFFF"/>
+          <w:sz w:val="21"/>
+          <w:szCs w:val="21"/>
+        </w:rPr>
+        <w:t>.</w:t>
+      </w:r>
+      <w:r>
+        <w:rPr>
+          <w:rFonts w:ascii="Consolas" w:eastAsia="Times New Roman" w:hAnsi="Consolas" w:cs="Times New Roman"/>
+          <w:color w:val="FF9DA4"/>
+          <w:sz w:val="21"/>
+          <w:szCs w:val="21"/>
+        </w:rPr>
+        <w:t>id</w:t>
+      </w:r>
+      <w:r>
+        <w:rPr>
+          <w:rFonts w:ascii="Consolas" w:eastAsia="Times New Roman" w:hAnsi="Consolas" w:cs="Times New Roman"/>
+          <w:color w:val="FFFFFF"/>
+          <w:sz w:val="21"/>
+          <w:szCs w:val="21"/>
+        </w:rPr>
+        <w:t xml:space="preserve"> </w:t>
+      </w:r>
+      <w:r>
+        <w:rPr>
+          <w:rFonts w:ascii="Consolas" w:eastAsia="Times New Roman" w:hAnsi="Consolas" w:cs="Times New Roman"/>
+          <w:color w:val="99FFFF"/>
+          <w:sz w:val="21"/>
+          <w:szCs w:val="21"/>
+        </w:rPr>
+        <w:t>=</w:t>
+      </w:r>
+      <w:r>
+        <w:rPr>
+          <w:rFonts w:ascii="Consolas" w:eastAsia="Times New Roman" w:hAnsi="Consolas" w:cs="Times New Roman"/>
+          <w:color w:val="FFFFFF"/>
+          <w:sz w:val="21"/>
+          <w:szCs w:val="21"/>
+        </w:rPr>
+        <w:t xml:space="preserve"> </w:t>
+      </w:r>
+      <w:r>
+        <w:rPr>
+          <w:rFonts w:ascii="Consolas" w:eastAsia="Times New Roman" w:hAnsi="Consolas" w:cs="Times New Roman"/>
+          <w:color w:val="FFC58F"/>
+          <w:sz w:val="21"/>
+          <w:szCs w:val="21"/>
+        </w:rPr>
+        <w:t>0x600</w:t>
+      </w:r>
+      <w:r>
+        <w:rPr>
+          <w:rFonts w:ascii="Consolas" w:eastAsia="Times New Roman" w:hAnsi="Consolas" w:cs="Times New Roman"/>
+          <w:color w:val="FFFFFF"/>
+          <w:sz w:val="21"/>
+          <w:szCs w:val="21"/>
+        </w:rPr>
+        <w:t>;</w:t>
+      </w:r>
+    </w:p>
+    <w:p>
+      <w:pPr>
+        <w:shd w:val="clear" w:color="auto" w:fill="002451"/>
+        <w:spacing w:after="0" w:line="285" w:lineRule="atLeast"/>
+        <w:rPr>
+          <w:rFonts w:ascii="Consolas" w:eastAsia="Times New Roman" w:hAnsi="Consolas" w:cs="Times New Roman"/>
+          <w:color w:val="FFFFFF"/>
+          <w:sz w:val="21"/>
+          <w:szCs w:val="21"/>
+        </w:rPr>
+      </w:pPr>
+      <w:r>
+        <w:rPr>
+          <w:rFonts w:ascii="Consolas" w:eastAsia="Times New Roman" w:hAnsi="Consolas" w:cs="Times New Roman"/>
+          <w:color w:val="FFFFFF"/>
+          <w:sz w:val="21"/>
+          <w:szCs w:val="21"/>
+        </w:rPr>
+        <w:t xml:space="preserve">    </w:t>
+      </w:r>
+      <w:proofErr w:type="spellStart"/>
+      <w:proofErr w:type="gramStart"/>
+      <w:r>
+        <w:rPr>
+          <w:rFonts w:ascii="Consolas" w:eastAsia="Times New Roman" w:hAnsi="Consolas" w:cs="Times New Roman"/>
+          <w:color w:val="FF9DA4"/>
+          <w:sz w:val="21"/>
+          <w:szCs w:val="21"/>
+        </w:rPr>
+        <w:t>frame</w:t>
+      </w:r>
+      <w:r>
+        <w:rPr>
+          <w:rFonts w:ascii="Consolas" w:eastAsia="Times New Roman" w:hAnsi="Consolas" w:cs="Times New Roman"/>
+          <w:color w:val="FFFFFF"/>
+          <w:sz w:val="21"/>
+          <w:szCs w:val="21"/>
+        </w:rPr>
+        <w:t>.</w:t>
+      </w:r>
+      <w:r>
+        <w:rPr>
+          <w:rFonts w:ascii="Consolas" w:eastAsia="Times New Roman" w:hAnsi="Consolas" w:cs="Times New Roman"/>
+          <w:color w:val="FF9DA4"/>
+          <w:sz w:val="21"/>
+          <w:szCs w:val="21"/>
+        </w:rPr>
+        <w:t>length</w:t>
+      </w:r>
+      <w:proofErr w:type="spellEnd"/>
+      <w:proofErr w:type="gramEnd"/>
+      <w:r>
+        <w:rPr>
+          <w:rFonts w:ascii="Consolas" w:eastAsia="Times New Roman" w:hAnsi="Consolas" w:cs="Times New Roman"/>
+          <w:color w:val="FFFFFF"/>
+          <w:sz w:val="21"/>
+          <w:szCs w:val="21"/>
+        </w:rPr>
+        <w:t xml:space="preserve"> </w:t>
+      </w:r>
+      <w:r>
+        <w:rPr>
+          <w:rFonts w:ascii="Consolas" w:eastAsia="Times New Roman" w:hAnsi="Consolas" w:cs="Times New Roman"/>
+          <w:color w:val="99FFFF"/>
+          <w:sz w:val="21"/>
+          <w:szCs w:val="21"/>
+        </w:rPr>
+        <w:t>=</w:t>
+      </w:r>
+      <w:r>
+        <w:rPr>
+          <w:rFonts w:ascii="Consolas" w:eastAsia="Times New Roman" w:hAnsi="Consolas" w:cs="Times New Roman"/>
+          <w:color w:val="FFFFFF"/>
+          <w:sz w:val="21"/>
+          <w:szCs w:val="21"/>
+        </w:rPr>
+        <w:t xml:space="preserve"> </w:t>
+      </w:r>
+      <w:r>
+        <w:rPr>
+          <w:rFonts w:ascii="Consolas" w:eastAsia="Times New Roman" w:hAnsi="Consolas" w:cs="Times New Roman"/>
+          <w:color w:val="FFC58F"/>
+          <w:sz w:val="21"/>
+          <w:szCs w:val="21"/>
+        </w:rPr>
+        <w:t>2</w:t>
+      </w:r>
+      <w:r>
+        <w:rPr>
+          <w:rFonts w:ascii="Consolas" w:eastAsia="Times New Roman" w:hAnsi="Consolas" w:cs="Times New Roman"/>
+          <w:color w:val="FFFFFF"/>
+          <w:sz w:val="21"/>
+          <w:szCs w:val="21"/>
+        </w:rPr>
+        <w:t>;</w:t>
+      </w:r>
+    </w:p>
+    <w:p>
+      <w:pPr>
+        <w:shd w:val="clear" w:color="auto" w:fill="002451"/>
+        <w:spacing w:after="0" w:line="285" w:lineRule="atLeast"/>
+        <w:rPr>
+          <w:rFonts w:ascii="Consolas" w:eastAsia="Times New Roman" w:hAnsi="Consolas" w:cs="Times New Roman"/>
+          <w:color w:val="FFFFFF"/>
+          <w:sz w:val="21"/>
+          <w:szCs w:val="21"/>
+        </w:rPr>
+      </w:pPr>
+      <w:r>
+        <w:rPr>
+          <w:rFonts w:ascii="Consolas" w:eastAsia="Times New Roman" w:hAnsi="Consolas" w:cs="Times New Roman"/>
+          <w:color w:val="FFFFFF"/>
+          <w:sz w:val="21"/>
+          <w:szCs w:val="21"/>
+        </w:rPr>
+        <w:t xml:space="preserve">    </w:t>
+      </w:r>
+    </w:p>
+    <w:p>
+      <w:pPr>
+        <w:shd w:val="clear" w:color="auto" w:fill="002451"/>
+        <w:spacing w:after="0" w:line="285" w:lineRule="atLeast"/>
+        <w:rPr>
+          <w:rFonts w:ascii="Consolas" w:eastAsia="Times New Roman" w:hAnsi="Consolas" w:cs="Times New Roman"/>
+          <w:color w:val="FFFFFF"/>
+          <w:sz w:val="21"/>
+          <w:szCs w:val="21"/>
+        </w:rPr>
+      </w:pPr>
+      <w:r>
+        <w:rPr>
+          <w:rFonts w:ascii="Consolas" w:eastAsia="Times New Roman" w:hAnsi="Consolas" w:cs="Times New Roman"/>
+          <w:color w:val="7285B7"/>
+          <w:sz w:val="21"/>
+          <w:szCs w:val="21"/>
+        </w:rPr>
+        <w:t xml:space="preserve">    //integer 10x value of </w:t>
+      </w:r>
+      <w:proofErr w:type="spellStart"/>
+      <w:r>
+        <w:rPr>
+          <w:rFonts w:ascii="Consolas" w:eastAsia="Times New Roman" w:hAnsi="Consolas" w:cs="Times New Roman"/>
+          <w:color w:val="7285B7"/>
+          <w:sz w:val="21"/>
+          <w:szCs w:val="21"/>
+        </w:rPr>
+        <w:t>temperature_c</w:t>
+      </w:r>
+      <w:proofErr w:type="spellEnd"/>
+      <w:r>
+        <w:rPr>
+          <w:rFonts w:ascii="Consolas" w:eastAsia="Times New Roman" w:hAnsi="Consolas" w:cs="Times New Roman"/>
+          <w:color w:val="7285B7"/>
+          <w:sz w:val="21"/>
+          <w:szCs w:val="21"/>
+        </w:rPr>
+        <w:t>, will always round down at 1dp (25.19 -&gt; 251), level of precision is acceptable.</w:t>
+      </w:r>
+    </w:p>
+    <w:p>
+      <w:pPr>
+        <w:shd w:val="clear" w:color="auto" w:fill="002451"/>
+        <w:spacing w:after="0" w:line="285" w:lineRule="atLeast"/>
+        <w:rPr>
+          <w:rFonts w:ascii="Consolas" w:eastAsia="Times New Roman" w:hAnsi="Consolas" w:cs="Times New Roman"/>
+          <w:color w:val="FFFFFF"/>
+          <w:sz w:val="21"/>
+          <w:szCs w:val="21"/>
+        </w:rPr>
+      </w:pPr>
+      <w:r>
+        <w:rPr>
+          <w:rFonts w:ascii="Consolas" w:eastAsia="Times New Roman" w:hAnsi="Consolas" w:cs="Times New Roman"/>
+          <w:color w:val="FFFFFF"/>
+          <w:sz w:val="21"/>
+          <w:szCs w:val="21"/>
+        </w:rPr>
+        <w:t xml:space="preserve">    </w:t>
+      </w:r>
+      <w:r>
+        <w:rPr>
+          <w:rFonts w:ascii="Consolas" w:eastAsia="Times New Roman" w:hAnsi="Consolas" w:cs="Times New Roman"/>
+          <w:color w:val="FFEEAD"/>
+          <w:sz w:val="21"/>
+          <w:szCs w:val="21"/>
+        </w:rPr>
+        <w:t>int16_t</w:t>
+      </w:r>
+      <w:r>
+        <w:rPr>
+          <w:rFonts w:ascii="Consolas" w:eastAsia="Times New Roman" w:hAnsi="Consolas" w:cs="Times New Roman"/>
+          <w:color w:val="FFFFFF"/>
+          <w:sz w:val="21"/>
+          <w:szCs w:val="21"/>
+        </w:rPr>
+        <w:t xml:space="preserve"> </w:t>
+      </w:r>
+      <w:r>
+        <w:rPr>
+          <w:rFonts w:ascii="Consolas" w:eastAsia="Times New Roman" w:hAnsi="Consolas" w:cs="Times New Roman"/>
+          <w:color w:val="FF9DA4"/>
+          <w:sz w:val="21"/>
+          <w:szCs w:val="21"/>
+        </w:rPr>
+        <w:t>temperature_10x</w:t>
+      </w:r>
+      <w:r>
+        <w:rPr>
+          <w:rFonts w:ascii="Consolas" w:eastAsia="Times New Roman" w:hAnsi="Consolas" w:cs="Times New Roman"/>
+          <w:color w:val="FFFFFF"/>
+          <w:sz w:val="21"/>
+          <w:szCs w:val="21"/>
+        </w:rPr>
+        <w:t xml:space="preserve"> </w:t>
+      </w:r>
+      <w:r>
+        <w:rPr>
+          <w:rFonts w:ascii="Consolas" w:eastAsia="Times New Roman" w:hAnsi="Consolas" w:cs="Times New Roman"/>
+          <w:color w:val="99FFFF"/>
+          <w:sz w:val="21"/>
+          <w:szCs w:val="21"/>
+        </w:rPr>
+        <w:t>=</w:t>
+      </w:r>
+      <w:r>
+        <w:rPr>
+          <w:rFonts w:ascii="Consolas" w:eastAsia="Times New Roman" w:hAnsi="Consolas" w:cs="Times New Roman"/>
+          <w:color w:val="FFFFFF"/>
+          <w:sz w:val="21"/>
+          <w:szCs w:val="21"/>
+        </w:rPr>
+        <w:t xml:space="preserve"> </w:t>
+      </w:r>
+      <w:proofErr w:type="spellStart"/>
+      <w:r>
+        <w:rPr>
+          <w:rFonts w:ascii="Consolas" w:eastAsia="Times New Roman" w:hAnsi="Consolas" w:cs="Times New Roman"/>
+          <w:color w:val="FFC58F"/>
+          <w:sz w:val="21"/>
+          <w:szCs w:val="21"/>
+        </w:rPr>
+        <w:t>temperature_c</w:t>
+      </w:r>
+      <w:proofErr w:type="spellEnd"/>
+      <w:r>
+        <w:rPr>
+          <w:rFonts w:ascii="Consolas" w:eastAsia="Times New Roman" w:hAnsi="Consolas" w:cs="Times New Roman"/>
+          <w:color w:val="FFFFFF"/>
+          <w:sz w:val="21"/>
+          <w:szCs w:val="21"/>
+        </w:rPr>
+        <w:t xml:space="preserve"> </w:t>
+      </w:r>
+      <w:r>
+        <w:rPr>
+          <w:rFonts w:ascii="Consolas" w:eastAsia="Times New Roman" w:hAnsi="Consolas" w:cs="Times New Roman"/>
+          <w:color w:val="99FFFF"/>
+          <w:sz w:val="21"/>
+          <w:szCs w:val="21"/>
+        </w:rPr>
+        <w:t>*</w:t>
+      </w:r>
+      <w:r>
+        <w:rPr>
+          <w:rFonts w:ascii="Consolas" w:eastAsia="Times New Roman" w:hAnsi="Consolas" w:cs="Times New Roman"/>
+          <w:color w:val="FFFFFF"/>
+          <w:sz w:val="21"/>
+          <w:szCs w:val="21"/>
+        </w:rPr>
+        <w:t xml:space="preserve"> </w:t>
+      </w:r>
+      <w:r>
+        <w:rPr>
+          <w:rFonts w:ascii="Consolas" w:eastAsia="Times New Roman" w:hAnsi="Consolas" w:cs="Times New Roman"/>
+          <w:color w:val="FFC58F"/>
+          <w:sz w:val="21"/>
+          <w:szCs w:val="21"/>
+        </w:rPr>
+        <w:t>10</w:t>
+      </w:r>
+      <w:r>
+        <w:rPr>
+          <w:rFonts w:ascii="Consolas" w:eastAsia="Times New Roman" w:hAnsi="Consolas" w:cs="Times New Roman"/>
+          <w:color w:val="FFFFFF"/>
+          <w:sz w:val="21"/>
+          <w:szCs w:val="21"/>
+        </w:rPr>
+        <w:t>;</w:t>
+      </w:r>
+    </w:p>
+    <w:p>
+      <w:pPr>
+        <w:shd w:val="clear" w:color="auto" w:fill="002451"/>
+        <w:spacing w:after="0" w:line="285" w:lineRule="atLeast"/>
+        <w:rPr>
+          <w:rFonts w:ascii="Consolas" w:eastAsia="Times New Roman" w:hAnsi="Consolas" w:cs="Times New Roman"/>
+          <w:color w:val="FFFFFF"/>
+          <w:sz w:val="21"/>
+          <w:szCs w:val="21"/>
+        </w:rPr>
+      </w:pPr>
+      <w:r>
+        <w:rPr>
+          <w:rFonts w:ascii="Consolas" w:eastAsia="Times New Roman" w:hAnsi="Consolas" w:cs="Times New Roman"/>
+          <w:color w:val="7285B7"/>
+          <w:sz w:val="21"/>
+          <w:szCs w:val="21"/>
+        </w:rPr>
+        <w:t xml:space="preserve">    //Convert to 16 </w:t>
+      </w:r>
+      <w:proofErr w:type="gramStart"/>
+      <w:r>
+        <w:rPr>
+          <w:rFonts w:ascii="Consolas" w:eastAsia="Times New Roman" w:hAnsi="Consolas" w:cs="Times New Roman"/>
+          <w:color w:val="7285B7"/>
+          <w:sz w:val="21"/>
+          <w:szCs w:val="21"/>
+        </w:rPr>
+        <w:t>bit</w:t>
+      </w:r>
+      <w:proofErr w:type="gramEnd"/>
+      <w:r>
+        <w:rPr>
+          <w:rFonts w:ascii="Consolas" w:eastAsia="Times New Roman" w:hAnsi="Consolas" w:cs="Times New Roman"/>
+          <w:color w:val="7285B7"/>
+          <w:sz w:val="21"/>
+          <w:szCs w:val="21"/>
+        </w:rPr>
+        <w:t xml:space="preserve"> signed, split into 2 bytes for payload prep. Frame uses unsigned int, convert signed directly and CAN will change it back?</w:t>
+      </w:r>
+    </w:p>
+    <w:p>
+      <w:pPr>
+        <w:shd w:val="clear" w:color="auto" w:fill="002451"/>
+        <w:spacing w:after="0" w:line="285" w:lineRule="atLeast"/>
+        <w:rPr>
+          <w:rFonts w:ascii="Consolas" w:eastAsia="Times New Roman" w:hAnsi="Consolas" w:cs="Times New Roman"/>
+          <w:color w:val="FFFFFF"/>
+          <w:sz w:val="21"/>
+          <w:szCs w:val="21"/>
+        </w:rPr>
+      </w:pPr>
+    </w:p>
+    <w:p>
+      <w:pPr>
+        <w:shd w:val="clear" w:color="auto" w:fill="002451"/>
+        <w:spacing w:after="0" w:line="285" w:lineRule="atLeast"/>
+        <w:rPr>
+          <w:rFonts w:ascii="Consolas" w:eastAsia="Times New Roman" w:hAnsi="Consolas" w:cs="Times New Roman"/>
+          <w:color w:val="FFFFFF"/>
+          <w:sz w:val="21"/>
+          <w:szCs w:val="21"/>
+        </w:rPr>
+      </w:pPr>
+      <w:r>
+        <w:rPr>
+          <w:rFonts w:ascii="Consolas" w:eastAsia="Times New Roman" w:hAnsi="Consolas" w:cs="Times New Roman"/>
+          <w:color w:val="7285B7"/>
+          <w:sz w:val="21"/>
+          <w:szCs w:val="21"/>
+        </w:rPr>
+        <w:t>    //Packing helper for int16_t -&gt; uint8_t (from MSM_CAN.hpp):</w:t>
+      </w:r>
+    </w:p>
+    <w:p>
+      <w:pPr>
+        <w:shd w:val="clear" w:color="auto" w:fill="002451"/>
+        <w:spacing w:after="0" w:line="285" w:lineRule="atLeast"/>
+        <w:rPr>
+          <w:rFonts w:ascii="Consolas" w:eastAsia="Times New Roman" w:hAnsi="Consolas" w:cs="Times New Roman"/>
+          <w:color w:val="FFFFFF"/>
+          <w:sz w:val="21"/>
+          <w:szCs w:val="21"/>
+        </w:rPr>
+      </w:pPr>
+      <w:r>
+        <w:rPr>
+          <w:rFonts w:ascii="Consolas" w:eastAsia="Times New Roman" w:hAnsi="Consolas" w:cs="Times New Roman"/>
+          <w:color w:val="7285B7"/>
+          <w:sz w:val="21"/>
+          <w:szCs w:val="21"/>
+        </w:rPr>
+        <w:t xml:space="preserve">    //inline void pack_i16(uint8_t </w:t>
+      </w:r>
+      <w:proofErr w:type="gramStart"/>
+      <w:r>
+        <w:rPr>
+          <w:rFonts w:ascii="Consolas" w:eastAsia="Times New Roman" w:hAnsi="Consolas" w:cs="Times New Roman"/>
+          <w:color w:val="7285B7"/>
+          <w:sz w:val="21"/>
+          <w:szCs w:val="21"/>
+        </w:rPr>
+        <w:t>data[</w:t>
+      </w:r>
+      <w:proofErr w:type="gramEnd"/>
+      <w:r>
+        <w:rPr>
+          <w:rFonts w:ascii="Consolas" w:eastAsia="Times New Roman" w:hAnsi="Consolas" w:cs="Times New Roman"/>
+          <w:color w:val="7285B7"/>
+          <w:sz w:val="21"/>
+          <w:szCs w:val="21"/>
+        </w:rPr>
+        <w:t xml:space="preserve">8], uint8_t index, int16_t </w:t>
+      </w:r>
+      <w:proofErr w:type="gramStart"/>
+      <w:r>
+        <w:rPr>
+          <w:rFonts w:ascii="Consolas" w:eastAsia="Times New Roman" w:hAnsi="Consolas" w:cs="Times New Roman"/>
+          <w:color w:val="7285B7"/>
+          <w:sz w:val="21"/>
+          <w:szCs w:val="21"/>
+        </w:rPr>
+        <w:t xml:space="preserve">value)   </w:t>
+      </w:r>
+      <w:proofErr w:type="gramEnd"/>
+      <w:r>
+        <w:rPr>
+          <w:rFonts w:ascii="Consolas" w:eastAsia="Times New Roman" w:hAnsi="Consolas" w:cs="Times New Roman"/>
+          <w:color w:val="7285B7"/>
+          <w:sz w:val="21"/>
+          <w:szCs w:val="21"/>
+        </w:rPr>
+        <w:t xml:space="preserve">              //helper function to pack uint8_t </w:t>
+      </w:r>
+      <w:proofErr w:type="gramStart"/>
+      <w:r>
+        <w:rPr>
+          <w:rFonts w:ascii="Consolas" w:eastAsia="Times New Roman" w:hAnsi="Consolas" w:cs="Times New Roman"/>
+          <w:color w:val="7285B7"/>
+          <w:sz w:val="21"/>
+          <w:szCs w:val="21"/>
+        </w:rPr>
+        <w:t>data[</w:t>
+      </w:r>
+      <w:proofErr w:type="gramEnd"/>
+      <w:r>
+        <w:rPr>
+          <w:rFonts w:ascii="Consolas" w:eastAsia="Times New Roman" w:hAnsi="Consolas" w:cs="Times New Roman"/>
+          <w:color w:val="7285B7"/>
+          <w:sz w:val="21"/>
+          <w:szCs w:val="21"/>
+        </w:rPr>
+        <w:t>8] with a big-endian encoded int16_t</w:t>
+      </w:r>
+    </w:p>
+    <w:p>
+      <w:pPr>
+        <w:shd w:val="clear" w:color="auto" w:fill="002451"/>
+        <w:spacing w:after="0" w:line="285" w:lineRule="atLeast"/>
+        <w:rPr>
+          <w:rFonts w:ascii="Consolas" w:eastAsia="Times New Roman" w:hAnsi="Consolas" w:cs="Times New Roman"/>
+          <w:color w:val="FFFFFF"/>
+          <w:sz w:val="21"/>
+          <w:szCs w:val="21"/>
+        </w:rPr>
+      </w:pPr>
+      <w:r>
+        <w:rPr>
+          <w:rFonts w:ascii="Consolas" w:eastAsia="Times New Roman" w:hAnsi="Consolas" w:cs="Times New Roman"/>
+          <w:color w:val="7285B7"/>
+          <w:sz w:val="21"/>
+          <w:szCs w:val="21"/>
+        </w:rPr>
+        <w:t>    //{</w:t>
+      </w:r>
+    </w:p>
+    <w:p>
+      <w:pPr>
+        <w:shd w:val="clear" w:color="auto" w:fill="002451"/>
+        <w:spacing w:after="0" w:line="285" w:lineRule="atLeast"/>
+        <w:rPr>
+          <w:rFonts w:ascii="Consolas" w:eastAsia="Times New Roman" w:hAnsi="Consolas" w:cs="Times New Roman"/>
+          <w:color w:val="FFFFFF"/>
+          <w:sz w:val="21"/>
+          <w:szCs w:val="21"/>
+        </w:rPr>
+      </w:pPr>
+      <w:r>
+        <w:rPr>
+          <w:rFonts w:ascii="Consolas" w:eastAsia="Times New Roman" w:hAnsi="Consolas" w:cs="Times New Roman"/>
+          <w:color w:val="7285B7"/>
+          <w:sz w:val="21"/>
+          <w:szCs w:val="21"/>
+        </w:rPr>
+        <w:t xml:space="preserve">    //    pack_u16(data, index, </w:t>
+      </w:r>
+      <w:proofErr w:type="spellStart"/>
+      <w:r>
+        <w:rPr>
+          <w:rFonts w:ascii="Consolas" w:eastAsia="Times New Roman" w:hAnsi="Consolas" w:cs="Times New Roman"/>
+          <w:color w:val="7285B7"/>
+          <w:sz w:val="21"/>
+          <w:szCs w:val="21"/>
+        </w:rPr>
+        <w:t>static_cast</w:t>
+      </w:r>
+      <w:proofErr w:type="spellEnd"/>
+      <w:r>
+        <w:rPr>
+          <w:rFonts w:ascii="Consolas" w:eastAsia="Times New Roman" w:hAnsi="Consolas" w:cs="Times New Roman"/>
+          <w:color w:val="7285B7"/>
+          <w:sz w:val="21"/>
+          <w:szCs w:val="21"/>
+        </w:rPr>
+        <w:t>&lt;uint16_t&gt;(value));</w:t>
+      </w:r>
+    </w:p>
+    <w:p>
+      <w:pPr>
+        <w:shd w:val="clear" w:color="auto" w:fill="002451"/>
+        <w:spacing w:after="0" w:line="285" w:lineRule="atLeast"/>
+        <w:rPr>
+          <w:rFonts w:ascii="Consolas" w:eastAsia="Times New Roman" w:hAnsi="Consolas" w:cs="Times New Roman"/>
+          <w:color w:val="FFFFFF"/>
+          <w:sz w:val="21"/>
+          <w:szCs w:val="21"/>
+        </w:rPr>
+      </w:pPr>
+      <w:r>
+        <w:rPr>
+          <w:rFonts w:ascii="Consolas" w:eastAsia="Times New Roman" w:hAnsi="Consolas" w:cs="Times New Roman"/>
+          <w:color w:val="7285B7"/>
+          <w:sz w:val="21"/>
+          <w:szCs w:val="21"/>
+        </w:rPr>
+        <w:t>    //}</w:t>
+      </w:r>
+    </w:p>
+    <w:p>
+      <w:pPr>
+        <w:shd w:val="clear" w:color="auto" w:fill="002451"/>
+        <w:spacing w:after="0" w:line="285" w:lineRule="atLeast"/>
+        <w:rPr>
+          <w:rFonts w:ascii="Consolas" w:eastAsia="Times New Roman" w:hAnsi="Consolas" w:cs="Times New Roman"/>
+          <w:color w:val="FFFFFF"/>
+          <w:sz w:val="21"/>
+          <w:szCs w:val="21"/>
+        </w:rPr>
+      </w:pPr>
+      <w:r>
+        <w:rPr>
+          <w:rFonts w:ascii="Consolas" w:eastAsia="Times New Roman" w:hAnsi="Consolas" w:cs="Times New Roman"/>
+          <w:color w:val="FFFFFF"/>
+          <w:sz w:val="21"/>
+          <w:szCs w:val="21"/>
+        </w:rPr>
+        <w:t xml:space="preserve">    </w:t>
+      </w:r>
+      <w:r>
+        <w:rPr>
+          <w:rFonts w:ascii="Consolas" w:eastAsia="Times New Roman" w:hAnsi="Consolas" w:cs="Times New Roman"/>
+          <w:color w:val="FFEEAD"/>
+          <w:sz w:val="21"/>
+          <w:szCs w:val="21"/>
+        </w:rPr>
+        <w:t>MSM_</w:t>
+      </w:r>
+      <w:proofErr w:type="gramStart"/>
+      <w:r>
+        <w:rPr>
+          <w:rFonts w:ascii="Consolas" w:eastAsia="Times New Roman" w:hAnsi="Consolas" w:cs="Times New Roman"/>
+          <w:color w:val="FFEEAD"/>
+          <w:sz w:val="21"/>
+          <w:szCs w:val="21"/>
+        </w:rPr>
+        <w:t>CAN</w:t>
+      </w:r>
+      <w:r>
+        <w:rPr>
+          <w:rFonts w:ascii="Consolas" w:eastAsia="Times New Roman" w:hAnsi="Consolas" w:cs="Times New Roman"/>
+          <w:color w:val="FFFFFF"/>
+          <w:sz w:val="21"/>
+          <w:szCs w:val="21"/>
+        </w:rPr>
+        <w:t>::</w:t>
+      </w:r>
+      <w:proofErr w:type="gramEnd"/>
+      <w:r>
+        <w:rPr>
+          <w:rFonts w:ascii="Consolas" w:eastAsia="Times New Roman" w:hAnsi="Consolas" w:cs="Times New Roman"/>
+          <w:color w:val="BBDAFF"/>
+          <w:sz w:val="21"/>
+          <w:szCs w:val="21"/>
+        </w:rPr>
+        <w:t>pack_i16</w:t>
+      </w:r>
+      <w:r>
+        <w:rPr>
+          <w:rFonts w:ascii="Consolas" w:eastAsia="Times New Roman" w:hAnsi="Consolas" w:cs="Times New Roman"/>
+          <w:color w:val="FFFFFF"/>
+          <w:sz w:val="21"/>
+          <w:szCs w:val="21"/>
+        </w:rPr>
+        <w:t>(</w:t>
+      </w:r>
+      <w:proofErr w:type="spellStart"/>
+      <w:r>
+        <w:rPr>
+          <w:rFonts w:ascii="Consolas" w:eastAsia="Times New Roman" w:hAnsi="Consolas" w:cs="Times New Roman"/>
+          <w:color w:val="FF9DA4"/>
+          <w:sz w:val="21"/>
+          <w:szCs w:val="21"/>
+        </w:rPr>
+        <w:t>frame</w:t>
+      </w:r>
+      <w:r>
+        <w:rPr>
+          <w:rFonts w:ascii="Consolas" w:eastAsia="Times New Roman" w:hAnsi="Consolas" w:cs="Times New Roman"/>
+          <w:color w:val="FFFFFF"/>
+          <w:sz w:val="21"/>
+          <w:szCs w:val="21"/>
+        </w:rPr>
+        <w:t>.</w:t>
+      </w:r>
+      <w:r>
+        <w:rPr>
+          <w:rFonts w:ascii="Consolas" w:eastAsia="Times New Roman" w:hAnsi="Consolas" w:cs="Times New Roman"/>
+          <w:color w:val="FF9DA4"/>
+          <w:sz w:val="21"/>
+          <w:szCs w:val="21"/>
+        </w:rPr>
+        <w:t>data</w:t>
+      </w:r>
+      <w:proofErr w:type="spellEnd"/>
+      <w:r>
+        <w:rPr>
+          <w:rFonts w:ascii="Consolas" w:eastAsia="Times New Roman" w:hAnsi="Consolas" w:cs="Times New Roman"/>
+          <w:color w:val="FFFFFF"/>
+          <w:sz w:val="21"/>
+          <w:szCs w:val="21"/>
+        </w:rPr>
+        <w:t xml:space="preserve">, </w:t>
+      </w:r>
+      <w:r>
+        <w:rPr>
+          <w:rFonts w:ascii="Consolas" w:eastAsia="Times New Roman" w:hAnsi="Consolas" w:cs="Times New Roman"/>
+          <w:color w:val="FFC58F"/>
+          <w:sz w:val="21"/>
+          <w:szCs w:val="21"/>
+        </w:rPr>
+        <w:t>1</w:t>
+      </w:r>
+      <w:r>
+        <w:rPr>
+          <w:rFonts w:ascii="Consolas" w:eastAsia="Times New Roman" w:hAnsi="Consolas" w:cs="Times New Roman"/>
+          <w:color w:val="FFFFFF"/>
+          <w:sz w:val="21"/>
+          <w:szCs w:val="21"/>
+        </w:rPr>
+        <w:t xml:space="preserve">, </w:t>
+      </w:r>
+      <w:r>
+        <w:rPr>
+          <w:rFonts w:ascii="Consolas" w:eastAsia="Times New Roman" w:hAnsi="Consolas" w:cs="Times New Roman"/>
+          <w:color w:val="FF9DA4"/>
+          <w:sz w:val="21"/>
+          <w:szCs w:val="21"/>
+        </w:rPr>
+        <w:t>temperature_10x</w:t>
+      </w:r>
+      <w:r>
+        <w:rPr>
+          <w:rFonts w:ascii="Consolas" w:eastAsia="Times New Roman" w:hAnsi="Consolas" w:cs="Times New Roman"/>
+          <w:color w:val="FFFFFF"/>
+          <w:sz w:val="21"/>
+          <w:szCs w:val="21"/>
+        </w:rPr>
+        <w:t>);</w:t>
+      </w:r>
+    </w:p>
+    <w:p>
+      <w:pPr>
+        <w:shd w:val="clear" w:color="auto" w:fill="002451"/>
+        <w:spacing w:after="0" w:line="285" w:lineRule="atLeast"/>
+        <w:rPr>
+          <w:rFonts w:ascii="Consolas" w:eastAsia="Times New Roman" w:hAnsi="Consolas" w:cs="Times New Roman"/>
+          <w:color w:val="FFFFFF"/>
+          <w:sz w:val="21"/>
+          <w:szCs w:val="21"/>
+        </w:rPr>
+      </w:pPr>
+      <w:r>
+        <w:rPr>
+          <w:rFonts w:ascii="Consolas" w:eastAsia="Times New Roman" w:hAnsi="Consolas" w:cs="Times New Roman"/>
+          <w:color w:val="FFFFFF"/>
+          <w:sz w:val="21"/>
+          <w:szCs w:val="21"/>
+        </w:rPr>
+        <w:t xml:space="preserve">    </w:t>
+      </w:r>
+      <w:r>
+        <w:rPr>
+          <w:rFonts w:ascii="Consolas" w:eastAsia="Times New Roman" w:hAnsi="Consolas" w:cs="Times New Roman"/>
+          <w:color w:val="FFEEAD"/>
+          <w:sz w:val="21"/>
+          <w:szCs w:val="21"/>
+        </w:rPr>
+        <w:t>MSM_</w:t>
+      </w:r>
+      <w:proofErr w:type="gramStart"/>
+      <w:r>
+        <w:rPr>
+          <w:rFonts w:ascii="Consolas" w:eastAsia="Times New Roman" w:hAnsi="Consolas" w:cs="Times New Roman"/>
+          <w:color w:val="FFEEAD"/>
+          <w:sz w:val="21"/>
+          <w:szCs w:val="21"/>
+        </w:rPr>
+        <w:t>CAN</w:t>
+      </w:r>
+      <w:r>
+        <w:rPr>
+          <w:rFonts w:ascii="Consolas" w:eastAsia="Times New Roman" w:hAnsi="Consolas" w:cs="Times New Roman"/>
+          <w:color w:val="FFFFFF"/>
+          <w:sz w:val="21"/>
+          <w:szCs w:val="21"/>
+        </w:rPr>
+        <w:t>::</w:t>
+      </w:r>
+      <w:proofErr w:type="spellStart"/>
+      <w:proofErr w:type="gramEnd"/>
+      <w:r>
+        <w:rPr>
+          <w:rFonts w:ascii="Consolas" w:eastAsia="Times New Roman" w:hAnsi="Consolas" w:cs="Times New Roman"/>
+          <w:color w:val="BBDAFF"/>
+          <w:sz w:val="21"/>
+          <w:szCs w:val="21"/>
+        </w:rPr>
+        <w:t>send_msg</w:t>
+      </w:r>
+      <w:proofErr w:type="spellEnd"/>
+      <w:r>
+        <w:rPr>
+          <w:rFonts w:ascii="Consolas" w:eastAsia="Times New Roman" w:hAnsi="Consolas" w:cs="Times New Roman"/>
+          <w:color w:val="FFFFFF"/>
+          <w:sz w:val="21"/>
+          <w:szCs w:val="21"/>
+        </w:rPr>
+        <w:t>(</w:t>
+      </w:r>
+      <w:r>
+        <w:rPr>
+          <w:rFonts w:ascii="Consolas" w:eastAsia="Times New Roman" w:hAnsi="Consolas" w:cs="Times New Roman"/>
+          <w:color w:val="FF9DA4"/>
+          <w:sz w:val="21"/>
+          <w:szCs w:val="21"/>
+        </w:rPr>
+        <w:t>frame</w:t>
+      </w:r>
+      <w:r>
+        <w:rPr>
+          <w:rFonts w:ascii="Consolas" w:eastAsia="Times New Roman" w:hAnsi="Consolas" w:cs="Times New Roman"/>
+          <w:color w:val="FFFFFF"/>
+          <w:sz w:val="21"/>
+          <w:szCs w:val="21"/>
+        </w:rPr>
+        <w:t>);</w:t>
+      </w:r>
+    </w:p>
+    <w:p>
+      <w:pPr>
+        <w:shd w:val="clear" w:color="auto" w:fill="002451"/>
+        <w:spacing w:after="0" w:line="285" w:lineRule="atLeast"/>
+        <w:rPr>
+          <w:rFonts w:ascii="Consolas" w:eastAsia="Times New Roman" w:hAnsi="Consolas" w:cs="Times New Roman"/>
+          <w:color w:val="FFFFFF"/>
+          <w:sz w:val="21"/>
+          <w:szCs w:val="21"/>
+        </w:rPr>
+      </w:pPr>
+      <w:r>
+        <w:rPr>
+          <w:rFonts w:ascii="Consolas" w:eastAsia="Times New Roman" w:hAnsi="Consolas" w:cs="Times New Roman"/>
+          <w:color w:val="7285B7"/>
+          <w:sz w:val="21"/>
+          <w:szCs w:val="21"/>
+        </w:rPr>
+        <w:t xml:space="preserve">    // Could be better to use </w:t>
+      </w:r>
+      <w:proofErr w:type="gramStart"/>
+      <w:r>
+        <w:rPr>
+          <w:rFonts w:ascii="Consolas" w:eastAsia="Times New Roman" w:hAnsi="Consolas" w:cs="Times New Roman"/>
+          <w:color w:val="7285B7"/>
+          <w:sz w:val="21"/>
+          <w:szCs w:val="21"/>
+        </w:rPr>
+        <w:t>schedule(</w:t>
+      </w:r>
+      <w:proofErr w:type="gramEnd"/>
+      <w:r>
+        <w:rPr>
+          <w:rFonts w:ascii="Consolas" w:eastAsia="Times New Roman" w:hAnsi="Consolas" w:cs="Times New Roman"/>
+          <w:color w:val="7285B7"/>
+          <w:sz w:val="21"/>
+          <w:szCs w:val="21"/>
+        </w:rPr>
+        <w:t xml:space="preserve">) instead of </w:t>
+      </w:r>
+      <w:proofErr w:type="spellStart"/>
+      <w:r>
+        <w:rPr>
+          <w:rFonts w:ascii="Consolas" w:eastAsia="Times New Roman" w:hAnsi="Consolas" w:cs="Times New Roman"/>
+          <w:color w:val="7285B7"/>
+          <w:sz w:val="21"/>
+          <w:szCs w:val="21"/>
+        </w:rPr>
+        <w:t>send_</w:t>
+      </w:r>
+      <w:proofErr w:type="gramStart"/>
+      <w:r>
+        <w:rPr>
+          <w:rFonts w:ascii="Consolas" w:eastAsia="Times New Roman" w:hAnsi="Consolas" w:cs="Times New Roman"/>
+          <w:color w:val="7285B7"/>
+          <w:sz w:val="21"/>
+          <w:szCs w:val="21"/>
+        </w:rPr>
+        <w:t>msg</w:t>
+      </w:r>
+      <w:proofErr w:type="spellEnd"/>
+      <w:r>
+        <w:rPr>
+          <w:rFonts w:ascii="Consolas" w:eastAsia="Times New Roman" w:hAnsi="Consolas" w:cs="Times New Roman"/>
+          <w:color w:val="7285B7"/>
+          <w:sz w:val="21"/>
+          <w:szCs w:val="21"/>
+        </w:rPr>
+        <w:t>(</w:t>
+      </w:r>
+      <w:proofErr w:type="gramEnd"/>
+      <w:r>
+        <w:rPr>
+          <w:rFonts w:ascii="Consolas" w:eastAsia="Times New Roman" w:hAnsi="Consolas" w:cs="Times New Roman"/>
+          <w:color w:val="7285B7"/>
+          <w:sz w:val="21"/>
+          <w:szCs w:val="21"/>
+        </w:rPr>
+        <w:t>) as this would allow us to send the data periodically every second (as the brief states)</w:t>
+      </w:r>
+    </w:p>
+    <w:p>
+      <w:pPr>
+        <w:shd w:val="clear" w:color="auto" w:fill="002451"/>
+        <w:spacing w:after="0" w:line="285" w:lineRule="atLeast"/>
+        <w:rPr>
+          <w:rFonts w:ascii="Consolas" w:eastAsia="Times New Roman" w:hAnsi="Consolas" w:cs="Times New Roman"/>
+          <w:color w:val="FFFFFF"/>
+          <w:sz w:val="21"/>
+          <w:szCs w:val="21"/>
+        </w:rPr>
+      </w:pPr>
+      <w:r>
+        <w:rPr>
+          <w:rFonts w:ascii="Consolas" w:eastAsia="Times New Roman" w:hAnsi="Consolas" w:cs="Times New Roman"/>
+          <w:color w:val="FFFFFF"/>
+          <w:sz w:val="21"/>
+          <w:szCs w:val="21"/>
+        </w:rPr>
+        <w:t>}</w:t>
+      </w:r>
+    </w:p>
+    <w:p>
+      <w:pPr>
+        <w:shd w:val="clear" w:color="auto" w:fill="002451"/>
+        <w:spacing w:after="0" w:line="285" w:lineRule="atLeast"/>
+        <w:rPr>
+          <w:rFonts w:ascii="Consolas" w:eastAsia="Times New Roman" w:hAnsi="Consolas" w:cs="Times New Roman"/>
+          <w:color w:val="FFFFFF"/>
+          <w:sz w:val="21"/>
+          <w:szCs w:val="21"/>
+        </w:rPr>
+      </w:pPr>
+    </w:p>
+    <w:p/>
+    <w:p/>
+    <w:p>
       <w:pPr>
         <w:rPr>
           <w:i/>
@@ -505,8 +4703,8 @@
       </w:r>
     </w:p>
     <w:sectPr>
-      <w:headerReference w:type="default" r:id="rId11"/>
-      <w:footerReference w:type="default" r:id="rId12"/>
+      <w:headerReference w:type="default" r:id="rId19"/>
+      <w:footerReference w:type="default" r:id="rId20"/>
       <w:pgSz w:w="11906" w:h="16838"/>
       <w:pgMar w:top="1440" w:right="1440" w:bottom="1440" w:left="1440" w:header="708" w:footer="708" w:gutter="0"/>
       <w:pgNumType w:start="1"/>
@@ -2498,15 +6696,9 @@
 </file>
 
 <file path=customXml/item2.xml><?xml version="1.0" encoding="utf-8"?>
-<p:properties xmlns:p="http://schemas.microsoft.com/office/2006/metadata/properties" xmlns:xsi="http://www.w3.org/2001/XMLSchema-instance" xmlns:pc="http://schemas.microsoft.com/office/infopath/2007/PartnerControls">
-  <documentManagement>
-    <TaxCatchAll xmlns="36f3e818-3c3c-4059-b43f-85d6fe5a4907" xsi:nil="true"/>
-    <lcf76f155ced4ddcb4097134ff3c332f xmlns="71f2bcdf-b919-4e72-ac41-7f47d8bc1e5b">
-      <Terms xmlns="http://schemas.microsoft.com/office/infopath/2007/PartnerControls"/>
-    </lcf76f155ced4ddcb4097134ff3c332f>
-    <BuySheet_x003a_https_x003a__x002f__x002f_livemanchesterac_x002d_my_x002e_sharepoint_x002e_com_x002f__x003a_x_x003a__x002f_g_x002f_personal_x002f_horea_gribovschi_student_manchester_ac_uk_x002f_EXa8nefdUV1JrKoXbfCBC3UBM_cxCZTgJ2ZVvmQFXwQ8Nw_x003f_e_x003d_eAZuEa xmlns="71f2bcdf-b919-4e72-ac41-7f47d8bc1e5b" xsi:nil="true"/>
-  </documentManagement>
-</p:properties>
+<go:gDocsCustomXmlDataStorage xmlns:go="http://customooxmlschemas.google.com/" xmlns:r="http://schemas.openxmlformats.org/officeDocument/2006/relationships" uri="GoogleDocsCustomDataVersion2">
+  <go:docsCustomData xmlns:go="http://customooxmlschemas.google.com/" roundtripDataSignature="AMtx7mi3C8LRY0HyDBPpFXT1qOgscXoayg==">CgMxLjA4AHIhMWpfaXI3MC0wOTFBTUtXZ2h0b0ZRX1ZNOUxKVUQ1bm83</go:docsCustomData>
+</go:gDocsCustomXmlDataStorage>
 </file>
 
 <file path=customXml/item3.xml><?xml version="1.0" encoding="utf-8"?>
@@ -2519,9 +6711,15 @@
 </file>
 
 <file path=customXml/item4.xml><?xml version="1.0" encoding="utf-8"?>
-<go:gDocsCustomXmlDataStorage xmlns:go="http://customooxmlschemas.google.com/" xmlns:r="http://schemas.openxmlformats.org/officeDocument/2006/relationships" uri="GoogleDocsCustomDataVersion2">
-  <go:docsCustomData xmlns:go="http://customooxmlschemas.google.com/" roundtripDataSignature="AMtx7mi3C8LRY0HyDBPpFXT1qOgscXoayg==">CgMxLjA4AHIhMWpfaXI3MC0wOTFBTUtXZ2h0b0ZRX1ZNOUxKVUQ1bm83</go:docsCustomData>
-</go:gDocsCustomXmlDataStorage>
+<p:properties xmlns:p="http://schemas.microsoft.com/office/2006/metadata/properties" xmlns:xsi="http://www.w3.org/2001/XMLSchema-instance" xmlns:pc="http://schemas.microsoft.com/office/infopath/2007/PartnerControls">
+  <documentManagement>
+    <TaxCatchAll xmlns="36f3e818-3c3c-4059-b43f-85d6fe5a4907" xsi:nil="true"/>
+    <lcf76f155ced4ddcb4097134ff3c332f xmlns="71f2bcdf-b919-4e72-ac41-7f47d8bc1e5b">
+      <Terms xmlns="http://schemas.microsoft.com/office/infopath/2007/PartnerControls"/>
+    </lcf76f155ced4ddcb4097134ff3c332f>
+    <BuySheet_x003a_https_x003a__x002f__x002f_livemanchesterac_x002d_my_x002e_sharepoint_x002e_com_x002f__x003a_x_x003a__x002f_g_x002f_personal_x002f_horea_gribovschi_student_manchester_ac_uk_x002f_EXa8nefdUV1JrKoXbfCBC3UBM_cxCZTgJ2ZVvmQFXwQ8Nw_x003f_e_x003d_eAZuEa xmlns="71f2bcdf-b919-4e72-ac41-7f47d8bc1e5b" xsi:nil="true"/>
+  </documentManagement>
+</p:properties>
 </file>
 
 <file path=customXml/itemProps1.xml><?xml version="1.0" encoding="utf-8"?>
@@ -2544,12 +6742,10 @@
 </file>
 
 <file path=customXml/itemProps2.xml><?xml version="1.0" encoding="utf-8"?>
-<ds:datastoreItem xmlns:ds="http://schemas.openxmlformats.org/officeDocument/2006/customXml" ds:itemID="{867482C4-E036-47E3-82D5-0145EB7865E2}">
+<ds:datastoreItem xmlns:ds="http://schemas.openxmlformats.org/officeDocument/2006/customXml" ds:itemID="{11111111-1234-1234-1234-123412341234}">
   <ds:schemaRefs>
-    <ds:schemaRef ds:uri="http://schemas.microsoft.com/office/2006/metadata/properties"/>
-    <ds:schemaRef ds:uri="http://schemas.microsoft.com/office/infopath/2007/PartnerControls"/>
-    <ds:schemaRef ds:uri="36f3e818-3c3c-4059-b43f-85d6fe5a4907"/>
-    <ds:schemaRef ds:uri="71f2bcdf-b919-4e72-ac41-7f47d8bc1e5b"/>
+    <ds:schemaRef ds:uri="http://customooxmlschemas.google.com/"/>
+    <ds:schemaRef ds:uri="http://schemas.openxmlformats.org/officeDocument/2006/relationships"/>
   </ds:schemaRefs>
 </ds:datastoreItem>
 </file>
@@ -2563,10 +6759,12 @@
 </file>
 
 <file path=customXml/itemProps4.xml><?xml version="1.0" encoding="utf-8"?>
-<ds:datastoreItem xmlns:ds="http://schemas.openxmlformats.org/officeDocument/2006/customXml" ds:itemID="{11111111-1234-1234-1234-123412341234}">
+<ds:datastoreItem xmlns:ds="http://schemas.openxmlformats.org/officeDocument/2006/customXml" ds:itemID="{867482C4-E036-47E3-82D5-0145EB7865E2}">
   <ds:schemaRefs>
-    <ds:schemaRef ds:uri="http://customooxmlschemas.google.com/"/>
-    <ds:schemaRef ds:uri="http://schemas.openxmlformats.org/officeDocument/2006/relationships"/>
+    <ds:schemaRef ds:uri="http://schemas.microsoft.com/office/2006/metadata/properties"/>
+    <ds:schemaRef ds:uri="http://schemas.microsoft.com/office/infopath/2007/PartnerControls"/>
+    <ds:schemaRef ds:uri="36f3e818-3c3c-4059-b43f-85d6fe5a4907"/>
+    <ds:schemaRef ds:uri="71f2bcdf-b919-4e72-ac41-7f47d8bc1e5b"/>
   </ds:schemaRefs>
 </ds:datastoreItem>
 </file>
</xml_diff>

<commit_message>
Notes for flowchart section.
</commit_message>
<xml_diff>
--- a/Supplementary Files/Submission - Electrical Software Indivual Challenge Douglas Gray ID 190.docx
+++ b/Supplementary Files/Submission - Electrical Software Indivual Challenge Douglas Gray ID 190.docx
@@ -230,28 +230,12 @@
     </w:p>
     <w:p>
       <w:r>
-        <w:t xml:space="preserve">(b) Failures of </w:t>
-      </w:r>
-      <w:proofErr w:type="spellStart"/>
-      <w:r>
-        <w:t>analog</w:t>
-      </w:r>
-      <w:proofErr w:type="spellEnd"/>
-      <w:r>
-        <w:t xml:space="preserve"> sensor signals transmitted by cable: • Short circuit to supply voltage </w:t>
-      </w:r>
-    </w:p>
-    <w:p>
-      <w:r>
-        <w:t xml:space="preserve">(c) Failures of sensor signals used in programmable devices: • Implausibility due to </w:t>
-      </w:r>
-      <w:proofErr w:type="gramStart"/>
-      <w:r>
-        <w:t>out of range</w:t>
-      </w:r>
-      <w:proofErr w:type="gramEnd"/>
-      <w:r>
-        <w:t xml:space="preserve"> signals, e.g. mechanically impossible angle of an angle sensor. </w:t>
+        <w:t xml:space="preserve">(b) Failures of analog sensor signals transmitted by cable: • Short circuit to supply voltage </w:t>
+      </w:r>
+    </w:p>
+    <w:p>
+      <w:r>
+        <w:t xml:space="preserve">(c) Failures of sensor signals used in programmable devices: • Implausibility due to out of range signals, e.g. mechanically impossible angle of an angle sensor. </w:t>
       </w:r>
     </w:p>
     <w:p>
@@ -261,15 +245,7 @@
     </w:p>
     <w:p>
       <w:r>
-        <w:t xml:space="preserve">Signals might be a member of multiple signal classes, e.g. </w:t>
-      </w:r>
-      <w:proofErr w:type="spellStart"/>
-      <w:r>
-        <w:t>analog</w:t>
-      </w:r>
-      <w:proofErr w:type="spellEnd"/>
-      <w:r>
-        <w:t xml:space="preserve"> signals transmitted by cable might be a member of T11.9.2.a, T11.9.2.b and T11.9.2.c.</w:t>
+        <w:t>Signals might be a member of multiple signal classes, e.g. analog signals transmitted by cable might be a member of T11.9.2.a, T11.9.2.b and T11.9.2.c.</w:t>
       </w:r>
       <w:r>
         <w:t>”</w:t>
@@ -348,10 +324,10 @@
         </w:rPr>
         <w:lastRenderedPageBreak/>
         <w:drawing>
-          <wp:anchor distT="0" distB="0" distL="114300" distR="114300" simplePos="0" relativeHeight="251658240" behindDoc="0" locked="0" layoutInCell="1" allowOverlap="1" wp14:anchorId="3511E1A5" wp14:editId="5785B5EC">
+          <wp:anchor distT="0" distB="0" distL="114300" distR="114300" simplePos="0" relativeHeight="251658240" behindDoc="0" locked="0" layoutInCell="1" allowOverlap="1" wp14:anchorId="3511E1A5" wp14:editId="1D73CCC5">
             <wp:simplePos x="0" y="0"/>
             <wp:positionH relativeFrom="margin">
-              <wp:align>right</wp:align>
+              <wp:posOffset>5080</wp:posOffset>
             </wp:positionH>
             <wp:positionV relativeFrom="paragraph">
               <wp:posOffset>388620</wp:posOffset>
@@ -407,6 +383,48 @@
         <w:t>3. Logic/block diagram</w:t>
       </w:r>
     </w:p>
+    <w:p>
+      <w:r>
+        <w:rPr>
+          <w:b/>
+          <w:bCs/>
+        </w:rPr>
+        <w:t>Physical Processes</w:t>
+      </w:r>
+    </w:p>
+    <w:p>
+      <w:r>
+        <w:t>These are what is physically happening on the circuit board, particularly across the voltage divider, as the temperature varies and the thermistor changes resistance.</w:t>
+      </w:r>
+    </w:p>
+    <w:p>
+      <w:r>
+        <w:rPr>
+          <w:b/>
+          <w:bCs/>
+        </w:rPr>
+        <w:t>ADC Task</w:t>
+      </w:r>
+    </w:p>
+    <w:p>
+      <w:r>
+        <w:t>First the ADC completes its nominal purpose of converting the analogue voltage signal to a 12-bit digital signal, and then using voltage divider and an NTC beta constant equation, I solve for the temperature of the thermistor and return the function.</w:t>
+      </w:r>
+    </w:p>
+    <w:p>
+      <w:r>
+        <w:rPr>
+          <w:b/>
+          <w:bCs/>
+        </w:rPr>
+        <w:t>CAN Task</w:t>
+      </w:r>
+    </w:p>
+    <w:p>
+      <w:r>
+        <w:t>First I convert the float value of temperature into a signed 16 bit integer value, multiplied by 10 to bring along the first decimal place. This value is then packed into the provided data frame using the packing helper function, and sent using send_msg() to the CAN data node.</w:t>
+      </w:r>
+    </w:p>
     <w:p/>
     <w:p/>
     <w:p/>
@@ -418,7 +436,6 @@
     <w:p/>
     <w:p>
       <w:r>
-        <w:lastRenderedPageBreak/>
         <w:t>Desmos Graph to model the inputs, constants, and ‘outputs’ for the ADC task processes:</w:t>
       </w:r>
     </w:p>
@@ -601,6 +618,7 @@
         <w:rPr>
           <w:noProof/>
         </w:rPr>
+        <w:lastRenderedPageBreak/>
         <w:drawing>
           <wp:inline distT="0" distB="0" distL="0" distR="0" wp14:anchorId="127C02E0" wp14:editId="606CB81B">
             <wp:extent cx="5731510" cy="1939925"/>
@@ -681,7 +699,6 @@
         <w:rPr>
           <w:noProof/>
         </w:rPr>
-        <w:lastRenderedPageBreak/>
         <w:drawing>
           <wp:anchor distT="0" distB="0" distL="114300" distR="114300" simplePos="0" relativeHeight="251661312" behindDoc="0" locked="0" layoutInCell="1" allowOverlap="1" wp14:anchorId="39AEF56C" wp14:editId="6016761D">
             <wp:simplePos x="0" y="0"/>
@@ -758,11 +775,7 @@
     </w:p>
     <w:p>
       <w:r>
-        <w:t xml:space="preserve">A simple voltage divider to find the voltage across the 10kOhm constant resistor against the variable resistance of the NTC thermistor. The </w:t>
-      </w:r>
-      <w:proofErr w:type="spellStart"/>
-      <w:r>
-        <w:t>V</w:t>
+        <w:t>A simple voltage divider to find the voltage across the 10kOhm constant resistor against the variable resistance of the NTC thermistor. The V</w:t>
       </w:r>
       <w:r>
         <w:rPr>
@@ -770,7 +783,6 @@
         </w:rPr>
         <w:t>out</w:t>
       </w:r>
-      <w:proofErr w:type="spellEnd"/>
       <w:r>
         <w:t xml:space="preserve"> from this goes to the input pin of the ADC to be converted into a digital signal.</w:t>
       </w:r>
@@ -787,54 +799,12 @@
     </w:p>
     <w:p>
       <w:r>
-        <w:t xml:space="preserve">The ADC takes input on only 1 pin of the voltage across the constant resistor and translates it into a </w:t>
-      </w:r>
-      <w:proofErr w:type="gramStart"/>
-      <w:r>
-        <w:t>12 bit</w:t>
-      </w:r>
-      <w:proofErr w:type="gramEnd"/>
-      <w:r>
-        <w:t xml:space="preserve"> signal. It is powered in parallel to the voltage divider from a 3.3V source, within </w:t>
-      </w:r>
-      <w:proofErr w:type="spellStart"/>
-      <w:proofErr w:type="gramStart"/>
-      <w:r>
-        <w:t>it’s</w:t>
-      </w:r>
-      <w:proofErr w:type="spellEnd"/>
-      <w:proofErr w:type="gramEnd"/>
-      <w:r>
-        <w:t xml:space="preserve"> operating range, with the recommended capacitors from the datasheet in place performing power bypassing to ensure any noise from the power source does not interfere.</w:t>
-      </w:r>
-    </w:p>
-    <w:p>
-      <w:r>
-        <w:t xml:space="preserve">The chip </w:t>
-      </w:r>
-      <w:proofErr w:type="gramStart"/>
-      <w:r>
-        <w:t>select</w:t>
-      </w:r>
-      <w:proofErr w:type="gramEnd"/>
-      <w:r>
-        <w:t xml:space="preserve">, clock and data output and input pins are all connected to the microcontroller to the correct GPIO pins as specified in framework.cpp from the template code and the microcontrollers datasheet. This ensures that it stays in sync and can be called to with the </w:t>
-      </w:r>
-      <w:proofErr w:type="spellStart"/>
-      <w:r>
-        <w:t>read_</w:t>
-      </w:r>
-      <w:proofErr w:type="gramStart"/>
-      <w:r>
-        <w:t>adc</w:t>
-      </w:r>
-      <w:proofErr w:type="spellEnd"/>
-      <w:r>
-        <w:t>(</w:t>
-      </w:r>
-      <w:proofErr w:type="gramEnd"/>
-      <w:r>
-        <w:t>) function.</w:t>
+        <w:t>The ADC takes input on only 1 pin of the voltage across the constant resistor and translates it into a 12 bit signal. It is powered in parallel to the voltage divider from a 3.3V source, within it’s operating range, with the recommended capacitors from the datasheet in place performing power bypassing to ensure any noise from the power source does not interfere.</w:t>
+      </w:r>
+    </w:p>
+    <w:p>
+      <w:r>
+        <w:t>The chip select, clock and data output and input pins are all connected to the microcontroller to the correct GPIO pins as specified in framework.cpp from the template code and the microcontrollers datasheet. This ensures that it stays in sync and can be called to with the read_adc() function.</w:t>
       </w:r>
     </w:p>
     <w:p/>
@@ -845,7 +815,6 @@
           <w:b/>
           <w:bCs/>
         </w:rPr>
-        <w:lastRenderedPageBreak/>
         <w:t>Microcontroller</w:t>
       </w:r>
     </w:p>
@@ -937,27 +906,7 @@
           <w:sz w:val="21"/>
           <w:szCs w:val="21"/>
         </w:rPr>
-        <w:t>"</w:t>
-      </w:r>
-      <w:proofErr w:type="spellStart"/>
-      <w:r>
-        <w:rPr>
-          <w:rFonts w:ascii="Consolas" w:eastAsia="Times New Roman" w:hAnsi="Consolas" w:cs="Times New Roman"/>
-          <w:color w:val="D1F1A9"/>
-          <w:sz w:val="21"/>
-          <w:szCs w:val="21"/>
-        </w:rPr>
-        <w:t>challenge.h</w:t>
-      </w:r>
-      <w:proofErr w:type="spellEnd"/>
-      <w:r>
-        <w:rPr>
-          <w:rFonts w:ascii="Consolas" w:eastAsia="Times New Roman" w:hAnsi="Consolas" w:cs="Times New Roman"/>
-          <w:color w:val="D1F1A9"/>
-          <w:sz w:val="21"/>
-          <w:szCs w:val="21"/>
-        </w:rPr>
-        <w:t>"</w:t>
+        <w:t>"challenge.h"</w:t>
       </w:r>
     </w:p>
     <w:p>
@@ -996,27 +945,7 @@
           <w:sz w:val="21"/>
           <w:szCs w:val="21"/>
         </w:rPr>
-        <w:t>&lt;</w:t>
-      </w:r>
-      <w:proofErr w:type="spellStart"/>
-      <w:r>
-        <w:rPr>
-          <w:rFonts w:ascii="Consolas" w:eastAsia="Times New Roman" w:hAnsi="Consolas" w:cs="Times New Roman"/>
-          <w:color w:val="D1F1A9"/>
-          <w:sz w:val="21"/>
-          <w:szCs w:val="21"/>
-        </w:rPr>
-        <w:t>cmath</w:t>
-      </w:r>
-      <w:proofErr w:type="spellEnd"/>
-      <w:r>
-        <w:rPr>
-          <w:rFonts w:ascii="Consolas" w:eastAsia="Times New Roman" w:hAnsi="Consolas" w:cs="Times New Roman"/>
-          <w:color w:val="D1F1A9"/>
-          <w:sz w:val="21"/>
-          <w:szCs w:val="21"/>
-        </w:rPr>
-        <w:t>&gt;</w:t>
+        <w:t>&lt;cmath&gt;</w:t>
       </w:r>
     </w:p>
     <w:p>
@@ -1049,47 +978,7 @@
           <w:sz w:val="21"/>
           <w:szCs w:val="21"/>
         </w:rPr>
-        <w:t xml:space="preserve">// Runs once a second. </w:t>
-      </w:r>
-      <w:proofErr w:type="spellStart"/>
-      <w:r>
-        <w:rPr>
-          <w:rFonts w:ascii="Consolas" w:eastAsia="Times New Roman" w:hAnsi="Consolas" w:cs="Times New Roman"/>
-          <w:color w:val="7285B7"/>
-          <w:sz w:val="21"/>
-          <w:szCs w:val="21"/>
-        </w:rPr>
-        <w:t>read_</w:t>
-      </w:r>
-      <w:proofErr w:type="gramStart"/>
-      <w:r>
-        <w:rPr>
-          <w:rFonts w:ascii="Consolas" w:eastAsia="Times New Roman" w:hAnsi="Consolas" w:cs="Times New Roman"/>
-          <w:color w:val="7285B7"/>
-          <w:sz w:val="21"/>
-          <w:szCs w:val="21"/>
-        </w:rPr>
-        <w:t>adc</w:t>
-      </w:r>
-      <w:proofErr w:type="spellEnd"/>
-      <w:r>
-        <w:rPr>
-          <w:rFonts w:ascii="Consolas" w:eastAsia="Times New Roman" w:hAnsi="Consolas" w:cs="Times New Roman"/>
-          <w:color w:val="7285B7"/>
-          <w:sz w:val="21"/>
-          <w:szCs w:val="21"/>
-        </w:rPr>
-        <w:t>(</w:t>
-      </w:r>
-      <w:proofErr w:type="gramEnd"/>
-      <w:r>
-        <w:rPr>
-          <w:rFonts w:ascii="Consolas" w:eastAsia="Times New Roman" w:hAnsi="Consolas" w:cs="Times New Roman"/>
-          <w:color w:val="7285B7"/>
-          <w:sz w:val="21"/>
-          <w:szCs w:val="21"/>
-        </w:rPr>
-        <w:t>) gives you a number from 0 to 4095.</w:t>
+        <w:t>// Runs once a second. read_adc() gives you a number from 0 to 4095.</w:t>
       </w:r>
     </w:p>
     <w:p>
@@ -1121,7 +1010,6 @@
         </w:rPr>
         <w:t xml:space="preserve"> </w:t>
       </w:r>
-      <w:proofErr w:type="spellStart"/>
       <w:r>
         <w:rPr>
           <w:rFonts w:ascii="Consolas" w:eastAsia="Times New Roman" w:hAnsi="Consolas" w:cs="Times New Roman"/>
@@ -1129,19 +1017,8 @@
           <w:sz w:val="21"/>
           <w:szCs w:val="21"/>
         </w:rPr>
-        <w:t>adc_</w:t>
-      </w:r>
-      <w:proofErr w:type="gramStart"/>
-      <w:r>
-        <w:rPr>
-          <w:rFonts w:ascii="Consolas" w:eastAsia="Times New Roman" w:hAnsi="Consolas" w:cs="Times New Roman"/>
-          <w:color w:val="BBDAFF"/>
-          <w:sz w:val="21"/>
-          <w:szCs w:val="21"/>
-        </w:rPr>
-        <w:t>read</w:t>
-      </w:r>
-      <w:proofErr w:type="spellEnd"/>
+        <w:t>adc_read</w:t>
+      </w:r>
       <w:r>
         <w:rPr>
           <w:rFonts w:ascii="Consolas" w:eastAsia="Times New Roman" w:hAnsi="Consolas" w:cs="Times New Roman"/>
@@ -1151,7 +1028,6 @@
         </w:rPr>
         <w:t>(</w:t>
       </w:r>
-      <w:proofErr w:type="gramEnd"/>
       <w:r>
         <w:rPr>
           <w:rFonts w:ascii="Consolas" w:eastAsia="Times New Roman" w:hAnsi="Consolas" w:cs="Times New Roman"/>
@@ -1179,7 +1055,6 @@
         </w:rPr>
         <w:t>&amp;</w:t>
       </w:r>
-      <w:proofErr w:type="spellStart"/>
       <w:r>
         <w:rPr>
           <w:rFonts w:ascii="Consolas" w:eastAsia="Times New Roman" w:hAnsi="Consolas" w:cs="Times New Roman"/>
@@ -1189,7 +1064,6 @@
         </w:rPr>
         <w:t>temperature_c</w:t>
       </w:r>
-      <w:proofErr w:type="spellEnd"/>
       <w:r>
         <w:rPr>
           <w:rFonts w:ascii="Consolas" w:eastAsia="Times New Roman" w:hAnsi="Consolas" w:cs="Times New Roman"/>
@@ -1241,7 +1115,6 @@
         </w:rPr>
         <w:t xml:space="preserve">    </w:t>
       </w:r>
-      <w:proofErr w:type="spellStart"/>
       <w:r>
         <w:rPr>
           <w:rFonts w:ascii="Consolas" w:eastAsia="Times New Roman" w:hAnsi="Consolas" w:cs="Times New Roman"/>
@@ -1251,7 +1124,6 @@
         </w:rPr>
         <w:t>const</w:t>
       </w:r>
-      <w:proofErr w:type="spellEnd"/>
       <w:r>
         <w:rPr>
           <w:rFonts w:ascii="Consolas" w:eastAsia="Times New Roman" w:hAnsi="Consolas" w:cs="Times New Roman"/>
@@ -1279,7 +1151,6 @@
         </w:rPr>
         <w:t xml:space="preserve"> </w:t>
       </w:r>
-      <w:proofErr w:type="spellStart"/>
       <w:r>
         <w:rPr>
           <w:rFonts w:ascii="Consolas" w:eastAsia="Times New Roman" w:hAnsi="Consolas" w:cs="Times New Roman"/>
@@ -1289,7 +1160,6 @@
         </w:rPr>
         <w:t>raw_adc</w:t>
       </w:r>
-      <w:proofErr w:type="spellEnd"/>
       <w:r>
         <w:rPr>
           <w:rFonts w:ascii="Consolas" w:eastAsia="Times New Roman" w:hAnsi="Consolas" w:cs="Times New Roman"/>
@@ -1317,7 +1187,6 @@
         </w:rPr>
         <w:t xml:space="preserve"> </w:t>
       </w:r>
-      <w:proofErr w:type="spellStart"/>
       <w:r>
         <w:rPr>
           <w:rFonts w:ascii="Consolas" w:eastAsia="Times New Roman" w:hAnsi="Consolas" w:cs="Times New Roman"/>
@@ -1325,37 +1194,16 @@
           <w:sz w:val="21"/>
           <w:szCs w:val="21"/>
         </w:rPr>
-        <w:t>read_</w:t>
-      </w:r>
-      <w:proofErr w:type="gramStart"/>
-      <w:r>
-        <w:rPr>
-          <w:rFonts w:ascii="Consolas" w:eastAsia="Times New Roman" w:hAnsi="Consolas" w:cs="Times New Roman"/>
-          <w:color w:val="BBDAFF"/>
-          <w:sz w:val="21"/>
-          <w:szCs w:val="21"/>
-        </w:rPr>
-        <w:t>adc</w:t>
-      </w:r>
-      <w:proofErr w:type="spellEnd"/>
-      <w:r>
-        <w:rPr>
-          <w:rFonts w:ascii="Consolas" w:eastAsia="Times New Roman" w:hAnsi="Consolas" w:cs="Times New Roman"/>
-          <w:color w:val="FFFFFF"/>
-          <w:sz w:val="21"/>
-          <w:szCs w:val="21"/>
-        </w:rPr>
-        <w:t>(</w:t>
-      </w:r>
-      <w:proofErr w:type="gramEnd"/>
-      <w:r>
-        <w:rPr>
-          <w:rFonts w:ascii="Consolas" w:eastAsia="Times New Roman" w:hAnsi="Consolas" w:cs="Times New Roman"/>
-          <w:color w:val="FFFFFF"/>
-          <w:sz w:val="21"/>
-          <w:szCs w:val="21"/>
-        </w:rPr>
-        <w:t>);</w:t>
+        <w:t>read_adc</w:t>
+      </w:r>
+      <w:r>
+        <w:rPr>
+          <w:rFonts w:ascii="Consolas" w:eastAsia="Times New Roman" w:hAnsi="Consolas" w:cs="Times New Roman"/>
+          <w:color w:val="FFFFFF"/>
+          <w:sz w:val="21"/>
+          <w:szCs w:val="21"/>
+        </w:rPr>
+        <w:t>();</w:t>
       </w:r>
     </w:p>
     <w:p>
@@ -1394,9 +1242,44 @@
           <w:sz w:val="21"/>
           <w:szCs w:val="21"/>
         </w:rPr>
-        <w:t xml:space="preserve"> </w:t>
-      </w:r>
-      <w:proofErr w:type="gramStart"/>
+        <w:t xml:space="preserve"> (</w:t>
+      </w:r>
+      <w:r>
+        <w:rPr>
+          <w:rFonts w:ascii="Consolas" w:eastAsia="Times New Roman" w:hAnsi="Consolas" w:cs="Times New Roman"/>
+          <w:color w:val="99FFFF"/>
+          <w:sz w:val="21"/>
+          <w:szCs w:val="21"/>
+        </w:rPr>
+        <w:t>!</w:t>
+      </w:r>
+      <w:r>
+        <w:rPr>
+          <w:rFonts w:ascii="Consolas" w:eastAsia="Times New Roman" w:hAnsi="Consolas" w:cs="Times New Roman"/>
+          <w:color w:val="FFEEAD"/>
+          <w:sz w:val="21"/>
+          <w:szCs w:val="21"/>
+        </w:rPr>
+        <w:t>std</w:t>
+      </w:r>
+      <w:r>
+        <w:rPr>
+          <w:rFonts w:ascii="Consolas" w:eastAsia="Times New Roman" w:hAnsi="Consolas" w:cs="Times New Roman"/>
+          <w:color w:val="FFFFFF"/>
+          <w:sz w:val="21"/>
+          <w:szCs w:val="21"/>
+        </w:rPr>
+        <w:t>::</w:t>
+      </w:r>
+      <w:r>
+        <w:rPr>
+          <w:rFonts w:ascii="Consolas" w:eastAsia="Times New Roman" w:hAnsi="Consolas" w:cs="Times New Roman"/>
+          <w:color w:val="BBDAFF"/>
+          <w:sz w:val="21"/>
+          <w:szCs w:val="21"/>
+        </w:rPr>
+        <w:t>isfinite</w:t>
+      </w:r>
       <w:r>
         <w:rPr>
           <w:rFonts w:ascii="Consolas" w:eastAsia="Times New Roman" w:hAnsi="Consolas" w:cs="Times New Roman"/>
@@ -1409,62 +1292,12 @@
       <w:r>
         <w:rPr>
           <w:rFonts w:ascii="Consolas" w:eastAsia="Times New Roman" w:hAnsi="Consolas" w:cs="Times New Roman"/>
-          <w:color w:val="99FFFF"/>
-          <w:sz w:val="21"/>
-          <w:szCs w:val="21"/>
-        </w:rPr>
-        <w:t>!</w:t>
-      </w:r>
-      <w:r>
-        <w:rPr>
-          <w:rFonts w:ascii="Consolas" w:eastAsia="Times New Roman" w:hAnsi="Consolas" w:cs="Times New Roman"/>
-          <w:color w:val="FFEEAD"/>
-          <w:sz w:val="21"/>
-          <w:szCs w:val="21"/>
-        </w:rPr>
-        <w:t>std</w:t>
-      </w:r>
-      <w:r>
-        <w:rPr>
-          <w:rFonts w:ascii="Consolas" w:eastAsia="Times New Roman" w:hAnsi="Consolas" w:cs="Times New Roman"/>
-          <w:color w:val="FFFFFF"/>
-          <w:sz w:val="21"/>
-          <w:szCs w:val="21"/>
-        </w:rPr>
-        <w:t>::</w:t>
-      </w:r>
-      <w:proofErr w:type="spellStart"/>
-      <w:proofErr w:type="gramEnd"/>
-      <w:r>
-        <w:rPr>
-          <w:rFonts w:ascii="Consolas" w:eastAsia="Times New Roman" w:hAnsi="Consolas" w:cs="Times New Roman"/>
-          <w:color w:val="BBDAFF"/>
-          <w:sz w:val="21"/>
-          <w:szCs w:val="21"/>
-        </w:rPr>
-        <w:t>isfinite</w:t>
-      </w:r>
-      <w:proofErr w:type="spellEnd"/>
-      <w:r>
-        <w:rPr>
-          <w:rFonts w:ascii="Consolas" w:eastAsia="Times New Roman" w:hAnsi="Consolas" w:cs="Times New Roman"/>
-          <w:color w:val="FFFFFF"/>
-          <w:sz w:val="21"/>
-          <w:szCs w:val="21"/>
-        </w:rPr>
-        <w:t>(</w:t>
-      </w:r>
-      <w:proofErr w:type="spellStart"/>
-      <w:r>
-        <w:rPr>
-          <w:rFonts w:ascii="Consolas" w:eastAsia="Times New Roman" w:hAnsi="Consolas" w:cs="Times New Roman"/>
           <w:color w:val="FF9DA4"/>
           <w:sz w:val="21"/>
           <w:szCs w:val="21"/>
         </w:rPr>
         <w:t>raw_adc</w:t>
       </w:r>
-      <w:proofErr w:type="spellEnd"/>
       <w:r>
         <w:rPr>
           <w:rFonts w:ascii="Consolas" w:eastAsia="Times New Roman" w:hAnsi="Consolas" w:cs="Times New Roman"/>
@@ -1531,7 +1364,6 @@
         </w:rPr>
         <w:t xml:space="preserve">    </w:t>
       </w:r>
-      <w:proofErr w:type="spellStart"/>
       <w:r>
         <w:rPr>
           <w:rFonts w:ascii="Consolas" w:eastAsia="Times New Roman" w:hAnsi="Consolas" w:cs="Times New Roman"/>
@@ -1541,7 +1373,6 @@
         </w:rPr>
         <w:t>temperature_c</w:t>
       </w:r>
-      <w:proofErr w:type="spellEnd"/>
       <w:r>
         <w:rPr>
           <w:rFonts w:ascii="Consolas" w:eastAsia="Times New Roman" w:hAnsi="Consolas" w:cs="Times New Roman"/>
@@ -1639,27 +1470,8 @@
           <w:sz w:val="21"/>
           <w:szCs w:val="21"/>
         </w:rPr>
-        <w:t>    //</w:t>
-      </w:r>
-      <w:proofErr w:type="spellStart"/>
-      <w:r>
-        <w:rPr>
-          <w:rFonts w:ascii="Consolas" w:eastAsia="Times New Roman" w:hAnsi="Consolas" w:cs="Times New Roman"/>
-          <w:color w:val="7285B7"/>
-          <w:sz w:val="21"/>
-          <w:szCs w:val="21"/>
-        </w:rPr>
-        <w:t>RCon</w:t>
-      </w:r>
-      <w:proofErr w:type="spellEnd"/>
-      <w:r>
-        <w:rPr>
-          <w:rFonts w:ascii="Consolas" w:eastAsia="Times New Roman" w:hAnsi="Consolas" w:cs="Times New Roman"/>
-          <w:color w:val="7285B7"/>
-          <w:sz w:val="21"/>
-          <w:szCs w:val="21"/>
-        </w:rPr>
-        <w:t xml:space="preserve"> - Resistance of constant resistance comparator resistor in the voltage divider against the thermistor.</w:t>
+        <w:lastRenderedPageBreak/>
+        <w:t>    //RCon - Resistance of constant resistance comparator resistor in the voltage divider against the thermistor.</w:t>
       </w:r>
     </w:p>
     <w:p>
@@ -1680,47 +1492,7 @@
           <w:sz w:val="21"/>
           <w:szCs w:val="21"/>
         </w:rPr>
-        <w:t>    //</w:t>
-      </w:r>
-      <w:proofErr w:type="spellStart"/>
-      <w:r>
-        <w:rPr>
-          <w:rFonts w:ascii="Consolas" w:eastAsia="Times New Roman" w:hAnsi="Consolas" w:cs="Times New Roman"/>
-          <w:color w:val="7285B7"/>
-          <w:sz w:val="21"/>
-          <w:szCs w:val="21"/>
-        </w:rPr>
-        <w:t>RThe</w:t>
-      </w:r>
-      <w:proofErr w:type="spellEnd"/>
-      <w:r>
-        <w:rPr>
-          <w:rFonts w:ascii="Consolas" w:eastAsia="Times New Roman" w:hAnsi="Consolas" w:cs="Times New Roman"/>
-          <w:color w:val="7285B7"/>
-          <w:sz w:val="21"/>
-          <w:szCs w:val="21"/>
-        </w:rPr>
-        <w:t xml:space="preserve"> - Datasheet resistance of thermistor at a temperature of 25 degrees </w:t>
-      </w:r>
-      <w:proofErr w:type="spellStart"/>
-      <w:r>
-        <w:rPr>
-          <w:rFonts w:ascii="Consolas" w:eastAsia="Times New Roman" w:hAnsi="Consolas" w:cs="Times New Roman"/>
-          <w:color w:val="7285B7"/>
-          <w:sz w:val="21"/>
-          <w:szCs w:val="21"/>
-        </w:rPr>
-        <w:t>celsius</w:t>
-      </w:r>
-      <w:proofErr w:type="spellEnd"/>
-      <w:r>
-        <w:rPr>
-          <w:rFonts w:ascii="Consolas" w:eastAsia="Times New Roman" w:hAnsi="Consolas" w:cs="Times New Roman"/>
-          <w:color w:val="7285B7"/>
-          <w:sz w:val="21"/>
-          <w:szCs w:val="21"/>
-        </w:rPr>
-        <w:t>.</w:t>
+        <w:t>    //RThe - Datasheet resistance of thermistor at a temperature of 25 degrees celsius.</w:t>
       </w:r>
     </w:p>
     <w:p>
@@ -1741,47 +1513,7 @@
           <w:sz w:val="21"/>
           <w:szCs w:val="21"/>
         </w:rPr>
-        <w:t>    //</w:t>
-      </w:r>
-      <w:proofErr w:type="spellStart"/>
-      <w:r>
-        <w:rPr>
-          <w:rFonts w:ascii="Consolas" w:eastAsia="Times New Roman" w:hAnsi="Consolas" w:cs="Times New Roman"/>
-          <w:color w:val="7285B7"/>
-          <w:sz w:val="21"/>
-          <w:szCs w:val="21"/>
-        </w:rPr>
-        <w:t>BetaCon</w:t>
-      </w:r>
-      <w:proofErr w:type="spellEnd"/>
-      <w:r>
-        <w:rPr>
-          <w:rFonts w:ascii="Consolas" w:eastAsia="Times New Roman" w:hAnsi="Consolas" w:cs="Times New Roman"/>
-          <w:color w:val="7285B7"/>
-          <w:sz w:val="21"/>
-          <w:szCs w:val="21"/>
-        </w:rPr>
-        <w:t xml:space="preserve"> - Datasheet beta constant of thermistor between temps of 25 to 85 degrees </w:t>
-      </w:r>
-      <w:proofErr w:type="spellStart"/>
-      <w:r>
-        <w:rPr>
-          <w:rFonts w:ascii="Consolas" w:eastAsia="Times New Roman" w:hAnsi="Consolas" w:cs="Times New Roman"/>
-          <w:color w:val="7285B7"/>
-          <w:sz w:val="21"/>
-          <w:szCs w:val="21"/>
-        </w:rPr>
-        <w:t>celsius</w:t>
-      </w:r>
-      <w:proofErr w:type="spellEnd"/>
-      <w:r>
-        <w:rPr>
-          <w:rFonts w:ascii="Consolas" w:eastAsia="Times New Roman" w:hAnsi="Consolas" w:cs="Times New Roman"/>
-          <w:color w:val="7285B7"/>
-          <w:sz w:val="21"/>
-          <w:szCs w:val="21"/>
-        </w:rPr>
-        <w:t>, used to calculate temperature from resistance.</w:t>
+        <w:t>    //BetaCon - Datasheet beta constant of thermistor between temps of 25 to 85 degrees celsius, used to calculate temperature from resistance.</w:t>
       </w:r>
     </w:p>
     <w:p>
@@ -1802,27 +1534,7 @@
           <w:sz w:val="21"/>
           <w:szCs w:val="21"/>
         </w:rPr>
-        <w:t>    //</w:t>
-      </w:r>
-      <w:proofErr w:type="spellStart"/>
-      <w:r>
-        <w:rPr>
-          <w:rFonts w:ascii="Consolas" w:eastAsia="Times New Roman" w:hAnsi="Consolas" w:cs="Times New Roman"/>
-          <w:color w:val="7285B7"/>
-          <w:sz w:val="21"/>
-          <w:szCs w:val="21"/>
-        </w:rPr>
-        <w:t>ThermistorBaselineTemp</w:t>
-      </w:r>
-      <w:proofErr w:type="spellEnd"/>
-      <w:r>
-        <w:rPr>
-          <w:rFonts w:ascii="Consolas" w:eastAsia="Times New Roman" w:hAnsi="Consolas" w:cs="Times New Roman"/>
-          <w:color w:val="7285B7"/>
-          <w:sz w:val="21"/>
-          <w:szCs w:val="21"/>
-        </w:rPr>
-        <w:t xml:space="preserve"> - Temperature in kelvin (required for temp calculations) at which thermistor reaches its baseline resistance.</w:t>
+        <w:t>    //ThermistorBaselineTemp - Temperature in kelvin (required for temp calculations) at which thermistor reaches its baseline resistance.</w:t>
       </w:r>
     </w:p>
     <w:p>
@@ -1845,7 +1557,6 @@
         </w:rPr>
         <w:t xml:space="preserve">    </w:t>
       </w:r>
-      <w:proofErr w:type="spellStart"/>
       <w:r>
         <w:rPr>
           <w:rFonts w:ascii="Consolas" w:eastAsia="Times New Roman" w:hAnsi="Consolas" w:cs="Times New Roman"/>
@@ -1855,7 +1566,6 @@
         </w:rPr>
         <w:t>const</w:t>
       </w:r>
-      <w:proofErr w:type="spellEnd"/>
       <w:r>
         <w:rPr>
           <w:rFonts w:ascii="Consolas" w:eastAsia="Times New Roman" w:hAnsi="Consolas" w:cs="Times New Roman"/>
@@ -1883,7 +1593,6 @@
         </w:rPr>
         <w:t xml:space="preserve"> </w:t>
       </w:r>
-      <w:proofErr w:type="spellStart"/>
       <w:r>
         <w:rPr>
           <w:rFonts w:ascii="Consolas" w:eastAsia="Times New Roman" w:hAnsi="Consolas" w:cs="Times New Roman"/>
@@ -1893,7 +1602,6 @@
         </w:rPr>
         <w:t>RConstant</w:t>
       </w:r>
-      <w:proofErr w:type="spellEnd"/>
       <w:r>
         <w:rPr>
           <w:rFonts w:ascii="Consolas" w:eastAsia="Times New Roman" w:hAnsi="Consolas" w:cs="Times New Roman"/>
@@ -2014,7 +1722,6 @@
         </w:rPr>
         <w:t xml:space="preserve">    </w:t>
       </w:r>
-      <w:proofErr w:type="spellStart"/>
       <w:r>
         <w:rPr>
           <w:rFonts w:ascii="Consolas" w:eastAsia="Times New Roman" w:hAnsi="Consolas" w:cs="Times New Roman"/>
@@ -2024,7 +1731,6 @@
         </w:rPr>
         <w:t>const</w:t>
       </w:r>
-      <w:proofErr w:type="spellEnd"/>
       <w:r>
         <w:rPr>
           <w:rFonts w:ascii="Consolas" w:eastAsia="Times New Roman" w:hAnsi="Consolas" w:cs="Times New Roman"/>
@@ -2127,7 +1833,6 @@
         </w:rPr>
         <w:t xml:space="preserve">    </w:t>
       </w:r>
-      <w:proofErr w:type="spellStart"/>
       <w:r>
         <w:rPr>
           <w:rFonts w:ascii="Consolas" w:eastAsia="Times New Roman" w:hAnsi="Consolas" w:cs="Times New Roman"/>
@@ -2137,7 +1842,6 @@
         </w:rPr>
         <w:t>const</w:t>
       </w:r>
-      <w:proofErr w:type="spellEnd"/>
       <w:r>
         <w:rPr>
           <w:rFonts w:ascii="Consolas" w:eastAsia="Times New Roman" w:hAnsi="Consolas" w:cs="Times New Roman"/>
@@ -2165,7 +1869,6 @@
         </w:rPr>
         <w:t xml:space="preserve"> </w:t>
       </w:r>
-      <w:proofErr w:type="spellStart"/>
       <w:r>
         <w:rPr>
           <w:rFonts w:ascii="Consolas" w:eastAsia="Times New Roman" w:hAnsi="Consolas" w:cs="Times New Roman"/>
@@ -2175,7 +1878,6 @@
         </w:rPr>
         <w:t>ThermistorBaselineTempKelvin</w:t>
       </w:r>
-      <w:proofErr w:type="spellEnd"/>
       <w:r>
         <w:rPr>
           <w:rFonts w:ascii="Consolas" w:eastAsia="Times New Roman" w:hAnsi="Consolas" w:cs="Times New Roman"/>
@@ -2318,47 +2020,7 @@
           <w:sz w:val="21"/>
           <w:szCs w:val="21"/>
         </w:rPr>
-        <w:t xml:space="preserve">    //float </w:t>
-      </w:r>
-      <w:proofErr w:type="spellStart"/>
-      <w:r>
-        <w:rPr>
-          <w:rFonts w:ascii="Consolas" w:eastAsia="Times New Roman" w:hAnsi="Consolas" w:cs="Times New Roman"/>
-          <w:color w:val="7285B7"/>
-          <w:sz w:val="21"/>
-          <w:szCs w:val="21"/>
-        </w:rPr>
-        <w:t>VOut</w:t>
-      </w:r>
-      <w:proofErr w:type="spellEnd"/>
-      <w:r>
-        <w:rPr>
-          <w:rFonts w:ascii="Consolas" w:eastAsia="Times New Roman" w:hAnsi="Consolas" w:cs="Times New Roman"/>
-          <w:color w:val="7285B7"/>
-          <w:sz w:val="21"/>
-          <w:szCs w:val="21"/>
-        </w:rPr>
-        <w:t xml:space="preserve"> = 5.25 * </w:t>
-      </w:r>
-      <w:proofErr w:type="spellStart"/>
-      <w:r>
-        <w:rPr>
-          <w:rFonts w:ascii="Consolas" w:eastAsia="Times New Roman" w:hAnsi="Consolas" w:cs="Times New Roman"/>
-          <w:color w:val="7285B7"/>
-          <w:sz w:val="21"/>
-          <w:szCs w:val="21"/>
-        </w:rPr>
-        <w:t>raw_adc</w:t>
-      </w:r>
-      <w:proofErr w:type="spellEnd"/>
-      <w:r>
-        <w:rPr>
-          <w:rFonts w:ascii="Consolas" w:eastAsia="Times New Roman" w:hAnsi="Consolas" w:cs="Times New Roman"/>
-          <w:color w:val="7285B7"/>
-          <w:sz w:val="21"/>
-          <w:szCs w:val="21"/>
-        </w:rPr>
-        <w:t xml:space="preserve"> / 4095.0, simplified steps from flowchart diagram but line here for clarity.</w:t>
+        <w:t>    //float VOut = 5.25 * raw_adc / 4095.0, simplified steps from flowchart diagram but line here for clarity.</w:t>
       </w:r>
     </w:p>
     <w:p>
@@ -2399,7 +2061,6 @@
         </w:rPr>
         <w:t xml:space="preserve"> </w:t>
       </w:r>
-      <w:proofErr w:type="spellStart"/>
       <w:r>
         <w:rPr>
           <w:rFonts w:ascii="Consolas" w:eastAsia="Times New Roman" w:hAnsi="Consolas" w:cs="Times New Roman"/>
@@ -2409,7 +2070,6 @@
         </w:rPr>
         <w:t>RThermistor</w:t>
       </w:r>
-      <w:proofErr w:type="spellEnd"/>
       <w:r>
         <w:rPr>
           <w:rFonts w:ascii="Consolas" w:eastAsia="Times New Roman" w:hAnsi="Consolas" w:cs="Times New Roman"/>
@@ -2437,7 +2097,6 @@
         </w:rPr>
         <w:t xml:space="preserve"> </w:t>
       </w:r>
-      <w:proofErr w:type="spellStart"/>
       <w:r>
         <w:rPr>
           <w:rFonts w:ascii="Consolas" w:eastAsia="Times New Roman" w:hAnsi="Consolas" w:cs="Times New Roman"/>
@@ -2447,7 +2106,6 @@
         </w:rPr>
         <w:t>RConstant</w:t>
       </w:r>
-      <w:proofErr w:type="spellEnd"/>
       <w:r>
         <w:rPr>
           <w:rFonts w:ascii="Consolas" w:eastAsia="Times New Roman" w:hAnsi="Consolas" w:cs="Times New Roman"/>
@@ -2511,7 +2169,6 @@
         </w:rPr>
         <w:t xml:space="preserve"> </w:t>
       </w:r>
-      <w:proofErr w:type="spellStart"/>
       <w:r>
         <w:rPr>
           <w:rFonts w:ascii="Consolas" w:eastAsia="Times New Roman" w:hAnsi="Consolas" w:cs="Times New Roman"/>
@@ -2521,7 +2178,6 @@
         </w:rPr>
         <w:t>raw_adc</w:t>
       </w:r>
-      <w:proofErr w:type="spellEnd"/>
       <w:r>
         <w:rPr>
           <w:rFonts w:ascii="Consolas" w:eastAsia="Times New Roman" w:hAnsi="Consolas" w:cs="Times New Roman"/>
@@ -2549,7 +2205,6 @@
         </w:rPr>
         <w:t xml:space="preserve"> </w:t>
       </w:r>
-      <w:proofErr w:type="spellStart"/>
       <w:r>
         <w:rPr>
           <w:rFonts w:ascii="Consolas" w:eastAsia="Times New Roman" w:hAnsi="Consolas" w:cs="Times New Roman"/>
@@ -2559,7 +2214,6 @@
         </w:rPr>
         <w:t>RConstant</w:t>
       </w:r>
-      <w:proofErr w:type="spellEnd"/>
       <w:r>
         <w:rPr>
           <w:rFonts w:ascii="Consolas" w:eastAsia="Times New Roman" w:hAnsi="Consolas" w:cs="Times New Roman"/>
@@ -2609,28 +2263,7 @@
           <w:sz w:val="21"/>
           <w:szCs w:val="21"/>
         </w:rPr>
-        <w:lastRenderedPageBreak/>
-        <w:t>    //</w:t>
-      </w:r>
-      <w:proofErr w:type="spellStart"/>
-      <w:r>
-        <w:rPr>
-          <w:rFonts w:ascii="Consolas" w:eastAsia="Times New Roman" w:hAnsi="Consolas" w:cs="Times New Roman"/>
-          <w:color w:val="7285B7"/>
-          <w:sz w:val="21"/>
-          <w:szCs w:val="21"/>
-        </w:rPr>
-        <w:t>cmath</w:t>
-      </w:r>
-      <w:proofErr w:type="spellEnd"/>
-      <w:r>
-        <w:rPr>
-          <w:rFonts w:ascii="Consolas" w:eastAsia="Times New Roman" w:hAnsi="Consolas" w:cs="Times New Roman"/>
-          <w:color w:val="7285B7"/>
-          <w:sz w:val="21"/>
-          <w:szCs w:val="21"/>
-        </w:rPr>
-        <w:t xml:space="preserve"> power and natural log used, optimised math performance by performing minimal amount of resource intensive exponentiation and logarithms.</w:t>
+        <w:t>    //cmath power and natural log used, optimised math performance by performing minimal amount of resource intensive exponentiation and logarithms.</w:t>
       </w:r>
     </w:p>
     <w:p>
@@ -2653,7 +2286,6 @@
         </w:rPr>
         <w:t xml:space="preserve">    </w:t>
       </w:r>
-      <w:proofErr w:type="spellStart"/>
       <w:r>
         <w:rPr>
           <w:rFonts w:ascii="Consolas" w:eastAsia="Times New Roman" w:hAnsi="Consolas" w:cs="Times New Roman"/>
@@ -2663,7 +2295,6 @@
         </w:rPr>
         <w:t>temperature_c</w:t>
       </w:r>
-      <w:proofErr w:type="spellEnd"/>
       <w:r>
         <w:rPr>
           <w:rFonts w:ascii="Consolas" w:eastAsia="Times New Roman" w:hAnsi="Consolas" w:cs="Times New Roman"/>
@@ -2691,7 +2322,6 @@
         </w:rPr>
         <w:t xml:space="preserve"> </w:t>
       </w:r>
-      <w:proofErr w:type="gramStart"/>
       <w:r>
         <w:rPr>
           <w:rFonts w:ascii="Consolas" w:eastAsia="Times New Roman" w:hAnsi="Consolas" w:cs="Times New Roman"/>
@@ -2708,19 +2338,134 @@
           <w:sz w:val="21"/>
           <w:szCs w:val="21"/>
         </w:rPr>
+        <w:t>(((</w:t>
+      </w:r>
+      <w:r>
+        <w:rPr>
+          <w:rFonts w:ascii="Consolas" w:eastAsia="Times New Roman" w:hAnsi="Consolas" w:cs="Times New Roman"/>
+          <w:color w:val="BBDAFF"/>
+          <w:sz w:val="21"/>
+          <w:szCs w:val="21"/>
+        </w:rPr>
+        <w:t>log</w:t>
+      </w:r>
+      <w:r>
+        <w:rPr>
+          <w:rFonts w:ascii="Consolas" w:eastAsia="Times New Roman" w:hAnsi="Consolas" w:cs="Times New Roman"/>
+          <w:color w:val="FFFFFF"/>
+          <w:sz w:val="21"/>
+          <w:szCs w:val="21"/>
+        </w:rPr>
         <w:t>(</w:t>
       </w:r>
-      <w:proofErr w:type="gramEnd"/>
-      <w:r>
-        <w:rPr>
-          <w:rFonts w:ascii="Consolas" w:eastAsia="Times New Roman" w:hAnsi="Consolas" w:cs="Times New Roman"/>
-          <w:color w:val="FFFFFF"/>
-          <w:sz w:val="21"/>
-          <w:szCs w:val="21"/>
-        </w:rPr>
-        <w:t>((</w:t>
-      </w:r>
-      <w:proofErr w:type="gramStart"/>
+      <w:r>
+        <w:rPr>
+          <w:rFonts w:ascii="Consolas" w:eastAsia="Times New Roman" w:hAnsi="Consolas" w:cs="Times New Roman"/>
+          <w:color w:val="FF9DA4"/>
+          <w:sz w:val="21"/>
+          <w:szCs w:val="21"/>
+        </w:rPr>
+        <w:t>RThermistor</w:t>
+      </w:r>
+      <w:r>
+        <w:rPr>
+          <w:rFonts w:ascii="Consolas" w:eastAsia="Times New Roman" w:hAnsi="Consolas" w:cs="Times New Roman"/>
+          <w:color w:val="FFFFFF"/>
+          <w:sz w:val="21"/>
+          <w:szCs w:val="21"/>
+        </w:rPr>
+        <w:t xml:space="preserve"> </w:t>
+      </w:r>
+      <w:r>
+        <w:rPr>
+          <w:rFonts w:ascii="Consolas" w:eastAsia="Times New Roman" w:hAnsi="Consolas" w:cs="Times New Roman"/>
+          <w:color w:val="99FFFF"/>
+          <w:sz w:val="21"/>
+          <w:szCs w:val="21"/>
+        </w:rPr>
+        <w:t>/</w:t>
+      </w:r>
+      <w:r>
+        <w:rPr>
+          <w:rFonts w:ascii="Consolas" w:eastAsia="Times New Roman" w:hAnsi="Consolas" w:cs="Times New Roman"/>
+          <w:color w:val="FFFFFF"/>
+          <w:sz w:val="21"/>
+          <w:szCs w:val="21"/>
+        </w:rPr>
+        <w:t xml:space="preserve"> </w:t>
+      </w:r>
+      <w:r>
+        <w:rPr>
+          <w:rFonts w:ascii="Consolas" w:eastAsia="Times New Roman" w:hAnsi="Consolas" w:cs="Times New Roman"/>
+          <w:color w:val="FF9DA4"/>
+          <w:sz w:val="21"/>
+          <w:szCs w:val="21"/>
+        </w:rPr>
+        <w:t>RThermistor25Baseline</w:t>
+      </w:r>
+      <w:r>
+        <w:rPr>
+          <w:rFonts w:ascii="Consolas" w:eastAsia="Times New Roman" w:hAnsi="Consolas" w:cs="Times New Roman"/>
+          <w:color w:val="FFFFFF"/>
+          <w:sz w:val="21"/>
+          <w:szCs w:val="21"/>
+        </w:rPr>
+        <w:t xml:space="preserve">) </w:t>
+      </w:r>
+      <w:r>
+        <w:rPr>
+          <w:rFonts w:ascii="Consolas" w:eastAsia="Times New Roman" w:hAnsi="Consolas" w:cs="Times New Roman"/>
+          <w:color w:val="99FFFF"/>
+          <w:sz w:val="21"/>
+          <w:szCs w:val="21"/>
+        </w:rPr>
+        <w:t>/</w:t>
+      </w:r>
+      <w:r>
+        <w:rPr>
+          <w:rFonts w:ascii="Consolas" w:eastAsia="Times New Roman" w:hAnsi="Consolas" w:cs="Times New Roman"/>
+          <w:color w:val="FFFFFF"/>
+          <w:sz w:val="21"/>
+          <w:szCs w:val="21"/>
+        </w:rPr>
+        <w:t xml:space="preserve"> </w:t>
+      </w:r>
+      <w:r>
+        <w:rPr>
+          <w:rFonts w:ascii="Consolas" w:eastAsia="Times New Roman" w:hAnsi="Consolas" w:cs="Times New Roman"/>
+          <w:color w:val="FF9DA4"/>
+          <w:sz w:val="21"/>
+          <w:szCs w:val="21"/>
+        </w:rPr>
+        <w:t>BetaConstant2585</w:t>
+      </w:r>
+      <w:r>
+        <w:rPr>
+          <w:rFonts w:ascii="Consolas" w:eastAsia="Times New Roman" w:hAnsi="Consolas" w:cs="Times New Roman"/>
+          <w:color w:val="FFFFFF"/>
+          <w:sz w:val="21"/>
+          <w:szCs w:val="21"/>
+        </w:rPr>
+        <w:t xml:space="preserve">) </w:t>
+      </w:r>
+      <w:r>
+        <w:rPr>
+          <w:rFonts w:ascii="Consolas" w:eastAsia="Times New Roman" w:hAnsi="Consolas" w:cs="Times New Roman"/>
+          <w:color w:val="99FFFF"/>
+          <w:sz w:val="21"/>
+          <w:szCs w:val="21"/>
+        </w:rPr>
+        <w:t>+</w:t>
+      </w:r>
+      <w:r>
+        <w:rPr>
+          <w:rFonts w:ascii="Consolas" w:eastAsia="Times New Roman" w:hAnsi="Consolas" w:cs="Times New Roman"/>
+          <w:color w:val="FFFFFF"/>
+          <w:sz w:val="21"/>
+          <w:szCs w:val="21"/>
+        </w:rPr>
+        <w:t xml:space="preserve"> </w:t>
+      </w:r>
       <w:r>
         <w:rPr>
           <w:rFonts w:ascii="Consolas" w:eastAsia="Times New Roman" w:hAnsi="Consolas" w:cs="Times New Roman"/>
@@ -2728,7 +2473,7 @@
           <w:sz w:val="21"/>
           <w:szCs w:val="21"/>
         </w:rPr>
-        <w:t>log</w:t>
+        <w:t>pow</w:t>
       </w:r>
       <w:r>
         <w:rPr>
@@ -2739,8 +2484,6 @@
         </w:rPr>
         <w:t>(</w:t>
       </w:r>
-      <w:proofErr w:type="spellStart"/>
-      <w:proofErr w:type="gramEnd"/>
       <w:r>
         <w:rPr>
           <w:rFonts w:ascii="Consolas" w:eastAsia="Times New Roman" w:hAnsi="Consolas" w:cs="Times New Roman"/>
@@ -2748,139 +2491,8 @@
           <w:sz w:val="21"/>
           <w:szCs w:val="21"/>
         </w:rPr>
-        <w:t>RThermistor</w:t>
-      </w:r>
-      <w:proofErr w:type="spellEnd"/>
-      <w:r>
-        <w:rPr>
-          <w:rFonts w:ascii="Consolas" w:eastAsia="Times New Roman" w:hAnsi="Consolas" w:cs="Times New Roman"/>
-          <w:color w:val="FFFFFF"/>
-          <w:sz w:val="21"/>
-          <w:szCs w:val="21"/>
-        </w:rPr>
-        <w:t xml:space="preserve"> </w:t>
-      </w:r>
-      <w:r>
-        <w:rPr>
-          <w:rFonts w:ascii="Consolas" w:eastAsia="Times New Roman" w:hAnsi="Consolas" w:cs="Times New Roman"/>
-          <w:color w:val="99FFFF"/>
-          <w:sz w:val="21"/>
-          <w:szCs w:val="21"/>
-        </w:rPr>
-        <w:t>/</w:t>
-      </w:r>
-      <w:r>
-        <w:rPr>
-          <w:rFonts w:ascii="Consolas" w:eastAsia="Times New Roman" w:hAnsi="Consolas" w:cs="Times New Roman"/>
-          <w:color w:val="FFFFFF"/>
-          <w:sz w:val="21"/>
-          <w:szCs w:val="21"/>
-        </w:rPr>
-        <w:t xml:space="preserve"> </w:t>
-      </w:r>
-      <w:r>
-        <w:rPr>
-          <w:rFonts w:ascii="Consolas" w:eastAsia="Times New Roman" w:hAnsi="Consolas" w:cs="Times New Roman"/>
-          <w:color w:val="FF9DA4"/>
-          <w:sz w:val="21"/>
-          <w:szCs w:val="21"/>
-        </w:rPr>
-        <w:t>RThermistor25Baseline</w:t>
-      </w:r>
-      <w:r>
-        <w:rPr>
-          <w:rFonts w:ascii="Consolas" w:eastAsia="Times New Roman" w:hAnsi="Consolas" w:cs="Times New Roman"/>
-          <w:color w:val="FFFFFF"/>
-          <w:sz w:val="21"/>
-          <w:szCs w:val="21"/>
-        </w:rPr>
-        <w:t xml:space="preserve">) </w:t>
-      </w:r>
-      <w:r>
-        <w:rPr>
-          <w:rFonts w:ascii="Consolas" w:eastAsia="Times New Roman" w:hAnsi="Consolas" w:cs="Times New Roman"/>
-          <w:color w:val="99FFFF"/>
-          <w:sz w:val="21"/>
-          <w:szCs w:val="21"/>
-        </w:rPr>
-        <w:t>/</w:t>
-      </w:r>
-      <w:r>
-        <w:rPr>
-          <w:rFonts w:ascii="Consolas" w:eastAsia="Times New Roman" w:hAnsi="Consolas" w:cs="Times New Roman"/>
-          <w:color w:val="FFFFFF"/>
-          <w:sz w:val="21"/>
-          <w:szCs w:val="21"/>
-        </w:rPr>
-        <w:t xml:space="preserve"> </w:t>
-      </w:r>
-      <w:r>
-        <w:rPr>
-          <w:rFonts w:ascii="Consolas" w:eastAsia="Times New Roman" w:hAnsi="Consolas" w:cs="Times New Roman"/>
-          <w:color w:val="FF9DA4"/>
-          <w:sz w:val="21"/>
-          <w:szCs w:val="21"/>
-        </w:rPr>
-        <w:t>BetaConstant2585</w:t>
-      </w:r>
-      <w:r>
-        <w:rPr>
-          <w:rFonts w:ascii="Consolas" w:eastAsia="Times New Roman" w:hAnsi="Consolas" w:cs="Times New Roman"/>
-          <w:color w:val="FFFFFF"/>
-          <w:sz w:val="21"/>
-          <w:szCs w:val="21"/>
-        </w:rPr>
-        <w:t xml:space="preserve">) </w:t>
-      </w:r>
-      <w:r>
-        <w:rPr>
-          <w:rFonts w:ascii="Consolas" w:eastAsia="Times New Roman" w:hAnsi="Consolas" w:cs="Times New Roman"/>
-          <w:color w:val="99FFFF"/>
-          <w:sz w:val="21"/>
-          <w:szCs w:val="21"/>
-        </w:rPr>
-        <w:t>+</w:t>
-      </w:r>
-      <w:r>
-        <w:rPr>
-          <w:rFonts w:ascii="Consolas" w:eastAsia="Times New Roman" w:hAnsi="Consolas" w:cs="Times New Roman"/>
-          <w:color w:val="FFFFFF"/>
-          <w:sz w:val="21"/>
-          <w:szCs w:val="21"/>
-        </w:rPr>
-        <w:t xml:space="preserve"> </w:t>
-      </w:r>
-      <w:proofErr w:type="gramStart"/>
-      <w:r>
-        <w:rPr>
-          <w:rFonts w:ascii="Consolas" w:eastAsia="Times New Roman" w:hAnsi="Consolas" w:cs="Times New Roman"/>
-          <w:color w:val="BBDAFF"/>
-          <w:sz w:val="21"/>
-          <w:szCs w:val="21"/>
-        </w:rPr>
-        <w:t>pow</w:t>
-      </w:r>
-      <w:r>
-        <w:rPr>
-          <w:rFonts w:ascii="Consolas" w:eastAsia="Times New Roman" w:hAnsi="Consolas" w:cs="Times New Roman"/>
-          <w:color w:val="FFFFFF"/>
-          <w:sz w:val="21"/>
-          <w:szCs w:val="21"/>
-        </w:rPr>
-        <w:t>(</w:t>
-      </w:r>
-      <w:proofErr w:type="spellStart"/>
-      <w:proofErr w:type="gramEnd"/>
-      <w:r>
-        <w:rPr>
-          <w:rFonts w:ascii="Consolas" w:eastAsia="Times New Roman" w:hAnsi="Consolas" w:cs="Times New Roman"/>
-          <w:color w:val="FF9DA4"/>
-          <w:sz w:val="21"/>
-          <w:szCs w:val="21"/>
-        </w:rPr>
         <w:t>ThermistorBaselineTempKelvin</w:t>
       </w:r>
-      <w:proofErr w:type="spellEnd"/>
       <w:r>
         <w:rPr>
           <w:rFonts w:ascii="Consolas" w:eastAsia="Times New Roman" w:hAnsi="Consolas" w:cs="Times New Roman"/>
@@ -3011,47 +2623,7 @@
           <w:sz w:val="21"/>
           <w:szCs w:val="21"/>
         </w:rPr>
-        <w:t xml:space="preserve">    //Maths code tested </w:t>
-      </w:r>
-      <w:proofErr w:type="spellStart"/>
-      <w:r>
-        <w:rPr>
-          <w:rFonts w:ascii="Consolas" w:eastAsia="Times New Roman" w:hAnsi="Consolas" w:cs="Times New Roman"/>
-          <w:color w:val="7285B7"/>
-          <w:sz w:val="21"/>
-          <w:szCs w:val="21"/>
-        </w:rPr>
-        <w:t>seperately</w:t>
-      </w:r>
-      <w:proofErr w:type="spellEnd"/>
-      <w:r>
-        <w:rPr>
-          <w:rFonts w:ascii="Consolas" w:eastAsia="Times New Roman" w:hAnsi="Consolas" w:cs="Times New Roman"/>
-          <w:color w:val="7285B7"/>
-          <w:sz w:val="21"/>
-          <w:szCs w:val="21"/>
-        </w:rPr>
-        <w:t xml:space="preserve"> outputs expected value for different </w:t>
-      </w:r>
-      <w:proofErr w:type="spellStart"/>
-      <w:r>
-        <w:rPr>
-          <w:rFonts w:ascii="Consolas" w:eastAsia="Times New Roman" w:hAnsi="Consolas" w:cs="Times New Roman"/>
-          <w:color w:val="7285B7"/>
-          <w:sz w:val="21"/>
-          <w:szCs w:val="21"/>
-        </w:rPr>
-        <w:t>raw_adcs</w:t>
-      </w:r>
-      <w:proofErr w:type="spellEnd"/>
-      <w:r>
-        <w:rPr>
-          <w:rFonts w:ascii="Consolas" w:eastAsia="Times New Roman" w:hAnsi="Consolas" w:cs="Times New Roman"/>
-          <w:color w:val="7285B7"/>
-          <w:sz w:val="21"/>
-          <w:szCs w:val="21"/>
-        </w:rPr>
-        <w:t>.</w:t>
+        <w:t>    //Maths code tested seperately outputs expected value for different raw_adcs.</w:t>
       </w:r>
     </w:p>
     <w:p>
@@ -3104,7 +2676,6 @@
         </w:rPr>
         <w:t xml:space="preserve"> </w:t>
       </w:r>
-      <w:proofErr w:type="gramStart"/>
       <w:r>
         <w:rPr>
           <w:rFonts w:ascii="Consolas" w:eastAsia="Times New Roman" w:hAnsi="Consolas" w:cs="Times New Roman"/>
@@ -3123,8 +2694,6 @@
         </w:rPr>
         <w:t>::</w:t>
       </w:r>
-      <w:proofErr w:type="spellStart"/>
-      <w:proofErr w:type="gramEnd"/>
       <w:r>
         <w:rPr>
           <w:rFonts w:ascii="Consolas" w:eastAsia="Times New Roman" w:hAnsi="Consolas" w:cs="Times New Roman"/>
@@ -3134,7 +2703,6 @@
         </w:rPr>
         <w:t>isfinite</w:t>
       </w:r>
-      <w:proofErr w:type="spellEnd"/>
       <w:r>
         <w:rPr>
           <w:rFonts w:ascii="Consolas" w:eastAsia="Times New Roman" w:hAnsi="Consolas" w:cs="Times New Roman"/>
@@ -3144,7 +2712,6 @@
         </w:rPr>
         <w:t>(</w:t>
       </w:r>
-      <w:proofErr w:type="spellStart"/>
       <w:r>
         <w:rPr>
           <w:rFonts w:ascii="Consolas" w:eastAsia="Times New Roman" w:hAnsi="Consolas" w:cs="Times New Roman"/>
@@ -3154,7 +2721,6 @@
         </w:rPr>
         <w:t>temperature_c</w:t>
       </w:r>
-      <w:proofErr w:type="spellEnd"/>
       <w:r>
         <w:rPr>
           <w:rFonts w:ascii="Consolas" w:eastAsia="Times New Roman" w:hAnsi="Consolas" w:cs="Times New Roman"/>
@@ -3261,27 +2827,7 @@
           <w:sz w:val="21"/>
           <w:szCs w:val="21"/>
         </w:rPr>
-        <w:t>"</w:t>
-      </w:r>
-      <w:proofErr w:type="spellStart"/>
-      <w:r>
-        <w:rPr>
-          <w:rFonts w:ascii="Consolas" w:eastAsia="Times New Roman" w:hAnsi="Consolas" w:cs="Times New Roman"/>
-          <w:color w:val="D1F1A9"/>
-          <w:sz w:val="21"/>
-          <w:szCs w:val="21"/>
-        </w:rPr>
-        <w:t>challenge.h</w:t>
-      </w:r>
-      <w:proofErr w:type="spellEnd"/>
-      <w:r>
-        <w:rPr>
-          <w:rFonts w:ascii="Consolas" w:eastAsia="Times New Roman" w:hAnsi="Consolas" w:cs="Times New Roman"/>
-          <w:color w:val="D1F1A9"/>
-          <w:sz w:val="21"/>
-          <w:szCs w:val="21"/>
-        </w:rPr>
-        <w:t>"</w:t>
+        <w:t>"challenge.h"</w:t>
       </w:r>
     </w:p>
     <w:p>
@@ -3359,27 +2905,7 @@
           <w:sz w:val="21"/>
           <w:szCs w:val="21"/>
         </w:rPr>
-        <w:t>&lt;</w:t>
-      </w:r>
-      <w:proofErr w:type="spellStart"/>
-      <w:r>
-        <w:rPr>
-          <w:rFonts w:ascii="Consolas" w:eastAsia="Times New Roman" w:hAnsi="Consolas" w:cs="Times New Roman"/>
-          <w:color w:val="D1F1A9"/>
-          <w:sz w:val="21"/>
-          <w:szCs w:val="21"/>
-        </w:rPr>
-        <w:t>cmath</w:t>
-      </w:r>
-      <w:proofErr w:type="spellEnd"/>
-      <w:r>
-        <w:rPr>
-          <w:rFonts w:ascii="Consolas" w:eastAsia="Times New Roman" w:hAnsi="Consolas" w:cs="Times New Roman"/>
-          <w:color w:val="D1F1A9"/>
-          <w:sz w:val="21"/>
-          <w:szCs w:val="21"/>
-        </w:rPr>
-        <w:t>&gt;</w:t>
+        <w:t>&lt;cmath&gt;</w:t>
       </w:r>
     </w:p>
     <w:p>
@@ -3412,27 +2938,7 @@
           <w:sz w:val="21"/>
           <w:szCs w:val="21"/>
         </w:rPr>
-        <w:t xml:space="preserve">// Pack </w:t>
-      </w:r>
-      <w:proofErr w:type="spellStart"/>
-      <w:r>
-        <w:rPr>
-          <w:rFonts w:ascii="Consolas" w:eastAsia="Times New Roman" w:hAnsi="Consolas" w:cs="Times New Roman"/>
-          <w:color w:val="7285B7"/>
-          <w:sz w:val="21"/>
-          <w:szCs w:val="21"/>
-        </w:rPr>
-        <w:t>temperature_c</w:t>
-      </w:r>
-      <w:proofErr w:type="spellEnd"/>
-      <w:r>
-        <w:rPr>
-          <w:rFonts w:ascii="Consolas" w:eastAsia="Times New Roman" w:hAnsi="Consolas" w:cs="Times New Roman"/>
-          <w:color w:val="7285B7"/>
-          <w:sz w:val="21"/>
-          <w:szCs w:val="21"/>
-        </w:rPr>
-        <w:t xml:space="preserve"> multiplied by 10, then send the message.</w:t>
+        <w:t>// Pack temperature_c multiplied by 10, then send the message.</w:t>
       </w:r>
     </w:p>
     <w:p>
@@ -3464,7 +2970,6 @@
         </w:rPr>
         <w:t xml:space="preserve"> </w:t>
       </w:r>
-      <w:proofErr w:type="spellStart"/>
       <w:r>
         <w:rPr>
           <w:rFonts w:ascii="Consolas" w:eastAsia="Times New Roman" w:hAnsi="Consolas" w:cs="Times New Roman"/>
@@ -3472,19 +2977,8 @@
           <w:sz w:val="21"/>
           <w:szCs w:val="21"/>
         </w:rPr>
-        <w:t>can_send_</w:t>
-      </w:r>
-      <w:proofErr w:type="gramStart"/>
-      <w:r>
-        <w:rPr>
-          <w:rFonts w:ascii="Consolas" w:eastAsia="Times New Roman" w:hAnsi="Consolas" w:cs="Times New Roman"/>
-          <w:color w:val="BBDAFF"/>
-          <w:sz w:val="21"/>
-          <w:szCs w:val="21"/>
-        </w:rPr>
-        <w:t>temperature</w:t>
-      </w:r>
-      <w:proofErr w:type="spellEnd"/>
+        <w:t>can_send_temperature</w:t>
+      </w:r>
       <w:r>
         <w:rPr>
           <w:rFonts w:ascii="Consolas" w:eastAsia="Times New Roman" w:hAnsi="Consolas" w:cs="Times New Roman"/>
@@ -3494,7 +2988,6 @@
         </w:rPr>
         <w:t>(</w:t>
       </w:r>
-      <w:proofErr w:type="gramEnd"/>
       <w:r>
         <w:rPr>
           <w:rFonts w:ascii="Consolas" w:eastAsia="Times New Roman" w:hAnsi="Consolas" w:cs="Times New Roman"/>
@@ -3513,7 +3006,6 @@
         </w:rPr>
         <w:t xml:space="preserve"> </w:t>
       </w:r>
-      <w:proofErr w:type="spellStart"/>
       <w:r>
         <w:rPr>
           <w:rFonts w:ascii="Consolas" w:eastAsia="Times New Roman" w:hAnsi="Consolas" w:cs="Times New Roman"/>
@@ -3523,7 +3015,6 @@
         </w:rPr>
         <w:t>temperature_c</w:t>
       </w:r>
-      <w:proofErr w:type="spellEnd"/>
       <w:r>
         <w:rPr>
           <w:rFonts w:ascii="Consolas" w:eastAsia="Times New Roman" w:hAnsi="Consolas" w:cs="Times New Roman"/>
@@ -3582,9 +3073,17 @@
           <w:sz w:val="21"/>
           <w:szCs w:val="21"/>
         </w:rPr>
-        <w:t>MSM_</w:t>
-      </w:r>
-      <w:proofErr w:type="gramStart"/>
+        <w:t>MSM_CAN</w:t>
+      </w:r>
+      <w:r>
+        <w:rPr>
+          <w:rFonts w:ascii="Consolas" w:eastAsia="Times New Roman" w:hAnsi="Consolas" w:cs="Times New Roman"/>
+          <w:color w:val="FFFFFF"/>
+          <w:sz w:val="21"/>
+          <w:szCs w:val="21"/>
+        </w:rPr>
+        <w:t>::</w:t>
+      </w:r>
       <w:r>
         <w:rPr>
           <w:rFonts w:ascii="Consolas" w:eastAsia="Times New Roman" w:hAnsi="Consolas" w:cs="Times New Roman"/>
@@ -3592,29 +3091,8 @@
           <w:sz w:val="21"/>
           <w:szCs w:val="21"/>
         </w:rPr>
-        <w:t>CAN</w:t>
-      </w:r>
-      <w:r>
-        <w:rPr>
-          <w:rFonts w:ascii="Consolas" w:eastAsia="Times New Roman" w:hAnsi="Consolas" w:cs="Times New Roman"/>
-          <w:color w:val="FFFFFF"/>
-          <w:sz w:val="21"/>
-          <w:szCs w:val="21"/>
-        </w:rPr>
-        <w:t>::</w:t>
-      </w:r>
-      <w:proofErr w:type="spellStart"/>
-      <w:proofErr w:type="gramEnd"/>
-      <w:r>
-        <w:rPr>
-          <w:rFonts w:ascii="Consolas" w:eastAsia="Times New Roman" w:hAnsi="Consolas" w:cs="Times New Roman"/>
-          <w:color w:val="FFEEAD"/>
-          <w:sz w:val="21"/>
-          <w:szCs w:val="21"/>
-        </w:rPr>
         <w:t>TxFrame</w:t>
       </w:r>
-      <w:proofErr w:type="spellEnd"/>
       <w:r>
         <w:rPr>
           <w:rFonts w:ascii="Consolas" w:eastAsia="Times New Roman" w:hAnsi="Consolas" w:cs="Times New Roman"/>
@@ -3624,7 +3102,6 @@
         </w:rPr>
         <w:t xml:space="preserve"> </w:t>
       </w:r>
-      <w:proofErr w:type="gramStart"/>
       <w:r>
         <w:rPr>
           <w:rFonts w:ascii="Consolas" w:eastAsia="Times New Roman" w:hAnsi="Consolas" w:cs="Times New Roman"/>
@@ -3641,17 +3118,7 @@
           <w:sz w:val="21"/>
           <w:szCs w:val="21"/>
         </w:rPr>
-        <w:t>{</w:t>
-      </w:r>
-      <w:proofErr w:type="gramEnd"/>
-      <w:r>
-        <w:rPr>
-          <w:rFonts w:ascii="Consolas" w:eastAsia="Times New Roman" w:hAnsi="Consolas" w:cs="Times New Roman"/>
-          <w:color w:val="FFFFFF"/>
-          <w:sz w:val="21"/>
-          <w:szCs w:val="21"/>
-        </w:rPr>
-        <w:t>};</w:t>
+        <w:t>{};</w:t>
       </w:r>
     </w:p>
     <w:p>
@@ -3767,8 +3234,6 @@
         </w:rPr>
         <w:t xml:space="preserve">    </w:t>
       </w:r>
-      <w:proofErr w:type="spellStart"/>
-      <w:proofErr w:type="gramStart"/>
       <w:r>
         <w:rPr>
           <w:rFonts w:ascii="Consolas" w:eastAsia="Times New Roman" w:hAnsi="Consolas" w:cs="Times New Roman"/>
@@ -3796,8 +3261,6 @@
         </w:rPr>
         <w:t>length</w:t>
       </w:r>
-      <w:proofErr w:type="spellEnd"/>
-      <w:proofErr w:type="gramEnd"/>
       <w:r>
         <w:rPr>
           <w:rFonts w:ascii="Consolas" w:eastAsia="Times New Roman" w:hAnsi="Consolas" w:cs="Times New Roman"/>
@@ -3883,27 +3346,7 @@
           <w:sz w:val="21"/>
           <w:szCs w:val="21"/>
         </w:rPr>
-        <w:t xml:space="preserve">    //integer 10x value of </w:t>
-      </w:r>
-      <w:proofErr w:type="spellStart"/>
-      <w:r>
-        <w:rPr>
-          <w:rFonts w:ascii="Consolas" w:eastAsia="Times New Roman" w:hAnsi="Consolas" w:cs="Times New Roman"/>
-          <w:color w:val="7285B7"/>
-          <w:sz w:val="21"/>
-          <w:szCs w:val="21"/>
-        </w:rPr>
-        <w:t>temperature_c</w:t>
-      </w:r>
-      <w:proofErr w:type="spellEnd"/>
-      <w:r>
-        <w:rPr>
-          <w:rFonts w:ascii="Consolas" w:eastAsia="Times New Roman" w:hAnsi="Consolas" w:cs="Times New Roman"/>
-          <w:color w:val="7285B7"/>
-          <w:sz w:val="21"/>
-          <w:szCs w:val="21"/>
-        </w:rPr>
-        <w:t>, will always round down at 1dp (25.19 -&gt; 251), level of precision is acceptable.</w:t>
+        <w:t>    //integer 10x value of temperature_c, will always round down at 1dp (25.19 -&gt; 251), level of precision is acceptable.</w:t>
       </w:r>
     </w:p>
     <w:p>
@@ -3924,6 +3367,7 @@
           <w:sz w:val="21"/>
           <w:szCs w:val="21"/>
         </w:rPr>
+        <w:lastRenderedPageBreak/>
         <w:t xml:space="preserve">    </w:t>
       </w:r>
       <w:r>
@@ -3980,7 +3424,6 @@
         </w:rPr>
         <w:t xml:space="preserve"> </w:t>
       </w:r>
-      <w:proofErr w:type="spellStart"/>
       <w:r>
         <w:rPr>
           <w:rFonts w:ascii="Consolas" w:eastAsia="Times New Roman" w:hAnsi="Consolas" w:cs="Times New Roman"/>
@@ -3990,7 +3433,6 @@
         </w:rPr>
         <w:t>temperature_c</w:t>
       </w:r>
-      <w:proofErr w:type="spellEnd"/>
       <w:r>
         <w:rPr>
           <w:rFonts w:ascii="Consolas" w:eastAsia="Times New Roman" w:hAnsi="Consolas" w:cs="Times New Roman"/>
@@ -4055,27 +3497,7 @@
           <w:sz w:val="21"/>
           <w:szCs w:val="21"/>
         </w:rPr>
-        <w:t xml:space="preserve">    //Convert to 16 </w:t>
-      </w:r>
-      <w:proofErr w:type="gramStart"/>
-      <w:r>
-        <w:rPr>
-          <w:rFonts w:ascii="Consolas" w:eastAsia="Times New Roman" w:hAnsi="Consolas" w:cs="Times New Roman"/>
-          <w:color w:val="7285B7"/>
-          <w:sz w:val="21"/>
-          <w:szCs w:val="21"/>
-        </w:rPr>
-        <w:t>bit</w:t>
-      </w:r>
-      <w:proofErr w:type="gramEnd"/>
-      <w:r>
-        <w:rPr>
-          <w:rFonts w:ascii="Consolas" w:eastAsia="Times New Roman" w:hAnsi="Consolas" w:cs="Times New Roman"/>
-          <w:color w:val="7285B7"/>
-          <w:sz w:val="21"/>
-          <w:szCs w:val="21"/>
-        </w:rPr>
-        <w:t xml:space="preserve"> signed, split into 2 bytes for payload prep. Frame uses unsigned int, convert signed directly and CAN will change it back?</w:t>
+        <w:t>    //Convert to 16 bit signed, split into 2 bytes for payload prep. Frame uses unsigned int, convert signed directly and CAN will change it back?</w:t>
       </w:r>
     </w:p>
     <w:p>
@@ -4129,67 +3551,7 @@
           <w:sz w:val="21"/>
           <w:szCs w:val="21"/>
         </w:rPr>
-        <w:t xml:space="preserve">    //inline void pack_i16(uint8_t </w:t>
-      </w:r>
-      <w:proofErr w:type="gramStart"/>
-      <w:r>
-        <w:rPr>
-          <w:rFonts w:ascii="Consolas" w:eastAsia="Times New Roman" w:hAnsi="Consolas" w:cs="Times New Roman"/>
-          <w:color w:val="7285B7"/>
-          <w:sz w:val="21"/>
-          <w:szCs w:val="21"/>
-        </w:rPr>
-        <w:t>data[</w:t>
-      </w:r>
-      <w:proofErr w:type="gramEnd"/>
-      <w:r>
-        <w:rPr>
-          <w:rFonts w:ascii="Consolas" w:eastAsia="Times New Roman" w:hAnsi="Consolas" w:cs="Times New Roman"/>
-          <w:color w:val="7285B7"/>
-          <w:sz w:val="21"/>
-          <w:szCs w:val="21"/>
-        </w:rPr>
-        <w:t xml:space="preserve">8], uint8_t index, int16_t </w:t>
-      </w:r>
-      <w:proofErr w:type="gramStart"/>
-      <w:r>
-        <w:rPr>
-          <w:rFonts w:ascii="Consolas" w:eastAsia="Times New Roman" w:hAnsi="Consolas" w:cs="Times New Roman"/>
-          <w:color w:val="7285B7"/>
-          <w:sz w:val="21"/>
-          <w:szCs w:val="21"/>
-        </w:rPr>
-        <w:t xml:space="preserve">value)   </w:t>
-      </w:r>
-      <w:proofErr w:type="gramEnd"/>
-      <w:r>
-        <w:rPr>
-          <w:rFonts w:ascii="Consolas" w:eastAsia="Times New Roman" w:hAnsi="Consolas" w:cs="Times New Roman"/>
-          <w:color w:val="7285B7"/>
-          <w:sz w:val="21"/>
-          <w:szCs w:val="21"/>
-        </w:rPr>
-        <w:t xml:space="preserve">              //helper function to pack uint8_t </w:t>
-      </w:r>
-      <w:proofErr w:type="gramStart"/>
-      <w:r>
-        <w:rPr>
-          <w:rFonts w:ascii="Consolas" w:eastAsia="Times New Roman" w:hAnsi="Consolas" w:cs="Times New Roman"/>
-          <w:color w:val="7285B7"/>
-          <w:sz w:val="21"/>
-          <w:szCs w:val="21"/>
-        </w:rPr>
-        <w:t>data[</w:t>
-      </w:r>
-      <w:proofErr w:type="gramEnd"/>
-      <w:r>
-        <w:rPr>
-          <w:rFonts w:ascii="Consolas" w:eastAsia="Times New Roman" w:hAnsi="Consolas" w:cs="Times New Roman"/>
-          <w:color w:val="7285B7"/>
-          <w:sz w:val="21"/>
-          <w:szCs w:val="21"/>
-        </w:rPr>
-        <w:t>8] with a big-endian encoded int16_t</w:t>
+        <w:t>    //inline void pack_i16(uint8_t data[8], uint8_t index, int16_t value)                 //helper function to pack uint8_t data[8] with a big-endian encoded int16_t</w:t>
       </w:r>
     </w:p>
     <w:p>
@@ -4231,27 +3593,7 @@
           <w:sz w:val="21"/>
           <w:szCs w:val="21"/>
         </w:rPr>
-        <w:t xml:space="preserve">    //    pack_u16(data, index, </w:t>
-      </w:r>
-      <w:proofErr w:type="spellStart"/>
-      <w:r>
-        <w:rPr>
-          <w:rFonts w:ascii="Consolas" w:eastAsia="Times New Roman" w:hAnsi="Consolas" w:cs="Times New Roman"/>
-          <w:color w:val="7285B7"/>
-          <w:sz w:val="21"/>
-          <w:szCs w:val="21"/>
-        </w:rPr>
-        <w:t>static_cast</w:t>
-      </w:r>
-      <w:proofErr w:type="spellEnd"/>
-      <w:r>
-        <w:rPr>
-          <w:rFonts w:ascii="Consolas" w:eastAsia="Times New Roman" w:hAnsi="Consolas" w:cs="Times New Roman"/>
-          <w:color w:val="7285B7"/>
-          <w:sz w:val="21"/>
-          <w:szCs w:val="21"/>
-        </w:rPr>
-        <w:t>&lt;uint16_t&gt;(value));</w:t>
+        <w:t>    //    pack_u16(data, index, static_cast&lt;uint16_t&gt;(value));</w:t>
       </w:r>
     </w:p>
     <w:p>
@@ -4302,17 +3644,7 @@
           <w:sz w:val="21"/>
           <w:szCs w:val="21"/>
         </w:rPr>
-        <w:t>MSM_</w:t>
-      </w:r>
-      <w:proofErr w:type="gramStart"/>
-      <w:r>
-        <w:rPr>
-          <w:rFonts w:ascii="Consolas" w:eastAsia="Times New Roman" w:hAnsi="Consolas" w:cs="Times New Roman"/>
-          <w:color w:val="FFEEAD"/>
-          <w:sz w:val="21"/>
-          <w:szCs w:val="21"/>
-        </w:rPr>
-        <w:t>CAN</w:t>
+        <w:t>MSM_CAN</w:t>
       </w:r>
       <w:r>
         <w:rPr>
@@ -4323,7 +3655,6 @@
         </w:rPr>
         <w:t>::</w:t>
       </w:r>
-      <w:proofErr w:type="gramEnd"/>
       <w:r>
         <w:rPr>
           <w:rFonts w:ascii="Consolas" w:eastAsia="Times New Roman" w:hAnsi="Consolas" w:cs="Times New Roman"/>
@@ -4342,7 +3673,6 @@
         </w:rPr>
         <w:t>(</w:t>
       </w:r>
-      <w:proofErr w:type="spellStart"/>
       <w:r>
         <w:rPr>
           <w:rFonts w:ascii="Consolas" w:eastAsia="Times New Roman" w:hAnsi="Consolas" w:cs="Times New Roman"/>
@@ -4370,7 +3700,6 @@
         </w:rPr>
         <w:t>data</w:t>
       </w:r>
-      <w:proofErr w:type="spellEnd"/>
       <w:r>
         <w:rPr>
           <w:rFonts w:ascii="Consolas" w:eastAsia="Times New Roman" w:hAnsi="Consolas" w:cs="Times New Roman"/>
@@ -4444,17 +3773,7 @@
           <w:sz w:val="21"/>
           <w:szCs w:val="21"/>
         </w:rPr>
-        <w:t>MSM_</w:t>
-      </w:r>
-      <w:proofErr w:type="gramStart"/>
-      <w:r>
-        <w:rPr>
-          <w:rFonts w:ascii="Consolas" w:eastAsia="Times New Roman" w:hAnsi="Consolas" w:cs="Times New Roman"/>
-          <w:color w:val="FFEEAD"/>
-          <w:sz w:val="21"/>
-          <w:szCs w:val="21"/>
-        </w:rPr>
-        <w:t>CAN</w:t>
+        <w:t>MSM_CAN</w:t>
       </w:r>
       <w:r>
         <w:rPr>
@@ -4465,8 +3784,6 @@
         </w:rPr>
         <w:t>::</w:t>
       </w:r>
-      <w:proofErr w:type="spellStart"/>
-      <w:proofErr w:type="gramEnd"/>
       <w:r>
         <w:rPr>
           <w:rFonts w:ascii="Consolas" w:eastAsia="Times New Roman" w:hAnsi="Consolas" w:cs="Times New Roman"/>
@@ -4476,7 +3793,6 @@
         </w:rPr>
         <w:t>send_msg</w:t>
       </w:r>
-      <w:proofErr w:type="spellEnd"/>
       <w:r>
         <w:rPr>
           <w:rFonts w:ascii="Consolas" w:eastAsia="Times New Roman" w:hAnsi="Consolas" w:cs="Times New Roman"/>
@@ -4523,67 +3839,7 @@
           <w:sz w:val="21"/>
           <w:szCs w:val="21"/>
         </w:rPr>
-        <w:t xml:space="preserve">    // Could be better to use </w:t>
-      </w:r>
-      <w:proofErr w:type="gramStart"/>
-      <w:r>
-        <w:rPr>
-          <w:rFonts w:ascii="Consolas" w:eastAsia="Times New Roman" w:hAnsi="Consolas" w:cs="Times New Roman"/>
-          <w:color w:val="7285B7"/>
-          <w:sz w:val="21"/>
-          <w:szCs w:val="21"/>
-        </w:rPr>
-        <w:t>schedule(</w:t>
-      </w:r>
-      <w:proofErr w:type="gramEnd"/>
-      <w:r>
-        <w:rPr>
-          <w:rFonts w:ascii="Consolas" w:eastAsia="Times New Roman" w:hAnsi="Consolas" w:cs="Times New Roman"/>
-          <w:color w:val="7285B7"/>
-          <w:sz w:val="21"/>
-          <w:szCs w:val="21"/>
-        </w:rPr>
-        <w:t xml:space="preserve">) instead of </w:t>
-      </w:r>
-      <w:proofErr w:type="spellStart"/>
-      <w:r>
-        <w:rPr>
-          <w:rFonts w:ascii="Consolas" w:eastAsia="Times New Roman" w:hAnsi="Consolas" w:cs="Times New Roman"/>
-          <w:color w:val="7285B7"/>
-          <w:sz w:val="21"/>
-          <w:szCs w:val="21"/>
-        </w:rPr>
-        <w:t>send_</w:t>
-      </w:r>
-      <w:proofErr w:type="gramStart"/>
-      <w:r>
-        <w:rPr>
-          <w:rFonts w:ascii="Consolas" w:eastAsia="Times New Roman" w:hAnsi="Consolas" w:cs="Times New Roman"/>
-          <w:color w:val="7285B7"/>
-          <w:sz w:val="21"/>
-          <w:szCs w:val="21"/>
-        </w:rPr>
-        <w:t>msg</w:t>
-      </w:r>
-      <w:proofErr w:type="spellEnd"/>
-      <w:r>
-        <w:rPr>
-          <w:rFonts w:ascii="Consolas" w:eastAsia="Times New Roman" w:hAnsi="Consolas" w:cs="Times New Roman"/>
-          <w:color w:val="7285B7"/>
-          <w:sz w:val="21"/>
-          <w:szCs w:val="21"/>
-        </w:rPr>
-        <w:t>(</w:t>
-      </w:r>
-      <w:proofErr w:type="gramEnd"/>
-      <w:r>
-        <w:rPr>
-          <w:rFonts w:ascii="Consolas" w:eastAsia="Times New Roman" w:hAnsi="Consolas" w:cs="Times New Roman"/>
-          <w:color w:val="7285B7"/>
-          <w:sz w:val="21"/>
-          <w:szCs w:val="21"/>
-        </w:rPr>
-        <w:t>) as this would allow us to send the data periodically every second (as the brief states)</w:t>
+        <w:t>    // Could be better to use schedule() instead of send_msg() as this would allow us to send the data periodically every second (as the brief states)</w:t>
       </w:r>
     </w:p>
     <w:p>

</xml_diff>

<commit_message>
Removed unnecessary comments, added error checks.
</commit_message>
<xml_diff>
--- a/Supplementary Files/Submission - Electrical Software Indivual Challenge Douglas Gray ID 190.docx
+++ b/Supplementary Files/Submission - Electrical Software Indivual Challenge Douglas Gray ID 190.docx
@@ -230,7 +230,15 @@
     </w:p>
     <w:p>
       <w:r>
-        <w:t xml:space="preserve">(b) Failures of analog sensor signals transmitted by cable: • Short circuit to supply voltage </w:t>
+        <w:t xml:space="preserve">(b) Failures of </w:t>
+      </w:r>
+      <w:proofErr w:type="spellStart"/>
+      <w:r>
+        <w:t>analog</w:t>
+      </w:r>
+      <w:proofErr w:type="spellEnd"/>
+      <w:r>
+        <w:t xml:space="preserve"> sensor signals transmitted by cable: • Short circuit to supply voltage </w:t>
       </w:r>
     </w:p>
     <w:p>
@@ -245,7 +253,15 @@
     </w:p>
     <w:p>
       <w:r>
-        <w:t>Signals might be a member of multiple signal classes, e.g. analog signals transmitted by cable might be a member of T11.9.2.a, T11.9.2.b and T11.9.2.c.</w:t>
+        <w:t xml:space="preserve">Signals might be a member of multiple signal classes, e.g. </w:t>
+      </w:r>
+      <w:proofErr w:type="spellStart"/>
+      <w:r>
+        <w:t>analog</w:t>
+      </w:r>
+      <w:proofErr w:type="spellEnd"/>
+      <w:r>
+        <w:t xml:space="preserve"> signals transmitted by cable might be a member of T11.9.2.a, T11.9.2.b and T11.9.2.c.</w:t>
       </w:r>
       <w:r>
         <w:t>”</w:t>
@@ -422,18 +438,27 @@
     </w:p>
     <w:p>
       <w:r>
-        <w:t>First I convert the float value of temperature into a signed 16 bit integer value, multiplied by 10 to bring along the first decimal place. This value is then packed into the provided data frame using the packing helper function, and sent using send_msg() to the CAN data node.</w:t>
-      </w:r>
-    </w:p>
-    <w:p/>
-    <w:p/>
-    <w:p/>
-    <w:p/>
-    <w:p/>
-    <w:p/>
-    <w:p/>
-    <w:p/>
-    <w:p/>
+        <w:t xml:space="preserve">First I convert the float value of temperature into a signed 16 bit integer value, multiplied by 10 to bring along the first decimal place. This value is then packed into the provided data frame using the packing helper function, and sent using </w:t>
+      </w:r>
+      <w:proofErr w:type="spellStart"/>
+      <w:r>
+        <w:t>send_msg</w:t>
+      </w:r>
+      <w:proofErr w:type="spellEnd"/>
+      <w:r>
+        <w:t>() to the CAN data node.</w:t>
+      </w:r>
+    </w:p>
+    <w:p>
+      <w:r>
+        <w:rPr>
+          <w:b/>
+          <w:bCs/>
+        </w:rPr>
+        <w:lastRenderedPageBreak/>
+        <w:t>Mathematical Modelling</w:t>
+      </w:r>
+    </w:p>
     <w:p>
       <w:r>
         <w:t>Desmos Graph to model the inputs, constants, and ‘outputs’ for the ADC task processes:</w:t>
@@ -618,7 +643,6 @@
         <w:rPr>
           <w:noProof/>
         </w:rPr>
-        <w:lastRenderedPageBreak/>
         <w:drawing>
           <wp:inline distT="0" distB="0" distL="0" distR="0" wp14:anchorId="127C02E0" wp14:editId="606CB81B">
             <wp:extent cx="5731510" cy="1939925"/>
@@ -699,6 +723,7 @@
         <w:rPr>
           <w:noProof/>
         </w:rPr>
+        <w:lastRenderedPageBreak/>
         <w:drawing>
           <wp:anchor distT="0" distB="0" distL="114300" distR="114300" simplePos="0" relativeHeight="251661312" behindDoc="0" locked="0" layoutInCell="1" allowOverlap="1" wp14:anchorId="39AEF56C" wp14:editId="6016761D">
             <wp:simplePos x="0" y="0"/>
@@ -775,7 +800,11 @@
     </w:p>
     <w:p>
       <w:r>
-        <w:t>A simple voltage divider to find the voltage across the 10kOhm constant resistor against the variable resistance of the NTC thermistor. The V</w:t>
+        <w:t xml:space="preserve">A simple voltage divider to find the voltage across the 10kOhm constant resistor against the variable resistance of the NTC thermistor. The </w:t>
+      </w:r>
+      <w:proofErr w:type="spellStart"/>
+      <w:r>
+        <w:t>V</w:t>
       </w:r>
       <w:r>
         <w:rPr>
@@ -783,6 +812,7 @@
         </w:rPr>
         <w:t>out</w:t>
       </w:r>
+      <w:proofErr w:type="spellEnd"/>
       <w:r>
         <w:t xml:space="preserve"> from this goes to the input pin of the ADC to be converted into a digital signal.</w:t>
       </w:r>
@@ -799,12 +829,28 @@
     </w:p>
     <w:p>
       <w:r>
-        <w:t>The ADC takes input on only 1 pin of the voltage across the constant resistor and translates it into a 12 bit signal. It is powered in parallel to the voltage divider from a 3.3V source, within it’s operating range, with the recommended capacitors from the datasheet in place performing power bypassing to ensure any noise from the power source does not interfere.</w:t>
-      </w:r>
-    </w:p>
-    <w:p>
-      <w:r>
-        <w:t>The chip select, clock and data output and input pins are all connected to the microcontroller to the correct GPIO pins as specified in framework.cpp from the template code and the microcontrollers datasheet. This ensures that it stays in sync and can be called to with the read_adc() function.</w:t>
+        <w:t xml:space="preserve">The ADC takes input on only 1 pin of the voltage across the constant resistor and translates it into a 12 bit signal. It is powered in parallel to the voltage divider from a 3.3V source, within </w:t>
+      </w:r>
+      <w:proofErr w:type="spellStart"/>
+      <w:r>
+        <w:t>it’s</w:t>
+      </w:r>
+      <w:proofErr w:type="spellEnd"/>
+      <w:r>
+        <w:t xml:space="preserve"> operating range, with the recommended capacitors from the datasheet in place performing power bypassing to ensure any noise from the power source does not interfere.</w:t>
+      </w:r>
+    </w:p>
+    <w:p>
+      <w:r>
+        <w:t xml:space="preserve">The chip select, clock and data output and input pins are all connected to the microcontroller to the correct GPIO pins as specified in framework.cpp from the template code and the microcontrollers datasheet. This ensures that it stays in sync and can be called to with the </w:t>
+      </w:r>
+      <w:proofErr w:type="spellStart"/>
+      <w:r>
+        <w:t>read_adc</w:t>
+      </w:r>
+      <w:proofErr w:type="spellEnd"/>
+      <w:r>
+        <w:t>() function.</w:t>
       </w:r>
     </w:p>
     <w:p/>
@@ -815,6 +861,7 @@
           <w:b/>
           <w:bCs/>
         </w:rPr>
+        <w:lastRenderedPageBreak/>
         <w:t>Microcontroller</w:t>
       </w:r>
     </w:p>
@@ -827,13 +874,60 @@
       </w:r>
     </w:p>
     <w:p>
-      <w:pPr>
-        <w:rPr>
-          <w:vertAlign w:val="subscript"/>
-        </w:rPr>
-      </w:pPr>
       <w:r>
         <w:t>As stated in the brief, the microcontroller is already integrated into the CAN node with a CAN interface, so in order to keep the schematic clear I have not detailed this.</w:t>
+      </w:r>
+    </w:p>
+    <w:p/>
+    <w:p>
+      <w:r>
+        <w:rPr>
+          <w:b/>
+          <w:bCs/>
+        </w:rPr>
+        <w:t>Component Values</w:t>
+      </w:r>
+    </w:p>
+    <w:p>
+      <w:r>
+        <w:t>I extracted the relevant component values from the data sheets of each component. From the thermistor, I needed the baseline resistance and temperature, which was 10kOhms and 25</w:t>
+      </w:r>
+      <w:r>
+        <w:rPr>
+          <w:vertAlign w:val="superscript"/>
+        </w:rPr>
+        <w:t>o</w:t>
+      </w:r>
+      <w:r>
+        <w:t>C respectively, and the beta constant (measured over the range 25 to 85</w:t>
+      </w:r>
+      <w:r>
+        <w:rPr>
+          <w:vertAlign w:val="superscript"/>
+        </w:rPr>
+        <w:t>o</w:t>
+      </w:r>
+      <w:r>
+        <w:t>C, which should be accurate for our measurement range of 0-100</w:t>
+      </w:r>
+      <w:r>
+        <w:rPr>
+          <w:vertAlign w:val="superscript"/>
+        </w:rPr>
+        <w:t>o</w:t>
+      </w:r>
+      <w:r>
+        <w:t>C), which was 3940. This allows me to calculate the temperature of the thermistor using its resistance, along with the resistance of the constant resistor, which I choose to be a 10kOhm resistor to best compare against the thermistor.</w:t>
+      </w:r>
+    </w:p>
+    <w:p>
+      <w:r>
+        <w:t>For the ADC, I needed the voltage range, which was 0 – 5.25V, and the resolution of its measurement, which was 12 bits. I powered it with a source of 3.3V, within its range and compatible with the source powering the microcontroller. I also used the datasheet to ensure I connected all the correct pins to the microcontroller.</w:t>
+      </w:r>
+    </w:p>
+    <w:p>
+      <w:r>
+        <w:t>Finally, for the microcontroller I ensured it was powered with a source compatible with its range of 3.0 – 3.3V, and used the datasheet to ensure all pins, especially the input pin taking the ADC output, were compatible with the correct data transfer types (SPI).</w:t>
       </w:r>
     </w:p>
     <w:p>
@@ -853,9 +947,58 @@
     </w:p>
     <w:p>
       <w:pPr>
+        <w:rPr>
+          <w:i/>
+          <w:color w:val="7030A0"/>
+        </w:rPr>
+      </w:pPr>
+    </w:p>
+    <w:p>
+      <w:pPr>
+        <w:rPr>
+          <w:i/>
+          <w:color w:val="7030A0"/>
+        </w:rPr>
+      </w:pPr>
+    </w:p>
+    <w:p>
+      <w:pPr>
+        <w:rPr>
+          <w:i/>
+          <w:color w:val="7030A0"/>
+        </w:rPr>
+      </w:pPr>
+    </w:p>
+    <w:p>
+      <w:pPr>
+        <w:rPr>
+          <w:i/>
+          <w:color w:val="7030A0"/>
+        </w:rPr>
+      </w:pPr>
+    </w:p>
+    <w:p>
+      <w:pPr>
+        <w:rPr>
+          <w:i/>
+          <w:color w:val="7030A0"/>
+        </w:rPr>
+      </w:pPr>
+    </w:p>
+    <w:p>
+      <w:pPr>
+        <w:rPr>
+          <w:i/>
+          <w:color w:val="7030A0"/>
+        </w:rPr>
+      </w:pPr>
+    </w:p>
+    <w:p>
+      <w:pPr>
         <w:pStyle w:val="Heading1"/>
       </w:pPr>
       <w:r>
+        <w:lastRenderedPageBreak/>
         <w:t xml:space="preserve">5. </w:t>
       </w:r>
       <w:r>
@@ -866,8 +1009,18 @@
       </w:r>
     </w:p>
     <w:p>
-      <w:r>
-        <w:t>ADC Task:</w:t>
+      <w:pPr>
+        <w:rPr>
+          <w:b/>
+          <w:bCs/>
+        </w:rPr>
+      </w:pPr>
+      <w:r>
+        <w:rPr>
+          <w:b/>
+          <w:bCs/>
+        </w:rPr>
+        <w:t>ADC Task</w:t>
       </w:r>
     </w:p>
     <w:p>
@@ -906,7 +1059,27 @@
           <w:sz w:val="21"/>
           <w:szCs w:val="21"/>
         </w:rPr>
-        <w:t>"challenge.h"</w:t>
+        <w:t>"</w:t>
+      </w:r>
+      <w:proofErr w:type="spellStart"/>
+      <w:r>
+        <w:rPr>
+          <w:rFonts w:ascii="Consolas" w:eastAsia="Times New Roman" w:hAnsi="Consolas" w:cs="Times New Roman"/>
+          <w:color w:val="D1F1A9"/>
+          <w:sz w:val="21"/>
+          <w:szCs w:val="21"/>
+        </w:rPr>
+        <w:t>challenge.h</w:t>
+      </w:r>
+      <w:proofErr w:type="spellEnd"/>
+      <w:r>
+        <w:rPr>
+          <w:rFonts w:ascii="Consolas" w:eastAsia="Times New Roman" w:hAnsi="Consolas" w:cs="Times New Roman"/>
+          <w:color w:val="D1F1A9"/>
+          <w:sz w:val="21"/>
+          <w:szCs w:val="21"/>
+        </w:rPr>
+        <w:t>"</w:t>
       </w:r>
     </w:p>
     <w:p>
@@ -945,7 +1118,27 @@
           <w:sz w:val="21"/>
           <w:szCs w:val="21"/>
         </w:rPr>
-        <w:t>&lt;cmath&gt;</w:t>
+        <w:t>&lt;</w:t>
+      </w:r>
+      <w:proofErr w:type="spellStart"/>
+      <w:r>
+        <w:rPr>
+          <w:rFonts w:ascii="Consolas" w:eastAsia="Times New Roman" w:hAnsi="Consolas" w:cs="Times New Roman"/>
+          <w:color w:val="D1F1A9"/>
+          <w:sz w:val="21"/>
+          <w:szCs w:val="21"/>
+        </w:rPr>
+        <w:t>cmath</w:t>
+      </w:r>
+      <w:proofErr w:type="spellEnd"/>
+      <w:r>
+        <w:rPr>
+          <w:rFonts w:ascii="Consolas" w:eastAsia="Times New Roman" w:hAnsi="Consolas" w:cs="Times New Roman"/>
+          <w:color w:val="D1F1A9"/>
+          <w:sz w:val="21"/>
+          <w:szCs w:val="21"/>
+        </w:rPr>
+        <w:t>&gt;</w:t>
       </w:r>
     </w:p>
     <w:p>
@@ -978,7 +1171,27 @@
           <w:sz w:val="21"/>
           <w:szCs w:val="21"/>
         </w:rPr>
-        <w:t>// Runs once a second. read_adc() gives you a number from 0 to 4095.</w:t>
+        <w:t xml:space="preserve">// Runs once a second. </w:t>
+      </w:r>
+      <w:proofErr w:type="spellStart"/>
+      <w:r>
+        <w:rPr>
+          <w:rFonts w:ascii="Consolas" w:eastAsia="Times New Roman" w:hAnsi="Consolas" w:cs="Times New Roman"/>
+          <w:color w:val="7285B7"/>
+          <w:sz w:val="21"/>
+          <w:szCs w:val="21"/>
+        </w:rPr>
+        <w:t>read_adc</w:t>
+      </w:r>
+      <w:proofErr w:type="spellEnd"/>
+      <w:r>
+        <w:rPr>
+          <w:rFonts w:ascii="Consolas" w:eastAsia="Times New Roman" w:hAnsi="Consolas" w:cs="Times New Roman"/>
+          <w:color w:val="7285B7"/>
+          <w:sz w:val="21"/>
+          <w:szCs w:val="21"/>
+        </w:rPr>
+        <w:t>() gives you a number from 0 to 4095.</w:t>
       </w:r>
     </w:p>
     <w:p>
@@ -1010,6 +1223,7 @@
         </w:rPr>
         <w:t xml:space="preserve"> </w:t>
       </w:r>
+      <w:proofErr w:type="spellStart"/>
       <w:r>
         <w:rPr>
           <w:rFonts w:ascii="Consolas" w:eastAsia="Times New Roman" w:hAnsi="Consolas" w:cs="Times New Roman"/>
@@ -1019,6 +1233,7 @@
         </w:rPr>
         <w:t>adc_read</w:t>
       </w:r>
+      <w:proofErr w:type="spellEnd"/>
       <w:r>
         <w:rPr>
           <w:rFonts w:ascii="Consolas" w:eastAsia="Times New Roman" w:hAnsi="Consolas" w:cs="Times New Roman"/>
@@ -1055,6 +1270,7 @@
         </w:rPr>
         <w:t>&amp;</w:t>
       </w:r>
+      <w:proofErr w:type="spellStart"/>
       <w:r>
         <w:rPr>
           <w:rFonts w:ascii="Consolas" w:eastAsia="Times New Roman" w:hAnsi="Consolas" w:cs="Times New Roman"/>
@@ -1064,6 +1280,7 @@
         </w:rPr>
         <w:t>temperature_c</w:t>
       </w:r>
+      <w:proofErr w:type="spellEnd"/>
       <w:r>
         <w:rPr>
           <w:rFonts w:ascii="Consolas" w:eastAsia="Times New Roman" w:hAnsi="Consolas" w:cs="Times New Roman"/>
@@ -1115,6 +1332,7 @@
         </w:rPr>
         <w:t xml:space="preserve">    </w:t>
       </w:r>
+      <w:proofErr w:type="spellStart"/>
       <w:r>
         <w:rPr>
           <w:rFonts w:ascii="Consolas" w:eastAsia="Times New Roman" w:hAnsi="Consolas" w:cs="Times New Roman"/>
@@ -1124,6 +1342,7 @@
         </w:rPr>
         <w:t>const</w:t>
       </w:r>
+      <w:proofErr w:type="spellEnd"/>
       <w:r>
         <w:rPr>
           <w:rFonts w:ascii="Consolas" w:eastAsia="Times New Roman" w:hAnsi="Consolas" w:cs="Times New Roman"/>
@@ -1151,6 +1370,7 @@
         </w:rPr>
         <w:t xml:space="preserve"> </w:t>
       </w:r>
+      <w:proofErr w:type="spellStart"/>
       <w:r>
         <w:rPr>
           <w:rFonts w:ascii="Consolas" w:eastAsia="Times New Roman" w:hAnsi="Consolas" w:cs="Times New Roman"/>
@@ -1160,6 +1380,7 @@
         </w:rPr>
         <w:t>raw_adc</w:t>
       </w:r>
+      <w:proofErr w:type="spellEnd"/>
       <w:r>
         <w:rPr>
           <w:rFonts w:ascii="Consolas" w:eastAsia="Times New Roman" w:hAnsi="Consolas" w:cs="Times New Roman"/>
@@ -1187,6 +1408,7 @@
         </w:rPr>
         <w:t xml:space="preserve"> </w:t>
       </w:r>
+      <w:proofErr w:type="spellStart"/>
       <w:r>
         <w:rPr>
           <w:rFonts w:ascii="Consolas" w:eastAsia="Times New Roman" w:hAnsi="Consolas" w:cs="Times New Roman"/>
@@ -1196,6 +1418,7 @@
         </w:rPr>
         <w:t>read_adc</w:t>
       </w:r>
+      <w:proofErr w:type="spellEnd"/>
       <w:r>
         <w:rPr>
           <w:rFonts w:ascii="Consolas" w:eastAsia="Times New Roman" w:hAnsi="Consolas" w:cs="Times New Roman"/>
@@ -1271,6 +1494,7 @@
         </w:rPr>
         <w:t>::</w:t>
       </w:r>
+      <w:proofErr w:type="spellStart"/>
       <w:r>
         <w:rPr>
           <w:rFonts w:ascii="Consolas" w:eastAsia="Times New Roman" w:hAnsi="Consolas" w:cs="Times New Roman"/>
@@ -1280,6 +1504,7 @@
         </w:rPr>
         <w:t>isfinite</w:t>
       </w:r>
+      <w:proofErr w:type="spellEnd"/>
       <w:r>
         <w:rPr>
           <w:rFonts w:ascii="Consolas" w:eastAsia="Times New Roman" w:hAnsi="Consolas" w:cs="Times New Roman"/>
@@ -1289,6 +1514,7 @@
         </w:rPr>
         <w:t>(</w:t>
       </w:r>
+      <w:proofErr w:type="spellStart"/>
       <w:r>
         <w:rPr>
           <w:rFonts w:ascii="Consolas" w:eastAsia="Times New Roman" w:hAnsi="Consolas" w:cs="Times New Roman"/>
@@ -1298,6 +1524,7 @@
         </w:rPr>
         <w:t>raw_adc</w:t>
       </w:r>
+      <w:proofErr w:type="spellEnd"/>
       <w:r>
         <w:rPr>
           <w:rFonts w:ascii="Consolas" w:eastAsia="Times New Roman" w:hAnsi="Consolas" w:cs="Times New Roman"/>
@@ -1364,6 +1591,7 @@
         </w:rPr>
         <w:t xml:space="preserve">    </w:t>
       </w:r>
+      <w:proofErr w:type="spellStart"/>
       <w:r>
         <w:rPr>
           <w:rFonts w:ascii="Consolas" w:eastAsia="Times New Roman" w:hAnsi="Consolas" w:cs="Times New Roman"/>
@@ -1373,6 +1601,7 @@
         </w:rPr>
         <w:t>temperature_c</w:t>
       </w:r>
+      <w:proofErr w:type="spellEnd"/>
       <w:r>
         <w:rPr>
           <w:rFonts w:ascii="Consolas" w:eastAsia="Times New Roman" w:hAnsi="Consolas" w:cs="Times New Roman"/>
@@ -1470,8 +1699,27 @@
           <w:sz w:val="21"/>
           <w:szCs w:val="21"/>
         </w:rPr>
-        <w:lastRenderedPageBreak/>
-        <w:t>    //RCon - Resistance of constant resistance comparator resistor in the voltage divider against the thermistor.</w:t>
+        <w:t>    //</w:t>
+      </w:r>
+      <w:proofErr w:type="spellStart"/>
+      <w:r>
+        <w:rPr>
+          <w:rFonts w:ascii="Consolas" w:eastAsia="Times New Roman" w:hAnsi="Consolas" w:cs="Times New Roman"/>
+          <w:color w:val="7285B7"/>
+          <w:sz w:val="21"/>
+          <w:szCs w:val="21"/>
+        </w:rPr>
+        <w:t>RCon</w:t>
+      </w:r>
+      <w:proofErr w:type="spellEnd"/>
+      <w:r>
+        <w:rPr>
+          <w:rFonts w:ascii="Consolas" w:eastAsia="Times New Roman" w:hAnsi="Consolas" w:cs="Times New Roman"/>
+          <w:color w:val="7285B7"/>
+          <w:sz w:val="21"/>
+          <w:szCs w:val="21"/>
+        </w:rPr>
+        <w:t xml:space="preserve"> - Resistance of constant resistance comparator resistor in the voltage divider against the thermistor.</w:t>
       </w:r>
     </w:p>
     <w:p>
@@ -1492,7 +1740,47 @@
           <w:sz w:val="21"/>
           <w:szCs w:val="21"/>
         </w:rPr>
-        <w:t>    //RThe - Datasheet resistance of thermistor at a temperature of 25 degrees celsius.</w:t>
+        <w:t>    //</w:t>
+      </w:r>
+      <w:proofErr w:type="spellStart"/>
+      <w:r>
+        <w:rPr>
+          <w:rFonts w:ascii="Consolas" w:eastAsia="Times New Roman" w:hAnsi="Consolas" w:cs="Times New Roman"/>
+          <w:color w:val="7285B7"/>
+          <w:sz w:val="21"/>
+          <w:szCs w:val="21"/>
+        </w:rPr>
+        <w:t>RThe</w:t>
+      </w:r>
+      <w:proofErr w:type="spellEnd"/>
+      <w:r>
+        <w:rPr>
+          <w:rFonts w:ascii="Consolas" w:eastAsia="Times New Roman" w:hAnsi="Consolas" w:cs="Times New Roman"/>
+          <w:color w:val="7285B7"/>
+          <w:sz w:val="21"/>
+          <w:szCs w:val="21"/>
+        </w:rPr>
+        <w:t xml:space="preserve"> - Datasheet resistance of thermistor at a temperature of 25 degrees </w:t>
+      </w:r>
+      <w:proofErr w:type="spellStart"/>
+      <w:r>
+        <w:rPr>
+          <w:rFonts w:ascii="Consolas" w:eastAsia="Times New Roman" w:hAnsi="Consolas" w:cs="Times New Roman"/>
+          <w:color w:val="7285B7"/>
+          <w:sz w:val="21"/>
+          <w:szCs w:val="21"/>
+        </w:rPr>
+        <w:t>celsius</w:t>
+      </w:r>
+      <w:proofErr w:type="spellEnd"/>
+      <w:r>
+        <w:rPr>
+          <w:rFonts w:ascii="Consolas" w:eastAsia="Times New Roman" w:hAnsi="Consolas" w:cs="Times New Roman"/>
+          <w:color w:val="7285B7"/>
+          <w:sz w:val="21"/>
+          <w:szCs w:val="21"/>
+        </w:rPr>
+        <w:t>.</w:t>
       </w:r>
     </w:p>
     <w:p>
@@ -1513,7 +1801,47 @@
           <w:sz w:val="21"/>
           <w:szCs w:val="21"/>
         </w:rPr>
-        <w:t>    //BetaCon - Datasheet beta constant of thermistor between temps of 25 to 85 degrees celsius, used to calculate temperature from resistance.</w:t>
+        <w:t>    //</w:t>
+      </w:r>
+      <w:proofErr w:type="spellStart"/>
+      <w:r>
+        <w:rPr>
+          <w:rFonts w:ascii="Consolas" w:eastAsia="Times New Roman" w:hAnsi="Consolas" w:cs="Times New Roman"/>
+          <w:color w:val="7285B7"/>
+          <w:sz w:val="21"/>
+          <w:szCs w:val="21"/>
+        </w:rPr>
+        <w:t>BetaCon</w:t>
+      </w:r>
+      <w:proofErr w:type="spellEnd"/>
+      <w:r>
+        <w:rPr>
+          <w:rFonts w:ascii="Consolas" w:eastAsia="Times New Roman" w:hAnsi="Consolas" w:cs="Times New Roman"/>
+          <w:color w:val="7285B7"/>
+          <w:sz w:val="21"/>
+          <w:szCs w:val="21"/>
+        </w:rPr>
+        <w:t xml:space="preserve"> - Datasheet beta constant of thermistor between temps of 25 to 85 degrees </w:t>
+      </w:r>
+      <w:proofErr w:type="spellStart"/>
+      <w:r>
+        <w:rPr>
+          <w:rFonts w:ascii="Consolas" w:eastAsia="Times New Roman" w:hAnsi="Consolas" w:cs="Times New Roman"/>
+          <w:color w:val="7285B7"/>
+          <w:sz w:val="21"/>
+          <w:szCs w:val="21"/>
+        </w:rPr>
+        <w:t>celsius</w:t>
+      </w:r>
+      <w:proofErr w:type="spellEnd"/>
+      <w:r>
+        <w:rPr>
+          <w:rFonts w:ascii="Consolas" w:eastAsia="Times New Roman" w:hAnsi="Consolas" w:cs="Times New Roman"/>
+          <w:color w:val="7285B7"/>
+          <w:sz w:val="21"/>
+          <w:szCs w:val="21"/>
+        </w:rPr>
+        <w:t>, used to calculate temperature from resistance.</w:t>
       </w:r>
     </w:p>
     <w:p>
@@ -1534,7 +1862,27 @@
           <w:sz w:val="21"/>
           <w:szCs w:val="21"/>
         </w:rPr>
-        <w:t>    //ThermistorBaselineTemp - Temperature in kelvin (required for temp calculations) at which thermistor reaches its baseline resistance.</w:t>
+        <w:t>    //</w:t>
+      </w:r>
+      <w:proofErr w:type="spellStart"/>
+      <w:r>
+        <w:rPr>
+          <w:rFonts w:ascii="Consolas" w:eastAsia="Times New Roman" w:hAnsi="Consolas" w:cs="Times New Roman"/>
+          <w:color w:val="7285B7"/>
+          <w:sz w:val="21"/>
+          <w:szCs w:val="21"/>
+        </w:rPr>
+        <w:t>ThermistorBaselineTemp</w:t>
+      </w:r>
+      <w:proofErr w:type="spellEnd"/>
+      <w:r>
+        <w:rPr>
+          <w:rFonts w:ascii="Consolas" w:eastAsia="Times New Roman" w:hAnsi="Consolas" w:cs="Times New Roman"/>
+          <w:color w:val="7285B7"/>
+          <w:sz w:val="21"/>
+          <w:szCs w:val="21"/>
+        </w:rPr>
+        <w:t xml:space="preserve"> - Temperature in kelvin (required for temp calculations) at which thermistor reaches its baseline resistance.</w:t>
       </w:r>
     </w:p>
     <w:p>
@@ -1557,6 +1905,7 @@
         </w:rPr>
         <w:t xml:space="preserve">    </w:t>
       </w:r>
+      <w:proofErr w:type="spellStart"/>
       <w:r>
         <w:rPr>
           <w:rFonts w:ascii="Consolas" w:eastAsia="Times New Roman" w:hAnsi="Consolas" w:cs="Times New Roman"/>
@@ -1566,6 +1915,7 @@
         </w:rPr>
         <w:t>const</w:t>
       </w:r>
+      <w:proofErr w:type="spellEnd"/>
       <w:r>
         <w:rPr>
           <w:rFonts w:ascii="Consolas" w:eastAsia="Times New Roman" w:hAnsi="Consolas" w:cs="Times New Roman"/>
@@ -1593,6 +1943,7 @@
         </w:rPr>
         <w:t xml:space="preserve"> </w:t>
       </w:r>
+      <w:proofErr w:type="spellStart"/>
       <w:r>
         <w:rPr>
           <w:rFonts w:ascii="Consolas" w:eastAsia="Times New Roman" w:hAnsi="Consolas" w:cs="Times New Roman"/>
@@ -1602,6 +1953,7 @@
         </w:rPr>
         <w:t>RConstant</w:t>
       </w:r>
+      <w:proofErr w:type="spellEnd"/>
       <w:r>
         <w:rPr>
           <w:rFonts w:ascii="Consolas" w:eastAsia="Times New Roman" w:hAnsi="Consolas" w:cs="Times New Roman"/>
@@ -1722,6 +2074,7 @@
         </w:rPr>
         <w:t xml:space="preserve">    </w:t>
       </w:r>
+      <w:proofErr w:type="spellStart"/>
       <w:r>
         <w:rPr>
           <w:rFonts w:ascii="Consolas" w:eastAsia="Times New Roman" w:hAnsi="Consolas" w:cs="Times New Roman"/>
@@ -1731,6 +2084,7 @@
         </w:rPr>
         <w:t>const</w:t>
       </w:r>
+      <w:proofErr w:type="spellEnd"/>
       <w:r>
         <w:rPr>
           <w:rFonts w:ascii="Consolas" w:eastAsia="Times New Roman" w:hAnsi="Consolas" w:cs="Times New Roman"/>
@@ -1833,6 +2187,7 @@
         </w:rPr>
         <w:t xml:space="preserve">    </w:t>
       </w:r>
+      <w:proofErr w:type="spellStart"/>
       <w:r>
         <w:rPr>
           <w:rFonts w:ascii="Consolas" w:eastAsia="Times New Roman" w:hAnsi="Consolas" w:cs="Times New Roman"/>
@@ -1842,6 +2197,7 @@
         </w:rPr>
         <w:t>const</w:t>
       </w:r>
+      <w:proofErr w:type="spellEnd"/>
       <w:r>
         <w:rPr>
           <w:rFonts w:ascii="Consolas" w:eastAsia="Times New Roman" w:hAnsi="Consolas" w:cs="Times New Roman"/>
@@ -1869,6 +2225,7 @@
         </w:rPr>
         <w:t xml:space="preserve"> </w:t>
       </w:r>
+      <w:proofErr w:type="spellStart"/>
       <w:r>
         <w:rPr>
           <w:rFonts w:ascii="Consolas" w:eastAsia="Times New Roman" w:hAnsi="Consolas" w:cs="Times New Roman"/>
@@ -1878,6 +2235,7 @@
         </w:rPr>
         <w:t>ThermistorBaselineTempKelvin</w:t>
       </w:r>
+      <w:proofErr w:type="spellEnd"/>
       <w:r>
         <w:rPr>
           <w:rFonts w:ascii="Consolas" w:eastAsia="Times New Roman" w:hAnsi="Consolas" w:cs="Times New Roman"/>
@@ -2020,7 +2378,47 @@
           <w:sz w:val="21"/>
           <w:szCs w:val="21"/>
         </w:rPr>
-        <w:t>    //float VOut = 5.25 * raw_adc / 4095.0, simplified steps from flowchart diagram but line here for clarity.</w:t>
+        <w:t xml:space="preserve">    //float </w:t>
+      </w:r>
+      <w:proofErr w:type="spellStart"/>
+      <w:r>
+        <w:rPr>
+          <w:rFonts w:ascii="Consolas" w:eastAsia="Times New Roman" w:hAnsi="Consolas" w:cs="Times New Roman"/>
+          <w:color w:val="7285B7"/>
+          <w:sz w:val="21"/>
+          <w:szCs w:val="21"/>
+        </w:rPr>
+        <w:t>VOut</w:t>
+      </w:r>
+      <w:proofErr w:type="spellEnd"/>
+      <w:r>
+        <w:rPr>
+          <w:rFonts w:ascii="Consolas" w:eastAsia="Times New Roman" w:hAnsi="Consolas" w:cs="Times New Roman"/>
+          <w:color w:val="7285B7"/>
+          <w:sz w:val="21"/>
+          <w:szCs w:val="21"/>
+        </w:rPr>
+        <w:t xml:space="preserve"> = 5.25 * </w:t>
+      </w:r>
+      <w:proofErr w:type="spellStart"/>
+      <w:r>
+        <w:rPr>
+          <w:rFonts w:ascii="Consolas" w:eastAsia="Times New Roman" w:hAnsi="Consolas" w:cs="Times New Roman"/>
+          <w:color w:val="7285B7"/>
+          <w:sz w:val="21"/>
+          <w:szCs w:val="21"/>
+        </w:rPr>
+        <w:t>raw_adc</w:t>
+      </w:r>
+      <w:proofErr w:type="spellEnd"/>
+      <w:r>
+        <w:rPr>
+          <w:rFonts w:ascii="Consolas" w:eastAsia="Times New Roman" w:hAnsi="Consolas" w:cs="Times New Roman"/>
+          <w:color w:val="7285B7"/>
+          <w:sz w:val="21"/>
+          <w:szCs w:val="21"/>
+        </w:rPr>
+        <w:t xml:space="preserve"> / 4095.0, simplified steps from flowchart diagram but line here for clarity.</w:t>
       </w:r>
     </w:p>
     <w:p>
@@ -2061,6 +2459,7 @@
         </w:rPr>
         <w:t xml:space="preserve"> </w:t>
       </w:r>
+      <w:proofErr w:type="spellStart"/>
       <w:r>
         <w:rPr>
           <w:rFonts w:ascii="Consolas" w:eastAsia="Times New Roman" w:hAnsi="Consolas" w:cs="Times New Roman"/>
@@ -2070,6 +2469,7 @@
         </w:rPr>
         <w:t>RThermistor</w:t>
       </w:r>
+      <w:proofErr w:type="spellEnd"/>
       <w:r>
         <w:rPr>
           <w:rFonts w:ascii="Consolas" w:eastAsia="Times New Roman" w:hAnsi="Consolas" w:cs="Times New Roman"/>
@@ -2097,6 +2497,7 @@
         </w:rPr>
         <w:t xml:space="preserve"> </w:t>
       </w:r>
+      <w:proofErr w:type="spellStart"/>
       <w:r>
         <w:rPr>
           <w:rFonts w:ascii="Consolas" w:eastAsia="Times New Roman" w:hAnsi="Consolas" w:cs="Times New Roman"/>
@@ -2106,6 +2507,7 @@
         </w:rPr>
         <w:t>RConstant</w:t>
       </w:r>
+      <w:proofErr w:type="spellEnd"/>
       <w:r>
         <w:rPr>
           <w:rFonts w:ascii="Consolas" w:eastAsia="Times New Roman" w:hAnsi="Consolas" w:cs="Times New Roman"/>
@@ -2169,6 +2571,7 @@
         </w:rPr>
         <w:t xml:space="preserve"> </w:t>
       </w:r>
+      <w:proofErr w:type="spellStart"/>
       <w:r>
         <w:rPr>
           <w:rFonts w:ascii="Consolas" w:eastAsia="Times New Roman" w:hAnsi="Consolas" w:cs="Times New Roman"/>
@@ -2178,6 +2581,7 @@
         </w:rPr>
         <w:t>raw_adc</w:t>
       </w:r>
+      <w:proofErr w:type="spellEnd"/>
       <w:r>
         <w:rPr>
           <w:rFonts w:ascii="Consolas" w:eastAsia="Times New Roman" w:hAnsi="Consolas" w:cs="Times New Roman"/>
@@ -2205,6 +2609,7 @@
         </w:rPr>
         <w:t xml:space="preserve"> </w:t>
       </w:r>
+      <w:proofErr w:type="spellStart"/>
       <w:r>
         <w:rPr>
           <w:rFonts w:ascii="Consolas" w:eastAsia="Times New Roman" w:hAnsi="Consolas" w:cs="Times New Roman"/>
@@ -2214,6 +2619,7 @@
         </w:rPr>
         <w:t>RConstant</w:t>
       </w:r>
+      <w:proofErr w:type="spellEnd"/>
       <w:r>
         <w:rPr>
           <w:rFonts w:ascii="Consolas" w:eastAsia="Times New Roman" w:hAnsi="Consolas" w:cs="Times New Roman"/>
@@ -2263,7 +2669,27 @@
           <w:sz w:val="21"/>
           <w:szCs w:val="21"/>
         </w:rPr>
-        <w:t>    //cmath power and natural log used, optimised math performance by performing minimal amount of resource intensive exponentiation and logarithms.</w:t>
+        <w:t>    //</w:t>
+      </w:r>
+      <w:proofErr w:type="spellStart"/>
+      <w:r>
+        <w:rPr>
+          <w:rFonts w:ascii="Consolas" w:eastAsia="Times New Roman" w:hAnsi="Consolas" w:cs="Times New Roman"/>
+          <w:color w:val="7285B7"/>
+          <w:sz w:val="21"/>
+          <w:szCs w:val="21"/>
+        </w:rPr>
+        <w:t>cmath</w:t>
+      </w:r>
+      <w:proofErr w:type="spellEnd"/>
+      <w:r>
+        <w:rPr>
+          <w:rFonts w:ascii="Consolas" w:eastAsia="Times New Roman" w:hAnsi="Consolas" w:cs="Times New Roman"/>
+          <w:color w:val="7285B7"/>
+          <w:sz w:val="21"/>
+          <w:szCs w:val="21"/>
+        </w:rPr>
+        <w:t xml:space="preserve"> power and natural log used, optimised math performance by performing minimal amount of resource intensive exponentiation and logarithms.</w:t>
       </w:r>
     </w:p>
     <w:p>
@@ -2286,6 +2712,7 @@
         </w:rPr>
         <w:t xml:space="preserve">    </w:t>
       </w:r>
+      <w:proofErr w:type="spellStart"/>
       <w:r>
         <w:rPr>
           <w:rFonts w:ascii="Consolas" w:eastAsia="Times New Roman" w:hAnsi="Consolas" w:cs="Times New Roman"/>
@@ -2295,6 +2722,7 @@
         </w:rPr>
         <w:t>temperature_c</w:t>
       </w:r>
+      <w:proofErr w:type="spellEnd"/>
       <w:r>
         <w:rPr>
           <w:rFonts w:ascii="Consolas" w:eastAsia="Times New Roman" w:hAnsi="Consolas" w:cs="Times New Roman"/>
@@ -2358,6 +2786,7 @@
         </w:rPr>
         <w:t>(</w:t>
       </w:r>
+      <w:proofErr w:type="spellStart"/>
       <w:r>
         <w:rPr>
           <w:rFonts w:ascii="Consolas" w:eastAsia="Times New Roman" w:hAnsi="Consolas" w:cs="Times New Roman"/>
@@ -2367,6 +2796,7 @@
         </w:rPr>
         <w:t>RThermistor</w:t>
       </w:r>
+      <w:proofErr w:type="spellEnd"/>
       <w:r>
         <w:rPr>
           <w:rFonts w:ascii="Consolas" w:eastAsia="Times New Roman" w:hAnsi="Consolas" w:cs="Times New Roman"/>
@@ -2484,6 +2914,7 @@
         </w:rPr>
         <w:t>(</w:t>
       </w:r>
+      <w:proofErr w:type="spellStart"/>
       <w:r>
         <w:rPr>
           <w:rFonts w:ascii="Consolas" w:eastAsia="Times New Roman" w:hAnsi="Consolas" w:cs="Times New Roman"/>
@@ -2493,6 +2924,7 @@
         </w:rPr>
         <w:t>ThermistorBaselineTempKelvin</w:t>
       </w:r>
+      <w:proofErr w:type="spellEnd"/>
       <w:r>
         <w:rPr>
           <w:rFonts w:ascii="Consolas" w:eastAsia="Times New Roman" w:hAnsi="Consolas" w:cs="Times New Roman"/>
@@ -2623,7 +3055,47 @@
           <w:sz w:val="21"/>
           <w:szCs w:val="21"/>
         </w:rPr>
-        <w:t>    //Maths code tested seperately outputs expected value for different raw_adcs.</w:t>
+        <w:t xml:space="preserve">    //Maths code tested </w:t>
+      </w:r>
+      <w:proofErr w:type="spellStart"/>
+      <w:r>
+        <w:rPr>
+          <w:rFonts w:ascii="Consolas" w:eastAsia="Times New Roman" w:hAnsi="Consolas" w:cs="Times New Roman"/>
+          <w:color w:val="7285B7"/>
+          <w:sz w:val="21"/>
+          <w:szCs w:val="21"/>
+        </w:rPr>
+        <w:t>seperately</w:t>
+      </w:r>
+      <w:proofErr w:type="spellEnd"/>
+      <w:r>
+        <w:rPr>
+          <w:rFonts w:ascii="Consolas" w:eastAsia="Times New Roman" w:hAnsi="Consolas" w:cs="Times New Roman"/>
+          <w:color w:val="7285B7"/>
+          <w:sz w:val="21"/>
+          <w:szCs w:val="21"/>
+        </w:rPr>
+        <w:t xml:space="preserve"> outputs expected value for different </w:t>
+      </w:r>
+      <w:proofErr w:type="spellStart"/>
+      <w:r>
+        <w:rPr>
+          <w:rFonts w:ascii="Consolas" w:eastAsia="Times New Roman" w:hAnsi="Consolas" w:cs="Times New Roman"/>
+          <w:color w:val="7285B7"/>
+          <w:sz w:val="21"/>
+          <w:szCs w:val="21"/>
+        </w:rPr>
+        <w:t>raw_adcs</w:t>
+      </w:r>
+      <w:proofErr w:type="spellEnd"/>
+      <w:r>
+        <w:rPr>
+          <w:rFonts w:ascii="Consolas" w:eastAsia="Times New Roman" w:hAnsi="Consolas" w:cs="Times New Roman"/>
+          <w:color w:val="7285B7"/>
+          <w:sz w:val="21"/>
+          <w:szCs w:val="21"/>
+        </w:rPr>
+        <w:t>.</w:t>
       </w:r>
     </w:p>
     <w:p>
@@ -2694,6 +3166,7 @@
         </w:rPr>
         <w:t>::</w:t>
       </w:r>
+      <w:proofErr w:type="spellStart"/>
       <w:r>
         <w:rPr>
           <w:rFonts w:ascii="Consolas" w:eastAsia="Times New Roman" w:hAnsi="Consolas" w:cs="Times New Roman"/>
@@ -2703,6 +3176,7 @@
         </w:rPr>
         <w:t>isfinite</w:t>
       </w:r>
+      <w:proofErr w:type="spellEnd"/>
       <w:r>
         <w:rPr>
           <w:rFonts w:ascii="Consolas" w:eastAsia="Times New Roman" w:hAnsi="Consolas" w:cs="Times New Roman"/>
@@ -2712,6 +3186,7 @@
         </w:rPr>
         <w:t>(</w:t>
       </w:r>
+      <w:proofErr w:type="spellStart"/>
       <w:r>
         <w:rPr>
           <w:rFonts w:ascii="Consolas" w:eastAsia="Times New Roman" w:hAnsi="Consolas" w:cs="Times New Roman"/>
@@ -2721,6 +3196,7 @@
         </w:rPr>
         <w:t>temperature_c</w:t>
       </w:r>
+      <w:proofErr w:type="spellEnd"/>
       <w:r>
         <w:rPr>
           <w:rFonts w:ascii="Consolas" w:eastAsia="Times New Roman" w:hAnsi="Consolas" w:cs="Times New Roman"/>
@@ -2787,7 +3263,18 @@
     </w:p>
     <w:p/>
     <w:p>
-      <w:r>
+      <w:pPr>
+        <w:rPr>
+          <w:b/>
+          <w:bCs/>
+        </w:rPr>
+      </w:pPr>
+      <w:r>
+        <w:rPr>
+          <w:b/>
+          <w:bCs/>
+        </w:rPr>
+        <w:lastRenderedPageBreak/>
         <w:t>CAN Task</w:t>
       </w:r>
     </w:p>
@@ -2827,7 +3314,27 @@
           <w:sz w:val="21"/>
           <w:szCs w:val="21"/>
         </w:rPr>
-        <w:t>"challenge.h"</w:t>
+        <w:t>"</w:t>
+      </w:r>
+      <w:proofErr w:type="spellStart"/>
+      <w:r>
+        <w:rPr>
+          <w:rFonts w:ascii="Consolas" w:eastAsia="Times New Roman" w:hAnsi="Consolas" w:cs="Times New Roman"/>
+          <w:color w:val="D1F1A9"/>
+          <w:sz w:val="21"/>
+          <w:szCs w:val="21"/>
+        </w:rPr>
+        <w:t>challenge.h</w:t>
+      </w:r>
+      <w:proofErr w:type="spellEnd"/>
+      <w:r>
+        <w:rPr>
+          <w:rFonts w:ascii="Consolas" w:eastAsia="Times New Roman" w:hAnsi="Consolas" w:cs="Times New Roman"/>
+          <w:color w:val="D1F1A9"/>
+          <w:sz w:val="21"/>
+          <w:szCs w:val="21"/>
+        </w:rPr>
+        <w:t>"</w:t>
       </w:r>
     </w:p>
     <w:p>
@@ -2905,7 +3412,27 @@
           <w:sz w:val="21"/>
           <w:szCs w:val="21"/>
         </w:rPr>
-        <w:t>&lt;cmath&gt;</w:t>
+        <w:t>&lt;</w:t>
+      </w:r>
+      <w:proofErr w:type="spellStart"/>
+      <w:r>
+        <w:rPr>
+          <w:rFonts w:ascii="Consolas" w:eastAsia="Times New Roman" w:hAnsi="Consolas" w:cs="Times New Roman"/>
+          <w:color w:val="D1F1A9"/>
+          <w:sz w:val="21"/>
+          <w:szCs w:val="21"/>
+        </w:rPr>
+        <w:t>cmath</w:t>
+      </w:r>
+      <w:proofErr w:type="spellEnd"/>
+      <w:r>
+        <w:rPr>
+          <w:rFonts w:ascii="Consolas" w:eastAsia="Times New Roman" w:hAnsi="Consolas" w:cs="Times New Roman"/>
+          <w:color w:val="D1F1A9"/>
+          <w:sz w:val="21"/>
+          <w:szCs w:val="21"/>
+        </w:rPr>
+        <w:t>&gt;</w:t>
       </w:r>
     </w:p>
     <w:p>
@@ -2938,7 +3465,27 @@
           <w:sz w:val="21"/>
           <w:szCs w:val="21"/>
         </w:rPr>
-        <w:t>// Pack temperature_c multiplied by 10, then send the message.</w:t>
+        <w:t xml:space="preserve">// Pack </w:t>
+      </w:r>
+      <w:proofErr w:type="spellStart"/>
+      <w:r>
+        <w:rPr>
+          <w:rFonts w:ascii="Consolas" w:eastAsia="Times New Roman" w:hAnsi="Consolas" w:cs="Times New Roman"/>
+          <w:color w:val="7285B7"/>
+          <w:sz w:val="21"/>
+          <w:szCs w:val="21"/>
+        </w:rPr>
+        <w:t>temperature_c</w:t>
+      </w:r>
+      <w:proofErr w:type="spellEnd"/>
+      <w:r>
+        <w:rPr>
+          <w:rFonts w:ascii="Consolas" w:eastAsia="Times New Roman" w:hAnsi="Consolas" w:cs="Times New Roman"/>
+          <w:color w:val="7285B7"/>
+          <w:sz w:val="21"/>
+          <w:szCs w:val="21"/>
+        </w:rPr>
+        <w:t xml:space="preserve"> multiplied by 10, then send the message.</w:t>
       </w:r>
     </w:p>
     <w:p>
@@ -2970,6 +3517,7 @@
         </w:rPr>
         <w:t xml:space="preserve"> </w:t>
       </w:r>
+      <w:proofErr w:type="spellStart"/>
       <w:r>
         <w:rPr>
           <w:rFonts w:ascii="Consolas" w:eastAsia="Times New Roman" w:hAnsi="Consolas" w:cs="Times New Roman"/>
@@ -2979,6 +3527,7 @@
         </w:rPr>
         <w:t>can_send_temperature</w:t>
       </w:r>
+      <w:proofErr w:type="spellEnd"/>
       <w:r>
         <w:rPr>
           <w:rFonts w:ascii="Consolas" w:eastAsia="Times New Roman" w:hAnsi="Consolas" w:cs="Times New Roman"/>
@@ -3006,6 +3555,7 @@
         </w:rPr>
         <w:t xml:space="preserve"> </w:t>
       </w:r>
+      <w:proofErr w:type="spellStart"/>
       <w:r>
         <w:rPr>
           <w:rFonts w:ascii="Consolas" w:eastAsia="Times New Roman" w:hAnsi="Consolas" w:cs="Times New Roman"/>
@@ -3015,6 +3565,7 @@
         </w:rPr>
         <w:t>temperature_c</w:t>
       </w:r>
+      <w:proofErr w:type="spellEnd"/>
       <w:r>
         <w:rPr>
           <w:rFonts w:ascii="Consolas" w:eastAsia="Times New Roman" w:hAnsi="Consolas" w:cs="Times New Roman"/>
@@ -3084,6 +3635,7 @@
         </w:rPr>
         <w:t>::</w:t>
       </w:r>
+      <w:proofErr w:type="spellStart"/>
       <w:r>
         <w:rPr>
           <w:rFonts w:ascii="Consolas" w:eastAsia="Times New Roman" w:hAnsi="Consolas" w:cs="Times New Roman"/>
@@ -3093,6 +3645,7 @@
         </w:rPr>
         <w:t>TxFrame</w:t>
       </w:r>
+      <w:proofErr w:type="spellEnd"/>
       <w:r>
         <w:rPr>
           <w:rFonts w:ascii="Consolas" w:eastAsia="Times New Roman" w:hAnsi="Consolas" w:cs="Times New Roman"/>
@@ -3234,6 +3787,7 @@
         </w:rPr>
         <w:t xml:space="preserve">    </w:t>
       </w:r>
+      <w:proofErr w:type="spellStart"/>
       <w:r>
         <w:rPr>
           <w:rFonts w:ascii="Consolas" w:eastAsia="Times New Roman" w:hAnsi="Consolas" w:cs="Times New Roman"/>
@@ -3261,6 +3815,7 @@
         </w:rPr>
         <w:t>length</w:t>
       </w:r>
+      <w:proofErr w:type="spellEnd"/>
       <w:r>
         <w:rPr>
           <w:rFonts w:ascii="Consolas" w:eastAsia="Times New Roman" w:hAnsi="Consolas" w:cs="Times New Roman"/>
@@ -3346,7 +3901,27 @@
           <w:sz w:val="21"/>
           <w:szCs w:val="21"/>
         </w:rPr>
-        <w:t>    //integer 10x value of temperature_c, will always round down at 1dp (25.19 -&gt; 251), level of precision is acceptable.</w:t>
+        <w:t xml:space="preserve">    //integer 10x value of </w:t>
+      </w:r>
+      <w:proofErr w:type="spellStart"/>
+      <w:r>
+        <w:rPr>
+          <w:rFonts w:ascii="Consolas" w:eastAsia="Times New Roman" w:hAnsi="Consolas" w:cs="Times New Roman"/>
+          <w:color w:val="7285B7"/>
+          <w:sz w:val="21"/>
+          <w:szCs w:val="21"/>
+        </w:rPr>
+        <w:t>temperature_c</w:t>
+      </w:r>
+      <w:proofErr w:type="spellEnd"/>
+      <w:r>
+        <w:rPr>
+          <w:rFonts w:ascii="Consolas" w:eastAsia="Times New Roman" w:hAnsi="Consolas" w:cs="Times New Roman"/>
+          <w:color w:val="7285B7"/>
+          <w:sz w:val="21"/>
+          <w:szCs w:val="21"/>
+        </w:rPr>
+        <w:t>, will always round down at 1dp (25.19 -&gt; 251), level of precision is acceptable.</w:t>
       </w:r>
     </w:p>
     <w:p>
@@ -3367,7 +3942,6 @@
           <w:sz w:val="21"/>
           <w:szCs w:val="21"/>
         </w:rPr>
-        <w:lastRenderedPageBreak/>
         <w:t xml:space="preserve">    </w:t>
       </w:r>
       <w:r>
@@ -3424,6 +3998,7 @@
         </w:rPr>
         <w:t xml:space="preserve"> </w:t>
       </w:r>
+      <w:proofErr w:type="spellStart"/>
       <w:r>
         <w:rPr>
           <w:rFonts w:ascii="Consolas" w:eastAsia="Times New Roman" w:hAnsi="Consolas" w:cs="Times New Roman"/>
@@ -3433,6 +4008,7 @@
         </w:rPr>
         <w:t>temperature_c</w:t>
       </w:r>
+      <w:proofErr w:type="spellEnd"/>
       <w:r>
         <w:rPr>
           <w:rFonts w:ascii="Consolas" w:eastAsia="Times New Roman" w:hAnsi="Consolas" w:cs="Times New Roman"/>
@@ -3593,7 +4169,27 @@
           <w:sz w:val="21"/>
           <w:szCs w:val="21"/>
         </w:rPr>
-        <w:t>    //    pack_u16(data, index, static_cast&lt;uint16_t&gt;(value));</w:t>
+        <w:t xml:space="preserve">    //    pack_u16(data, index, </w:t>
+      </w:r>
+      <w:proofErr w:type="spellStart"/>
+      <w:r>
+        <w:rPr>
+          <w:rFonts w:ascii="Consolas" w:eastAsia="Times New Roman" w:hAnsi="Consolas" w:cs="Times New Roman"/>
+          <w:color w:val="7285B7"/>
+          <w:sz w:val="21"/>
+          <w:szCs w:val="21"/>
+        </w:rPr>
+        <w:t>static_cast</w:t>
+      </w:r>
+      <w:proofErr w:type="spellEnd"/>
+      <w:r>
+        <w:rPr>
+          <w:rFonts w:ascii="Consolas" w:eastAsia="Times New Roman" w:hAnsi="Consolas" w:cs="Times New Roman"/>
+          <w:color w:val="7285B7"/>
+          <w:sz w:val="21"/>
+          <w:szCs w:val="21"/>
+        </w:rPr>
+        <w:t>&lt;uint16_t&gt;(value));</w:t>
       </w:r>
     </w:p>
     <w:p>
@@ -3673,6 +4269,7 @@
         </w:rPr>
         <w:t>(</w:t>
       </w:r>
+      <w:proofErr w:type="spellStart"/>
       <w:r>
         <w:rPr>
           <w:rFonts w:ascii="Consolas" w:eastAsia="Times New Roman" w:hAnsi="Consolas" w:cs="Times New Roman"/>
@@ -3700,6 +4297,7 @@
         </w:rPr>
         <w:t>data</w:t>
       </w:r>
+      <w:proofErr w:type="spellEnd"/>
       <w:r>
         <w:rPr>
           <w:rFonts w:ascii="Consolas" w:eastAsia="Times New Roman" w:hAnsi="Consolas" w:cs="Times New Roman"/>
@@ -3784,6 +4382,7 @@
         </w:rPr>
         <w:t>::</w:t>
       </w:r>
+      <w:proofErr w:type="spellStart"/>
       <w:r>
         <w:rPr>
           <w:rFonts w:ascii="Consolas" w:eastAsia="Times New Roman" w:hAnsi="Consolas" w:cs="Times New Roman"/>
@@ -3793,6 +4392,7 @@
         </w:rPr>
         <w:t>send_msg</w:t>
       </w:r>
+      <w:proofErr w:type="spellEnd"/>
       <w:r>
         <w:rPr>
           <w:rFonts w:ascii="Consolas" w:eastAsia="Times New Roman" w:hAnsi="Consolas" w:cs="Times New Roman"/>
@@ -3839,7 +4439,27 @@
           <w:sz w:val="21"/>
           <w:szCs w:val="21"/>
         </w:rPr>
-        <w:t>    // Could be better to use schedule() instead of send_msg() as this would allow us to send the data periodically every second (as the brief states)</w:t>
+        <w:t xml:space="preserve">    // Could be better to use schedule() instead of </w:t>
+      </w:r>
+      <w:proofErr w:type="spellStart"/>
+      <w:r>
+        <w:rPr>
+          <w:rFonts w:ascii="Consolas" w:eastAsia="Times New Roman" w:hAnsi="Consolas" w:cs="Times New Roman"/>
+          <w:color w:val="7285B7"/>
+          <w:sz w:val="21"/>
+          <w:szCs w:val="21"/>
+        </w:rPr>
+        <w:t>send_msg</w:t>
+      </w:r>
+      <w:proofErr w:type="spellEnd"/>
+      <w:r>
+        <w:rPr>
+          <w:rFonts w:ascii="Consolas" w:eastAsia="Times New Roman" w:hAnsi="Consolas" w:cs="Times New Roman"/>
+          <w:color w:val="7285B7"/>
+          <w:sz w:val="21"/>
+          <w:szCs w:val="21"/>
+        </w:rPr>
+        <w:t>() as this would allow us to send the data periodically every second (as the brief states)</w:t>
       </w:r>
     </w:p>
     <w:p>
@@ -3876,6 +4496,99 @@
       </w:pPr>
     </w:p>
     <w:p/>
+    <w:p>
+      <w:r>
+        <w:rPr>
+          <w:b/>
+          <w:bCs/>
+        </w:rPr>
+        <w:t>Worked Example</w:t>
+      </w:r>
+    </w:p>
+    <w:p>
+      <w:proofErr w:type="spellStart"/>
+      <w:r>
+        <w:t>raw_adc</w:t>
+      </w:r>
+      <w:proofErr w:type="spellEnd"/>
+      <w:r>
+        <w:t xml:space="preserve"> = 2500</w:t>
+      </w:r>
+    </w:p>
+    <w:p>
+      <w:proofErr w:type="spellStart"/>
+      <w:r>
+        <w:t>RThermistor</w:t>
+      </w:r>
+      <w:proofErr w:type="spellEnd"/>
+      <w:r>
+        <w:t xml:space="preserve"> = 10000 * 4095 / 2500 – 10000 = 6380Ω</w:t>
+      </w:r>
+    </w:p>
+    <w:p>
+      <w:proofErr w:type="spellStart"/>
+      <w:r>
+        <w:t>temperature_c</w:t>
+      </w:r>
+      <w:proofErr w:type="spellEnd"/>
+      <w:r>
+        <w:t xml:space="preserve"> = ((ln(6380/10000) / (3940) + (25 + 273.15)</w:t>
+      </w:r>
+      <w:r>
+        <w:rPr>
+          <w:vertAlign w:val="superscript"/>
+        </w:rPr>
+        <w:t>-1</w:t>
+      </w:r>
+      <w:r>
+        <w:t>)</w:t>
+      </w:r>
+      <w:r>
+        <w:rPr>
+          <w:vertAlign w:val="superscript"/>
+        </w:rPr>
+        <w:t>-1</w:t>
+      </w:r>
+      <w:r>
+        <w:t xml:space="preserve"> </w:t>
+      </w:r>
+      <w:r>
+        <w:t>– 273.15 = 35.4966</w:t>
+      </w:r>
+    </w:p>
+    <w:p>
+      <w:r>
+        <w:t>temperature_10x = 354 (decimal) = 0162 (hexadecimal)</w:t>
+      </w:r>
+    </w:p>
+    <w:p>
+      <w:r>
+        <w:t>frame[0] = 01, frame[1] = 62</w:t>
+      </w:r>
+    </w:p>
+    <w:p/>
+    <w:p>
+      <w:r>
+        <w:t xml:space="preserve">I also tested for </w:t>
+      </w:r>
+      <w:proofErr w:type="spellStart"/>
+      <w:r>
+        <w:t>RThermistor</w:t>
+      </w:r>
+      <w:proofErr w:type="spellEnd"/>
+      <w:r>
+        <w:t xml:space="preserve"> = 702 and 33518Ω (boundary values) and they returned the correct values of 100 and 0</w:t>
+      </w:r>
+      <w:r>
+        <w:rPr>
+          <w:vertAlign w:val="superscript"/>
+        </w:rPr>
+        <w:t>o</w:t>
+      </w:r>
+      <w:r>
+        <w:t>C respectively.</w:t>
+      </w:r>
+    </w:p>
     <w:p/>
     <w:p>
       <w:pPr>
@@ -3949,6 +4662,16 @@
         <w:t>6. Implementation</w:t>
       </w:r>
     </w:p>
+    <w:p>
+      <w:r>
+        <w:rPr>
+          <w:b/>
+          <w:bCs/>
+        </w:rPr>
+        <w:t>Progress to Working Component</w:t>
+      </w:r>
+    </w:p>
+    <w:p/>
     <w:p>
       <w:r>
         <w:rPr>

</xml_diff>

<commit_message>
Moved rules summary and wrote overview.
</commit_message>
<xml_diff>
--- a/Supplementary Files/Submission - Electrical Software Indivual Challenge Douglas Gray ID 190.docx
+++ b/Supplementary Files/Submission - Electrical Software Indivual Challenge Douglas Gray ID 190.docx
@@ -27,6 +27,10 @@
       </w:r>
       <w:r>
         <w:t>Douglas Gray</w:t>
+      </w:r>
+      <w:r>
+        <w:tab/>
+        <w:t>Applicant ID: 190</w:t>
       </w:r>
     </w:p>
     <w:p>
@@ -189,10 +193,6 @@
         <w:t>FSG T11.12 Sensors, Cameras &amp; Electrical Components Mounting should cover this?</w:t>
       </w:r>
     </w:p>
-    <w:p/>
-    <w:p/>
-    <w:p/>
-    <w:p/>
     <w:p>
       <w:pPr>
         <w:rPr>
@@ -205,31 +205,31 @@
           <w:b/>
           <w:bCs/>
         </w:rPr>
+        <w:t>FSG T11.9 System Critical Signal (SCS)</w:t>
+      </w:r>
+    </w:p>
+    <w:p>
+      <w:r>
+        <w:t xml:space="preserve">FSG </w:t>
+      </w:r>
+      <w:r>
+        <w:t xml:space="preserve">T11.9.2 </w:t>
+      </w:r>
+      <w:r>
+        <w:t>“</w:t>
+      </w:r>
+      <w:r>
+        <w:t xml:space="preserve">Any of the following SCS single failures must result in a safe state of all connected systems: </w:t>
+      </w:r>
+    </w:p>
+    <w:p>
+      <w:r>
+        <w:t xml:space="preserve">(a) Failures of signals transmitted by cable: • Open circuit • Short circuit to ground </w:t>
+      </w:r>
+    </w:p>
+    <w:p>
+      <w:r>
         <w:lastRenderedPageBreak/>
-        <w:t>FSG T11.9 System Critical Signal (SCS)</w:t>
-      </w:r>
-    </w:p>
-    <w:p>
-      <w:r>
-        <w:t xml:space="preserve">FSG </w:t>
-      </w:r>
-      <w:r>
-        <w:t xml:space="preserve">T11.9.2 </w:t>
-      </w:r>
-      <w:r>
-        <w:t>“</w:t>
-      </w:r>
-      <w:r>
-        <w:t xml:space="preserve">Any of the following SCS single failures must result in a safe state of all connected systems: </w:t>
-      </w:r>
-    </w:p>
-    <w:p>
-      <w:r>
-        <w:t xml:space="preserve">(a) Failures of signals transmitted by cable: • Open circuit • Short circuit to ground </w:t>
-      </w:r>
-    </w:p>
-    <w:p>
-      <w:r>
         <w:t xml:space="preserve">(b) Failures of </w:t>
       </w:r>
       <w:proofErr w:type="spellStart"/>
@@ -243,7 +243,15 @@
     </w:p>
     <w:p>
       <w:r>
-        <w:t xml:space="preserve">(c) Failures of sensor signals used in programmable devices: • Implausibility due to out of range signals, e.g. mechanically impossible angle of an angle sensor. </w:t>
+        <w:t xml:space="preserve">(c) Failures of sensor signals used in programmable devices: • Implausibility due to </w:t>
+      </w:r>
+      <w:proofErr w:type="gramStart"/>
+      <w:r>
+        <w:t>out of range</w:t>
+      </w:r>
+      <w:proofErr w:type="gramEnd"/>
+      <w:r>
+        <w:t xml:space="preserve"> signals, e.g. mechanically impossible angle of an angle sensor. </w:t>
       </w:r>
     </w:p>
     <w:p>
@@ -295,39 +303,106 @@
     </w:p>
     <w:p>
       <w:pPr>
+        <w:rPr>
+          <w:b/>
+          <w:bCs/>
+        </w:rPr>
+      </w:pPr>
+      <w:r>
+        <w:rPr>
+          <w:b/>
+          <w:bCs/>
+        </w:rPr>
+        <w:t>Summary and Analysis of Rules</w:t>
+      </w:r>
+    </w:p>
+    <w:p>
+      <w:r>
+        <w:t>The rules I researched related to the restrictions with mounting sensors/electrical components, and how they must transfer data through the system for critical signals. As the task does not specify where this temperature sensor will be placed in the car, I also researched rules relating to possible locations that would require one.</w:t>
+      </w:r>
+    </w:p>
+    <w:p>
+      <w:r>
+        <w:t>FSUK T11.7 – Over-temp for longer than 1s must trip something to disconnect the battery, and the measured temperature must be able to be displayed by connecting a laptop. This would likely be handled by other systems rather than the sensor itself, but is worth noting.</w:t>
+      </w:r>
+    </w:p>
+    <w:p>
+      <w:r>
+        <w:t>FSUK &amp; FSG T11.9 – System Critical Signal failures, which this temperature could be depending on the install location, have to be carefully considered for multiple ways they could fail, i.e. corruption, packet loss, physical sensor failure, etc.</w:t>
+      </w:r>
+    </w:p>
+    <w:p>
+      <w:r>
+        <w:t>FSG CV4.1 may be triggered by the above SCS, so I included a short excerpt from that section to have a reference for it.</w:t>
+      </w:r>
+    </w:p>
+    <w:p>
+      <w:r>
+        <w:br w:type="page"/>
+      </w:r>
+    </w:p>
+    <w:p>
+      <w:pPr>
         <w:pStyle w:val="Heading1"/>
       </w:pPr>
       <w:r>
+        <w:lastRenderedPageBreak/>
         <w:t>2. Overview</w:t>
       </w:r>
     </w:p>
     <w:p>
       <w:r>
-        <w:t>The rules I researched related to the restrictions with mounting sensors/electrical components, and how they must transfer data through the system for critical signals. As the task does not specify where this temperature sensor will be placed in the car, I also researched rules relating to possible locations that would require one.</w:t>
-      </w:r>
-    </w:p>
-    <w:p>
-      <w:r>
-        <w:t>FSUK T11.7 – Over-temp for longer than 1s must trip something to disconnect the battery, and the measured temperature must be able to be displayed by connecting a laptop. This would likely be handled by other systems rather than the sensor itself, but is worth noting.</w:t>
-      </w:r>
-    </w:p>
-    <w:p>
-      <w:r>
-        <w:t>FSUK &amp; FSG T11.9 – System Critical Signal failures, which this temperature could be depending on the install location, have to be carefully considered for multiple ways they could fail, i.e. corruption, packet loss, physical sensor failure, etc.</w:t>
-      </w:r>
-    </w:p>
-    <w:p>
-      <w:r>
-        <w:t>FSG CV4.1 may be triggered by the above SCS, so I included a short excerpt from that section to have a reference for it.</w:t>
-      </w:r>
-    </w:p>
-    <w:p>
-      <w:r>
-        <w:rPr>
-          <w:i/>
-          <w:color w:val="7030A0"/>
-        </w:rPr>
-        <w:t>[Write your overview here as described in the challenge instructions. Only a short paragraph is needed]</w:t>
+        <w:t>My approach to the task was sequential, beginning with ensuring that I understood all the basic processes, components, and any problems or errors that I could face before moving on to any coding or schematic work. This helped me account for all scenarios in my code and have a greater holistic understanding of the systems at work, instead of overly focusing onto a small section and missing important steps.</w:t>
+      </w:r>
+    </w:p>
+    <w:p>
+      <w:r>
+        <w:t>My first step was to create a GitHub repo to store all my work and data within,</w:t>
+      </w:r>
+      <w:r>
+        <w:t xml:space="preserve"> allowing </w:t>
+      </w:r>
+      <w:r>
+        <w:t xml:space="preserve">everything </w:t>
+      </w:r>
+      <w:r>
+        <w:t>to be</w:t>
+      </w:r>
+      <w:r>
+        <w:t xml:space="preserve"> saved and tracked </w:t>
+      </w:r>
+      <w:r>
+        <w:t>and helping me consider problems from multiple directions and within the context of the greater codebase.</w:t>
+      </w:r>
+    </w:p>
+    <w:p>
+      <w:r>
+        <w:t xml:space="preserve">By creating a detailed flowchart and modelling the </w:t>
+      </w:r>
+      <w:r>
+        <w:t>mathematical</w:t>
+      </w:r>
+      <w:r>
+        <w:t xml:space="preserve"> process using </w:t>
+      </w:r>
+      <w:r>
+        <w:t>Desmos</w:t>
+      </w:r>
+      <w:r>
+        <w:t>, I was able to ensure the ADC and CAN code was as lightweight as possible to ensure quick processing, and my researched knowledge of the components made the schematic creation process simpler as I understood the required connections.</w:t>
+      </w:r>
+    </w:p>
+    <w:p>
+      <w:r>
+        <w:t xml:space="preserve">Finally, I have made sure to </w:t>
+      </w:r>
+      <w:r>
+        <w:t>look back at the end of the process so I can identify any further changes I can make to improve the system with a greater knowledge of the final structure.</w:t>
+      </w:r>
+    </w:p>
+    <w:p>
+      <w:r>
+        <w:br w:type="page"/>
       </w:r>
     </w:p>
     <w:p>
@@ -335,18 +410,23 @@
         <w:pStyle w:val="Heading1"/>
       </w:pPr>
       <w:r>
+        <w:lastRenderedPageBreak/>
+        <w:t>3. Logic/block diagram</w:t>
+      </w:r>
+    </w:p>
+    <w:p>
+      <w:r>
         <w:rPr>
           <w:noProof/>
         </w:rPr>
-        <w:lastRenderedPageBreak/>
         <w:drawing>
-          <wp:anchor distT="0" distB="0" distL="114300" distR="114300" simplePos="0" relativeHeight="251658240" behindDoc="0" locked="0" layoutInCell="1" allowOverlap="1" wp14:anchorId="3511E1A5" wp14:editId="1D73CCC5">
+          <wp:anchor distT="0" distB="0" distL="114300" distR="114300" simplePos="0" relativeHeight="251658240" behindDoc="0" locked="0" layoutInCell="1" allowOverlap="1" wp14:anchorId="3511E1A5" wp14:editId="4B5B838F">
             <wp:simplePos x="0" y="0"/>
             <wp:positionH relativeFrom="margin">
-              <wp:posOffset>5080</wp:posOffset>
+              <wp:align>left</wp:align>
             </wp:positionH>
             <wp:positionV relativeFrom="paragraph">
-              <wp:posOffset>388620</wp:posOffset>
+              <wp:posOffset>222885</wp:posOffset>
             </wp:positionV>
             <wp:extent cx="5730240" cy="5386070"/>
             <wp:effectExtent l="0" t="0" r="3810" b="5080"/>
@@ -396,21 +476,11 @@
         </w:drawing>
       </w:r>
       <w:r>
-        <w:t>3. Logic/block diagram</w:t>
-      </w:r>
-    </w:p>
-    <w:p>
-      <w:r>
         <w:rPr>
           <w:b/>
           <w:bCs/>
         </w:rPr>
-        <w:t>Physical Processes</w:t>
-      </w:r>
-    </w:p>
-    <w:p>
-      <w:r>
-        <w:t>These are what is physically happening on the circuit board, particularly across the voltage divider, as the temperature varies and the thermistor changes resistance.</w:t>
+        <w:t>Flowchart</w:t>
       </w:r>
     </w:p>
     <w:p>
@@ -419,12 +489,12 @@
           <w:b/>
           <w:bCs/>
         </w:rPr>
-        <w:t>ADC Task</w:t>
-      </w:r>
-    </w:p>
-    <w:p>
-      <w:r>
-        <w:t>First the ADC completes its nominal purpose of converting the analogue voltage signal to a 12-bit digital signal, and then using voltage divider and an NTC beta constant equation, I solve for the temperature of the thermistor and return the function.</w:t>
+        <w:t>Physical Processes</w:t>
+      </w:r>
+    </w:p>
+    <w:p>
+      <w:r>
+        <w:t>These are what is physically happening on the circuit board, particularly across the voltage divider, as the temperature varies and the thermistor changes resistance.</w:t>
       </w:r>
     </w:p>
     <w:p>
@@ -433,20 +503,12 @@
           <w:b/>
           <w:bCs/>
         </w:rPr>
-        <w:t>CAN Task</w:t>
-      </w:r>
-    </w:p>
-    <w:p>
-      <w:r>
-        <w:t xml:space="preserve">First I convert the float value of temperature into a signed 16 bit integer value, multiplied by 10 to bring along the first decimal place. This value is then packed into the provided data frame using the packing helper function, and sent using </w:t>
-      </w:r>
-      <w:proofErr w:type="spellStart"/>
-      <w:r>
-        <w:t>send_msg</w:t>
-      </w:r>
-      <w:proofErr w:type="spellEnd"/>
-      <w:r>
-        <w:t>() to the CAN data node.</w:t>
+        <w:t>ADC Task</w:t>
+      </w:r>
+    </w:p>
+    <w:p>
+      <w:r>
+        <w:t>First the ADC completes its nominal purpose of converting the analogue voltage signal to a 12-bit digital signal, and then using voltage divider and an NTC beta constant equation, I solve for the temperature of the thermistor and return the function.</w:t>
       </w:r>
     </w:p>
     <w:p>
@@ -455,7 +517,54 @@
           <w:b/>
           <w:bCs/>
         </w:rPr>
+        <w:t>CAN Task</w:t>
+      </w:r>
+    </w:p>
+    <w:p>
+      <w:proofErr w:type="gramStart"/>
+      <w:r>
+        <w:t>First</w:t>
+      </w:r>
+      <w:proofErr w:type="gramEnd"/>
+      <w:r>
+        <w:t xml:space="preserve"> I convert the float value of temperature into a signed </w:t>
+      </w:r>
+      <w:proofErr w:type="gramStart"/>
+      <w:r>
+        <w:t>16 bit</w:t>
+      </w:r>
+      <w:proofErr w:type="gramEnd"/>
+      <w:r>
+        <w:t xml:space="preserve"> integer value, multiplied by 10 to bring along the first decimal place. This value is then packed into the </w:t>
+      </w:r>
+      <w:r>
         <w:lastRenderedPageBreak/>
+        <w:t xml:space="preserve">provided data frame using the packing helper function, and sent using </w:t>
+      </w:r>
+      <w:proofErr w:type="spellStart"/>
+      <w:r>
+        <w:t>send_</w:t>
+      </w:r>
+      <w:proofErr w:type="gramStart"/>
+      <w:r>
+        <w:t>msg</w:t>
+      </w:r>
+      <w:proofErr w:type="spellEnd"/>
+      <w:r>
+        <w:t>(</w:t>
+      </w:r>
+      <w:proofErr w:type="gramEnd"/>
+      <w:r>
+        <w:t>) to the CAN data node.</w:t>
+      </w:r>
+    </w:p>
+    <w:p/>
+    <w:p>
+      <w:r>
+        <w:rPr>
+          <w:b/>
+          <w:bCs/>
+        </w:rPr>
         <w:t>Mathematical Modelling</w:t>
       </w:r>
     </w:p>
@@ -701,18 +810,8 @@
       </w:r>
     </w:p>
     <w:p>
-      <w:pPr>
-        <w:rPr>
-          <w:i/>
-          <w:color w:val="7030A0"/>
-        </w:rPr>
-      </w:pPr>
-      <w:r>
-        <w:rPr>
-          <w:i/>
-          <w:color w:val="7030A0"/>
-        </w:rPr>
-        <w:t>[Include your logic/block diagram for the BSPD here, along with a written description]</w:t>
+      <w:r>
+        <w:br w:type="page"/>
       </w:r>
     </w:p>
     <w:p>
@@ -720,18 +819,23 @@
         <w:pStyle w:val="Heading1"/>
       </w:pPr>
       <w:r>
+        <w:lastRenderedPageBreak/>
+        <w:t xml:space="preserve">4. Schematic Design </w:t>
+      </w:r>
+    </w:p>
+    <w:p>
+      <w:r>
         <w:rPr>
           <w:noProof/>
         </w:rPr>
-        <w:lastRenderedPageBreak/>
         <w:drawing>
-          <wp:anchor distT="0" distB="0" distL="114300" distR="114300" simplePos="0" relativeHeight="251661312" behindDoc="0" locked="0" layoutInCell="1" allowOverlap="1" wp14:anchorId="39AEF56C" wp14:editId="6016761D">
+          <wp:anchor distT="0" distB="0" distL="114300" distR="114300" simplePos="0" relativeHeight="251661312" behindDoc="0" locked="0" layoutInCell="1" allowOverlap="1" wp14:anchorId="39AEF56C" wp14:editId="29ABA0EC">
             <wp:simplePos x="0" y="0"/>
             <wp:positionH relativeFrom="margin">
               <wp:align>right</wp:align>
             </wp:positionH>
             <wp:positionV relativeFrom="paragraph">
-              <wp:posOffset>388620</wp:posOffset>
+              <wp:posOffset>210820</wp:posOffset>
             </wp:positionV>
             <wp:extent cx="5730240" cy="3736340"/>
             <wp:effectExtent l="0" t="0" r="0" b="0"/>
@@ -780,77 +884,116 @@
           </wp:anchor>
         </w:drawing>
       </w:r>
-      <w:r>
-        <w:t xml:space="preserve">4. Schematic Design </w:t>
-      </w:r>
-    </w:p>
-    <w:p>
-      <w:r>
-        <w:t>The schematic includes 3 primary elements as follows:</w:t>
-      </w:r>
-    </w:p>
-    <w:p>
+      <w:proofErr w:type="spellStart"/>
       <w:r>
         <w:rPr>
           <w:b/>
           <w:bCs/>
         </w:rPr>
-        <w:t>Voltage Divider</w:t>
-      </w:r>
-    </w:p>
-    <w:p>
-      <w:r>
-        <w:t xml:space="preserve">A simple voltage divider to find the voltage across the 10kOhm constant resistor against the variable resistance of the NTC thermistor. The </w:t>
-      </w:r>
-      <w:proofErr w:type="spellStart"/>
-      <w:r>
-        <w:t>V</w:t>
-      </w:r>
-      <w:r>
-        <w:rPr>
-          <w:vertAlign w:val="subscript"/>
-        </w:rPr>
-        <w:t>out</w:t>
+        <w:t>KiCad</w:t>
       </w:r>
       <w:proofErr w:type="spellEnd"/>
-      <w:r>
-        <w:t xml:space="preserve"> from this goes to the input pin of the ADC to be converted into a digital signal.</w:t>
-      </w:r>
-    </w:p>
-    <w:p/>
-    <w:p>
       <w:r>
         <w:rPr>
           <w:b/>
           <w:bCs/>
         </w:rPr>
+        <w:t xml:space="preserve"> Schematic with Annotations</w:t>
+      </w:r>
+    </w:p>
+    <w:p>
+      <w:r>
+        <w:t>The schematic includes 3 primary elements as follows:</w:t>
+      </w:r>
+    </w:p>
+    <w:p>
+      <w:r>
+        <w:rPr>
+          <w:b/>
+          <w:bCs/>
+        </w:rPr>
+        <w:t>Voltage Divider</w:t>
+      </w:r>
+    </w:p>
+    <w:p>
+      <w:r>
+        <w:t xml:space="preserve">A simple voltage divider to find the voltage across the 10kOhm constant resistor against the variable resistance of the NTC thermistor. The </w:t>
+      </w:r>
+      <w:proofErr w:type="spellStart"/>
+      <w:r>
+        <w:t>V</w:t>
+      </w:r>
+      <w:r>
+        <w:rPr>
+          <w:vertAlign w:val="subscript"/>
+        </w:rPr>
+        <w:t>out</w:t>
+      </w:r>
+      <w:proofErr w:type="spellEnd"/>
+      <w:r>
+        <w:t xml:space="preserve"> from this goes to the input pin of the ADC to be converted into a digital signal.</w:t>
+      </w:r>
+    </w:p>
+    <w:p/>
+    <w:p>
+      <w:r>
+        <w:rPr>
+          <w:b/>
+          <w:bCs/>
+        </w:rPr>
         <w:t>Analogue Digital Converter</w:t>
       </w:r>
     </w:p>
     <w:p>
       <w:r>
-        <w:t xml:space="preserve">The ADC takes input on only 1 pin of the voltage across the constant resistor and translates it into a 12 bit signal. It is powered in parallel to the voltage divider from a 3.3V source, within </w:t>
+        <w:t xml:space="preserve">The ADC takes input on only 1 pin of the voltage across the constant resistor and translates it into a </w:t>
+      </w:r>
+      <w:proofErr w:type="gramStart"/>
+      <w:r>
+        <w:t>12 bit</w:t>
+      </w:r>
+      <w:proofErr w:type="gramEnd"/>
+      <w:r>
+        <w:t xml:space="preserve"> signal. It is powered in parallel to the voltage divider from a 3.3V source, within </w:t>
       </w:r>
       <w:proofErr w:type="spellStart"/>
+      <w:proofErr w:type="gramStart"/>
       <w:r>
         <w:t>it’s</w:t>
       </w:r>
       <w:proofErr w:type="spellEnd"/>
+      <w:proofErr w:type="gramEnd"/>
       <w:r>
         <w:t xml:space="preserve"> operating range, with the recommended capacitors from the datasheet in place performing power bypassing to ensure any noise from the power source does not interfere.</w:t>
       </w:r>
     </w:p>
     <w:p>
       <w:r>
-        <w:t xml:space="preserve">The chip select, clock and data output and input pins are all connected to the microcontroller to the correct GPIO pins as specified in framework.cpp from the template code and the microcontrollers datasheet. This ensures that it stays in sync and can be called to with the </w:t>
+        <w:t xml:space="preserve">The chip </w:t>
+      </w:r>
+      <w:proofErr w:type="gramStart"/>
+      <w:r>
+        <w:t>select</w:t>
+      </w:r>
+      <w:proofErr w:type="gramEnd"/>
+      <w:r>
+        <w:t xml:space="preserve">, clock and data output and input pins are all connected to the microcontroller to the correct GPIO pins as specified in framework.cpp from the template code and the microcontrollers datasheet. This ensures that it stays in sync and can be called to with the </w:t>
       </w:r>
       <w:proofErr w:type="spellStart"/>
       <w:r>
-        <w:t>read_adc</w:t>
+        <w:t>read_</w:t>
+      </w:r>
+      <w:proofErr w:type="gramStart"/>
+      <w:r>
+        <w:t>adc</w:t>
       </w:r>
       <w:proofErr w:type="spellEnd"/>
       <w:r>
-        <w:t>() function.</w:t>
+        <w:t>(</w:t>
+      </w:r>
+      <w:proofErr w:type="gramEnd"/>
+      <w:r>
+        <w:t>) function.</w:t>
       </w:r>
     </w:p>
     <w:p/>
@@ -861,7 +1004,6 @@
           <w:b/>
           <w:bCs/>
         </w:rPr>
-        <w:lastRenderedPageBreak/>
         <w:t>Microcontroller</w:t>
       </w:r>
     </w:p>
@@ -879,6 +1021,11 @@
       </w:r>
     </w:p>
     <w:p/>
+    <w:p>
+      <w:r>
+        <w:t>To ensure the functionality of all components in the schematic, I made sure to verify the working conditions for each component involved.</w:t>
+      </w:r>
+    </w:p>
     <w:p>
       <w:r>
         <w:rPr>
@@ -931,67 +1078,9 @@
       </w:r>
     </w:p>
     <w:p>
-      <w:pPr>
-        <w:rPr>
-          <w:i/>
-          <w:color w:val="7030A0"/>
-        </w:rPr>
-      </w:pPr>
-      <w:r>
-        <w:rPr>
-          <w:i/>
-          <w:color w:val="7030A0"/>
-        </w:rPr>
-        <w:t>[In this section include your screenshot of your schematic. Ensure that the schematic is large enough to be easily readable on a laptop screen - this may require a full page. Also include the description of your schematic here, giving as much detail as you feel is necessary to explain it]</w:t>
-      </w:r>
-    </w:p>
-    <w:p>
-      <w:pPr>
-        <w:rPr>
-          <w:i/>
-          <w:color w:val="7030A0"/>
-        </w:rPr>
-      </w:pPr>
-    </w:p>
-    <w:p>
-      <w:pPr>
-        <w:rPr>
-          <w:i/>
-          <w:color w:val="7030A0"/>
-        </w:rPr>
-      </w:pPr>
-    </w:p>
-    <w:p>
-      <w:pPr>
-        <w:rPr>
-          <w:i/>
-          <w:color w:val="7030A0"/>
-        </w:rPr>
-      </w:pPr>
-    </w:p>
-    <w:p>
-      <w:pPr>
-        <w:rPr>
-          <w:i/>
-          <w:color w:val="7030A0"/>
-        </w:rPr>
-      </w:pPr>
-    </w:p>
-    <w:p>
-      <w:pPr>
-        <w:rPr>
-          <w:i/>
-          <w:color w:val="7030A0"/>
-        </w:rPr>
-      </w:pPr>
-    </w:p>
-    <w:p>
-      <w:pPr>
-        <w:rPr>
-          <w:i/>
-          <w:color w:val="7030A0"/>
-        </w:rPr>
-      </w:pPr>
+      <w:r>
+        <w:br w:type="page"/>
+      </w:r>
     </w:p>
     <w:p>
       <w:pPr>
@@ -1181,7 +1270,17 @@
           <w:sz w:val="21"/>
           <w:szCs w:val="21"/>
         </w:rPr>
-        <w:t>read_adc</w:t>
+        <w:t>read_</w:t>
+      </w:r>
+      <w:proofErr w:type="gramStart"/>
+      <w:r>
+        <w:rPr>
+          <w:rFonts w:ascii="Consolas" w:eastAsia="Times New Roman" w:hAnsi="Consolas" w:cs="Times New Roman"/>
+          <w:color w:val="7285B7"/>
+          <w:sz w:val="21"/>
+          <w:szCs w:val="21"/>
+        </w:rPr>
+        <w:t>adc</w:t>
       </w:r>
       <w:proofErr w:type="spellEnd"/>
       <w:r>
@@ -1191,7 +1290,17 @@
           <w:sz w:val="21"/>
           <w:szCs w:val="21"/>
         </w:rPr>
-        <w:t>() gives you a number from 0 to 4095.</w:t>
+        <w:t>(</w:t>
+      </w:r>
+      <w:proofErr w:type="gramEnd"/>
+      <w:r>
+        <w:rPr>
+          <w:rFonts w:ascii="Consolas" w:eastAsia="Times New Roman" w:hAnsi="Consolas" w:cs="Times New Roman"/>
+          <w:color w:val="7285B7"/>
+          <w:sz w:val="21"/>
+          <w:szCs w:val="21"/>
+        </w:rPr>
+        <w:t>) gives you a number from 0 to 4095.</w:t>
       </w:r>
     </w:p>
     <w:p>
@@ -1231,7 +1340,17 @@
           <w:sz w:val="21"/>
           <w:szCs w:val="21"/>
         </w:rPr>
-        <w:t>adc_read</w:t>
+        <w:t>adc_</w:t>
+      </w:r>
+      <w:proofErr w:type="gramStart"/>
+      <w:r>
+        <w:rPr>
+          <w:rFonts w:ascii="Consolas" w:eastAsia="Times New Roman" w:hAnsi="Consolas" w:cs="Times New Roman"/>
+          <w:color w:val="BBDAFF"/>
+          <w:sz w:val="21"/>
+          <w:szCs w:val="21"/>
+        </w:rPr>
+        <w:t>read</w:t>
       </w:r>
       <w:proofErr w:type="spellEnd"/>
       <w:r>
@@ -1243,6 +1362,7 @@
         </w:rPr>
         <w:t>(</w:t>
       </w:r>
+      <w:proofErr w:type="gramEnd"/>
       <w:r>
         <w:rPr>
           <w:rFonts w:ascii="Consolas" w:eastAsia="Times New Roman" w:hAnsi="Consolas" w:cs="Times New Roman"/>
@@ -1416,7 +1536,17 @@
           <w:sz w:val="21"/>
           <w:szCs w:val="21"/>
         </w:rPr>
-        <w:t>read_adc</w:t>
+        <w:t>read_</w:t>
+      </w:r>
+      <w:proofErr w:type="gramStart"/>
+      <w:r>
+        <w:rPr>
+          <w:rFonts w:ascii="Consolas" w:eastAsia="Times New Roman" w:hAnsi="Consolas" w:cs="Times New Roman"/>
+          <w:color w:val="BBDAFF"/>
+          <w:sz w:val="21"/>
+          <w:szCs w:val="21"/>
+        </w:rPr>
+        <w:t>adc</w:t>
       </w:r>
       <w:proofErr w:type="spellEnd"/>
       <w:r>
@@ -1426,7 +1556,17 @@
           <w:sz w:val="21"/>
           <w:szCs w:val="21"/>
         </w:rPr>
-        <w:t>();</w:t>
+        <w:t>(</w:t>
+      </w:r>
+      <w:proofErr w:type="gramEnd"/>
+      <w:r>
+        <w:rPr>
+          <w:rFonts w:ascii="Consolas" w:eastAsia="Times New Roman" w:hAnsi="Consolas" w:cs="Times New Roman"/>
+          <w:color w:val="FFFFFF"/>
+          <w:sz w:val="21"/>
+          <w:szCs w:val="21"/>
+        </w:rPr>
+        <w:t>);</w:t>
       </w:r>
     </w:p>
     <w:p>
@@ -1465,7 +1605,17 @@
           <w:sz w:val="21"/>
           <w:szCs w:val="21"/>
         </w:rPr>
-        <w:t xml:space="preserve"> (</w:t>
+        <w:t xml:space="preserve"> </w:t>
+      </w:r>
+      <w:proofErr w:type="gramStart"/>
+      <w:r>
+        <w:rPr>
+          <w:rFonts w:ascii="Consolas" w:eastAsia="Times New Roman" w:hAnsi="Consolas" w:cs="Times New Roman"/>
+          <w:color w:val="FFFFFF"/>
+          <w:sz w:val="21"/>
+          <w:szCs w:val="21"/>
+        </w:rPr>
+        <w:t>(</w:t>
       </w:r>
       <w:r>
         <w:rPr>
@@ -1495,6 +1645,7 @@
         <w:t>::</w:t>
       </w:r>
       <w:proofErr w:type="spellStart"/>
+      <w:proofErr w:type="gramEnd"/>
       <w:r>
         <w:rPr>
           <w:rFonts w:ascii="Consolas" w:eastAsia="Times New Roman" w:hAnsi="Consolas" w:cs="Times New Roman"/>
@@ -2750,6 +2901,7 @@
         </w:rPr>
         <w:t xml:space="preserve"> </w:t>
       </w:r>
+      <w:proofErr w:type="gramStart"/>
       <w:r>
         <w:rPr>
           <w:rFonts w:ascii="Consolas" w:eastAsia="Times New Roman" w:hAnsi="Consolas" w:cs="Times New Roman"/>
@@ -2766,8 +2918,19 @@
           <w:sz w:val="21"/>
           <w:szCs w:val="21"/>
         </w:rPr>
-        <w:t>(((</w:t>
-      </w:r>
+        <w:t>(</w:t>
+      </w:r>
+      <w:proofErr w:type="gramEnd"/>
+      <w:r>
+        <w:rPr>
+          <w:rFonts w:ascii="Consolas" w:eastAsia="Times New Roman" w:hAnsi="Consolas" w:cs="Times New Roman"/>
+          <w:color w:val="FFFFFF"/>
+          <w:sz w:val="21"/>
+          <w:szCs w:val="21"/>
+        </w:rPr>
+        <w:t>((</w:t>
+      </w:r>
+      <w:proofErr w:type="gramStart"/>
       <w:r>
         <w:rPr>
           <w:rFonts w:ascii="Consolas" w:eastAsia="Times New Roman" w:hAnsi="Consolas" w:cs="Times New Roman"/>
@@ -2787,6 +2950,7 @@
         <w:t>(</w:t>
       </w:r>
       <w:proofErr w:type="spellStart"/>
+      <w:proofErr w:type="gramEnd"/>
       <w:r>
         <w:rPr>
           <w:rFonts w:ascii="Consolas" w:eastAsia="Times New Roman" w:hAnsi="Consolas" w:cs="Times New Roman"/>
@@ -2896,6 +3060,7 @@
         </w:rPr>
         <w:t xml:space="preserve"> </w:t>
       </w:r>
+      <w:proofErr w:type="gramStart"/>
       <w:r>
         <w:rPr>
           <w:rFonts w:ascii="Consolas" w:eastAsia="Times New Roman" w:hAnsi="Consolas" w:cs="Times New Roman"/>
@@ -2915,6 +3080,7 @@
         <w:t>(</w:t>
       </w:r>
       <w:proofErr w:type="spellStart"/>
+      <w:proofErr w:type="gramEnd"/>
       <w:r>
         <w:rPr>
           <w:rFonts w:ascii="Consolas" w:eastAsia="Times New Roman" w:hAnsi="Consolas" w:cs="Times New Roman"/>
@@ -3148,6 +3314,7 @@
         </w:rPr>
         <w:t xml:space="preserve"> </w:t>
       </w:r>
+      <w:proofErr w:type="gramStart"/>
       <w:r>
         <w:rPr>
           <w:rFonts w:ascii="Consolas" w:eastAsia="Times New Roman" w:hAnsi="Consolas" w:cs="Times New Roman"/>
@@ -3167,6 +3334,7 @@
         <w:t>::</w:t>
       </w:r>
       <w:proofErr w:type="spellStart"/>
+      <w:proofErr w:type="gramEnd"/>
       <w:r>
         <w:rPr>
           <w:rFonts w:ascii="Consolas" w:eastAsia="Times New Roman" w:hAnsi="Consolas" w:cs="Times New Roman"/>
@@ -3461,17 +3629,75 @@
       <w:r>
         <w:rPr>
           <w:rFonts w:ascii="Consolas" w:eastAsia="Times New Roman" w:hAnsi="Consolas" w:cs="Times New Roman"/>
-          <w:color w:val="7285B7"/>
-          <w:sz w:val="21"/>
-          <w:szCs w:val="21"/>
-        </w:rPr>
-        <w:t xml:space="preserve">// Pack </w:t>
+          <w:color w:val="EBBBFF"/>
+          <w:sz w:val="21"/>
+          <w:szCs w:val="21"/>
+        </w:rPr>
+        <w:t>void</w:t>
+      </w:r>
+      <w:r>
+        <w:rPr>
+          <w:rFonts w:ascii="Consolas" w:eastAsia="Times New Roman" w:hAnsi="Consolas" w:cs="Times New Roman"/>
+          <w:color w:val="FFFFFF"/>
+          <w:sz w:val="21"/>
+          <w:szCs w:val="21"/>
+        </w:rPr>
+        <w:t xml:space="preserve"> </w:t>
       </w:r>
       <w:proofErr w:type="spellStart"/>
       <w:r>
         <w:rPr>
           <w:rFonts w:ascii="Consolas" w:eastAsia="Times New Roman" w:hAnsi="Consolas" w:cs="Times New Roman"/>
-          <w:color w:val="7285B7"/>
+          <w:color w:val="BBDAFF"/>
+          <w:sz w:val="21"/>
+          <w:szCs w:val="21"/>
+        </w:rPr>
+        <w:t>can_send_</w:t>
+      </w:r>
+      <w:proofErr w:type="gramStart"/>
+      <w:r>
+        <w:rPr>
+          <w:rFonts w:ascii="Consolas" w:eastAsia="Times New Roman" w:hAnsi="Consolas" w:cs="Times New Roman"/>
+          <w:color w:val="BBDAFF"/>
+          <w:sz w:val="21"/>
+          <w:szCs w:val="21"/>
+        </w:rPr>
+        <w:t>temperature</w:t>
+      </w:r>
+      <w:proofErr w:type="spellEnd"/>
+      <w:r>
+        <w:rPr>
+          <w:rFonts w:ascii="Consolas" w:eastAsia="Times New Roman" w:hAnsi="Consolas" w:cs="Times New Roman"/>
+          <w:color w:val="FFFFFF"/>
+          <w:sz w:val="21"/>
+          <w:szCs w:val="21"/>
+        </w:rPr>
+        <w:t>(</w:t>
+      </w:r>
+      <w:proofErr w:type="gramEnd"/>
+      <w:r>
+        <w:rPr>
+          <w:rFonts w:ascii="Consolas" w:eastAsia="Times New Roman" w:hAnsi="Consolas" w:cs="Times New Roman"/>
+          <w:color w:val="EBBBFF"/>
+          <w:sz w:val="21"/>
+          <w:szCs w:val="21"/>
+        </w:rPr>
+        <w:t>float</w:t>
+      </w:r>
+      <w:r>
+        <w:rPr>
+          <w:rFonts w:ascii="Consolas" w:eastAsia="Times New Roman" w:hAnsi="Consolas" w:cs="Times New Roman"/>
+          <w:color w:val="FFFFFF"/>
+          <w:sz w:val="21"/>
+          <w:szCs w:val="21"/>
+        </w:rPr>
+        <w:t xml:space="preserve"> </w:t>
+      </w:r>
+      <w:proofErr w:type="spellStart"/>
+      <w:r>
+        <w:rPr>
+          <w:rFonts w:ascii="Consolas" w:eastAsia="Times New Roman" w:hAnsi="Consolas" w:cs="Times New Roman"/>
+          <w:color w:val="FFC58F"/>
           <w:sz w:val="21"/>
           <w:szCs w:val="21"/>
         </w:rPr>
@@ -3481,11 +3707,11 @@
       <w:r>
         <w:rPr>
           <w:rFonts w:ascii="Consolas" w:eastAsia="Times New Roman" w:hAnsi="Consolas" w:cs="Times New Roman"/>
-          <w:color w:val="7285B7"/>
-          <w:sz w:val="21"/>
-          <w:szCs w:val="21"/>
-        </w:rPr>
-        <w:t xml:space="preserve"> multiplied by 10, then send the message.</w:t>
+          <w:color w:val="FFFFFF"/>
+          <w:sz w:val="21"/>
+          <w:szCs w:val="21"/>
+        </w:rPr>
+        <w:t>)</w:t>
       </w:r>
     </w:p>
     <w:p>
@@ -3502,78 +3728,11 @@
       <w:r>
         <w:rPr>
           <w:rFonts w:ascii="Consolas" w:eastAsia="Times New Roman" w:hAnsi="Consolas" w:cs="Times New Roman"/>
-          <w:color w:val="EBBBFF"/>
-          <w:sz w:val="21"/>
-          <w:szCs w:val="21"/>
-        </w:rPr>
-        <w:t>void</w:t>
-      </w:r>
-      <w:r>
-        <w:rPr>
-          <w:rFonts w:ascii="Consolas" w:eastAsia="Times New Roman" w:hAnsi="Consolas" w:cs="Times New Roman"/>
-          <w:color w:val="FFFFFF"/>
-          <w:sz w:val="21"/>
-          <w:szCs w:val="21"/>
-        </w:rPr>
-        <w:t xml:space="preserve"> </w:t>
-      </w:r>
-      <w:proofErr w:type="spellStart"/>
-      <w:r>
-        <w:rPr>
-          <w:rFonts w:ascii="Consolas" w:eastAsia="Times New Roman" w:hAnsi="Consolas" w:cs="Times New Roman"/>
-          <w:color w:val="BBDAFF"/>
-          <w:sz w:val="21"/>
-          <w:szCs w:val="21"/>
-        </w:rPr>
-        <w:t>can_send_temperature</w:t>
-      </w:r>
-      <w:proofErr w:type="spellEnd"/>
-      <w:r>
-        <w:rPr>
-          <w:rFonts w:ascii="Consolas" w:eastAsia="Times New Roman" w:hAnsi="Consolas" w:cs="Times New Roman"/>
-          <w:color w:val="FFFFFF"/>
-          <w:sz w:val="21"/>
-          <w:szCs w:val="21"/>
-        </w:rPr>
-        <w:t>(</w:t>
-      </w:r>
-      <w:r>
-        <w:rPr>
-          <w:rFonts w:ascii="Consolas" w:eastAsia="Times New Roman" w:hAnsi="Consolas" w:cs="Times New Roman"/>
-          <w:color w:val="EBBBFF"/>
-          <w:sz w:val="21"/>
-          <w:szCs w:val="21"/>
-        </w:rPr>
-        <w:t>float</w:t>
-      </w:r>
-      <w:r>
-        <w:rPr>
-          <w:rFonts w:ascii="Consolas" w:eastAsia="Times New Roman" w:hAnsi="Consolas" w:cs="Times New Roman"/>
-          <w:color w:val="FFFFFF"/>
-          <w:sz w:val="21"/>
-          <w:szCs w:val="21"/>
-        </w:rPr>
-        <w:t xml:space="preserve"> </w:t>
-      </w:r>
-      <w:proofErr w:type="spellStart"/>
-      <w:r>
-        <w:rPr>
-          <w:rFonts w:ascii="Consolas" w:eastAsia="Times New Roman" w:hAnsi="Consolas" w:cs="Times New Roman"/>
-          <w:color w:val="FFC58F"/>
-          <w:sz w:val="21"/>
-          <w:szCs w:val="21"/>
-        </w:rPr>
-        <w:t>temperature_c</w:t>
-      </w:r>
-      <w:proofErr w:type="spellEnd"/>
-      <w:r>
-        <w:rPr>
-          <w:rFonts w:ascii="Consolas" w:eastAsia="Times New Roman" w:hAnsi="Consolas" w:cs="Times New Roman"/>
-          <w:color w:val="FFFFFF"/>
-          <w:sz w:val="21"/>
-          <w:szCs w:val="21"/>
-        </w:rPr>
-        <w:t>)</w:t>
+          <w:color w:val="FFFFFF"/>
+          <w:sz w:val="21"/>
+          <w:szCs w:val="21"/>
+        </w:rPr>
+        <w:t>{</w:t>
       </w:r>
     </w:p>
     <w:p>
@@ -3594,7 +3753,85 @@
           <w:sz w:val="21"/>
           <w:szCs w:val="21"/>
         </w:rPr>
+        <w:t xml:space="preserve">    </w:t>
+      </w:r>
+      <w:r>
+        <w:rPr>
+          <w:rFonts w:ascii="Consolas" w:eastAsia="Times New Roman" w:hAnsi="Consolas" w:cs="Times New Roman"/>
+          <w:color w:val="FFEEAD"/>
+          <w:sz w:val="21"/>
+          <w:szCs w:val="21"/>
+        </w:rPr>
+        <w:t>MSM_</w:t>
+      </w:r>
+      <w:proofErr w:type="gramStart"/>
+      <w:r>
+        <w:rPr>
+          <w:rFonts w:ascii="Consolas" w:eastAsia="Times New Roman" w:hAnsi="Consolas" w:cs="Times New Roman"/>
+          <w:color w:val="FFEEAD"/>
+          <w:sz w:val="21"/>
+          <w:szCs w:val="21"/>
+        </w:rPr>
+        <w:t>CAN</w:t>
+      </w:r>
+      <w:r>
+        <w:rPr>
+          <w:rFonts w:ascii="Consolas" w:eastAsia="Times New Roman" w:hAnsi="Consolas" w:cs="Times New Roman"/>
+          <w:color w:val="FFFFFF"/>
+          <w:sz w:val="21"/>
+          <w:szCs w:val="21"/>
+        </w:rPr>
+        <w:t>::</w:t>
+      </w:r>
+      <w:proofErr w:type="spellStart"/>
+      <w:proofErr w:type="gramEnd"/>
+      <w:r>
+        <w:rPr>
+          <w:rFonts w:ascii="Consolas" w:eastAsia="Times New Roman" w:hAnsi="Consolas" w:cs="Times New Roman"/>
+          <w:color w:val="FFEEAD"/>
+          <w:sz w:val="21"/>
+          <w:szCs w:val="21"/>
+        </w:rPr>
+        <w:t>TxFrame</w:t>
+      </w:r>
+      <w:proofErr w:type="spellEnd"/>
+      <w:r>
+        <w:rPr>
+          <w:rFonts w:ascii="Consolas" w:eastAsia="Times New Roman" w:hAnsi="Consolas" w:cs="Times New Roman"/>
+          <w:color w:val="FFFFFF"/>
+          <w:sz w:val="21"/>
+          <w:szCs w:val="21"/>
+        </w:rPr>
+        <w:t xml:space="preserve"> </w:t>
+      </w:r>
+      <w:proofErr w:type="gramStart"/>
+      <w:r>
+        <w:rPr>
+          <w:rFonts w:ascii="Consolas" w:eastAsia="Times New Roman" w:hAnsi="Consolas" w:cs="Times New Roman"/>
+          <w:color w:val="FF9DA4"/>
+          <w:sz w:val="21"/>
+          <w:szCs w:val="21"/>
+        </w:rPr>
+        <w:t>frame</w:t>
+      </w:r>
+      <w:r>
+        <w:rPr>
+          <w:rFonts w:ascii="Consolas" w:eastAsia="Times New Roman" w:hAnsi="Consolas" w:cs="Times New Roman"/>
+          <w:color w:val="FFFFFF"/>
+          <w:sz w:val="21"/>
+          <w:szCs w:val="21"/>
+        </w:rPr>
         <w:t>{</w:t>
+      </w:r>
+      <w:proofErr w:type="gramEnd"/>
+      <w:r>
+        <w:rPr>
+          <w:rFonts w:ascii="Consolas" w:eastAsia="Times New Roman" w:hAnsi="Consolas" w:cs="Times New Roman"/>
+          <w:color w:val="FFFFFF"/>
+          <w:sz w:val="21"/>
+          <w:szCs w:val="21"/>
+        </w:rPr>
+        <w:t>};</w:t>
       </w:r>
     </w:p>
     <w:p>
@@ -3620,32 +3857,30 @@
       <w:r>
         <w:rPr>
           <w:rFonts w:ascii="Consolas" w:eastAsia="Times New Roman" w:hAnsi="Consolas" w:cs="Times New Roman"/>
-          <w:color w:val="FFEEAD"/>
-          <w:sz w:val="21"/>
-          <w:szCs w:val="21"/>
-        </w:rPr>
-        <w:t>MSM_CAN</w:t>
-      </w:r>
-      <w:r>
-        <w:rPr>
-          <w:rFonts w:ascii="Consolas" w:eastAsia="Times New Roman" w:hAnsi="Consolas" w:cs="Times New Roman"/>
-          <w:color w:val="FFFFFF"/>
-          <w:sz w:val="21"/>
-          <w:szCs w:val="21"/>
-        </w:rPr>
-        <w:t>::</w:t>
-      </w:r>
-      <w:proofErr w:type="spellStart"/>
-      <w:r>
-        <w:rPr>
-          <w:rFonts w:ascii="Consolas" w:eastAsia="Times New Roman" w:hAnsi="Consolas" w:cs="Times New Roman"/>
-          <w:color w:val="FFEEAD"/>
-          <w:sz w:val="21"/>
-          <w:szCs w:val="21"/>
-        </w:rPr>
-        <w:t>TxFrame</w:t>
-      </w:r>
-      <w:proofErr w:type="spellEnd"/>
+          <w:color w:val="FF9DA4"/>
+          <w:sz w:val="21"/>
+          <w:szCs w:val="21"/>
+        </w:rPr>
+        <w:t>frame</w:t>
+      </w:r>
+      <w:r>
+        <w:rPr>
+          <w:rFonts w:ascii="Consolas" w:eastAsia="Times New Roman" w:hAnsi="Consolas" w:cs="Times New Roman"/>
+          <w:color w:val="FFFFFF"/>
+          <w:sz w:val="21"/>
+          <w:szCs w:val="21"/>
+        </w:rPr>
+        <w:t>.</w:t>
+      </w:r>
+      <w:r>
+        <w:rPr>
+          <w:rFonts w:ascii="Consolas" w:eastAsia="Times New Roman" w:hAnsi="Consolas" w:cs="Times New Roman"/>
+          <w:color w:val="FF9DA4"/>
+          <w:sz w:val="21"/>
+          <w:szCs w:val="21"/>
+        </w:rPr>
+        <w:t>id</w:t>
+      </w:r>
       <w:r>
         <w:rPr>
           <w:rFonts w:ascii="Consolas" w:eastAsia="Times New Roman" w:hAnsi="Consolas" w:cs="Times New Roman"/>
@@ -3658,20 +3893,38 @@
       <w:r>
         <w:rPr>
           <w:rFonts w:ascii="Consolas" w:eastAsia="Times New Roman" w:hAnsi="Consolas" w:cs="Times New Roman"/>
-          <w:color w:val="FF9DA4"/>
-          <w:sz w:val="21"/>
-          <w:szCs w:val="21"/>
-        </w:rPr>
-        <w:t>frame</w:t>
-      </w:r>
-      <w:r>
-        <w:rPr>
-          <w:rFonts w:ascii="Consolas" w:eastAsia="Times New Roman" w:hAnsi="Consolas" w:cs="Times New Roman"/>
-          <w:color w:val="FFFFFF"/>
-          <w:sz w:val="21"/>
-          <w:szCs w:val="21"/>
-        </w:rPr>
-        <w:t>{};</w:t>
+          <w:color w:val="99FFFF"/>
+          <w:sz w:val="21"/>
+          <w:szCs w:val="21"/>
+        </w:rPr>
+        <w:t>=</w:t>
+      </w:r>
+      <w:r>
+        <w:rPr>
+          <w:rFonts w:ascii="Consolas" w:eastAsia="Times New Roman" w:hAnsi="Consolas" w:cs="Times New Roman"/>
+          <w:color w:val="FFFFFF"/>
+          <w:sz w:val="21"/>
+          <w:szCs w:val="21"/>
+        </w:rPr>
+        <w:t xml:space="preserve"> </w:t>
+      </w:r>
+      <w:r>
+        <w:rPr>
+          <w:rFonts w:ascii="Consolas" w:eastAsia="Times New Roman" w:hAnsi="Consolas" w:cs="Times New Roman"/>
+          <w:color w:val="FFC58F"/>
+          <w:sz w:val="21"/>
+          <w:szCs w:val="21"/>
+        </w:rPr>
+        <w:t>0x600</w:t>
+      </w:r>
+      <w:r>
+        <w:rPr>
+          <w:rFonts w:ascii="Consolas" w:eastAsia="Times New Roman" w:hAnsi="Consolas" w:cs="Times New Roman"/>
+          <w:color w:val="FFFFFF"/>
+          <w:sz w:val="21"/>
+          <w:szCs w:val="21"/>
+        </w:rPr>
+        <w:t>;</w:t>
       </w:r>
     </w:p>
     <w:p>
@@ -3694,6 +3947,8 @@
         </w:rPr>
         <w:t xml:space="preserve">    </w:t>
       </w:r>
+      <w:proofErr w:type="spellStart"/>
+      <w:proofErr w:type="gramStart"/>
       <w:r>
         <w:rPr>
           <w:rFonts w:ascii="Consolas" w:eastAsia="Times New Roman" w:hAnsi="Consolas" w:cs="Times New Roman"/>
@@ -3719,8 +3974,10 @@
           <w:sz w:val="21"/>
           <w:szCs w:val="21"/>
         </w:rPr>
-        <w:t>id</w:t>
-      </w:r>
+        <w:t>length</w:t>
+      </w:r>
+      <w:proofErr w:type="spellEnd"/>
+      <w:proofErr w:type="gramEnd"/>
       <w:r>
         <w:rPr>
           <w:rFonts w:ascii="Consolas" w:eastAsia="Times New Roman" w:hAnsi="Consolas" w:cs="Times New Roman"/>
@@ -3755,7 +4012,7 @@
           <w:sz w:val="21"/>
           <w:szCs w:val="21"/>
         </w:rPr>
-        <w:t>0x600</w:t>
+        <w:t>2</w:t>
       </w:r>
       <w:r>
         <w:rPr>
@@ -3778,89 +4035,6 @@
           <w:szCs w:val="21"/>
         </w:rPr>
       </w:pPr>
-      <w:r>
-        <w:rPr>
-          <w:rFonts w:ascii="Consolas" w:eastAsia="Times New Roman" w:hAnsi="Consolas" w:cs="Times New Roman"/>
-          <w:color w:val="FFFFFF"/>
-          <w:sz w:val="21"/>
-          <w:szCs w:val="21"/>
-        </w:rPr>
-        <w:t xml:space="preserve">    </w:t>
-      </w:r>
-      <w:proofErr w:type="spellStart"/>
-      <w:r>
-        <w:rPr>
-          <w:rFonts w:ascii="Consolas" w:eastAsia="Times New Roman" w:hAnsi="Consolas" w:cs="Times New Roman"/>
-          <w:color w:val="FF9DA4"/>
-          <w:sz w:val="21"/>
-          <w:szCs w:val="21"/>
-        </w:rPr>
-        <w:t>frame</w:t>
-      </w:r>
-      <w:r>
-        <w:rPr>
-          <w:rFonts w:ascii="Consolas" w:eastAsia="Times New Roman" w:hAnsi="Consolas" w:cs="Times New Roman"/>
-          <w:color w:val="FFFFFF"/>
-          <w:sz w:val="21"/>
-          <w:szCs w:val="21"/>
-        </w:rPr>
-        <w:t>.</w:t>
-      </w:r>
-      <w:r>
-        <w:rPr>
-          <w:rFonts w:ascii="Consolas" w:eastAsia="Times New Roman" w:hAnsi="Consolas" w:cs="Times New Roman"/>
-          <w:color w:val="FF9DA4"/>
-          <w:sz w:val="21"/>
-          <w:szCs w:val="21"/>
-        </w:rPr>
-        <w:t>length</w:t>
-      </w:r>
-      <w:proofErr w:type="spellEnd"/>
-      <w:r>
-        <w:rPr>
-          <w:rFonts w:ascii="Consolas" w:eastAsia="Times New Roman" w:hAnsi="Consolas" w:cs="Times New Roman"/>
-          <w:color w:val="FFFFFF"/>
-          <w:sz w:val="21"/>
-          <w:szCs w:val="21"/>
-        </w:rPr>
-        <w:t xml:space="preserve"> </w:t>
-      </w:r>
-      <w:r>
-        <w:rPr>
-          <w:rFonts w:ascii="Consolas" w:eastAsia="Times New Roman" w:hAnsi="Consolas" w:cs="Times New Roman"/>
-          <w:color w:val="99FFFF"/>
-          <w:sz w:val="21"/>
-          <w:szCs w:val="21"/>
-        </w:rPr>
-        <w:t>=</w:t>
-      </w:r>
-      <w:r>
-        <w:rPr>
-          <w:rFonts w:ascii="Consolas" w:eastAsia="Times New Roman" w:hAnsi="Consolas" w:cs="Times New Roman"/>
-          <w:color w:val="FFFFFF"/>
-          <w:sz w:val="21"/>
-          <w:szCs w:val="21"/>
-        </w:rPr>
-        <w:t xml:space="preserve"> </w:t>
-      </w:r>
-      <w:r>
-        <w:rPr>
-          <w:rFonts w:ascii="Consolas" w:eastAsia="Times New Roman" w:hAnsi="Consolas" w:cs="Times New Roman"/>
-          <w:color w:val="FFC58F"/>
-          <w:sz w:val="21"/>
-          <w:szCs w:val="21"/>
-        </w:rPr>
-        <w:t>2</w:t>
-      </w:r>
-      <w:r>
-        <w:rPr>
-          <w:rFonts w:ascii="Consolas" w:eastAsia="Times New Roman" w:hAnsi="Consolas" w:cs="Times New Roman"/>
-          <w:color w:val="FFFFFF"/>
-          <w:sz w:val="21"/>
-          <w:szCs w:val="21"/>
-        </w:rPr>
-        <w:t>;</w:t>
-      </w:r>
     </w:p>
     <w:p>
       <w:pPr>
@@ -3876,11 +4050,11 @@
       <w:r>
         <w:rPr>
           <w:rFonts w:ascii="Consolas" w:eastAsia="Times New Roman" w:hAnsi="Consolas" w:cs="Times New Roman"/>
-          <w:color w:val="FFFFFF"/>
-          <w:sz w:val="21"/>
-          <w:szCs w:val="21"/>
-        </w:rPr>
-        <w:t xml:space="preserve">    </w:t>
+          <w:color w:val="7285B7"/>
+          <w:sz w:val="21"/>
+          <w:szCs w:val="21"/>
+        </w:rPr>
+        <w:t>    //Error checking to ensure results out of range are not sent</w:t>
       </w:r>
     </w:p>
     <w:p>
@@ -3897,17 +4071,35 @@
       <w:r>
         <w:rPr>
           <w:rFonts w:ascii="Consolas" w:eastAsia="Times New Roman" w:hAnsi="Consolas" w:cs="Times New Roman"/>
-          <w:color w:val="7285B7"/>
-          <w:sz w:val="21"/>
-          <w:szCs w:val="21"/>
-        </w:rPr>
-        <w:t xml:space="preserve">    //integer 10x value of </w:t>
+          <w:color w:val="FFFFFF"/>
+          <w:sz w:val="21"/>
+          <w:szCs w:val="21"/>
+        </w:rPr>
+        <w:t xml:space="preserve">    </w:t>
+      </w:r>
+      <w:r>
+        <w:rPr>
+          <w:rFonts w:ascii="Consolas" w:eastAsia="Times New Roman" w:hAnsi="Consolas" w:cs="Times New Roman"/>
+          <w:color w:val="EBBBFF"/>
+          <w:sz w:val="21"/>
+          <w:szCs w:val="21"/>
+        </w:rPr>
+        <w:t>if</w:t>
+      </w:r>
+      <w:r>
+        <w:rPr>
+          <w:rFonts w:ascii="Consolas" w:eastAsia="Times New Roman" w:hAnsi="Consolas" w:cs="Times New Roman"/>
+          <w:color w:val="FFFFFF"/>
+          <w:sz w:val="21"/>
+          <w:szCs w:val="21"/>
+        </w:rPr>
+        <w:t xml:space="preserve"> ((</w:t>
       </w:r>
       <w:proofErr w:type="spellStart"/>
       <w:r>
         <w:rPr>
           <w:rFonts w:ascii="Consolas" w:eastAsia="Times New Roman" w:hAnsi="Consolas" w:cs="Times New Roman"/>
-          <w:color w:val="7285B7"/>
+          <w:color w:val="FFC58F"/>
           <w:sz w:val="21"/>
           <w:szCs w:val="21"/>
         </w:rPr>
@@ -3917,11 +4109,121 @@
       <w:r>
         <w:rPr>
           <w:rFonts w:ascii="Consolas" w:eastAsia="Times New Roman" w:hAnsi="Consolas" w:cs="Times New Roman"/>
-          <w:color w:val="7285B7"/>
-          <w:sz w:val="21"/>
-          <w:szCs w:val="21"/>
-        </w:rPr>
-        <w:t>, will always round down at 1dp (25.19 -&gt; 251), level of precision is acceptable.</w:t>
+          <w:color w:val="FFFFFF"/>
+          <w:sz w:val="21"/>
+          <w:szCs w:val="21"/>
+        </w:rPr>
+        <w:t xml:space="preserve"> </w:t>
+      </w:r>
+      <w:r>
+        <w:rPr>
+          <w:rFonts w:ascii="Consolas" w:eastAsia="Times New Roman" w:hAnsi="Consolas" w:cs="Times New Roman"/>
+          <w:color w:val="99FFFF"/>
+          <w:sz w:val="21"/>
+          <w:szCs w:val="21"/>
+        </w:rPr>
+        <w:t>&lt;</w:t>
+      </w:r>
+      <w:r>
+        <w:rPr>
+          <w:rFonts w:ascii="Consolas" w:eastAsia="Times New Roman" w:hAnsi="Consolas" w:cs="Times New Roman"/>
+          <w:color w:val="FFFFFF"/>
+          <w:sz w:val="21"/>
+          <w:szCs w:val="21"/>
+        </w:rPr>
+        <w:t xml:space="preserve"> </w:t>
+      </w:r>
+      <w:r>
+        <w:rPr>
+          <w:rFonts w:ascii="Consolas" w:eastAsia="Times New Roman" w:hAnsi="Consolas" w:cs="Times New Roman"/>
+          <w:color w:val="FFC58F"/>
+          <w:sz w:val="21"/>
+          <w:szCs w:val="21"/>
+        </w:rPr>
+        <w:t>0.0</w:t>
+      </w:r>
+      <w:r>
+        <w:rPr>
+          <w:rFonts w:ascii="Consolas" w:eastAsia="Times New Roman" w:hAnsi="Consolas" w:cs="Times New Roman"/>
+          <w:color w:val="FFFFFF"/>
+          <w:sz w:val="21"/>
+          <w:szCs w:val="21"/>
+        </w:rPr>
+        <w:t xml:space="preserve">) </w:t>
+      </w:r>
+      <w:r>
+        <w:rPr>
+          <w:rFonts w:ascii="Consolas" w:eastAsia="Times New Roman" w:hAnsi="Consolas" w:cs="Times New Roman"/>
+          <w:color w:val="99FFFF"/>
+          <w:sz w:val="21"/>
+          <w:szCs w:val="21"/>
+        </w:rPr>
+        <w:t>||</w:t>
+      </w:r>
+      <w:r>
+        <w:rPr>
+          <w:rFonts w:ascii="Consolas" w:eastAsia="Times New Roman" w:hAnsi="Consolas" w:cs="Times New Roman"/>
+          <w:color w:val="FFFFFF"/>
+          <w:sz w:val="21"/>
+          <w:szCs w:val="21"/>
+        </w:rPr>
+        <w:t xml:space="preserve"> (</w:t>
+      </w:r>
+      <w:proofErr w:type="spellStart"/>
+      <w:r>
+        <w:rPr>
+          <w:rFonts w:ascii="Consolas" w:eastAsia="Times New Roman" w:hAnsi="Consolas" w:cs="Times New Roman"/>
+          <w:color w:val="FFC58F"/>
+          <w:sz w:val="21"/>
+          <w:szCs w:val="21"/>
+        </w:rPr>
+        <w:t>temperature_c</w:t>
+      </w:r>
+      <w:proofErr w:type="spellEnd"/>
+      <w:r>
+        <w:rPr>
+          <w:rFonts w:ascii="Consolas" w:eastAsia="Times New Roman" w:hAnsi="Consolas" w:cs="Times New Roman"/>
+          <w:color w:val="FFFFFF"/>
+          <w:sz w:val="21"/>
+          <w:szCs w:val="21"/>
+        </w:rPr>
+        <w:t xml:space="preserve"> </w:t>
+      </w:r>
+      <w:r>
+        <w:rPr>
+          <w:rFonts w:ascii="Consolas" w:eastAsia="Times New Roman" w:hAnsi="Consolas" w:cs="Times New Roman"/>
+          <w:color w:val="99FFFF"/>
+          <w:sz w:val="21"/>
+          <w:szCs w:val="21"/>
+        </w:rPr>
+        <w:t>&gt;</w:t>
+      </w:r>
+      <w:r>
+        <w:rPr>
+          <w:rFonts w:ascii="Consolas" w:eastAsia="Times New Roman" w:hAnsi="Consolas" w:cs="Times New Roman"/>
+          <w:color w:val="FFFFFF"/>
+          <w:sz w:val="21"/>
+          <w:szCs w:val="21"/>
+        </w:rPr>
+        <w:t xml:space="preserve"> </w:t>
+      </w:r>
+      <w:r>
+        <w:rPr>
+          <w:rFonts w:ascii="Consolas" w:eastAsia="Times New Roman" w:hAnsi="Consolas" w:cs="Times New Roman"/>
+          <w:color w:val="FFC58F"/>
+          <w:sz w:val="21"/>
+          <w:szCs w:val="21"/>
+        </w:rPr>
+        <w:t>100.0</w:t>
+      </w:r>
+      <w:r>
+        <w:rPr>
+          <w:rFonts w:ascii="Consolas" w:eastAsia="Times New Roman" w:hAnsi="Consolas" w:cs="Times New Roman"/>
+          <w:color w:val="FFFFFF"/>
+          <w:sz w:val="21"/>
+          <w:szCs w:val="21"/>
+        </w:rPr>
+        <w:t>)) {</w:t>
       </w:r>
     </w:p>
     <w:p>
@@ -3938,121 +4240,11 @@
       <w:r>
         <w:rPr>
           <w:rFonts w:ascii="Consolas" w:eastAsia="Times New Roman" w:hAnsi="Consolas" w:cs="Times New Roman"/>
-          <w:color w:val="FFFFFF"/>
-          <w:sz w:val="21"/>
-          <w:szCs w:val="21"/>
-        </w:rPr>
-        <w:t xml:space="preserve">    </w:t>
-      </w:r>
-      <w:r>
-        <w:rPr>
-          <w:rFonts w:ascii="Consolas" w:eastAsia="Times New Roman" w:hAnsi="Consolas" w:cs="Times New Roman"/>
-          <w:color w:val="FFEEAD"/>
-          <w:sz w:val="21"/>
-          <w:szCs w:val="21"/>
-        </w:rPr>
-        <w:t>int16_t</w:t>
-      </w:r>
-      <w:r>
-        <w:rPr>
-          <w:rFonts w:ascii="Consolas" w:eastAsia="Times New Roman" w:hAnsi="Consolas" w:cs="Times New Roman"/>
-          <w:color w:val="FFFFFF"/>
-          <w:sz w:val="21"/>
-          <w:szCs w:val="21"/>
-        </w:rPr>
-        <w:t xml:space="preserve"> </w:t>
-      </w:r>
-      <w:r>
-        <w:rPr>
-          <w:rFonts w:ascii="Consolas" w:eastAsia="Times New Roman" w:hAnsi="Consolas" w:cs="Times New Roman"/>
-          <w:color w:val="FF9DA4"/>
-          <w:sz w:val="21"/>
-          <w:szCs w:val="21"/>
-        </w:rPr>
-        <w:t>temperature_10x</w:t>
-      </w:r>
-      <w:r>
-        <w:rPr>
-          <w:rFonts w:ascii="Consolas" w:eastAsia="Times New Roman" w:hAnsi="Consolas" w:cs="Times New Roman"/>
-          <w:color w:val="FFFFFF"/>
-          <w:sz w:val="21"/>
-          <w:szCs w:val="21"/>
-        </w:rPr>
-        <w:t xml:space="preserve"> </w:t>
-      </w:r>
-      <w:r>
-        <w:rPr>
-          <w:rFonts w:ascii="Consolas" w:eastAsia="Times New Roman" w:hAnsi="Consolas" w:cs="Times New Roman"/>
-          <w:color w:val="99FFFF"/>
-          <w:sz w:val="21"/>
-          <w:szCs w:val="21"/>
-        </w:rPr>
-        <w:t>=</w:t>
-      </w:r>
-      <w:r>
-        <w:rPr>
-          <w:rFonts w:ascii="Consolas" w:eastAsia="Times New Roman" w:hAnsi="Consolas" w:cs="Times New Roman"/>
-          <w:color w:val="FFFFFF"/>
-          <w:sz w:val="21"/>
-          <w:szCs w:val="21"/>
-        </w:rPr>
-        <w:t xml:space="preserve"> </w:t>
-      </w:r>
-      <w:proofErr w:type="spellStart"/>
-      <w:r>
-        <w:rPr>
-          <w:rFonts w:ascii="Consolas" w:eastAsia="Times New Roman" w:hAnsi="Consolas" w:cs="Times New Roman"/>
-          <w:color w:val="FFC58F"/>
-          <w:sz w:val="21"/>
-          <w:szCs w:val="21"/>
-        </w:rPr>
-        <w:t>temperature_c</w:t>
-      </w:r>
-      <w:proofErr w:type="spellEnd"/>
-      <w:r>
-        <w:rPr>
-          <w:rFonts w:ascii="Consolas" w:eastAsia="Times New Roman" w:hAnsi="Consolas" w:cs="Times New Roman"/>
-          <w:color w:val="FFFFFF"/>
-          <w:sz w:val="21"/>
-          <w:szCs w:val="21"/>
-        </w:rPr>
-        <w:t xml:space="preserve"> </w:t>
-      </w:r>
-      <w:r>
-        <w:rPr>
-          <w:rFonts w:ascii="Consolas" w:eastAsia="Times New Roman" w:hAnsi="Consolas" w:cs="Times New Roman"/>
-          <w:color w:val="99FFFF"/>
-          <w:sz w:val="21"/>
-          <w:szCs w:val="21"/>
-        </w:rPr>
-        <w:t>*</w:t>
-      </w:r>
-      <w:r>
-        <w:rPr>
-          <w:rFonts w:ascii="Consolas" w:eastAsia="Times New Roman" w:hAnsi="Consolas" w:cs="Times New Roman"/>
-          <w:color w:val="FFFFFF"/>
-          <w:sz w:val="21"/>
-          <w:szCs w:val="21"/>
-        </w:rPr>
-        <w:t xml:space="preserve"> </w:t>
-      </w:r>
-      <w:r>
-        <w:rPr>
-          <w:rFonts w:ascii="Consolas" w:eastAsia="Times New Roman" w:hAnsi="Consolas" w:cs="Times New Roman"/>
-          <w:color w:val="FFC58F"/>
-          <w:sz w:val="21"/>
-          <w:szCs w:val="21"/>
-        </w:rPr>
-        <w:t>10</w:t>
-      </w:r>
-      <w:r>
-        <w:rPr>
-          <w:rFonts w:ascii="Consolas" w:eastAsia="Times New Roman" w:hAnsi="Consolas" w:cs="Times New Roman"/>
-          <w:color w:val="FFFFFF"/>
-          <w:sz w:val="21"/>
-          <w:szCs w:val="21"/>
-        </w:rPr>
-        <w:t>;</w:t>
+          <w:color w:val="7285B7"/>
+          <w:sz w:val="21"/>
+          <w:szCs w:val="21"/>
+        </w:rPr>
+        <w:t>        //Code to send an SCS error here</w:t>
       </w:r>
     </w:p>
     <w:p>
@@ -4069,11 +4261,11 @@
       <w:r>
         <w:rPr>
           <w:rFonts w:ascii="Consolas" w:eastAsia="Times New Roman" w:hAnsi="Consolas" w:cs="Times New Roman"/>
-          <w:color w:val="7285B7"/>
-          <w:sz w:val="21"/>
-          <w:szCs w:val="21"/>
-        </w:rPr>
-        <w:t>    //Convert to 16 bit signed, split into 2 bytes for payload prep. Frame uses unsigned int, convert signed directly and CAN will change it back?</w:t>
+          <w:color w:val="FFFFFF"/>
+          <w:sz w:val="21"/>
+          <w:szCs w:val="21"/>
+        </w:rPr>
+        <w:t>    }</w:t>
       </w:r>
     </w:p>
     <w:p>
@@ -4087,6 +4279,15 @@
           <w:szCs w:val="21"/>
         </w:rPr>
       </w:pPr>
+      <w:r>
+        <w:rPr>
+          <w:rFonts w:ascii="Consolas" w:eastAsia="Times New Roman" w:hAnsi="Consolas" w:cs="Times New Roman"/>
+          <w:color w:val="FFFFFF"/>
+          <w:sz w:val="21"/>
+          <w:szCs w:val="21"/>
+        </w:rPr>
+        <w:t xml:space="preserve">    </w:t>
+      </w:r>
     </w:p>
     <w:p>
       <w:pPr>
@@ -4106,7 +4307,27 @@
           <w:sz w:val="21"/>
           <w:szCs w:val="21"/>
         </w:rPr>
-        <w:t>    //Packing helper for int16_t -&gt; uint8_t (from MSM_CAN.hpp):</w:t>
+        <w:t xml:space="preserve">    //integer 10x value of </w:t>
+      </w:r>
+      <w:proofErr w:type="spellStart"/>
+      <w:r>
+        <w:rPr>
+          <w:rFonts w:ascii="Consolas" w:eastAsia="Times New Roman" w:hAnsi="Consolas" w:cs="Times New Roman"/>
+          <w:color w:val="7285B7"/>
+          <w:sz w:val="21"/>
+          <w:szCs w:val="21"/>
+        </w:rPr>
+        <w:t>temperature_c</w:t>
+      </w:r>
+      <w:proofErr w:type="spellEnd"/>
+      <w:r>
+        <w:rPr>
+          <w:rFonts w:ascii="Consolas" w:eastAsia="Times New Roman" w:hAnsi="Consolas" w:cs="Times New Roman"/>
+          <w:color w:val="7285B7"/>
+          <w:sz w:val="21"/>
+          <w:szCs w:val="21"/>
+        </w:rPr>
+        <w:t>, will always round down at 1dp (25.19 -&gt; 251), level of precision is acceptable.</w:t>
       </w:r>
     </w:p>
     <w:p>
@@ -4123,11 +4344,121 @@
       <w:r>
         <w:rPr>
           <w:rFonts w:ascii="Consolas" w:eastAsia="Times New Roman" w:hAnsi="Consolas" w:cs="Times New Roman"/>
-          <w:color w:val="7285B7"/>
-          <w:sz w:val="21"/>
-          <w:szCs w:val="21"/>
-        </w:rPr>
-        <w:t>    //inline void pack_i16(uint8_t data[8], uint8_t index, int16_t value)                 //helper function to pack uint8_t data[8] with a big-endian encoded int16_t</w:t>
+          <w:color w:val="FFFFFF"/>
+          <w:sz w:val="21"/>
+          <w:szCs w:val="21"/>
+        </w:rPr>
+        <w:t xml:space="preserve">    </w:t>
+      </w:r>
+      <w:r>
+        <w:rPr>
+          <w:rFonts w:ascii="Consolas" w:eastAsia="Times New Roman" w:hAnsi="Consolas" w:cs="Times New Roman"/>
+          <w:color w:val="FFEEAD"/>
+          <w:sz w:val="21"/>
+          <w:szCs w:val="21"/>
+        </w:rPr>
+        <w:t>int16_t</w:t>
+      </w:r>
+      <w:r>
+        <w:rPr>
+          <w:rFonts w:ascii="Consolas" w:eastAsia="Times New Roman" w:hAnsi="Consolas" w:cs="Times New Roman"/>
+          <w:color w:val="FFFFFF"/>
+          <w:sz w:val="21"/>
+          <w:szCs w:val="21"/>
+        </w:rPr>
+        <w:t xml:space="preserve"> </w:t>
+      </w:r>
+      <w:r>
+        <w:rPr>
+          <w:rFonts w:ascii="Consolas" w:eastAsia="Times New Roman" w:hAnsi="Consolas" w:cs="Times New Roman"/>
+          <w:color w:val="FF9DA4"/>
+          <w:sz w:val="21"/>
+          <w:szCs w:val="21"/>
+        </w:rPr>
+        <w:t>temperature_10x</w:t>
+      </w:r>
+      <w:r>
+        <w:rPr>
+          <w:rFonts w:ascii="Consolas" w:eastAsia="Times New Roman" w:hAnsi="Consolas" w:cs="Times New Roman"/>
+          <w:color w:val="FFFFFF"/>
+          <w:sz w:val="21"/>
+          <w:szCs w:val="21"/>
+        </w:rPr>
+        <w:t xml:space="preserve"> </w:t>
+      </w:r>
+      <w:r>
+        <w:rPr>
+          <w:rFonts w:ascii="Consolas" w:eastAsia="Times New Roman" w:hAnsi="Consolas" w:cs="Times New Roman"/>
+          <w:color w:val="99FFFF"/>
+          <w:sz w:val="21"/>
+          <w:szCs w:val="21"/>
+        </w:rPr>
+        <w:t>=</w:t>
+      </w:r>
+      <w:r>
+        <w:rPr>
+          <w:rFonts w:ascii="Consolas" w:eastAsia="Times New Roman" w:hAnsi="Consolas" w:cs="Times New Roman"/>
+          <w:color w:val="FFFFFF"/>
+          <w:sz w:val="21"/>
+          <w:szCs w:val="21"/>
+        </w:rPr>
+        <w:t xml:space="preserve"> </w:t>
+      </w:r>
+      <w:proofErr w:type="spellStart"/>
+      <w:r>
+        <w:rPr>
+          <w:rFonts w:ascii="Consolas" w:eastAsia="Times New Roman" w:hAnsi="Consolas" w:cs="Times New Roman"/>
+          <w:color w:val="FFC58F"/>
+          <w:sz w:val="21"/>
+          <w:szCs w:val="21"/>
+        </w:rPr>
+        <w:t>temperature_c</w:t>
+      </w:r>
+      <w:proofErr w:type="spellEnd"/>
+      <w:r>
+        <w:rPr>
+          <w:rFonts w:ascii="Consolas" w:eastAsia="Times New Roman" w:hAnsi="Consolas" w:cs="Times New Roman"/>
+          <w:color w:val="FFFFFF"/>
+          <w:sz w:val="21"/>
+          <w:szCs w:val="21"/>
+        </w:rPr>
+        <w:t xml:space="preserve"> </w:t>
+      </w:r>
+      <w:r>
+        <w:rPr>
+          <w:rFonts w:ascii="Consolas" w:eastAsia="Times New Roman" w:hAnsi="Consolas" w:cs="Times New Roman"/>
+          <w:color w:val="99FFFF"/>
+          <w:sz w:val="21"/>
+          <w:szCs w:val="21"/>
+        </w:rPr>
+        <w:t>*</w:t>
+      </w:r>
+      <w:r>
+        <w:rPr>
+          <w:rFonts w:ascii="Consolas" w:eastAsia="Times New Roman" w:hAnsi="Consolas" w:cs="Times New Roman"/>
+          <w:color w:val="FFFFFF"/>
+          <w:sz w:val="21"/>
+          <w:szCs w:val="21"/>
+        </w:rPr>
+        <w:t xml:space="preserve"> </w:t>
+      </w:r>
+      <w:r>
+        <w:rPr>
+          <w:rFonts w:ascii="Consolas" w:eastAsia="Times New Roman" w:hAnsi="Consolas" w:cs="Times New Roman"/>
+          <w:color w:val="FFC58F"/>
+          <w:sz w:val="21"/>
+          <w:szCs w:val="21"/>
+        </w:rPr>
+        <w:t>10</w:t>
+      </w:r>
+      <w:r>
+        <w:rPr>
+          <w:rFonts w:ascii="Consolas" w:eastAsia="Times New Roman" w:hAnsi="Consolas" w:cs="Times New Roman"/>
+          <w:color w:val="FFFFFF"/>
+          <w:sz w:val="21"/>
+          <w:szCs w:val="21"/>
+        </w:rPr>
+        <w:t>;</w:t>
       </w:r>
     </w:p>
     <w:p>
@@ -4148,7 +4479,27 @@
           <w:sz w:val="21"/>
           <w:szCs w:val="21"/>
         </w:rPr>
-        <w:t>    //{</w:t>
+        <w:t xml:space="preserve">    //Convert to 16 </w:t>
+      </w:r>
+      <w:proofErr w:type="gramStart"/>
+      <w:r>
+        <w:rPr>
+          <w:rFonts w:ascii="Consolas" w:eastAsia="Times New Roman" w:hAnsi="Consolas" w:cs="Times New Roman"/>
+          <w:color w:val="7285B7"/>
+          <w:sz w:val="21"/>
+          <w:szCs w:val="21"/>
+        </w:rPr>
+        <w:t>bit</w:t>
+      </w:r>
+      <w:proofErr w:type="gramEnd"/>
+      <w:r>
+        <w:rPr>
+          <w:rFonts w:ascii="Consolas" w:eastAsia="Times New Roman" w:hAnsi="Consolas" w:cs="Times New Roman"/>
+          <w:color w:val="7285B7"/>
+          <w:sz w:val="21"/>
+          <w:szCs w:val="21"/>
+        </w:rPr>
+        <w:t xml:space="preserve"> signed, split into 2 bytes for payload prep. Frame uses unsigned int, convert signed directly and CAN will change it back?</w:t>
       </w:r>
     </w:p>
     <w:p>
@@ -4162,35 +4513,6 @@
           <w:szCs w:val="21"/>
         </w:rPr>
       </w:pPr>
-      <w:r>
-        <w:rPr>
-          <w:rFonts w:ascii="Consolas" w:eastAsia="Times New Roman" w:hAnsi="Consolas" w:cs="Times New Roman"/>
-          <w:color w:val="7285B7"/>
-          <w:sz w:val="21"/>
-          <w:szCs w:val="21"/>
-        </w:rPr>
-        <w:t xml:space="preserve">    //    pack_u16(data, index, </w:t>
-      </w:r>
-      <w:proofErr w:type="spellStart"/>
-      <w:r>
-        <w:rPr>
-          <w:rFonts w:ascii="Consolas" w:eastAsia="Times New Roman" w:hAnsi="Consolas" w:cs="Times New Roman"/>
-          <w:color w:val="7285B7"/>
-          <w:sz w:val="21"/>
-          <w:szCs w:val="21"/>
-        </w:rPr>
-        <w:t>static_cast</w:t>
-      </w:r>
-      <w:proofErr w:type="spellEnd"/>
-      <w:r>
-        <w:rPr>
-          <w:rFonts w:ascii="Consolas" w:eastAsia="Times New Roman" w:hAnsi="Consolas" w:cs="Times New Roman"/>
-          <w:color w:val="7285B7"/>
-          <w:sz w:val="21"/>
-          <w:szCs w:val="21"/>
-        </w:rPr>
-        <w:t>&lt;uint16_t&gt;(value));</w:t>
-      </w:r>
     </w:p>
     <w:p>
       <w:pPr>
@@ -4210,7 +4532,7 @@
           <w:sz w:val="21"/>
           <w:szCs w:val="21"/>
         </w:rPr>
-        <w:t>    //}</w:t>
+        <w:t>    //Packing helper for int16_t -&gt; uint8_t (from MSM_CAN.hpp):</w:t>
       </w:r>
     </w:p>
     <w:p>
@@ -4227,121 +4549,31 @@
       <w:r>
         <w:rPr>
           <w:rFonts w:ascii="Consolas" w:eastAsia="Times New Roman" w:hAnsi="Consolas" w:cs="Times New Roman"/>
-          <w:color w:val="FFFFFF"/>
-          <w:sz w:val="21"/>
-          <w:szCs w:val="21"/>
-        </w:rPr>
-        <w:t xml:space="preserve">    </w:t>
-      </w:r>
-      <w:r>
-        <w:rPr>
-          <w:rFonts w:ascii="Consolas" w:eastAsia="Times New Roman" w:hAnsi="Consolas" w:cs="Times New Roman"/>
-          <w:color w:val="FFEEAD"/>
-          <w:sz w:val="21"/>
-          <w:szCs w:val="21"/>
-        </w:rPr>
-        <w:t>MSM_CAN</w:t>
-      </w:r>
-      <w:r>
-        <w:rPr>
-          <w:rFonts w:ascii="Consolas" w:eastAsia="Times New Roman" w:hAnsi="Consolas" w:cs="Times New Roman"/>
-          <w:color w:val="FFFFFF"/>
-          <w:sz w:val="21"/>
-          <w:szCs w:val="21"/>
-        </w:rPr>
-        <w:t>::</w:t>
-      </w:r>
-      <w:r>
-        <w:rPr>
-          <w:rFonts w:ascii="Consolas" w:eastAsia="Times New Roman" w:hAnsi="Consolas" w:cs="Times New Roman"/>
-          <w:color w:val="BBDAFF"/>
-          <w:sz w:val="21"/>
-          <w:szCs w:val="21"/>
-        </w:rPr>
-        <w:t>pack_i16</w:t>
-      </w:r>
-      <w:r>
-        <w:rPr>
-          <w:rFonts w:ascii="Consolas" w:eastAsia="Times New Roman" w:hAnsi="Consolas" w:cs="Times New Roman"/>
-          <w:color w:val="FFFFFF"/>
-          <w:sz w:val="21"/>
-          <w:szCs w:val="21"/>
-        </w:rPr>
-        <w:t>(</w:t>
-      </w:r>
-      <w:proofErr w:type="spellStart"/>
-      <w:r>
-        <w:rPr>
-          <w:rFonts w:ascii="Consolas" w:eastAsia="Times New Roman" w:hAnsi="Consolas" w:cs="Times New Roman"/>
-          <w:color w:val="FF9DA4"/>
-          <w:sz w:val="21"/>
-          <w:szCs w:val="21"/>
-        </w:rPr>
-        <w:t>frame</w:t>
-      </w:r>
-      <w:r>
-        <w:rPr>
-          <w:rFonts w:ascii="Consolas" w:eastAsia="Times New Roman" w:hAnsi="Consolas" w:cs="Times New Roman"/>
-          <w:color w:val="FFFFFF"/>
-          <w:sz w:val="21"/>
-          <w:szCs w:val="21"/>
-        </w:rPr>
-        <w:t>.</w:t>
-      </w:r>
-      <w:r>
-        <w:rPr>
-          <w:rFonts w:ascii="Consolas" w:eastAsia="Times New Roman" w:hAnsi="Consolas" w:cs="Times New Roman"/>
-          <w:color w:val="FF9DA4"/>
-          <w:sz w:val="21"/>
-          <w:szCs w:val="21"/>
-        </w:rPr>
-        <w:t>data</w:t>
-      </w:r>
-      <w:proofErr w:type="spellEnd"/>
-      <w:r>
-        <w:rPr>
-          <w:rFonts w:ascii="Consolas" w:eastAsia="Times New Roman" w:hAnsi="Consolas" w:cs="Times New Roman"/>
-          <w:color w:val="FFFFFF"/>
-          <w:sz w:val="21"/>
-          <w:szCs w:val="21"/>
-        </w:rPr>
-        <w:t xml:space="preserve">, </w:t>
-      </w:r>
-      <w:r>
-        <w:rPr>
-          <w:rFonts w:ascii="Consolas" w:eastAsia="Times New Roman" w:hAnsi="Consolas" w:cs="Times New Roman"/>
-          <w:color w:val="FFC58F"/>
-          <w:sz w:val="21"/>
-          <w:szCs w:val="21"/>
-        </w:rPr>
-        <w:t>1</w:t>
-      </w:r>
-      <w:r>
-        <w:rPr>
-          <w:rFonts w:ascii="Consolas" w:eastAsia="Times New Roman" w:hAnsi="Consolas" w:cs="Times New Roman"/>
-          <w:color w:val="FFFFFF"/>
-          <w:sz w:val="21"/>
-          <w:szCs w:val="21"/>
-        </w:rPr>
-        <w:t xml:space="preserve">, </w:t>
-      </w:r>
-      <w:r>
-        <w:rPr>
-          <w:rFonts w:ascii="Consolas" w:eastAsia="Times New Roman" w:hAnsi="Consolas" w:cs="Times New Roman"/>
-          <w:color w:val="FF9DA4"/>
-          <w:sz w:val="21"/>
-          <w:szCs w:val="21"/>
-        </w:rPr>
-        <w:t>temperature_10x</w:t>
-      </w:r>
-      <w:r>
-        <w:rPr>
-          <w:rFonts w:ascii="Consolas" w:eastAsia="Times New Roman" w:hAnsi="Consolas" w:cs="Times New Roman"/>
-          <w:color w:val="FFFFFF"/>
-          <w:sz w:val="21"/>
-          <w:szCs w:val="21"/>
-        </w:rPr>
-        <w:t>);</w:t>
+          <w:color w:val="7285B7"/>
+          <w:sz w:val="21"/>
+          <w:szCs w:val="21"/>
+        </w:rPr>
+        <w:t xml:space="preserve">    //inline void pack_i16(uint8_t </w:t>
+      </w:r>
+      <w:proofErr w:type="gramStart"/>
+      <w:r>
+        <w:rPr>
+          <w:rFonts w:ascii="Consolas" w:eastAsia="Times New Roman" w:hAnsi="Consolas" w:cs="Times New Roman"/>
+          <w:color w:val="7285B7"/>
+          <w:sz w:val="21"/>
+          <w:szCs w:val="21"/>
+        </w:rPr>
+        <w:t>data[</w:t>
+      </w:r>
+      <w:proofErr w:type="gramEnd"/>
+      <w:r>
+        <w:rPr>
+          <w:rFonts w:ascii="Consolas" w:eastAsia="Times New Roman" w:hAnsi="Consolas" w:cs="Times New Roman"/>
+          <w:color w:val="7285B7"/>
+          <w:sz w:val="21"/>
+          <w:szCs w:val="21"/>
+        </w:rPr>
+        <w:t>8], uint8_t index, int16_t value)</w:t>
       </w:r>
     </w:p>
     <w:p>
@@ -4358,67 +4590,11 @@
       <w:r>
         <w:rPr>
           <w:rFonts w:ascii="Consolas" w:eastAsia="Times New Roman" w:hAnsi="Consolas" w:cs="Times New Roman"/>
-          <w:color w:val="FFFFFF"/>
-          <w:sz w:val="21"/>
-          <w:szCs w:val="21"/>
-        </w:rPr>
-        <w:t xml:space="preserve">    </w:t>
-      </w:r>
-      <w:r>
-        <w:rPr>
-          <w:rFonts w:ascii="Consolas" w:eastAsia="Times New Roman" w:hAnsi="Consolas" w:cs="Times New Roman"/>
-          <w:color w:val="FFEEAD"/>
-          <w:sz w:val="21"/>
-          <w:szCs w:val="21"/>
-        </w:rPr>
-        <w:t>MSM_CAN</w:t>
-      </w:r>
-      <w:r>
-        <w:rPr>
-          <w:rFonts w:ascii="Consolas" w:eastAsia="Times New Roman" w:hAnsi="Consolas" w:cs="Times New Roman"/>
-          <w:color w:val="FFFFFF"/>
-          <w:sz w:val="21"/>
-          <w:szCs w:val="21"/>
-        </w:rPr>
-        <w:t>::</w:t>
-      </w:r>
-      <w:proofErr w:type="spellStart"/>
-      <w:r>
-        <w:rPr>
-          <w:rFonts w:ascii="Consolas" w:eastAsia="Times New Roman" w:hAnsi="Consolas" w:cs="Times New Roman"/>
-          <w:color w:val="BBDAFF"/>
-          <w:sz w:val="21"/>
-          <w:szCs w:val="21"/>
-        </w:rPr>
-        <w:t>send_msg</w:t>
-      </w:r>
-      <w:proofErr w:type="spellEnd"/>
-      <w:r>
-        <w:rPr>
-          <w:rFonts w:ascii="Consolas" w:eastAsia="Times New Roman" w:hAnsi="Consolas" w:cs="Times New Roman"/>
-          <w:color w:val="FFFFFF"/>
-          <w:sz w:val="21"/>
-          <w:szCs w:val="21"/>
-        </w:rPr>
-        <w:t>(</w:t>
-      </w:r>
-      <w:r>
-        <w:rPr>
-          <w:rFonts w:ascii="Consolas" w:eastAsia="Times New Roman" w:hAnsi="Consolas" w:cs="Times New Roman"/>
-          <w:color w:val="FF9DA4"/>
-          <w:sz w:val="21"/>
-          <w:szCs w:val="21"/>
-        </w:rPr>
-        <w:t>frame</w:t>
-      </w:r>
-      <w:r>
-        <w:rPr>
-          <w:rFonts w:ascii="Consolas" w:eastAsia="Times New Roman" w:hAnsi="Consolas" w:cs="Times New Roman"/>
-          <w:color w:val="FFFFFF"/>
-          <w:sz w:val="21"/>
-          <w:szCs w:val="21"/>
-        </w:rPr>
-        <w:t>);</w:t>
+          <w:color w:val="7285B7"/>
+          <w:sz w:val="21"/>
+          <w:szCs w:val="21"/>
+        </w:rPr>
+        <w:t>    //{</w:t>
       </w:r>
     </w:p>
     <w:p>
@@ -4439,7 +4615,7 @@
           <w:sz w:val="21"/>
           <w:szCs w:val="21"/>
         </w:rPr>
-        <w:t xml:space="preserve">    // Could be better to use schedule() instead of </w:t>
+        <w:t xml:space="preserve">    //    pack_u16(data, index, </w:t>
       </w:r>
       <w:proofErr w:type="spellStart"/>
       <w:r>
@@ -4449,7 +4625,7 @@
           <w:sz w:val="21"/>
           <w:szCs w:val="21"/>
         </w:rPr>
-        <w:t>send_msg</w:t>
+        <w:t>static_cast</w:t>
       </w:r>
       <w:proofErr w:type="spellEnd"/>
       <w:r>
@@ -4459,7 +4635,7 @@
           <w:sz w:val="21"/>
           <w:szCs w:val="21"/>
         </w:rPr>
-        <w:t>() as this would allow us to send the data periodically every second (as the brief states)</w:t>
+        <w:t>&lt;uint16_t&gt;(value));</w:t>
       </w:r>
     </w:p>
     <w:p>
@@ -4476,11 +4652,11 @@
       <w:r>
         <w:rPr>
           <w:rFonts w:ascii="Consolas" w:eastAsia="Times New Roman" w:hAnsi="Consolas" w:cs="Times New Roman"/>
-          <w:color w:val="FFFFFF"/>
-          <w:sz w:val="21"/>
-          <w:szCs w:val="21"/>
-        </w:rPr>
-        <w:t>}</w:t>
+          <w:color w:val="7285B7"/>
+          <w:sz w:val="21"/>
+          <w:szCs w:val="21"/>
+        </w:rPr>
+        <w:t>    //}</w:t>
       </w:r>
     </w:p>
     <w:p>
@@ -4494,6 +4670,307 @@
           <w:szCs w:val="21"/>
         </w:rPr>
       </w:pPr>
+      <w:r>
+        <w:rPr>
+          <w:rFonts w:ascii="Consolas" w:eastAsia="Times New Roman" w:hAnsi="Consolas" w:cs="Times New Roman"/>
+          <w:color w:val="FFFFFF"/>
+          <w:sz w:val="21"/>
+          <w:szCs w:val="21"/>
+        </w:rPr>
+        <w:t xml:space="preserve">    </w:t>
+      </w:r>
+      <w:r>
+        <w:rPr>
+          <w:rFonts w:ascii="Consolas" w:eastAsia="Times New Roman" w:hAnsi="Consolas" w:cs="Times New Roman"/>
+          <w:color w:val="FFEEAD"/>
+          <w:sz w:val="21"/>
+          <w:szCs w:val="21"/>
+        </w:rPr>
+        <w:t>MSM_</w:t>
+      </w:r>
+      <w:proofErr w:type="gramStart"/>
+      <w:r>
+        <w:rPr>
+          <w:rFonts w:ascii="Consolas" w:eastAsia="Times New Roman" w:hAnsi="Consolas" w:cs="Times New Roman"/>
+          <w:color w:val="FFEEAD"/>
+          <w:sz w:val="21"/>
+          <w:szCs w:val="21"/>
+        </w:rPr>
+        <w:t>CAN</w:t>
+      </w:r>
+      <w:r>
+        <w:rPr>
+          <w:rFonts w:ascii="Consolas" w:eastAsia="Times New Roman" w:hAnsi="Consolas" w:cs="Times New Roman"/>
+          <w:color w:val="FFFFFF"/>
+          <w:sz w:val="21"/>
+          <w:szCs w:val="21"/>
+        </w:rPr>
+        <w:t>::</w:t>
+      </w:r>
+      <w:proofErr w:type="gramEnd"/>
+      <w:r>
+        <w:rPr>
+          <w:rFonts w:ascii="Consolas" w:eastAsia="Times New Roman" w:hAnsi="Consolas" w:cs="Times New Roman"/>
+          <w:color w:val="BBDAFF"/>
+          <w:sz w:val="21"/>
+          <w:szCs w:val="21"/>
+        </w:rPr>
+        <w:t>pack_i16</w:t>
+      </w:r>
+      <w:r>
+        <w:rPr>
+          <w:rFonts w:ascii="Consolas" w:eastAsia="Times New Roman" w:hAnsi="Consolas" w:cs="Times New Roman"/>
+          <w:color w:val="FFFFFF"/>
+          <w:sz w:val="21"/>
+          <w:szCs w:val="21"/>
+        </w:rPr>
+        <w:t>(</w:t>
+      </w:r>
+      <w:proofErr w:type="spellStart"/>
+      <w:r>
+        <w:rPr>
+          <w:rFonts w:ascii="Consolas" w:eastAsia="Times New Roman" w:hAnsi="Consolas" w:cs="Times New Roman"/>
+          <w:color w:val="FF9DA4"/>
+          <w:sz w:val="21"/>
+          <w:szCs w:val="21"/>
+        </w:rPr>
+        <w:t>frame</w:t>
+      </w:r>
+      <w:r>
+        <w:rPr>
+          <w:rFonts w:ascii="Consolas" w:eastAsia="Times New Roman" w:hAnsi="Consolas" w:cs="Times New Roman"/>
+          <w:color w:val="FFFFFF"/>
+          <w:sz w:val="21"/>
+          <w:szCs w:val="21"/>
+        </w:rPr>
+        <w:t>.</w:t>
+      </w:r>
+      <w:r>
+        <w:rPr>
+          <w:rFonts w:ascii="Consolas" w:eastAsia="Times New Roman" w:hAnsi="Consolas" w:cs="Times New Roman"/>
+          <w:color w:val="FF9DA4"/>
+          <w:sz w:val="21"/>
+          <w:szCs w:val="21"/>
+        </w:rPr>
+        <w:t>data</w:t>
+      </w:r>
+      <w:proofErr w:type="spellEnd"/>
+      <w:r>
+        <w:rPr>
+          <w:rFonts w:ascii="Consolas" w:eastAsia="Times New Roman" w:hAnsi="Consolas" w:cs="Times New Roman"/>
+          <w:color w:val="FFFFFF"/>
+          <w:sz w:val="21"/>
+          <w:szCs w:val="21"/>
+        </w:rPr>
+        <w:t xml:space="preserve">, </w:t>
+      </w:r>
+      <w:r>
+        <w:rPr>
+          <w:rFonts w:ascii="Consolas" w:eastAsia="Times New Roman" w:hAnsi="Consolas" w:cs="Times New Roman"/>
+          <w:color w:val="FFC58F"/>
+          <w:sz w:val="21"/>
+          <w:szCs w:val="21"/>
+        </w:rPr>
+        <w:t>0</w:t>
+      </w:r>
+      <w:r>
+        <w:rPr>
+          <w:rFonts w:ascii="Consolas" w:eastAsia="Times New Roman" w:hAnsi="Consolas" w:cs="Times New Roman"/>
+          <w:color w:val="FFFFFF"/>
+          <w:sz w:val="21"/>
+          <w:szCs w:val="21"/>
+        </w:rPr>
+        <w:t xml:space="preserve">, </w:t>
+      </w:r>
+      <w:r>
+        <w:rPr>
+          <w:rFonts w:ascii="Consolas" w:eastAsia="Times New Roman" w:hAnsi="Consolas" w:cs="Times New Roman"/>
+          <w:color w:val="FF9DA4"/>
+          <w:sz w:val="21"/>
+          <w:szCs w:val="21"/>
+        </w:rPr>
+        <w:t>temperature_10x</w:t>
+      </w:r>
+      <w:r>
+        <w:rPr>
+          <w:rFonts w:ascii="Consolas" w:eastAsia="Times New Roman" w:hAnsi="Consolas" w:cs="Times New Roman"/>
+          <w:color w:val="FFFFFF"/>
+          <w:sz w:val="21"/>
+          <w:szCs w:val="21"/>
+        </w:rPr>
+        <w:t>);</w:t>
+      </w:r>
+    </w:p>
+    <w:p>
+      <w:pPr>
+        <w:shd w:val="clear" w:color="auto" w:fill="002451"/>
+        <w:spacing w:after="0" w:line="285" w:lineRule="atLeast"/>
+        <w:rPr>
+          <w:rFonts w:ascii="Consolas" w:eastAsia="Times New Roman" w:hAnsi="Consolas" w:cs="Times New Roman"/>
+          <w:color w:val="FFFFFF"/>
+          <w:sz w:val="21"/>
+          <w:szCs w:val="21"/>
+        </w:rPr>
+      </w:pPr>
+      <w:r>
+        <w:rPr>
+          <w:rFonts w:ascii="Consolas" w:eastAsia="Times New Roman" w:hAnsi="Consolas" w:cs="Times New Roman"/>
+          <w:color w:val="7285B7"/>
+          <w:sz w:val="21"/>
+          <w:szCs w:val="21"/>
+        </w:rPr>
+        <w:t>    //Packing from index 0 to ensure both bytes of data are included.</w:t>
+      </w:r>
+    </w:p>
+    <w:p>
+      <w:pPr>
+        <w:shd w:val="clear" w:color="auto" w:fill="002451"/>
+        <w:spacing w:after="0" w:line="285" w:lineRule="atLeast"/>
+        <w:rPr>
+          <w:rFonts w:ascii="Consolas" w:eastAsia="Times New Roman" w:hAnsi="Consolas" w:cs="Times New Roman"/>
+          <w:color w:val="FFFFFF"/>
+          <w:sz w:val="21"/>
+          <w:szCs w:val="21"/>
+        </w:rPr>
+      </w:pPr>
+      <w:r>
+        <w:rPr>
+          <w:rFonts w:ascii="Consolas" w:eastAsia="Times New Roman" w:hAnsi="Consolas" w:cs="Times New Roman"/>
+          <w:color w:val="FFFFFF"/>
+          <w:sz w:val="21"/>
+          <w:szCs w:val="21"/>
+        </w:rPr>
+        <w:t xml:space="preserve">    </w:t>
+      </w:r>
+      <w:r>
+        <w:rPr>
+          <w:rFonts w:ascii="Consolas" w:eastAsia="Times New Roman" w:hAnsi="Consolas" w:cs="Times New Roman"/>
+          <w:color w:val="FFEEAD"/>
+          <w:sz w:val="21"/>
+          <w:szCs w:val="21"/>
+        </w:rPr>
+        <w:t>MSM_</w:t>
+      </w:r>
+      <w:proofErr w:type="gramStart"/>
+      <w:r>
+        <w:rPr>
+          <w:rFonts w:ascii="Consolas" w:eastAsia="Times New Roman" w:hAnsi="Consolas" w:cs="Times New Roman"/>
+          <w:color w:val="FFEEAD"/>
+          <w:sz w:val="21"/>
+          <w:szCs w:val="21"/>
+        </w:rPr>
+        <w:t>CAN</w:t>
+      </w:r>
+      <w:r>
+        <w:rPr>
+          <w:rFonts w:ascii="Consolas" w:eastAsia="Times New Roman" w:hAnsi="Consolas" w:cs="Times New Roman"/>
+          <w:color w:val="FFFFFF"/>
+          <w:sz w:val="21"/>
+          <w:szCs w:val="21"/>
+        </w:rPr>
+        <w:t>::</w:t>
+      </w:r>
+      <w:proofErr w:type="spellStart"/>
+      <w:proofErr w:type="gramEnd"/>
+      <w:r>
+        <w:rPr>
+          <w:rFonts w:ascii="Consolas" w:eastAsia="Times New Roman" w:hAnsi="Consolas" w:cs="Times New Roman"/>
+          <w:color w:val="BBDAFF"/>
+          <w:sz w:val="21"/>
+          <w:szCs w:val="21"/>
+        </w:rPr>
+        <w:t>send_msg</w:t>
+      </w:r>
+      <w:proofErr w:type="spellEnd"/>
+      <w:r>
+        <w:rPr>
+          <w:rFonts w:ascii="Consolas" w:eastAsia="Times New Roman" w:hAnsi="Consolas" w:cs="Times New Roman"/>
+          <w:color w:val="FFFFFF"/>
+          <w:sz w:val="21"/>
+          <w:szCs w:val="21"/>
+        </w:rPr>
+        <w:t>(</w:t>
+      </w:r>
+      <w:r>
+        <w:rPr>
+          <w:rFonts w:ascii="Consolas" w:eastAsia="Times New Roman" w:hAnsi="Consolas" w:cs="Times New Roman"/>
+          <w:color w:val="FF9DA4"/>
+          <w:sz w:val="21"/>
+          <w:szCs w:val="21"/>
+        </w:rPr>
+        <w:t>frame</w:t>
+      </w:r>
+      <w:r>
+        <w:rPr>
+          <w:rFonts w:ascii="Consolas" w:eastAsia="Times New Roman" w:hAnsi="Consolas" w:cs="Times New Roman"/>
+          <w:color w:val="FFFFFF"/>
+          <w:sz w:val="21"/>
+          <w:szCs w:val="21"/>
+        </w:rPr>
+        <w:t>);</w:t>
+      </w:r>
+    </w:p>
+    <w:p>
+      <w:pPr>
+        <w:shd w:val="clear" w:color="auto" w:fill="002451"/>
+        <w:spacing w:after="0" w:line="285" w:lineRule="atLeast"/>
+        <w:rPr>
+          <w:rFonts w:ascii="Consolas" w:eastAsia="Times New Roman" w:hAnsi="Consolas" w:cs="Times New Roman"/>
+          <w:color w:val="FFFFFF"/>
+          <w:sz w:val="21"/>
+          <w:szCs w:val="21"/>
+        </w:rPr>
+      </w:pPr>
+      <w:r>
+        <w:rPr>
+          <w:rFonts w:ascii="Consolas" w:eastAsia="Times New Roman" w:hAnsi="Consolas" w:cs="Times New Roman"/>
+          <w:color w:val="7285B7"/>
+          <w:sz w:val="21"/>
+          <w:szCs w:val="21"/>
+        </w:rPr>
+        <w:t xml:space="preserve">    //Schedule </w:t>
+      </w:r>
+      <w:proofErr w:type="spellStart"/>
+      <w:r>
+        <w:rPr>
+          <w:rFonts w:ascii="Consolas" w:eastAsia="Times New Roman" w:hAnsi="Consolas" w:cs="Times New Roman"/>
+          <w:color w:val="7285B7"/>
+          <w:sz w:val="21"/>
+          <w:szCs w:val="21"/>
+        </w:rPr>
+        <w:t>unecessary</w:t>
+      </w:r>
+      <w:proofErr w:type="spellEnd"/>
+      <w:r>
+        <w:rPr>
+          <w:rFonts w:ascii="Consolas" w:eastAsia="Times New Roman" w:hAnsi="Consolas" w:cs="Times New Roman"/>
+          <w:color w:val="7285B7"/>
+          <w:sz w:val="21"/>
+          <w:szCs w:val="21"/>
+        </w:rPr>
+        <w:t xml:space="preserve"> as framework calls function per ADC sample.</w:t>
+      </w:r>
+    </w:p>
+    <w:p>
+      <w:pPr>
+        <w:shd w:val="clear" w:color="auto" w:fill="002451"/>
+        <w:spacing w:after="0" w:line="285" w:lineRule="atLeast"/>
+        <w:rPr>
+          <w:rFonts w:ascii="Consolas" w:eastAsia="Times New Roman" w:hAnsi="Consolas" w:cs="Times New Roman"/>
+          <w:color w:val="FFFFFF"/>
+          <w:sz w:val="21"/>
+          <w:szCs w:val="21"/>
+        </w:rPr>
+      </w:pPr>
+      <w:r>
+        <w:rPr>
+          <w:rFonts w:ascii="Consolas" w:eastAsia="Times New Roman" w:hAnsi="Consolas" w:cs="Times New Roman"/>
+          <w:color w:val="FFFFFF"/>
+          <w:sz w:val="21"/>
+          <w:szCs w:val="21"/>
+        </w:rPr>
+        <w:t>}</w:t>
+      </w:r>
     </w:p>
     <w:p/>
     <w:p>
@@ -4532,7 +5009,15 @@
       </w:r>
       <w:proofErr w:type="spellEnd"/>
       <w:r>
-        <w:t xml:space="preserve"> = ((ln(6380/10000) / (3940) + (25 + 273.15)</w:t>
+        <w:t xml:space="preserve"> = ((</w:t>
+      </w:r>
+      <w:proofErr w:type="gramStart"/>
+      <w:r>
+        <w:t>ln(</w:t>
+      </w:r>
+      <w:proofErr w:type="gramEnd"/>
+      <w:r>
+        <w:t>6380/10000) / (3940) + (25 + 273.15)</w:t>
       </w:r>
       <w:r>
         <w:rPr>
@@ -4562,13 +5047,27 @@
       </w:r>
     </w:p>
     <w:p>
-      <w:r>
-        <w:t>frame[0] = 01, frame[1] = 62</w:t>
+      <w:proofErr w:type="gramStart"/>
+      <w:r>
+        <w:t>frame[</w:t>
+      </w:r>
+      <w:proofErr w:type="gramEnd"/>
+      <w:r>
+        <w:t xml:space="preserve">0] = 01, </w:t>
+      </w:r>
+      <w:proofErr w:type="gramStart"/>
+      <w:r>
+        <w:t>frame[</w:t>
+      </w:r>
+      <w:proofErr w:type="gramEnd"/>
+      <w:r>
+        <w:t>1] = 62</w:t>
       </w:r>
     </w:p>
     <w:p/>
     <w:p>
       <w:r>
+        <w:lastRenderedPageBreak/>
         <w:t xml:space="preserve">I also tested for </w:t>
       </w:r>
       <w:proofErr w:type="spellStart"/>
@@ -4589,69 +5088,9 @@
         <w:t>C respectively.</w:t>
       </w:r>
     </w:p>
-    <w:p/>
-    <w:p>
-      <w:pPr>
-        <w:rPr>
-          <w:i/>
-          <w:color w:val="7030A0"/>
-        </w:rPr>
-      </w:pPr>
-      <w:r>
-        <w:rPr>
-          <w:i/>
-          <w:color w:val="7030A0"/>
-        </w:rPr>
-        <w:t xml:space="preserve">[In this section include </w:t>
-      </w:r>
-      <w:r>
-        <w:rPr>
-          <w:i/>
-          <w:color w:val="7030A0"/>
-        </w:rPr>
-        <w:t xml:space="preserve">the code you </w:t>
-      </w:r>
-      <w:r>
-        <w:rPr>
-          <w:i/>
-          <w:color w:val="7030A0"/>
-        </w:rPr>
-        <w:t>came up with for the daughterboard. We recommend coming into the interview with the code on your IDE as well as we may ask follow-up questions</w:t>
-      </w:r>
-      <w:r>
-        <w:rPr>
-          <w:i/>
-          <w:color w:val="7030A0"/>
-        </w:rPr>
-        <w:t xml:space="preserve">. Make sure that the </w:t>
-      </w:r>
-      <w:r>
-        <w:rPr>
-          <w:i/>
-          <w:color w:val="7030A0"/>
-        </w:rPr>
-        <w:t>code</w:t>
-      </w:r>
-      <w:r>
-        <w:rPr>
-          <w:i/>
-          <w:color w:val="7030A0"/>
-        </w:rPr>
-        <w:t xml:space="preserve"> is visible and clear, this can take up as much space as you require for clarity. Explain any key decisions you made </w:t>
-      </w:r>
-      <w:r>
-        <w:rPr>
-          <w:i/>
-          <w:color w:val="7030A0"/>
-        </w:rPr>
-        <w:t>through comments</w:t>
-      </w:r>
-      <w:r>
-        <w:rPr>
-          <w:i/>
-          <w:color w:val="7030A0"/>
-        </w:rPr>
-        <w:t>, explaining your thought process thoroughly]</w:t>
+    <w:p>
+      <w:r>
+        <w:br w:type="page"/>
       </w:r>
     </w:p>
     <w:p>
@@ -4659,26 +5098,160 @@
         <w:pStyle w:val="Heading1"/>
       </w:pPr>
       <w:r>
+        <w:lastRenderedPageBreak/>
         <w:t>6. Implementation</w:t>
       </w:r>
     </w:p>
     <w:p>
-      <w:r>
+      <w:pPr>
         <w:rPr>
           <w:b/>
           <w:bCs/>
         </w:rPr>
-        <w:t>Progress to Working Component</w:t>
+      </w:pPr>
+      <w:r>
+        <w:rPr>
+          <w:b/>
+          <w:bCs/>
+        </w:rPr>
+        <w:t>Spacing and Placement</w:t>
+      </w:r>
+    </w:p>
+    <w:p>
+      <w:r>
+        <w:t xml:space="preserve">The circuit itself is relatively simple, with the bulk of connections being pin to pin, but it would have to interface with the existing CAN system, so a mount that places it nearby to the data node would be necessary. </w:t>
+      </w:r>
+    </w:p>
+    <w:p>
+      <w:r>
+        <w:t>Certain features in the circuitry, such as the power decoupling capacitors must be placed in specific locations, in their case as close as possible to the power connection on the ADC and microcontroller (within 1 cm) for optimal working conditions. The grounding points across the system should all also go to the same ground to prevent voltage mismatch, so you would have to consider the placement with regards to proximity to one of the car’s grounding wires.</w:t>
       </w:r>
     </w:p>
     <w:p/>
-    <w:p>
-      <w:r>
-        <w:rPr>
-          <w:i/>
-          <w:color w:val="7030A0"/>
-        </w:rPr>
-        <w:t>[Here you can discuss the implementation process of your design, as described in the challenge description. Provide as much detail as you need to explain your vision of implementation]</w:t>
+    <w:p/>
+    <w:p>
+      <w:pPr>
+        <w:rPr>
+          <w:b/>
+          <w:bCs/>
+        </w:rPr>
+      </w:pPr>
+      <w:r>
+        <w:rPr>
+          <w:b/>
+          <w:bCs/>
+        </w:rPr>
+        <w:t>Making</w:t>
+      </w:r>
+    </w:p>
+    <w:p>
+      <w:r>
+        <w:t>The component could be made with a very simple PCB design, or even direct wiring as there are only a few connections.</w:t>
+      </w:r>
+      <w:r>
+        <w:t xml:space="preserve"> Some complexity could be created because connections cannot cross over as they do in the schematic.</w:t>
+      </w:r>
+      <w:r>
+        <w:t xml:space="preserve"> Power would likely have to be drawn from an existing power circuit in the car, so I would have to ensure it was at the correct voltage of 3.3V, perhaps using a transformer, and that it would not be overly high current so it doesn’t fry the components.</w:t>
+      </w:r>
+    </w:p>
+    <w:p/>
+    <w:p>
+      <w:pPr>
+        <w:rPr>
+          <w:b/>
+          <w:bCs/>
+        </w:rPr>
+      </w:pPr>
+      <w:r>
+        <w:rPr>
+          <w:b/>
+          <w:bCs/>
+        </w:rPr>
+        <w:t>Testing</w:t>
+      </w:r>
+    </w:p>
+    <w:p>
+      <w:r>
+        <w:t>The code files are small enough to easily fit within the memory of the microcontroller, but rigorous testing of the system should be done before making any permanent changes to ensure everything is working properly before it is in a place where it is more difficult to access or manipulate.</w:t>
+      </w:r>
+      <w:r>
+        <w:t xml:space="preserve"> This could be done using the MSM </w:t>
+      </w:r>
+      <w:proofErr w:type="spellStart"/>
+      <w:r>
+        <w:t>github</w:t>
+      </w:r>
+      <w:proofErr w:type="spellEnd"/>
+      <w:r>
+        <w:t xml:space="preserve"> loaded into a </w:t>
+      </w:r>
+      <w:proofErr w:type="spellStart"/>
+      <w:r>
+        <w:t>venv</w:t>
+      </w:r>
+      <w:proofErr w:type="spellEnd"/>
+      <w:r>
+        <w:t xml:space="preserve"> for software testing, and then with the actual components once software testing is complete.</w:t>
+      </w:r>
+    </w:p>
+    <w:p>
+      <w:r>
+        <w:t xml:space="preserve">To ensure the thermistor is working properly you could use a refrigerated or heated enclosed environment at a known temperature (using a thermometer) and compare the calculated value from the system to the true temperature. </w:t>
+      </w:r>
+    </w:p>
+    <w:p>
+      <w:r>
+        <w:t>The ADC’s operational range is -40 – 85</w:t>
+      </w:r>
+      <w:r>
+        <w:rPr>
+          <w:vertAlign w:val="superscript"/>
+        </w:rPr>
+        <w:t>o</w:t>
+      </w:r>
+      <w:r>
+        <w:t>C, so you should be careful not to overheat it during testing, and it may require some heat shielding to ensure it stays within this range during operation. You may also have to purchase the 105</w:t>
+      </w:r>
+      <w:r>
+        <w:rPr>
+          <w:vertAlign w:val="superscript"/>
+        </w:rPr>
+        <w:t>o</w:t>
+      </w:r>
+      <w:r>
+        <w:t>C rated version of the microcontroller.</w:t>
+      </w:r>
+    </w:p>
+    <w:p>
+      <w:r>
+        <w:lastRenderedPageBreak/>
+        <w:t>In addition to the testing within the range of 0-100</w:t>
+      </w:r>
+      <w:r>
+        <w:rPr>
+          <w:vertAlign w:val="superscript"/>
+        </w:rPr>
+        <w:t>o</w:t>
+      </w:r>
+      <w:r>
+        <w:t>C, it would also be prudent to do testing outside of the range to ensure that the system properly recognises and reports an issue when this happens.</w:t>
+      </w:r>
+    </w:p>
+    <w:p>
+      <w:r>
+        <w:t xml:space="preserve">The CAN message can be checked using one of the unpacking helper functions from MSM_CAN.hpp to merge the uint8s from the data frame back into an int16 and checking if this matches the calculated value from the earlier stage. As our temperature range does not go into the negatives, there should be no difference between the unsigned and signed, but this should be properly verified to prevent any errors in the translation. This </w:t>
+      </w:r>
+      <w:r>
+        <w:t>data should be able to be displayed using</w:t>
+      </w:r>
+      <w:r>
+        <w:t xml:space="preserve"> a laptop linked to the CAN system.</w:t>
+      </w:r>
+    </w:p>
+    <w:p>
+      <w:r>
+        <w:t>Any issues encountered during this should be narrowed down to a singular component/connection by progressive testing of each part of the system.</w:t>
       </w:r>
     </w:p>
     <w:sectPr>
@@ -4926,7 +5499,7 @@
       <w:lvlText w:val="%1."/>
       <w:lvlJc w:val="left"/>
       <w:pPr>
-        <w:ind w:left="792" w:hanging="432"/>
+        <w:ind w:left="432" w:hanging="432"/>
       </w:pPr>
       <w:rPr>
         <w:rFonts w:hint="default"/>
@@ -4938,7 +5511,7 @@
       <w:lvlText w:val="%2."/>
       <w:lvlJc w:val="left"/>
       <w:pPr>
-        <w:ind w:left="1440" w:hanging="360"/>
+        <w:ind w:left="1080" w:hanging="360"/>
       </w:pPr>
     </w:lvl>
     <w:lvl w:ilvl="2" w:tplc="0809001B" w:tentative="1">
@@ -4947,7 +5520,7 @@
       <w:lvlText w:val="%3."/>
       <w:lvlJc w:val="right"/>
       <w:pPr>
-        <w:ind w:left="2160" w:hanging="180"/>
+        <w:ind w:left="1800" w:hanging="180"/>
       </w:pPr>
     </w:lvl>
     <w:lvl w:ilvl="3" w:tplc="0809000F" w:tentative="1">
@@ -4956,7 +5529,7 @@
       <w:lvlText w:val="%4."/>
       <w:lvlJc w:val="left"/>
       <w:pPr>
-        <w:ind w:left="2880" w:hanging="360"/>
+        <w:ind w:left="2520" w:hanging="360"/>
       </w:pPr>
     </w:lvl>
     <w:lvl w:ilvl="4" w:tplc="08090019" w:tentative="1">
@@ -4965,7 +5538,7 @@
       <w:lvlText w:val="%5."/>
       <w:lvlJc w:val="left"/>
       <w:pPr>
-        <w:ind w:left="3600" w:hanging="360"/>
+        <w:ind w:left="3240" w:hanging="360"/>
       </w:pPr>
     </w:lvl>
     <w:lvl w:ilvl="5" w:tplc="0809001B" w:tentative="1">
@@ -4974,7 +5547,7 @@
       <w:lvlText w:val="%6."/>
       <w:lvlJc w:val="right"/>
       <w:pPr>
-        <w:ind w:left="4320" w:hanging="180"/>
+        <w:ind w:left="3960" w:hanging="180"/>
       </w:pPr>
     </w:lvl>
     <w:lvl w:ilvl="6" w:tplc="0809000F" w:tentative="1">
@@ -4983,7 +5556,7 @@
       <w:lvlText w:val="%7."/>
       <w:lvlJc w:val="left"/>
       <w:pPr>
-        <w:ind w:left="5040" w:hanging="360"/>
+        <w:ind w:left="4680" w:hanging="360"/>
       </w:pPr>
     </w:lvl>
     <w:lvl w:ilvl="7" w:tplc="08090019" w:tentative="1">
@@ -4992,7 +5565,7 @@
       <w:lvlText w:val="%8."/>
       <w:lvlJc w:val="left"/>
       <w:pPr>
-        <w:ind w:left="5760" w:hanging="360"/>
+        <w:ind w:left="5400" w:hanging="360"/>
       </w:pPr>
     </w:lvl>
     <w:lvl w:ilvl="8" w:tplc="0809001B" w:tentative="1">
@@ -5001,7 +5574,7 @@
       <w:lvlText w:val="%9."/>
       <w:lvlJc w:val="right"/>
       <w:pPr>
-        <w:ind w:left="6480" w:hanging="180"/>
+        <w:ind w:left="6120" w:hanging="180"/>
       </w:pPr>
     </w:lvl>
   </w:abstractNum>

</xml_diff>

<commit_message>
Final edits on submission document.
</commit_message>
<xml_diff>
--- a/Supplementary Files/Submission - Electrical Software Indivual Challenge Douglas Gray ID 190.docx
+++ b/Supplementary Files/Submission - Electrical Software Indivual Challenge Douglas Gray ID 190.docx
@@ -400,6 +400,25 @@
         <w:t>look back at the end of the process so I can identify any further changes I can make to improve the system with a greater knowledge of the final structure.</w:t>
       </w:r>
     </w:p>
+    <w:p/>
+    <w:p>
+      <w:r>
+        <w:rPr>
+          <w:b/>
+          <w:bCs/>
+        </w:rPr>
+        <w:t xml:space="preserve">GitHub Repo </w:t>
+      </w:r>
+      <w:hyperlink r:id="rId11" w:history="1">
+        <w:r>
+          <w:rPr>
+            <w:rStyle w:val="Hyperlink"/>
+          </w:rPr>
+          <w:t>https://github.com/AerosmithTG/CAN-Node-Sensor-Interface-ID-190</w:t>
+        </w:r>
+      </w:hyperlink>
+    </w:p>
+    <w:p/>
     <w:p>
       <w:r>
         <w:br w:type="page"/>
@@ -443,7 +462,7 @@
                     <pic:cNvPicPr/>
                   </pic:nvPicPr>
                   <pic:blipFill>
-                    <a:blip r:embed="rId11">
+                    <a:blip r:embed="rId12">
                       <a:extLst>
                         <a:ext uri="{28A0092B-C50C-407E-A947-70E740481C1C}">
                           <a14:useLocalDpi xmlns:a14="http://schemas.microsoft.com/office/drawing/2010/main" val="0"/>
@@ -602,7 +621,7 @@
                     <pic:cNvPicPr/>
                   </pic:nvPicPr>
                   <pic:blipFill>
-                    <a:blip r:embed="rId12" cstate="print">
+                    <a:blip r:embed="rId13" cstate="print">
                       <a:extLst>
                         <a:ext uri="{28A0092B-C50C-407E-A947-70E740481C1C}">
                           <a14:useLocalDpi xmlns:a14="http://schemas.microsoft.com/office/drawing/2010/main" val="0"/>
@@ -634,7 +653,7 @@
           </wp:anchor>
         </w:drawing>
       </w:r>
-      <w:hyperlink r:id="rId13" w:history="1">
+      <w:hyperlink r:id="rId14" w:history="1">
         <w:r>
           <w:rPr>
             <w:rStyle w:val="Hyperlink"/>
@@ -672,7 +691,7 @@
                     <pic:cNvPicPr/>
                   </pic:nvPicPr>
                   <pic:blipFill>
-                    <a:blip r:embed="rId14" cstate="print">
+                    <a:blip r:embed="rId15" cstate="print">
                       <a:extLst>
                         <a:ext uri="{28A0092B-C50C-407E-A947-70E740481C1C}">
                           <a14:useLocalDpi xmlns:a14="http://schemas.microsoft.com/office/drawing/2010/main" val="0"/>
@@ -720,7 +739,7 @@
                     <pic:cNvPicPr/>
                   </pic:nvPicPr>
                   <pic:blipFill>
-                    <a:blip r:embed="rId15">
+                    <a:blip r:embed="rId16">
                       <a:extLst>
                         <a:ext uri="{28A0092B-C50C-407E-A947-70E740481C1C}">
                           <a14:useLocalDpi xmlns:a14="http://schemas.microsoft.com/office/drawing/2010/main" val="0"/>
@@ -768,7 +787,7 @@
                     <pic:cNvPicPr/>
                   </pic:nvPicPr>
                   <pic:blipFill>
-                    <a:blip r:embed="rId16">
+                    <a:blip r:embed="rId17">
                       <a:extLst>
                         <a:ext uri="{28A0092B-C50C-407E-A947-70E740481C1C}">
                           <a14:useLocalDpi xmlns:a14="http://schemas.microsoft.com/office/drawing/2010/main" val="0"/>
@@ -852,10 +871,10 @@
                     <pic:cNvPicPr/>
                   </pic:nvPicPr>
                   <pic:blipFill>
-                    <a:blip r:embed="rId17">
+                    <a:blip r:embed="rId18">
                       <a:extLst>
                         <a:ext uri="{96DAC541-7B7A-43D3-8B79-37D633B846F1}">
-                          <asvg:svgBlip xmlns:asvg="http://schemas.microsoft.com/office/drawing/2016/SVG/main" r:embed="rId18"/>
+                          <asvg:svgBlip xmlns:asvg="http://schemas.microsoft.com/office/drawing/2016/SVG/main" r:embed="rId19"/>
                         </a:ext>
                       </a:extLst>
                     </a:blip>
@@ -5255,8 +5274,8 @@
       </w:r>
     </w:p>
     <w:sectPr>
-      <w:headerReference w:type="default" r:id="rId19"/>
-      <w:footerReference w:type="default" r:id="rId20"/>
+      <w:headerReference w:type="default" r:id="rId20"/>
+      <w:footerReference w:type="default" r:id="rId21"/>
       <w:pgSz w:w="11906" w:h="16838"/>
       <w:pgMar w:top="1440" w:right="1440" w:bottom="1440" w:left="1440" w:header="708" w:footer="708" w:gutter="0"/>
       <w:pgNumType w:start="1"/>

</xml_diff>